<commit_message>
Tai lieu 13: them hai cau hoi hay gap ve ngay 18/09 va ve so lo ben Dakao
</commit_message>
<xml_diff>
--- a/docs/13 Marou POC - Demo script (noi bo).docx
+++ b/docs/13 Marou POC - Demo script (noi bo).docx
@@ -10144,6 +10144,150 @@
                 <w:szCs w:val="20"/>
               </w:rPr>
               <w:t xml:space="preserve">Môi trường demo hiện dùng Azure OpenAI ở Mỹ. Khi triển khai, extension của NaviWorld tự chọn được vùng xử lý, giữ được trong Asia Pacific. Đây là điểm cần ghi vào phần governance.</w:t>
+            </w:r>
+          </w:p>
+        </w:tc>
+      </w:tr>
+      <w:tr>
+        <w:trPr>
+          <w:cantSplit/>
+          <w:tblHeader w:val="false"/>
+        </w:trPr>
+        <w:tc>
+          <w:tcPr>
+            <w:tcW w:type="dxa" w:w="3373"/>
+            <w:tcBorders>
+              <w:top w:val="single" w:color="A9D5E2" w:sz="4"/>
+              <w:left w:val="single" w:color="A9D5E2" w:sz="4"/>
+              <w:bottom w:val="single" w:color="A9D5E2" w:sz="4"/>
+              <w:right w:val="single" w:color="A9D5E2" w:sz="4"/>
+            </w:tcBorders>
+            <w:tcMar>
+              <w:top w:type="dxa" w:w="113"/>
+              <w:left w:type="dxa" w:w="113"/>
+              <w:bottom w:type="dxa" w:w="113"/>
+              <w:right w:type="dxa" w:w="113"/>
+            </w:tcMar>
+          </w:tcPr>
+          <w:p>
+            <w:pPr>
+              <w:spacing w:after="0" w:line="252"/>
+            </w:pPr>
+            <w:r>
+              <w:rPr>
+                <w:rFonts w:ascii="Aptos" w:cs="Aptos" w:eastAsia="Aptos" w:hAnsi="Aptos"/>
+                <w:b w:val="false"/>
+                <w:bCs w:val="false"/>
+                <w:color w:val="27343A"/>
+                <w:sz w:val="20"/>
+                <w:szCs w:val="20"/>
+              </w:rPr>
+              <w:t xml:space="preserve">Sao email và báo cáo đề ngày 18/09 mà hôm nay chưa tới ngày đó?</w:t>
+            </w:r>
+          </w:p>
+        </w:tc>
+        <w:tc>
+          <w:tcPr>
+            <w:tcW w:type="dxa" w:w="6265"/>
+            <w:tcBorders>
+              <w:top w:val="single" w:color="A9D5E2" w:sz="4"/>
+              <w:left w:val="single" w:color="A9D5E2" w:sz="4"/>
+              <w:bottom w:val="single" w:color="A9D5E2" w:sz="4"/>
+              <w:right w:val="single" w:color="A9D5E2" w:sz="4"/>
+            </w:tcBorders>
+            <w:tcMar>
+              <w:top w:type="dxa" w:w="113"/>
+              <w:left w:type="dxa" w:w="113"/>
+              <w:bottom w:type="dxa" w:w="113"/>
+              <w:right w:type="dxa" w:w="113"/>
+            </w:tcMar>
+          </w:tcPr>
+          <w:p>
+            <w:pPr>
+              <w:spacing w:after="0" w:line="252"/>
+            </w:pPr>
+            <w:r>
+              <w:rPr>
+                <w:rFonts w:ascii="Aptos" w:cs="Aptos" w:eastAsia="Aptos" w:hAnsi="Aptos"/>
+                <w:b w:val="false"/>
+                <w:bCs w:val="false"/>
+                <w:color w:val="27343A"/>
+                <w:sz w:val="20"/>
+                <w:szCs w:val="20"/>
+              </w:rPr>
+              <w:t xml:space="preserve">18/09 là ngày lớp tính toán trong Business Central chạy lần gần nhất, trợ lý neo theo đó chứ không neo theo ngày máy chạy. Nếu neo theo ngày máy thì cửa sổ lịch sử bán và số ngày kể từ lần bán cuối đều lệch. Chứng từ mua bán thì vẫn mang ngày thật.</w:t>
+            </w:r>
+          </w:p>
+        </w:tc>
+      </w:tr>
+      <w:tr>
+        <w:trPr>
+          <w:cantSplit/>
+          <w:tblHeader w:val="false"/>
+        </w:trPr>
+        <w:tc>
+          <w:tcPr>
+            <w:tcW w:type="dxa" w:w="3373"/>
+            <w:tcBorders>
+              <w:top w:val="single" w:color="A9D5E2" w:sz="4"/>
+              <w:left w:val="single" w:color="A9D5E2" w:sz="4"/>
+              <w:bottom w:val="single" w:color="A9D5E2" w:sz="4"/>
+              <w:right w:val="single" w:color="A9D5E2" w:sz="4"/>
+            </w:tcBorders>
+            <w:tcMar>
+              <w:top w:type="dxa" w:w="113"/>
+              <w:left w:type="dxa" w:w="113"/>
+              <w:bottom w:type="dxa" w:w="113"/>
+              <w:right w:type="dxa" w:w="113"/>
+            </w:tcMar>
+          </w:tcPr>
+          <w:p>
+            <w:pPr>
+              <w:spacing w:after="0" w:line="252"/>
+            </w:pPr>
+            <w:r>
+              <w:rPr>
+                <w:rFonts w:ascii="Aptos" w:cs="Aptos" w:eastAsia="Aptos" w:hAnsi="Aptos"/>
+                <w:b w:val="false"/>
+                <w:bCs w:val="false"/>
+                <w:color w:val="27343A"/>
+                <w:sz w:val="20"/>
+                <w:szCs w:val="20"/>
+              </w:rPr>
+              <w:t xml:space="preserve">Sao bên bán lẻ Dakao cũng thấy số lô, trong khi bán lẻ không quản lý lô?</w:t>
+            </w:r>
+          </w:p>
+        </w:tc>
+        <w:tc>
+          <w:tcPr>
+            <w:tcW w:type="dxa" w:w="6265"/>
+            <w:tcBorders>
+              <w:top w:val="single" w:color="A9D5E2" w:sz="4"/>
+              <w:left w:val="single" w:color="A9D5E2" w:sz="4"/>
+              <w:bottom w:val="single" w:color="A9D5E2" w:sz="4"/>
+              <w:right w:val="single" w:color="A9D5E2" w:sz="4"/>
+            </w:tcBorders>
+            <w:tcMar>
+              <w:top w:type="dxa" w:w="113"/>
+              <w:left w:type="dxa" w:w="113"/>
+              <w:bottom w:type="dxa" w:w="113"/>
+              <w:right w:type="dxa" w:w="113"/>
+            </w:tcMar>
+          </w:tcPr>
+          <w:p>
+            <w:pPr>
+              <w:spacing w:after="0" w:line="252"/>
+            </w:pPr>
+            <w:r>
+              <w:rPr>
+                <w:rFonts w:ascii="Aptos" w:cs="Aptos" w:eastAsia="Aptos" w:hAnsi="Aptos"/>
+                <w:b w:val="false"/>
+                <w:bCs w:val="false"/>
+                <w:color w:val="27343A"/>
+                <w:sz w:val="20"/>
+                <w:szCs w:val="20"/>
+              </w:rPr>
+              <w:t xml:space="preserve">Hai đơn vị đang dùng chung một bộ dữ liệu mô phỏng, dữ liệu bán lẻ riêng cho Dakao nằm ở bước sau. Riêng việc phiếu nhận mang đúng lô Marou đã xuất thì là có chủ ý: nhờ vậy truy được cả chuỗi từ lô sản xuất tới lô đang nằm ở cửa hàng.</w:t>
             </w:r>
           </w:p>
         </w:tc>

</xml_diff>

<commit_message>
Slide bang chung dung hai anh that: email trong hop thu va phieu nhan trong BC
Dung gui hai anh chup, thay cho anh email toi tu render. Slide 27 gio la hai anh dat canh nhau,
kem mot dong ke lai ca bon buoc cua don HO106201. Anh phieu nhan cat bo thanh dia chi trinh duyet
va cot danh sach ben trai; anh email giu nguyen.

Speaker note them cau tra loi neu khach de y dia chi nguoi gui la Gmail: tenant thu nghiem khong co
license Exchange Online nen POC gui qua SMTP, trien khai that thi di bang hop thu cua Marou. Cung
cau do them vao bang cau hoi hay gap cua tai lieu 13.
</commit_message>
<xml_diff>
--- a/docs/13 Marou POC - Demo script (noi bo).docx
+++ b/docs/13 Marou POC - Demo script (noi bo).docx
@@ -10288,6 +10288,78 @@
                 <w:szCs w:val="20"/>
               </w:rPr>
               <w:t xml:space="preserve">Hai đơn vị đang dùng chung một bộ dữ liệu mô phỏng, dữ liệu bán lẻ riêng cho Dakao nằm ở bước sau. Riêng việc phiếu nhận mang đúng lô Marou đã xuất thì là có chủ ý: nhờ vậy truy được cả chuỗi từ lô sản xuất tới lô đang nằm ở cửa hàng.</w:t>
+            </w:r>
+          </w:p>
+        </w:tc>
+      </w:tr>
+      <w:tr>
+        <w:trPr>
+          <w:cantSplit/>
+          <w:tblHeader w:val="false"/>
+        </w:trPr>
+        <w:tc>
+          <w:tcPr>
+            <w:tcW w:type="dxa" w:w="3373"/>
+            <w:tcBorders>
+              <w:top w:val="single" w:color="A9D5E2" w:sz="4"/>
+              <w:left w:val="single" w:color="A9D5E2" w:sz="4"/>
+              <w:bottom w:val="single" w:color="A9D5E2" w:sz="4"/>
+              <w:right w:val="single" w:color="A9D5E2" w:sz="4"/>
+            </w:tcBorders>
+            <w:tcMar>
+              <w:top w:type="dxa" w:w="113"/>
+              <w:left w:type="dxa" w:w="113"/>
+              <w:bottom w:type="dxa" w:w="113"/>
+              <w:right w:type="dxa" w:w="113"/>
+            </w:tcMar>
+          </w:tcPr>
+          <w:p>
+            <w:pPr>
+              <w:spacing w:after="0" w:line="252"/>
+            </w:pPr>
+            <w:r>
+              <w:rPr>
+                <w:rFonts w:ascii="Aptos" w:cs="Aptos" w:eastAsia="Aptos" w:hAnsi="Aptos"/>
+                <w:b w:val="false"/>
+                <w:bCs w:val="false"/>
+                <w:color w:val="27343A"/>
+                <w:sz w:val="20"/>
+                <w:szCs w:val="20"/>
+              </w:rPr>
+              <w:t xml:space="preserve">Sao email gửi từ một địa chỉ Gmail?</w:t>
+            </w:r>
+          </w:p>
+        </w:tc>
+        <w:tc>
+          <w:tcPr>
+            <w:tcW w:type="dxa" w:w="6265"/>
+            <w:tcBorders>
+              <w:top w:val="single" w:color="A9D5E2" w:sz="4"/>
+              <w:left w:val="single" w:color="A9D5E2" w:sz="4"/>
+              <w:bottom w:val="single" w:color="A9D5E2" w:sz="4"/>
+              <w:right w:val="single" w:color="A9D5E2" w:sz="4"/>
+            </w:tcBorders>
+            <w:tcMar>
+              <w:top w:type="dxa" w:w="113"/>
+              <w:left w:type="dxa" w:w="113"/>
+              <w:bottom w:type="dxa" w:w="113"/>
+              <w:right w:type="dxa" w:w="113"/>
+            </w:tcMar>
+          </w:tcPr>
+          <w:p>
+            <w:pPr>
+              <w:spacing w:after="0" w:line="252"/>
+            </w:pPr>
+            <w:r>
+              <w:rPr>
+                <w:rFonts w:ascii="Aptos" w:cs="Aptos" w:eastAsia="Aptos" w:hAnsi="Aptos"/>
+                <w:b w:val="false"/>
+                <w:bCs w:val="false"/>
+                <w:color w:val="27343A"/>
+                <w:sz w:val="20"/>
+                <w:szCs w:val="20"/>
+              </w:rPr>
+              <w:t xml:space="preserve">Môi trường demo nằm trên tenant thử nghiệm không có license Exchange Online, nên POC gửi qua SMTP. Khi triển khai thật, thư đi bằng hộp thư của Marou; đây là cấu hình một lần, không đụng vào code.</w:t>
             </w:r>
           </w:p>
         </w:tc>

</xml_diff>

<commit_message>
Cau chung ve planner thay vi cau mau; planner co tool suc khoe ton kho va de xuat LS kem co bat thuong; bo kiem so nhan cot store, ma hang va ngay thang
- handle_stockout khong co ten hang thi danh dau unresolved de core dua cho planner; prompt NLU: STOCKOUT phai co ten hang, hoi chung la PLAN.
- Toolbox: inventory_health, replenishment_suggestions (flags: min_max, oos_qua_nua_cua_so, khong_co_ban_binh_quan, de_xuat_vuot_ban_x_phu, kho_khong_du, ton_bang_0, de_xuat_bi_chan), explain_replenishment; stores_at_risk loc theo cua hang.
- Rule: bat thuong + de xuat/bo sung/LS khong phai ANOMALY cung khong phai BRIEF.
- kich_ban.so_sai_dia_diem: duong dan ghep ?store=...#itemNo=... khi ma hang trung, bo qua ma hang va ngay thang.
- Console them buoc 9; tai lieu 13 thanh 23 buoc.
</commit_message>
<xml_diff>
--- a/docs/13 Marou POC - Demo script (noi bo).docx
+++ b/docs/13 Marou POC - Demo script (noi bo).docx
@@ -39,7 +39,7 @@
           <w:sz w:val="28"/>
           <w:szCs w:val="28"/>
         </w:rPr>
-        <w:t xml:space="preserve">Runbook 22 bước cho buổi trình diễn 17/09/2026: dữ liệu đã tạo sẵn, bấm gì, khách thấy gì, nói gì</w:t>
+        <w:t xml:space="preserve">Runbook 23 bước cho buổi trình diễn 17/09/2026: dữ liệu đã tạo sẵn, bấm gì, khách thấy gì, nói gì</w:t>
       </w:r>
     </w:p>
     <w:p>
@@ -147,7 +147,7 @@
           <w:rFonts w:ascii="Aptos" w:cs="Aptos" w:eastAsia="Aptos" w:hAnsi="Aptos"/>
           <w:color w:val="27343A"/>
         </w:rPr>
-        <w:t xml:space="preserve">Một buổi sáng ở Dakao và Marou. Cửa hàng kêu hết hàng, LS Replenishment đã tính sẵn con số, trợ lý ghi đề xuất và giải thích, người của Marou duyệt, đơn mua tự sang Marou, Marou xuất kho, trợ lý báo cửa hàng chuẩn bị nhận và xin phép post phiếu nhận. Xen giữa là dự báo nối sang bổ sung, và một lô cận date để AI chọn phương án. Sáu phần, 20 bước, mỗi bước là một nút trên cột trái của console, bấm theo số thứ tự.</w:t>
+        <w:t xml:space="preserve">Một buổi sáng ở Dakao và Marou. Cửa hàng kêu hết hàng, LS Replenishment đã tính sẵn con số, trợ lý ghi đề xuất và giải thích, người của Marou duyệt, đơn mua tự sang Marou, Marou xuất kho, trợ lý báo cửa hàng chuẩn bị nhận và xin phép post phiếu nhận. Xen giữa là dự báo nối sang bổ sung, và một lô cận date để AI chọn phương án. Sáu phần, 23 bước, mỗi bước là một nút trên cột trái của console, bấm theo số thứ tự.</w:t>
       </w:r>
     </w:p>
     <w:tbl>
@@ -515,7 +515,7 @@
                 <w:sz w:val="20"/>
                 <w:szCs w:val="20"/>
               </w:rPr>
-              <w:t xml:space="preserve">3 đến 8</w:t>
+              <w:t xml:space="preserve">3 đến 9</w:t>
             </w:r>
           </w:p>
         </w:tc>
@@ -581,7 +581,7 @@
                 <w:sz w:val="20"/>
                 <w:szCs w:val="20"/>
               </w:rPr>
-              <w:t xml:space="preserve">4 đến 14</w:t>
+              <w:t xml:space="preserve">4 đến 15</w:t>
             </w:r>
           </w:p>
         </w:tc>
@@ -653,7 +653,7 @@
                 <w:sz w:val="20"/>
                 <w:szCs w:val="20"/>
               </w:rPr>
-              <w:t xml:space="preserve">9 đến 13</w:t>
+              <w:t xml:space="preserve">10 đến 14</w:t>
             </w:r>
           </w:p>
         </w:tc>
@@ -719,7 +719,7 @@
                 <w:sz w:val="20"/>
                 <w:szCs w:val="20"/>
               </w:rPr>
-              <w:t xml:space="preserve">14 đến 21</w:t>
+              <w:t xml:space="preserve">15 đến 22</w:t>
             </w:r>
           </w:p>
         </w:tc>
@@ -791,7 +791,7 @@
                 <w:sz w:val="20"/>
                 <w:szCs w:val="20"/>
               </w:rPr>
-              <w:t xml:space="preserve">14 đến 16</w:t>
+              <w:t xml:space="preserve">15 đến 17</w:t>
             </w:r>
           </w:p>
         </w:tc>
@@ -857,7 +857,7 @@
                 <w:sz w:val="20"/>
                 <w:szCs w:val="20"/>
               </w:rPr>
-              <w:t xml:space="preserve">21 đến 26</w:t>
+              <w:t xml:space="preserve">22 đến 27</w:t>
             </w:r>
           </w:p>
         </w:tc>
@@ -929,7 +929,7 @@
                 <w:sz w:val="20"/>
                 <w:szCs w:val="20"/>
               </w:rPr>
-              <w:t xml:space="preserve">17 đến 20</w:t>
+              <w:t xml:space="preserve">18 đến 21</w:t>
             </w:r>
           </w:p>
         </w:tc>
@@ -995,7 +995,7 @@
                 <w:sz w:val="20"/>
                 <w:szCs w:val="20"/>
               </w:rPr>
-              <w:t xml:space="preserve">26 đến 33</w:t>
+              <w:t xml:space="preserve">27 đến 34</w:t>
             </w:r>
           </w:p>
         </w:tc>
@@ -1067,7 +1067,7 @@
                 <w:sz w:val="20"/>
                 <w:szCs w:val="20"/>
               </w:rPr>
-              <w:t xml:space="preserve">21, 22</w:t>
+              <w:t xml:space="preserve">22, 23</w:t>
             </w:r>
           </w:p>
         </w:tc>
@@ -1133,7 +1133,7 @@
                 <w:sz w:val="20"/>
                 <w:szCs w:val="20"/>
               </w:rPr>
-              <w:t xml:space="preserve">33 đến 37</w:t>
+              <w:t xml:space="preserve">34 đến 38</w:t>
             </w:r>
           </w:p>
         </w:tc>
@@ -1178,7 +1178,7 @@
           <w:rFonts w:ascii="Aptos" w:cs="Aptos" w:eastAsia="Aptos" w:hAnsi="Aptos"/>
           <w:color w:val="27343A"/>
         </w:rPr>
-        <w:t xml:space="preserve">Khi bị cắt giờ, giữ các bước 2, 3, 4, 7, 15, 17, 19. Đó là một vòng trọn: AI tóm tắt, cửa hàng kêu hết hàng, LS giải thích, người duyệt, AI chọn phương án, Marou xuất kho, trợ lý post phiếu nhận sau khi được duyệt.</w:t>
+        <w:t xml:space="preserve">Khi bị cắt giờ, giữ các bước 2, 3, 4, 7, 9, 16, 18, 20. Đó là một vòng trọn: AI tóm tắt, cửa hàng kêu hết hàng, LS giải thích, người duyệt, AI phân tích đề xuất bất thường, AI chọn phương án, Marou xuất kho, trợ lý post phiếu nhận sau khi được duyệt.</w:t>
       </w:r>
     </w:p>
     <w:p>
@@ -1551,7 +1551,7 @@
                 <w:sz w:val="20"/>
                 <w:szCs w:val="20"/>
               </w:rPr>
-              <w:t xml:space="preserve">3 đến 6</w:t>
+              <w:t xml:space="preserve">3 đến 6, 9</w:t>
             </w:r>
           </w:p>
         </w:tc>
@@ -1656,7 +1656,7 @@
                 <w:sz w:val="20"/>
                 <w:szCs w:val="20"/>
               </w:rPr>
-              <w:t xml:space="preserve">6, 17, 18</w:t>
+              <w:t xml:space="preserve">6, 18, 19</w:t>
             </w:r>
           </w:p>
         </w:tc>
@@ -1761,7 +1761,7 @@
                 <w:sz w:val="20"/>
                 <w:szCs w:val="20"/>
               </w:rPr>
-              <w:t xml:space="preserve">17, 19</w:t>
+              <w:t xml:space="preserve">18, 20</w:t>
             </w:r>
           </w:p>
         </w:tc>
@@ -1866,7 +1866,7 @@
                 <w:sz w:val="20"/>
                 <w:szCs w:val="20"/>
               </w:rPr>
-              <w:t xml:space="preserve">11 đến 13</w:t>
+              <w:t xml:space="preserve">12 đến 14</w:t>
             </w:r>
           </w:p>
         </w:tc>
@@ -1971,7 +1971,7 @@
                 <w:sz w:val="20"/>
                 <w:szCs w:val="20"/>
               </w:rPr>
-              <w:t xml:space="preserve">9 đến 13</w:t>
+              <w:t xml:space="preserve">10 đến 14</w:t>
             </w:r>
           </w:p>
         </w:tc>
@@ -2076,7 +2076,7 @@
                 <w:sz w:val="20"/>
                 <w:szCs w:val="20"/>
               </w:rPr>
-              <w:t xml:space="preserve">14 đến 16</w:t>
+              <w:t xml:space="preserve">15 đến 17</w:t>
             </w:r>
           </w:p>
         </w:tc>
@@ -2411,7 +2411,7 @@
                 <w:sz w:val="20"/>
                 <w:szCs w:val="20"/>
               </w:rPr>
-              <w:t xml:space="preserve">Trợ lý ghi lại đúng lúc khi bấm Kiểm hàng Marou đã xuất kho ở bước 17.</w:t>
+              <w:t xml:space="preserve">Trợ lý ghi lại đúng lúc khi bấm Kiểm hàng Marou đã xuất kho ở bước 18.</w:t>
             </w:r>
           </w:p>
         </w:tc>
@@ -3793,7 +3793,7 @@
                 <w:sz w:val="20"/>
                 <w:szCs w:val="20"/>
               </w:rPr>
-              <w:t xml:space="preserve">1, 2, 4 đến 6, 8 đến 15, 21</w:t>
+              <w:t xml:space="preserve">1, 2, 4 đến 6, 8 đến 16, 22</w:t>
             </w:r>
           </w:p>
         </w:tc>
@@ -3931,7 +3931,7 @@
                 <w:sz w:val="20"/>
                 <w:szCs w:val="20"/>
               </w:rPr>
-              <w:t xml:space="preserve">3, 20</w:t>
+              <w:t xml:space="preserve">3, 21</w:t>
             </w:r>
           </w:p>
         </w:tc>
@@ -4069,7 +4069,7 @@
                 <w:sz w:val="20"/>
                 <w:szCs w:val="20"/>
               </w:rPr>
-              <w:t xml:space="preserve">7, 16, 17, 19, 20</w:t>
+              <w:t xml:space="preserve">7, 17, 18, 20, 21</w:t>
             </w:r>
           </w:p>
         </w:tc>
@@ -4207,7 +4207,7 @@
                 <w:sz w:val="20"/>
                 <w:szCs w:val="20"/>
               </w:rPr>
-              <w:t xml:space="preserve">18</w:t>
+              <w:t xml:space="preserve">19</w:t>
             </w:r>
           </w:p>
         </w:tc>
@@ -4345,7 +4345,7 @@
                 <w:sz w:val="20"/>
                 <w:szCs w:val="20"/>
               </w:rPr>
-              <w:t xml:space="preserve">22</w:t>
+              <w:t xml:space="preserve">23</w:t>
             </w:r>
           </w:p>
         </w:tc>
@@ -4418,7 +4418,7 @@
           <w:sz w:val="40"/>
           <w:szCs w:val="40"/>
         </w:rPr>
-        <w:t xml:space="preserve">3. Hai mươi hai bước</w:t>
+        <w:t xml:space="preserve">3. Hai mươi ba bước</w:t>
       </w:r>
     </w:p>
     <w:p>
@@ -6658,7 +6658,7 @@
           <w:rFonts w:ascii="Aptos" w:cs="Aptos" w:eastAsia="Aptos" w:hAnsi="Aptos"/>
           <w:color w:val="27343A"/>
         </w:rPr>
-        <w:t xml:space="preserve">Câu này khoảng 12 nghìn token, tức chưa tới nửa cent. Chi phí xem ở bước 22.</w:t>
+        <w:t xml:space="preserve">Câu này khoảng 12 nghìn token, tức chưa tới nửa cent. Chi phí xem ở bước 23.</w:t>
       </w:r>
     </w:p>
     <w:p>
@@ -6698,30 +6698,7 @@
           <w:sz w:val="28"/>
           <w:szCs w:val="28"/>
         </w:rPr>
-        <w:t xml:space="preserve">Phần 3 · Dự báo nối sang bổ sung</w:t>
-      </w:r>
-    </w:p>
-    <w:p>
-      <w:pPr>
-        <w:pStyle w:val="Heading2"/>
-        <w:keepNext/>
-        <w:keepLines/>
-        <w:pBdr>
-          <w:left w:val="single" w:color="4BACC6" w:sz="24" w:space="10"/>
-        </w:pBdr>
-        <w:spacing w:after="120" w:before="280"/>
-        <w:ind w:left="170"/>
-      </w:pPr>
-      <w:r>
-        <w:rPr>
-          <w:rFonts w:ascii="Aptos" w:cs="Aptos" w:eastAsia="Aptos" w:hAnsi="Aptos"/>
-          <w:b/>
-          <w:bCs/>
-          <w:color w:val="27343A"/>
-          <w:sz w:val="28"/>
-          <w:szCs w:val="28"/>
-        </w:rPr>
-        <w:t xml:space="preserve">Bước 9 · Tab Dự báo: ba phương pháp</w:t>
+        <w:t xml:space="preserve">Bước 9 · Đề xuất bổ sung nào bất thường</w:t>
       </w:r>
     </w:p>
     <w:p>
@@ -6860,7 +6837,7 @@
                 <w:sz w:val="20"/>
                 <w:szCs w:val="20"/>
               </w:rPr>
-              <w:t xml:space="preserve">Nút 9. Console mở tab Dự báo.</w:t>
+              <w:t xml:space="preserve">Nút 9. Câu: tổng hợp những đề xuất bổ sung bất thường.</w:t>
             </w:r>
           </w:p>
         </w:tc>
@@ -6893,7 +6870,7 @@
                 <w:sz w:val="20"/>
                 <w:szCs w:val="20"/>
               </w:rPr>
-              <w:t xml:space="preserve">Ba phương pháp, 74 cặp, kỳ kiểm tra 21/08 đến 17/09; biểu đồ theo ngày, 28 ngày tới, ngày sự kiện tô vàng.</w:t>
+              <w:t xml:space="preserve">Sau khoảng 10 giây: danh sách vài dòng LS đang đề xuất mà có dấu hiệu lạ, mỗi dòng nói vì sao (số ngày hết hàng, bán bình quân, số ngày phủ, kho cấp) và việc nên làm. Thẻ ghi Nguồn: model tự dựng chuỗi tra cứu.</w:t>
             </w:r>
           </w:p>
         </w:tc>
@@ -6941,7 +6918,7 @@
           <w:rFonts w:ascii="Aptos" w:cs="Aptos" w:eastAsia="Aptos" w:hAnsi="Aptos"/>
           <w:color w:val="27343A"/>
         </w:rPr>
-        <w:t xml:space="preserve">Độ chính xác đo bằng WAPE trên kỳ kiểm tra 28 ngày, học 84 ngày trước đó. Ngày hết hàng và ngày có sự kiện đã khai bị bỏ khỏi phép đo.</w:t>
+        <w:t xml:space="preserve">Đây là nhóm Khám phá và phân tích insight. Không ai viết sẵn câu trả lời: model gọi tool đọc toàn bộ đề xuất của LS, đọc các cờ do code tính, chọn dòng đáng xem và giải thích.</w:t>
       </w:r>
     </w:p>
     <w:p>
@@ -6958,7 +6935,41 @@
           <w:rFonts w:ascii="Aptos" w:cs="Aptos" w:eastAsia="Aptos" w:hAnsi="Aptos"/>
           <w:color w:val="27343A"/>
         </w:rPr>
-        <w:t xml:space="preserve">Holt-Winters là mô hình thống kê chuỗi thời gian, chưa phải AI. Nói thẳng.</w:t>
+        <w:t xml:space="preserve">Code tính cờ, model diễn giải và ưu tiên. Con số nào model viết cũng phải có trong kết quả tool.</w:t>
+      </w:r>
+    </w:p>
+    <w:p>
+      <w:pPr>
+        <w:pStyle w:val="ListParagraph"/>
+        <w:numPr>
+          <w:ilvl w:val="0"/>
+          <w:numId w:val="2"/>
+        </w:numPr>
+        <w:spacing w:after="80" w:line="276"/>
+      </w:pPr>
+      <w:r>
+        <w:rPr>
+          <w:rFonts w:ascii="Aptos" w:cs="Aptos" w:eastAsia="Aptos" w:hAnsi="Aptos"/>
+          <w:color w:val="27343A"/>
+        </w:rPr>
+        <w:t xml:space="preserve">Câu này trước đây bị hiểu là tổng hợp việc hôm nay; giờ chữ bất thường đi với đề xuất là chuyển cho model.</w:t>
+      </w:r>
+    </w:p>
+    <w:p>
+      <w:pPr>
+        <w:pBdr>
+          <w:left w:val="single" w:color="C89B72" w:sz="36" w:space="10"/>
+        </w:pBdr>
+        <w:shd w:fill="F4EEE8" w:val="clear"/>
+        <w:spacing w:after="200" w:before="120" w:line="276"/>
+        <w:ind w:left="200" w:right="120"/>
+      </w:pPr>
+      <w:r>
+        <w:rPr>
+          <w:rFonts w:ascii="Aptos" w:cs="Aptos" w:eastAsia="Aptos" w:hAnsi="Aptos"/>
+          <w:color w:val="27343A"/>
+        </w:rPr>
+        <w:t xml:space="preserve">Câu trả lời đổi theo dữ liệu, không học thuộc. Nếu model chọn dòng khác với dự kiến thì đọc lý do nó nêu, đó chính là điểm muốn cho khách thấy.</w:t>
       </w:r>
     </w:p>
     <w:p>
@@ -6981,7 +6992,30 @@
           <w:sz w:val="28"/>
           <w:szCs w:val="28"/>
         </w:rPr>
-        <w:t xml:space="preserve">Bước 10 · Dự báo đang sai ở đâu</w:t>
+        <w:t xml:space="preserve">Phần 3 · Dự báo nối sang bổ sung</w:t>
+      </w:r>
+    </w:p>
+    <w:p>
+      <w:pPr>
+        <w:pStyle w:val="Heading2"/>
+        <w:keepNext/>
+        <w:keepLines/>
+        <w:pBdr>
+          <w:left w:val="single" w:color="4BACC6" w:sz="24" w:space="10"/>
+        </w:pBdr>
+        <w:spacing w:after="120" w:before="280"/>
+        <w:ind w:left="170"/>
+      </w:pPr>
+      <w:r>
+        <w:rPr>
+          <w:rFonts w:ascii="Aptos" w:cs="Aptos" w:eastAsia="Aptos" w:hAnsi="Aptos"/>
+          <w:b/>
+          <w:bCs/>
+          <w:color w:val="27343A"/>
+          <w:sz w:val="28"/>
+          <w:szCs w:val="28"/>
+        </w:rPr>
+        <w:t xml:space="preserve">Bước 10 · Tab Dự báo: ba phương pháp</w:t>
       </w:r>
     </w:p>
     <w:p>
@@ -7120,7 +7154,7 @@
                 <w:sz w:val="20"/>
                 <w:szCs w:val="20"/>
               </w:rPr>
-              <w:t xml:space="preserve">Nút 10.</w:t>
+              <w:t xml:space="preserve">Nút 10. Console mở tab Dự báo.</w:t>
             </w:r>
           </w:p>
         </w:tc>
@@ -7153,7 +7187,7 @@
                 <w:sz w:val="20"/>
                 <w:szCs w:val="20"/>
               </w:rPr>
-              <w:t xml:space="preserve">Câu trả lời: Holt-Winters sai 37,0%, trung bình 28 ngày 38,0%, trung bình cùng thứ 37,2%; 20 cặp vượt ngưỡng; sai số theo điểm bán và nhóm hàng.</w:t>
+              <w:t xml:space="preserve">Ba phương pháp, 74 cặp, kỳ kiểm tra 21/08 đến 17/09; biểu đồ theo ngày, 28 ngày tới, ngày sự kiện tô vàng.</w:t>
             </w:r>
           </w:p>
         </w:tc>
@@ -7201,7 +7235,24 @@
           <w:rFonts w:ascii="Aptos" w:cs="Aptos" w:eastAsia="Aptos" w:hAnsi="Aptos"/>
           <w:color w:val="27343A"/>
         </w:rPr>
-        <w:t xml:space="preserve">Sai nhiều nhất là bánh croissant: dự báo cao hơn bán thực tế vì cửa hàng hay hết hàng. Đó lại nối về câu chuyện Out of Stock ở bước 5.</w:t>
+        <w:t xml:space="preserve">Độ chính xác đo bằng WAPE trên kỳ kiểm tra 28 ngày, học 84 ngày trước đó. Ngày hết hàng và ngày có sự kiện đã khai bị bỏ khỏi phép đo.</w:t>
+      </w:r>
+    </w:p>
+    <w:p>
+      <w:pPr>
+        <w:pStyle w:val="ListParagraph"/>
+        <w:numPr>
+          <w:ilvl w:val="0"/>
+          <w:numId w:val="2"/>
+        </w:numPr>
+        <w:spacing w:after="80" w:line="276"/>
+      </w:pPr>
+      <w:r>
+        <w:rPr>
+          <w:rFonts w:ascii="Aptos" w:cs="Aptos" w:eastAsia="Aptos" w:hAnsi="Aptos"/>
+          <w:color w:val="27343A"/>
+        </w:rPr>
+        <w:t xml:space="preserve">Holt-Winters là mô hình thống kê chuỗi thời gian, chưa phải AI. Nói thẳng.</w:t>
       </w:r>
     </w:p>
     <w:p>
@@ -7224,7 +7275,7 @@
           <w:sz w:val="28"/>
           <w:szCs w:val="28"/>
         </w:rPr>
-        <w:t xml:space="preserve">Bước 11 · Choco bowl S0010: 7 ngày tới và CTKM</w:t>
+        <w:t xml:space="preserve">Bước 11 · Dự báo đang sai ở đâu</w:t>
       </w:r>
     </w:p>
     <w:p>
@@ -7396,7 +7447,7 @@
                 <w:sz w:val="20"/>
                 <w:szCs w:val="20"/>
               </w:rPr>
-              <w:t xml:space="preserve">Thẻ Dự báo Choco bowl tại S0010: dự báo 7 ngày tới đã ghi vào Retail Forecast Entry của LS (tổng 25,2), sự kiện KM-CHOCOBOWL-09 cộng 150% từ 23 đến 25/09.</w:t>
+              <w:t xml:space="preserve">Câu trả lời: Holt-Winters sai 37,0%, trung bình 28 ngày 38,0%, trung bình cùng thứ 37,2%; 20 cặp vượt ngưỡng; sai số theo điểm bán và nhóm hàng.</w:t>
             </w:r>
           </w:p>
         </w:tc>
@@ -7444,24 +7495,7 @@
           <w:rFonts w:ascii="Aptos" w:cs="Aptos" w:eastAsia="Aptos" w:hAnsi="Aptos"/>
           <w:color w:val="27343A"/>
         </w:rPr>
-        <w:t xml:space="preserve">Dự báo không nằm ở bảng riêng của NaviWorld. Nó ghi vào bảng chuẩn của LS, nên LS Replenishment dùng được ngay.</w:t>
-      </w:r>
-    </w:p>
-    <w:p>
-      <w:pPr>
-        <w:pStyle w:val="ListParagraph"/>
-        <w:numPr>
-          <w:ilvl w:val="0"/>
-          <w:numId w:val="2"/>
-        </w:numPr>
-        <w:spacing w:after="80" w:line="276"/>
-      </w:pPr>
-      <w:r>
-        <w:rPr>
-          <w:rFonts w:ascii="Aptos" w:cs="Aptos" w:eastAsia="Aptos" w:hAnsi="Aptos"/>
-          <w:color w:val="27343A"/>
-        </w:rPr>
-        <w:t xml:space="preserve">Sự kiện lấy từ Planned Sales Demand của LS, cũng bảng chuẩn.</w:t>
+        <w:t xml:space="preserve">Sai nhiều nhất là bánh croissant: dự báo cao hơn bán thực tế vì cửa hàng hay hết hàng. Đó lại nối về câu chuyện Out of Stock ở bước 5.</w:t>
       </w:r>
     </w:p>
     <w:p>
@@ -7484,7 +7518,7 @@
           <w:sz w:val="28"/>
           <w:szCs w:val="28"/>
         </w:rPr>
-        <w:t xml:space="preserve">Bước 12 · CTKM đang chạy và sắp tới</w:t>
+        <w:t xml:space="preserve">Bước 12 · Choco bowl S0010: 7 ngày tới và CTKM</w:t>
       </w:r>
     </w:p>
     <w:p>
@@ -7656,7 +7690,7 @@
                 <w:sz w:val="20"/>
                 <w:szCs w:val="20"/>
               </w:rPr>
-              <w:t xml:space="preserve">Thẻ CTKM: 3 đang chạy, 2 sắp tới, 2 CTKM thiếu nhu cầu trong LS. Dòng cảnh báo: Choco bowl giảm 15% có Planned Event cho S0001, S0010 nhưng S0002, S0005 chưa có.</w:t>
+              <w:t xml:space="preserve">Thẻ Dự báo Choco bowl tại S0010: dự báo 7 ngày tới đã ghi vào Retail Forecast Entry của LS (tổng 25,2), sự kiện KM-CHOCOBOWL-09 cộng 150% từ 23 đến 25/09.</w:t>
             </w:r>
           </w:p>
         </w:tc>
@@ -7704,7 +7738,7 @@
           <w:rFonts w:ascii="Aptos" w:cs="Aptos" w:eastAsia="Aptos" w:hAnsi="Aptos"/>
           <w:color w:val="27343A"/>
         </w:rPr>
-        <w:t xml:space="preserve">Trợ lý đọc Periodic Discount của LS và soi xem LS đã cộng nhu cầu khuyến mãi cho cửa hàng nào. Thiếu thì nói rõ: LS sẽ tính như ngày thường và cửa hàng đó sẽ thiếu hàng đúng ngày khuyến mãi.</w:t>
+        <w:t xml:space="preserve">Dự báo không nằm ở bảng riêng của NaviWorld. Nó ghi vào bảng chuẩn của LS, nên LS Replenishment dùng được ngay.</w:t>
       </w:r>
     </w:p>
     <w:p>
@@ -7721,7 +7755,7 @@
           <w:rFonts w:ascii="Aptos" w:cs="Aptos" w:eastAsia="Aptos" w:hAnsi="Aptos"/>
           <w:color w:val="27343A"/>
         </w:rPr>
-        <w:t xml:space="preserve">Lỗ hổng này tôi cố ý để lại trong dữ liệu để thấy trợ lý bắt được.</w:t>
+        <w:t xml:space="preserve">Sự kiện lấy từ Planned Sales Demand của LS, cũng bảng chuẩn.</w:t>
       </w:r>
     </w:p>
     <w:p>
@@ -7744,7 +7778,7 @@
           <w:sz w:val="28"/>
           <w:szCs w:val="28"/>
         </w:rPr>
-        <w:t xml:space="preserve">Bước 13 · LS cộng khuyến mãi vào dự báo</w:t>
+        <w:t xml:space="preserve">Bước 13 · CTKM đang chạy và sắp tới</w:t>
       </w:r>
     </w:p>
     <w:p>
@@ -7916,7 +7950,7 @@
                 <w:sz w:val="20"/>
                 <w:szCs w:val="20"/>
               </w:rPr>
-              <w:t xml:space="preserve">Thẻ Vì sao LS đề xuất 2 Choco bowl cho S0010: kiểu Retail Forecast, dự báo 25,17 trong cửa sổ phủ, chỉnh theo Planned Sales Demand thành 35,22, trừ tồn 34.</w:t>
+              <w:t xml:space="preserve">Thẻ CTKM: 3 đang chạy, 2 sắp tới, 2 CTKM thiếu nhu cầu trong LS. Dòng cảnh báo: Choco bowl giảm 15% có Planned Event cho S0001, S0010 nhưng S0002, S0005 chưa có.</w:t>
             </w:r>
           </w:p>
         </w:tc>
@@ -7964,7 +7998,24 @@
           <w:rFonts w:ascii="Aptos" w:cs="Aptos" w:eastAsia="Aptos" w:hAnsi="Aptos"/>
           <w:color w:val="27343A"/>
         </w:rPr>
-        <w:t xml:space="preserve">Đây là chỗ UC1 nối sang UC5: dự báo của NaviWorld, sự kiện của Marou, phép tính của LS, và trợ lý kể lại cả chuỗi bằng một thẻ.</w:t>
+        <w:t xml:space="preserve">Trợ lý đọc Periodic Discount của LS và soi xem LS đã cộng nhu cầu khuyến mãi cho cửa hàng nào. Thiếu thì nói rõ: LS sẽ tính như ngày thường và cửa hàng đó sẽ thiếu hàng đúng ngày khuyến mãi.</w:t>
+      </w:r>
+    </w:p>
+    <w:p>
+      <w:pPr>
+        <w:pStyle w:val="ListParagraph"/>
+        <w:numPr>
+          <w:ilvl w:val="0"/>
+          <w:numId w:val="2"/>
+        </w:numPr>
+        <w:spacing w:after="80" w:line="276"/>
+      </w:pPr>
+      <w:r>
+        <w:rPr>
+          <w:rFonts w:ascii="Aptos" w:cs="Aptos" w:eastAsia="Aptos" w:hAnsi="Aptos"/>
+          <w:color w:val="27343A"/>
+        </w:rPr>
+        <w:t xml:space="preserve">Lỗ hổng này tôi cố ý để lại trong dữ liệu để thấy trợ lý bắt được.</w:t>
       </w:r>
     </w:p>
     <w:p>
@@ -7987,30 +8038,7 @@
           <w:sz w:val="28"/>
           <w:szCs w:val="28"/>
         </w:rPr>
-        <w:t xml:space="preserve">Phần 4 · Một lô cận date, AI chọn phương án</w:t>
-      </w:r>
-    </w:p>
-    <w:p>
-      <w:pPr>
-        <w:pStyle w:val="Heading2"/>
-        <w:keepNext/>
-        <w:keepLines/>
-        <w:pBdr>
-          <w:left w:val="single" w:color="4BACC6" w:sz="24" w:space="10"/>
-        </w:pBdr>
-        <w:spacing w:after="120" w:before="280"/>
-        <w:ind w:left="170"/>
-      </w:pPr>
-      <w:r>
-        <w:rPr>
-          <w:rFonts w:ascii="Aptos" w:cs="Aptos" w:eastAsia="Aptos" w:hAnsi="Aptos"/>
-          <w:b/>
-          <w:bCs/>
-          <w:color w:val="27343A"/>
-          <w:sz w:val="28"/>
-          <w:szCs w:val="28"/>
-        </w:rPr>
-        <w:t xml:space="preserve">Bước 14 · Lô nào sắp hết hạn</w:t>
+        <w:t xml:space="preserve">Bước 14 · LS cộng khuyến mãi vào dự báo</w:t>
       </w:r>
     </w:p>
     <w:p>
@@ -8022,7 +8050,7 @@
           <w:rFonts w:ascii="Aptos" w:cs="Aptos" w:eastAsia="Aptos" w:hAnsi="Aptos"/>
           <w:color w:val="27343A"/>
         </w:rPr>
-        <w:t xml:space="preserve">Vai: trang.sc · Marou</w:t>
+        <w:t xml:space="preserve">Vai: trang.sc · Dakao</w:t>
       </w:r>
     </w:p>
     <w:tbl>
@@ -8149,7 +8177,7 @@
                 <w:sz w:val="20"/>
                 <w:szCs w:val="20"/>
               </w:rPr>
-              <w:t xml:space="preserve">Nút 14. Console đổi về Marou.</w:t>
+              <w:t xml:space="preserve">Nút 14.</w:t>
             </w:r>
           </w:p>
         </w:tc>
@@ -8182,7 +8210,7 @@
                 <w:sz w:val="20"/>
                 <w:szCs w:val="20"/>
               </w:rPr>
-              <w:t xml:space="preserve">36 lô cận date, chia theo địa điểm; 5 thẻ lô giá trị lớn nhất. Thẻ Choco pillar S0010: 470 cái, 26 ngày, bán không kịp; hai nút Đề xuất giảm giá và Phương án xử lý.</w:t>
+              <w:t xml:space="preserve">Thẻ Vì sao LS đề xuất 2 Choco bowl cho S0010: kiểu Retail Forecast, dự báo 25,17 trong cửa sổ phủ, chỉnh theo Planned Sales Demand thành 35,22, trừ tồn 34.</w:t>
             </w:r>
           </w:p>
         </w:tc>
@@ -8230,7 +8258,7 @@
           <w:rFonts w:ascii="Aptos" w:cs="Aptos" w:eastAsia="Aptos" w:hAnsi="Aptos"/>
           <w:color w:val="27343A"/>
         </w:rPr>
-        <w:t xml:space="preserve">Câu này không gọi model, trợ lý đọc thẳng bảng. Điều phối thấy toàn hệ thống; quản lý cửa hàng hỏi cùng câu chỉ thấy cửa hàng mình.</w:t>
+        <w:t xml:space="preserve">Đây là chỗ UC1 nối sang UC5: dự báo của NaviWorld, sự kiện của Marou, phép tính của LS, và trợ lý kể lại cả chuỗi bằng một thẻ.</w:t>
       </w:r>
     </w:p>
     <w:p>
@@ -8253,7 +8281,30 @@
           <w:sz w:val="28"/>
           <w:szCs w:val="28"/>
         </w:rPr>
-        <w:t xml:space="preserve">Bước 15 · Phương án xử lý cho Choco pillar</w:t>
+        <w:t xml:space="preserve">Phần 4 · Một lô cận date, AI chọn phương án</w:t>
+      </w:r>
+    </w:p>
+    <w:p>
+      <w:pPr>
+        <w:pStyle w:val="Heading2"/>
+        <w:keepNext/>
+        <w:keepLines/>
+        <w:pBdr>
+          <w:left w:val="single" w:color="4BACC6" w:sz="24" w:space="10"/>
+        </w:pBdr>
+        <w:spacing w:after="120" w:before="280"/>
+        <w:ind w:left="170"/>
+      </w:pPr>
+      <w:r>
+        <w:rPr>
+          <w:rFonts w:ascii="Aptos" w:cs="Aptos" w:eastAsia="Aptos" w:hAnsi="Aptos"/>
+          <w:b/>
+          <w:bCs/>
+          <w:color w:val="27343A"/>
+          <w:sz w:val="28"/>
+          <w:szCs w:val="28"/>
+        </w:rPr>
+        <w:t xml:space="preserve">Bước 15 · Lô nào sắp hết hạn</w:t>
       </w:r>
     </w:p>
     <w:p>
@@ -8392,7 +8443,7 @@
                 <w:sz w:val="20"/>
                 <w:szCs w:val="20"/>
               </w:rPr>
-              <w:t xml:space="preserve">Nút 15 chỉ hiện hướng dẫn. Trên thẻ Choco pillar bấm Phương án xử lý.</w:t>
+              <w:t xml:space="preserve">Nút 15. Console đổi về Marou.</w:t>
             </w:r>
           </w:p>
         </w:tc>
@@ -8425,7 +8476,7 @@
                 <w:sz w:val="20"/>
                 <w:szCs w:val="20"/>
               </w:rPr>
-              <w:t xml:space="preserve">Sau khoảng 6 giây: thẻ bảng năm phương án kèm giá trị cứu được hoặc mất, lời khuyên của model (chuyển 199 sang S0001 bán nhanh hơn), nút ghi đề xuất.</w:t>
+              <w:t xml:space="preserve">36 lô cận date, chia theo địa điểm; 5 thẻ lô giá trị lớn nhất. Thẻ Choco pillar S0010: 470 cái, 26 ngày, bán không kịp; hai nút Đề xuất giảm giá và Phương án xử lý.</w:t>
             </w:r>
           </w:p>
         </w:tc>
@@ -8473,41 +8524,7 @@
           <w:rFonts w:ascii="Aptos" w:cs="Aptos" w:eastAsia="Aptos" w:hAnsi="Aptos"/>
           <w:color w:val="27343A"/>
         </w:rPr>
-        <w:t xml:space="preserve">Code tính năm phương án: giữ, chuyển, chuyển kèm giảm giá, giảm giá, huỷ. Khả năng nhận của từng cửa hàng bằng bán bình quân nhân ngày còn lại trừ tồn họ đang có.</w:t>
-      </w:r>
-    </w:p>
-    <w:p>
-      <w:pPr>
-        <w:pStyle w:val="ListParagraph"/>
-        <w:numPr>
-          <w:ilvl w:val="0"/>
-          <w:numId w:val="2"/>
-        </w:numPr>
-        <w:spacing w:after="80" w:line="276"/>
-      </w:pPr>
-      <w:r>
-        <w:rPr>
-          <w:rFonts w:ascii="Aptos" w:cs="Aptos" w:eastAsia="Aptos" w:hAnsi="Aptos"/>
-          <w:color w:val="27343A"/>
-        </w:rPr>
-        <w:t xml:space="preserve">Model chọn một và nói vì sao. Nó được chọn khác code, miễn nói được lý do trên số đã có. Khoá phương án phải nằm trong bảng, chữ số phải có trong dữ liệu.</w:t>
-      </w:r>
-    </w:p>
-    <w:p>
-      <w:pPr>
-        <w:pStyle w:val="ListParagraph"/>
-        <w:numPr>
-          <w:ilvl w:val="0"/>
-          <w:numId w:val="2"/>
-        </w:numPr>
-        <w:spacing w:after="80" w:line="276"/>
-      </w:pPr>
-      <w:r>
-        <w:rPr>
-          <w:rFonts w:ascii="Aptos" w:cs="Aptos" w:eastAsia="Aptos" w:hAnsi="Aptos"/>
-          <w:color w:val="27343A"/>
-        </w:rPr>
-        <w:t xml:space="preserve">Đây cũng là UC5 nhìn từ UC2: hàng cận date đi về nơi bán nhanh, không phải huỷ.</w:t>
+        <w:t xml:space="preserve">Câu này không gọi model, trợ lý đọc thẳng bảng. Điều phối thấy toàn hệ thống; quản lý cửa hàng hỏi cùng câu chỉ thấy cửa hàng mình.</w:t>
       </w:r>
     </w:p>
     <w:p>
@@ -8530,7 +8547,7 @@
           <w:sz w:val="28"/>
           <w:szCs w:val="28"/>
         </w:rPr>
-        <w:t xml:space="preserve">Bước 16 · Hùng duyệt chuyển hàng</w:t>
+        <w:t xml:space="preserve">Bước 16 · Phương án xử lý cho Choco pillar</w:t>
       </w:r>
     </w:p>
     <w:p>
@@ -8542,7 +8559,7 @@
           <w:rFonts w:ascii="Aptos" w:cs="Aptos" w:eastAsia="Aptos" w:hAnsi="Aptos"/>
           <w:color w:val="27343A"/>
         </w:rPr>
-        <w:t xml:space="preserve">Vai: hung.dieuphoi · Marou</w:t>
+        <w:t xml:space="preserve">Vai: trang.sc · Marou</w:t>
       </w:r>
     </w:p>
     <w:tbl>
@@ -8669,7 +8686,7 @@
                 <w:sz w:val="20"/>
                 <w:szCs w:val="20"/>
               </w:rPr>
-              <w:t xml:space="preserve">Nút 16 đổi sang Hùng. Bấm Duyệt chuyển hàng trên thẻ đề xuất 199 Choco pillar S0010 sang S0001.</w:t>
+              <w:t xml:space="preserve">Nút 16 chỉ hiện hướng dẫn. Trên thẻ Choco pillar bấm Phương án xử lý.</w:t>
             </w:r>
           </w:p>
         </w:tc>
@@ -8702,7 +8719,7 @@
                 <w:sz w:val="20"/>
                 <w:szCs w:val="20"/>
               </w:rPr>
-              <w:t xml:space="preserve">Thẻ Đã duyệt kèm số Transfer Order và link mở trong BC; cột phải Transfer Order có dòng mới, trạng thái Open.</w:t>
+              <w:t xml:space="preserve">Sau khoảng 6 giây: thẻ bảng năm phương án kèm giá trị cứu được hoặc mất, lời khuyên của model (chuyển 199 sang S0001 bán nhanh hơn), nút ghi đề xuất.</w:t>
             </w:r>
           </w:p>
         </w:tc>
@@ -8750,7 +8767,41 @@
           <w:rFonts w:ascii="Aptos" w:cs="Aptos" w:eastAsia="Aptos" w:hAnsi="Aptos"/>
           <w:color w:val="27343A"/>
         </w:rPr>
-        <w:t xml:space="preserve">Chứng từ mang số đề xuất, kiểm toán truy ngược được từ chứng từ về đề xuất và về dòng dữ liệu gốc.</w:t>
+        <w:t xml:space="preserve">Code tính năm phương án: giữ, chuyển, chuyển kèm giảm giá, giảm giá, huỷ. Khả năng nhận của từng cửa hàng bằng bán bình quân nhân ngày còn lại trừ tồn họ đang có.</w:t>
+      </w:r>
+    </w:p>
+    <w:p>
+      <w:pPr>
+        <w:pStyle w:val="ListParagraph"/>
+        <w:numPr>
+          <w:ilvl w:val="0"/>
+          <w:numId w:val="2"/>
+        </w:numPr>
+        <w:spacing w:after="80" w:line="276"/>
+      </w:pPr>
+      <w:r>
+        <w:rPr>
+          <w:rFonts w:ascii="Aptos" w:cs="Aptos" w:eastAsia="Aptos" w:hAnsi="Aptos"/>
+          <w:color w:val="27343A"/>
+        </w:rPr>
+        <w:t xml:space="preserve">Model chọn một và nói vì sao. Nó được chọn khác code, miễn nói được lý do trên số đã có. Khoá phương án phải nằm trong bảng, chữ số phải có trong dữ liệu.</w:t>
+      </w:r>
+    </w:p>
+    <w:p>
+      <w:pPr>
+        <w:pStyle w:val="ListParagraph"/>
+        <w:numPr>
+          <w:ilvl w:val="0"/>
+          <w:numId w:val="2"/>
+        </w:numPr>
+        <w:spacing w:after="80" w:line="276"/>
+      </w:pPr>
+      <w:r>
+        <w:rPr>
+          <w:rFonts w:ascii="Aptos" w:cs="Aptos" w:eastAsia="Aptos" w:hAnsi="Aptos"/>
+          <w:color w:val="27343A"/>
+        </w:rPr>
+        <w:t xml:space="preserve">Đây cũng là UC5 nhìn từ UC2: hàng cận date đi về nơi bán nhanh, không phải huỷ.</w:t>
       </w:r>
     </w:p>
     <w:p>
@@ -8773,30 +8824,7 @@
           <w:sz w:val="28"/>
           <w:szCs w:val="28"/>
         </w:rPr>
-        <w:t xml:space="preserve">Phần 5 · Liên công ty khép vòng</w:t>
-      </w:r>
-    </w:p>
-    <w:p>
-      <w:pPr>
-        <w:pStyle w:val="Heading2"/>
-        <w:keepNext/>
-        <w:keepLines/>
-        <w:pBdr>
-          <w:left w:val="single" w:color="4BACC6" w:sz="24" w:space="10"/>
-        </w:pBdr>
-        <w:spacing w:after="120" w:before="280"/>
-        <w:ind w:left="170"/>
-      </w:pPr>
-      <w:r>
-        <w:rPr>
-          <w:rFonts w:ascii="Aptos" w:cs="Aptos" w:eastAsia="Aptos" w:hAnsi="Aptos"/>
-          <w:b/>
-          <w:bCs/>
-          <w:color w:val="27343A"/>
-          <w:sz w:val="28"/>
-          <w:szCs w:val="28"/>
-        </w:rPr>
-        <w:t xml:space="preserve">Bước 17 · Kiểm hàng Marou đã xuất kho</w:t>
+        <w:t xml:space="preserve">Bước 17 · Hùng duyệt chuyển hàng</w:t>
       </w:r>
     </w:p>
     <w:p>
@@ -8808,7 +8836,7 @@
           <w:rFonts w:ascii="Aptos" w:cs="Aptos" w:eastAsia="Aptos" w:hAnsi="Aptos"/>
           <w:color w:val="27343A"/>
         </w:rPr>
-        <w:t xml:space="preserve">Vai: hung.dieuphoi · Dakao</w:t>
+        <w:t xml:space="preserve">Vai: hung.dieuphoi · Marou</w:t>
       </w:r>
     </w:p>
     <w:tbl>
@@ -8935,7 +8963,7 @@
                 <w:sz w:val="20"/>
                 <w:szCs w:val="20"/>
               </w:rPr>
-              <w:t xml:space="preserve">Nút 17. Console gọi vòng kiểm đơn liên công ty.</w:t>
+              <w:t xml:space="preserve">Nút 17 đổi sang Hùng. Bấm Duyệt chuyển hàng trên thẻ đề xuất 199 Choco pillar S0010 sang S0001.</w:t>
             </w:r>
           </w:p>
         </w:tc>
@@ -8968,7 +8996,7 @@
                 <w:sz w:val="20"/>
                 <w:szCs w:val="20"/>
               </w:rPr>
-              <w:t xml:space="preserve">Ba thứ: thẻ Marou đã xuất kho đơn HO106202 (82 Choco nuts, giao Cửa hàng Quận 1, phiếu 102045 ngày 17/09); dòng đơn HO106200 xuất từ 16/09 chưa post nhận kèm thẻ Cho trợ lý post nhận hàng; dòng đã gửi email.</w:t>
+              <w:t xml:space="preserve">Thẻ Đã duyệt kèm số Transfer Order và link mở trong BC; cột phải Transfer Order có dòng mới, trạng thái Open.</w:t>
             </w:r>
           </w:p>
         </w:tc>
@@ -9016,41 +9044,7 @@
           <w:rFonts w:ascii="Aptos" w:cs="Aptos" w:eastAsia="Aptos" w:hAnsi="Aptos"/>
           <w:color w:val="27343A"/>
         </w:rPr>
-        <w:t xml:space="preserve">Bên Marou không có gì tự động, người kho post xuất kho như mọi ngày. Bên Dakao, trợ lý đọc sang company bên kia bằng Intercompany và nối hai chứng từ.</w:t>
-      </w:r>
-    </w:p>
-    <w:p>
-      <w:pPr>
-        <w:pStyle w:val="ListParagraph"/>
-        <w:numPr>
-          <w:ilvl w:val="0"/>
-          <w:numId w:val="2"/>
-        </w:numPr>
-        <w:spacing w:after="80" w:line="276"/>
-      </w:pPr>
-      <w:r>
-        <w:rPr>
-          <w:rFonts w:ascii="Aptos" w:cs="Aptos" w:eastAsia="Aptos" w:hAnsi="Aptos"/>
-          <w:color w:val="27343A"/>
-        </w:rPr>
-        <w:t xml:space="preserve">Xuất kho trong ngày thì chỉ báo. Qua ngày hôm sau vẫn chưa post nhận thì nhắc lại và xin phép post thay. Không ai duyệt thì không có gì được post.</w:t>
-      </w:r>
-    </w:p>
-    <w:p>
-      <w:pPr>
-        <w:pStyle w:val="ListParagraph"/>
-        <w:numPr>
-          <w:ilvl w:val="0"/>
-          <w:numId w:val="2"/>
-        </w:numPr>
-        <w:spacing w:after="80" w:line="276"/>
-      </w:pPr>
-      <w:r>
-        <w:rPr>
-          <w:rFonts w:ascii="Aptos" w:cs="Aptos" w:eastAsia="Aptos" w:hAnsi="Aptos"/>
-          <w:color w:val="27343A"/>
-        </w:rPr>
-        <w:t xml:space="preserve">Đây là vấn đề số một trong khảo sát: hàng về mà chứng từ dồn tới cuối tháng, Marou đang thuê người ngoài để post.</w:t>
+        <w:t xml:space="preserve">Chứng từ mang số đề xuất, kiểm toán truy ngược được từ chứng từ về đề xuất và về dòng dữ liệu gốc.</w:t>
       </w:r>
     </w:p>
     <w:p>
@@ -9073,7 +9067,30 @@
           <w:sz w:val="28"/>
           <w:szCs w:val="28"/>
         </w:rPr>
-        <w:t xml:space="preserve">Bước 18 · Lan (S0001) nhận tin chuẩn bị nhận hàng</w:t>
+        <w:t xml:space="preserve">Phần 5 · Liên công ty khép vòng</w:t>
+      </w:r>
+    </w:p>
+    <w:p>
+      <w:pPr>
+        <w:pStyle w:val="Heading2"/>
+        <w:keepNext/>
+        <w:keepLines/>
+        <w:pBdr>
+          <w:left w:val="single" w:color="4BACC6" w:sz="24" w:space="10"/>
+        </w:pBdr>
+        <w:spacing w:after="120" w:before="280"/>
+        <w:ind w:left="170"/>
+      </w:pPr>
+      <w:r>
+        <w:rPr>
+          <w:rFonts w:ascii="Aptos" w:cs="Aptos" w:eastAsia="Aptos" w:hAnsi="Aptos"/>
+          <w:b/>
+          <w:bCs/>
+          <w:color w:val="27343A"/>
+          <w:sz w:val="28"/>
+          <w:szCs w:val="28"/>
+        </w:rPr>
+        <w:t xml:space="preserve">Bước 18 · Kiểm hàng Marou đã xuất kho</w:t>
       </w:r>
     </w:p>
     <w:p>
@@ -9085,7 +9102,7 @@
           <w:rFonts w:ascii="Aptos" w:cs="Aptos" w:eastAsia="Aptos" w:hAnsi="Aptos"/>
           <w:color w:val="27343A"/>
         </w:rPr>
-        <w:t xml:space="preserve">Vai: lan.s0001 · Dakao</w:t>
+        <w:t xml:space="preserve">Vai: hung.dieuphoi · Dakao</w:t>
       </w:r>
     </w:p>
     <w:tbl>
@@ -9212,7 +9229,7 @@
                 <w:sz w:val="20"/>
                 <w:szCs w:val="20"/>
               </w:rPr>
-              <w:t xml:space="preserve">Nút 18 đổi sang Lan.</w:t>
+              <w:t xml:space="preserve">Nút 18. Console gọi vòng kiểm đơn liên công ty.</w:t>
             </w:r>
           </w:p>
         </w:tc>
@@ -9245,7 +9262,7 @@
                 <w:sz w:val="20"/>
                 <w:szCs w:val="20"/>
               </w:rPr>
-              <w:t xml:space="preserve">Hộp thư Lan có thẻ Marou đã xuất kho đơn HO106202: Choco nuts 82, giao Cửa hàng Quận 1, link mở đơn mua. Email cùng nội dung đã tới hộp thư.</w:t>
+              <w:t xml:space="preserve">Ba thứ: thẻ Marou đã xuất kho đơn HO106202 (82 Choco nuts, giao Cửa hàng Quận 1, phiếu 102045 ngày 17/09); dòng đơn HO106200 xuất từ 16/09 chưa post nhận kèm thẻ Cho trợ lý post nhận hàng; dòng đã gửi email.</w:t>
             </w:r>
           </w:p>
         </w:tc>
@@ -9293,7 +9310,7 @@
           <w:rFonts w:ascii="Aptos" w:cs="Aptos" w:eastAsia="Aptos" w:hAnsi="Aptos"/>
           <w:color w:val="27343A"/>
         </w:rPr>
-        <w:t xml:space="preserve">Cửa hàng ở bước 6 đang hết Choco nuts; giờ họ biết 82 cái đang tới, trước khi xe về.</w:t>
+        <w:t xml:space="preserve">Bên Marou không có gì tự động, người kho post xuất kho như mọi ngày. Bên Dakao, trợ lý đọc sang company bên kia bằng Intercompany và nối hai chứng từ.</w:t>
       </w:r>
     </w:p>
     <w:p>
@@ -9310,7 +9327,24 @@
           <w:rFonts w:ascii="Aptos" w:cs="Aptos" w:eastAsia="Aptos" w:hAnsi="Aptos"/>
           <w:color w:val="27343A"/>
         </w:rPr>
-        <w:t xml:space="preserve">Thẻ không có số lô: bán lẻ không quản lý lô, trợ lý không đẩy số lô ra cho cửa hàng.</w:t>
+        <w:t xml:space="preserve">Xuất kho trong ngày thì chỉ báo. Qua ngày hôm sau vẫn chưa post nhận thì nhắc lại và xin phép post thay. Không ai duyệt thì không có gì được post.</w:t>
+      </w:r>
+    </w:p>
+    <w:p>
+      <w:pPr>
+        <w:pStyle w:val="ListParagraph"/>
+        <w:numPr>
+          <w:ilvl w:val="0"/>
+          <w:numId w:val="2"/>
+        </w:numPr>
+        <w:spacing w:after="80" w:line="276"/>
+      </w:pPr>
+      <w:r>
+        <w:rPr>
+          <w:rFonts w:ascii="Aptos" w:cs="Aptos" w:eastAsia="Aptos" w:hAnsi="Aptos"/>
+          <w:color w:val="27343A"/>
+        </w:rPr>
+        <w:t xml:space="preserve">Đây là vấn đề số một trong khảo sát: hàng về mà chứng từ dồn tới cuối tháng, Marou đang thuê người ngoài để post.</w:t>
       </w:r>
     </w:p>
     <w:p>
@@ -9333,7 +9367,7 @@
           <w:sz w:val="28"/>
           <w:szCs w:val="28"/>
         </w:rPr>
-        <w:t xml:space="preserve">Bước 19 · Hùng duyệt cho trợ lý post nhận HO106200</w:t>
+        <w:t xml:space="preserve">Bước 19 · Lan (S0001) nhận tin chuẩn bị nhận hàng</w:t>
       </w:r>
     </w:p>
     <w:p>
@@ -9345,7 +9379,7 @@
           <w:rFonts w:ascii="Aptos" w:cs="Aptos" w:eastAsia="Aptos" w:hAnsi="Aptos"/>
           <w:color w:val="27343A"/>
         </w:rPr>
-        <w:t xml:space="preserve">Vai: hung.dieuphoi · Dakao</w:t>
+        <w:t xml:space="preserve">Vai: lan.s0001 · Dakao</w:t>
       </w:r>
     </w:p>
     <w:tbl>
@@ -9472,7 +9506,7 @@
                 <w:sz w:val="20"/>
                 <w:szCs w:val="20"/>
               </w:rPr>
-              <w:t xml:space="preserve">Nút 19 đổi sang Hùng. Trên thẻ Cho trợ lý post nhận hàng đơn HO106200, bấm Duyệt cho post nhận hàng.</w:t>
+              <w:t xml:space="preserve">Nút 19 đổi sang Lan.</w:t>
             </w:r>
           </w:p>
         </w:tc>
@@ -9505,7 +9539,7 @@
                 <w:sz w:val="20"/>
                 <w:szCs w:val="20"/>
               </w:rPr>
-              <w:t xml:space="preserve">Thẻ Đã post phiếu nhận 1071xx kèm link mở phiếu nhận trong BC. Mở link: phiếu nhận đã post, đúng mặt hàng và số lượng của đơn mua.</w:t>
+              <w:t xml:space="preserve">Hộp thư Lan có thẻ Marou đã xuất kho đơn HO106202: Choco nuts 82, giao Cửa hàng Quận 1, link mở đơn mua. Email cùng nội dung đã tới hộp thư.</w:t>
             </w:r>
           </w:p>
         </w:tc>
@@ -9553,7 +9587,7 @@
           <w:rFonts w:ascii="Aptos" w:cs="Aptos" w:eastAsia="Aptos" w:hAnsi="Aptos"/>
           <w:color w:val="27343A"/>
         </w:rPr>
-        <w:t xml:space="preserve">Đây là loại đề xuất duy nhất mà việc duyệt làm Business Central post thật một chứng từ. Mọi loại khác dừng ở chứng từ nháp.</w:t>
+        <w:t xml:space="preserve">Cửa hàng ở bước 6 đang hết Choco nuts; giờ họ biết 82 cái đang tới, trước khi xe về.</w:t>
       </w:r>
     </w:p>
     <w:p>
@@ -9570,24 +9604,7 @@
           <w:rFonts w:ascii="Aptos" w:cs="Aptos" w:eastAsia="Aptos" w:hAnsi="Aptos"/>
           <w:color w:val="27343A"/>
         </w:rPr>
-        <w:t xml:space="preserve">Quyền post nằm trong permission set riêng, gán tay. Không gán thì bấm Duyệt báo thiếu quyền, không âm thầm bỏ qua.</w:t>
-      </w:r>
-    </w:p>
-    <w:p>
-      <w:pPr>
-        <w:pStyle w:val="ListParagraph"/>
-        <w:numPr>
-          <w:ilvl w:val="0"/>
-          <w:numId w:val="2"/>
-        </w:numPr>
-        <w:spacing w:after="80" w:line="276"/>
-      </w:pPr>
-      <w:r>
-        <w:rPr>
-          <w:rFonts w:ascii="Aptos" w:cs="Aptos" w:eastAsia="Aptos" w:hAnsi="Aptos"/>
-          <w:color w:val="27343A"/>
-        </w:rPr>
-        <w:t xml:space="preserve">Số lượng lấy từ đơn mua. Mặt hàng bên mua có bật quản lý lô thì số lô lấy từ sổ kho bên bán, không bịa; bán lẻ không bật thì phiếu post bình thường.</w:t>
+        <w:t xml:space="preserve">Thẻ không có số lô: bán lẻ không quản lý lô, trợ lý không đẩy số lô ra cho cửa hàng.</w:t>
       </w:r>
     </w:p>
     <w:p>
@@ -9610,7 +9627,7 @@
           <w:sz w:val="28"/>
           <w:szCs w:val="28"/>
         </w:rPr>
-        <w:t xml:space="preserve">Bước 20 · Marou xuất kho đơn Ice cream vừa gửi</w:t>
+        <w:t xml:space="preserve">Bước 20 · Hùng duyệt cho trợ lý post nhận HO106200</w:t>
       </w:r>
     </w:p>
     <w:p>
@@ -9622,7 +9639,7 @@
           <w:rFonts w:ascii="Aptos" w:cs="Aptos" w:eastAsia="Aptos" w:hAnsi="Aptos"/>
           <w:color w:val="27343A"/>
         </w:rPr>
-        <w:t xml:space="preserve">Vai: hung.dieuphoi · Dakao, rồi xem hộp thư Minh</w:t>
+        <w:t xml:space="preserve">Vai: hung.dieuphoi · Dakao</w:t>
       </w:r>
     </w:p>
     <w:tbl>
@@ -9749,7 +9766,7 @@
                 <w:sz w:val="20"/>
                 <w:szCs w:val="20"/>
               </w:rPr>
-              <w:t xml:space="preserve">Nút 20. Nút demo post xuất kho thay người kho Marou cho đơn Ice cream ở bước 7. Sau đó bấm vai Minh.</w:t>
+              <w:t xml:space="preserve">Nút 20 đổi sang Hùng. Trên thẻ Cho trợ lý post nhận hàng đơn HO106200, bấm Duyệt cho post nhận hàng.</w:t>
             </w:r>
           </w:p>
         </w:tc>
@@ -9782,7 +9799,7 @@
                 <w:sz w:val="20"/>
                 <w:szCs w:val="20"/>
               </w:rPr>
-              <w:t xml:space="preserve">Trợ lý báo Marou đã xuất kho, số phiếu giao hàng. Hộp thư Minh có thẻ chuẩn bị nhận 12 Ice cream.</w:t>
+              <w:t xml:space="preserve">Thẻ Đã post phiếu nhận 1071xx kèm link mở phiếu nhận trong BC. Mở link: phiếu nhận đã post, đúng mặt hàng và số lượng của đơn mua.</w:t>
             </w:r>
           </w:p>
         </w:tc>
@@ -9830,7 +9847,7 @@
           <w:rFonts w:ascii="Aptos" w:cs="Aptos" w:eastAsia="Aptos" w:hAnsi="Aptos"/>
           <w:color w:val="27343A"/>
         </w:rPr>
-        <w:t xml:space="preserve">Vòng khép lại: 17 phút trước Minh gõ một câu là sắp hết Ice cream; giờ hàng đã rời kho Marou và Minh được báo trước.</w:t>
+        <w:t xml:space="preserve">Đây là loại đề xuất duy nhất mà việc duyệt làm Business Central post thật một chứng từ. Mọi loại khác dừng ở chứng từ nháp.</w:t>
       </w:r>
     </w:p>
     <w:p>
@@ -9847,24 +9864,24 @@
           <w:rFonts w:ascii="Aptos" w:cs="Aptos" w:eastAsia="Aptos" w:hAnsi="Aptos"/>
           <w:color w:val="27343A"/>
         </w:rPr>
-        <w:t xml:space="preserve">Nút này là công cụ demo, không thuộc sản phẩm. Trên hệ thật đó là người kho Marou bấm Post Shipment.</w:t>
-      </w:r>
-    </w:p>
-    <w:p>
-      <w:pPr>
-        <w:pBdr>
-          <w:left w:val="single" w:color="C89B72" w:sz="36" w:space="10"/>
-        </w:pBdr>
-        <w:shd w:fill="F4EEE8" w:val="clear"/>
-        <w:spacing w:after="200" w:before="120" w:line="276"/>
-        <w:ind w:left="200" w:right="120"/>
-      </w:pPr>
-      <w:r>
-        <w:rPr>
-          <w:rFonts w:ascii="Aptos" w:cs="Aptos" w:eastAsia="Aptos" w:hAnsi="Aptos"/>
-          <w:color w:val="27343A"/>
-        </w:rPr>
-        <w:t xml:space="preserve">Muốn diễn tiếp cảnh hôm sau: bấm +24 giờ trong khay demo rồi bấm lại nút 17, trợ lý nhắc và ghi đề xuất post nhận cho đơn Ice cream. Chỉ làm sau khi xong bước 18, vì +24 giờ làm HO106202 thành quá ngày.</w:t>
+        <w:t xml:space="preserve">Quyền post nằm trong permission set riêng, gán tay. Không gán thì bấm Duyệt báo thiếu quyền, không âm thầm bỏ qua.</w:t>
+      </w:r>
+    </w:p>
+    <w:p>
+      <w:pPr>
+        <w:pStyle w:val="ListParagraph"/>
+        <w:numPr>
+          <w:ilvl w:val="0"/>
+          <w:numId w:val="2"/>
+        </w:numPr>
+        <w:spacing w:after="80" w:line="276"/>
+      </w:pPr>
+      <w:r>
+        <w:rPr>
+          <w:rFonts w:ascii="Aptos" w:cs="Aptos" w:eastAsia="Aptos" w:hAnsi="Aptos"/>
+          <w:color w:val="27343A"/>
+        </w:rPr>
+        <w:t xml:space="preserve">Số lượng lấy từ đơn mua. Mặt hàng bên mua có bật quản lý lô thì số lô lấy từ sổ kho bên bán, không bịa; bán lẻ không bật thì phiếu post bình thường.</w:t>
       </w:r>
     </w:p>
     <w:p>
@@ -9887,30 +9904,7 @@
           <w:sz w:val="28"/>
           <w:szCs w:val="28"/>
         </w:rPr>
-        <w:t xml:space="preserve">Phần 6 · Bất thường và chi phí</w:t>
-      </w:r>
-    </w:p>
-    <w:p>
-      <w:pPr>
-        <w:pStyle w:val="Heading2"/>
-        <w:keepNext/>
-        <w:keepLines/>
-        <w:pBdr>
-          <w:left w:val="single" w:color="4BACC6" w:sz="24" w:space="10"/>
-        </w:pBdr>
-        <w:spacing w:after="120" w:before="280"/>
-        <w:ind w:left="170"/>
-      </w:pPr>
-      <w:r>
-        <w:rPr>
-          <w:rFonts w:ascii="Aptos" w:cs="Aptos" w:eastAsia="Aptos" w:hAnsi="Aptos"/>
-          <w:b/>
-          <w:bCs/>
-          <w:color w:val="27343A"/>
-          <w:sz w:val="28"/>
-          <w:szCs w:val="28"/>
-        </w:rPr>
-        <w:t xml:space="preserve">Bước 21 · Có gì bất thường 28 ngày qua</w:t>
+        <w:t xml:space="preserve">Bước 21 · Marou xuất kho đơn Ice cream vừa gửi</w:t>
       </w:r>
     </w:p>
     <w:p>
@@ -9922,7 +9916,7 @@
           <w:rFonts w:ascii="Aptos" w:cs="Aptos" w:eastAsia="Aptos" w:hAnsi="Aptos"/>
           <w:color w:val="27343A"/>
         </w:rPr>
-        <w:t xml:space="preserve">Vai: trang.sc · Dakao</w:t>
+        <w:t xml:space="preserve">Vai: hung.dieuphoi · Dakao, rồi xem hộp thư Minh</w:t>
       </w:r>
     </w:p>
     <w:tbl>
@@ -10049,7 +10043,7 @@
                 <w:sz w:val="20"/>
                 <w:szCs w:val="20"/>
               </w:rPr>
-              <w:t xml:space="preserve">Nút 21.</w:t>
+              <w:t xml:space="preserve">Nút 21. Nút demo post xuất kho thay người kho Marou cho đơn Ice cream ở bước 7. Sau đó bấm vai Minh.</w:t>
             </w:r>
           </w:p>
         </w:tc>
@@ -10082,7 +10076,7 @@
                 <w:sz w:val="20"/>
                 <w:szCs w:val="20"/>
               </w:rPr>
-              <w:t xml:space="preserve">Thẻ 16 tín hiệu bất thường: 15 nhận hàng hạn quá ngắn, 1 hết hàng lặp lại; model ưu tiên ba tín hiệu ở S0001 và viết nhận xét; Người soạn AI.</w:t>
+              <w:t xml:space="preserve">Trợ lý báo Marou đã xuất kho, số phiếu giao hàng. Hộp thư Minh có thẻ chuẩn bị nhận 12 Ice cream.</w:t>
             </w:r>
           </w:p>
         </w:tc>
@@ -10130,7 +10124,7 @@
           <w:rFonts w:ascii="Aptos" w:cs="Aptos" w:eastAsia="Aptos" w:hAnsi="Aptos"/>
           <w:color w:val="27343A"/>
         </w:rPr>
-        <w:t xml:space="preserve">Năm tín hiệu code quét: bán sau hạn, nhận hàng hạn ngắn bất thường, huỷ tăng gấp đôi, tồn không bán, hết hàng lặp lại. Model chọn tối đa ba và giải thích; mã tín hiệu phải nằm trong danh sách.</w:t>
+        <w:t xml:space="preserve">Vòng khép lại: 20 phút trước Minh gõ một câu là sắp hết Ice cream; giờ hàng đã rời kho Marou và Minh được báo trước.</w:t>
       </w:r>
     </w:p>
     <w:p>
@@ -10147,7 +10141,24 @@
           <w:rFonts w:ascii="Aptos" w:cs="Aptos" w:eastAsia="Aptos" w:hAnsi="Aptos"/>
           <w:color w:val="27343A"/>
         </w:rPr>
-        <w:t xml:space="preserve">Lệch kiểm kê chưa đo được vì bộ dữ liệu không có phiếu kiểm kê. Nói thẳng chỗ này.</w:t>
+        <w:t xml:space="preserve">Nút này là công cụ demo, không thuộc sản phẩm. Trên hệ thật đó là người kho Marou bấm Post Shipment.</w:t>
+      </w:r>
+    </w:p>
+    <w:p>
+      <w:pPr>
+        <w:pBdr>
+          <w:left w:val="single" w:color="C89B72" w:sz="36" w:space="10"/>
+        </w:pBdr>
+        <w:shd w:fill="F4EEE8" w:val="clear"/>
+        <w:spacing w:after="200" w:before="120" w:line="276"/>
+        <w:ind w:left="200" w:right="120"/>
+      </w:pPr>
+      <w:r>
+        <w:rPr>
+          <w:rFonts w:ascii="Aptos" w:cs="Aptos" w:eastAsia="Aptos" w:hAnsi="Aptos"/>
+          <w:color w:val="27343A"/>
+        </w:rPr>
+        <w:t xml:space="preserve">Muốn diễn tiếp cảnh hôm sau: bấm +24 giờ trong khay demo rồi bấm lại nút 18, trợ lý nhắc và ghi đề xuất post nhận cho đơn Ice cream. Chỉ làm sau khi xong bước 19, vì +24 giờ làm HO106202 thành quá ngày.</w:t>
       </w:r>
     </w:p>
     <w:p>
@@ -10170,7 +10181,30 @@
           <w:sz w:val="28"/>
           <w:szCs w:val="28"/>
         </w:rPr>
-        <w:t xml:space="preserve">Bước 22 · Chi phí AI đo được</w:t>
+        <w:t xml:space="preserve">Phần 6 · Bất thường và chi phí</w:t>
+      </w:r>
+    </w:p>
+    <w:p>
+      <w:pPr>
+        <w:pStyle w:val="Heading2"/>
+        <w:keepNext/>
+        <w:keepLines/>
+        <w:pBdr>
+          <w:left w:val="single" w:color="4BACC6" w:sz="24" w:space="10"/>
+        </w:pBdr>
+        <w:spacing w:after="120" w:before="280"/>
+        <w:ind w:left="170"/>
+      </w:pPr>
+      <w:r>
+        <w:rPr>
+          <w:rFonts w:ascii="Aptos" w:cs="Aptos" w:eastAsia="Aptos" w:hAnsi="Aptos"/>
+          <w:b/>
+          <w:bCs/>
+          <w:color w:val="27343A"/>
+          <w:sz w:val="28"/>
+          <w:szCs w:val="28"/>
+        </w:rPr>
+        <w:t xml:space="preserve">Bước 22 · Có gì bất thường 28 ngày qua</w:t>
       </w:r>
     </w:p>
     <w:p>
@@ -10182,7 +10216,7 @@
           <w:rFonts w:ascii="Aptos" w:cs="Aptos" w:eastAsia="Aptos" w:hAnsi="Aptos"/>
           <w:color w:val="27343A"/>
         </w:rPr>
-        <w:t xml:space="preserve">Vai: dung.admin · Marou</w:t>
+        <w:t xml:space="preserve">Vai: trang.sc · Dakao</w:t>
       </w:r>
     </w:p>
     <w:tbl>
@@ -10309,7 +10343,267 @@
                 <w:sz w:val="20"/>
                 <w:szCs w:val="20"/>
               </w:rPr>
-              <w:t xml:space="preserve">Nút 22. Console mở tab Cài đặt AI.</w:t>
+              <w:t xml:space="preserve">Nút 22.</w:t>
+            </w:r>
+          </w:p>
+        </w:tc>
+        <w:tc>
+          <w:tcPr>
+            <w:tcW w:type="dxa" w:w="5301"/>
+            <w:tcBorders>
+              <w:top w:val="single" w:color="A9D5E2" w:sz="4"/>
+              <w:left w:val="single" w:color="A9D5E2" w:sz="4"/>
+              <w:bottom w:val="single" w:color="A9D5E2" w:sz="4"/>
+              <w:right w:val="single" w:color="A9D5E2" w:sz="4"/>
+            </w:tcBorders>
+            <w:tcMar>
+              <w:top w:type="dxa" w:w="113"/>
+              <w:left w:type="dxa" w:w="113"/>
+              <w:bottom w:type="dxa" w:w="113"/>
+              <w:right w:type="dxa" w:w="113"/>
+            </w:tcMar>
+          </w:tcPr>
+          <w:p>
+            <w:pPr>
+              <w:spacing w:after="0" w:line="252"/>
+            </w:pPr>
+            <w:r>
+              <w:rPr>
+                <w:rFonts w:ascii="Aptos" w:cs="Aptos" w:eastAsia="Aptos" w:hAnsi="Aptos"/>
+                <w:b w:val="false"/>
+                <w:bCs w:val="false"/>
+                <w:color w:val="27343A"/>
+                <w:sz w:val="20"/>
+                <w:szCs w:val="20"/>
+              </w:rPr>
+              <w:t xml:space="preserve">Thẻ 16 tín hiệu bất thường: 15 nhận hàng hạn quá ngắn, 1 hết hàng lặp lại; model ưu tiên ba tín hiệu ở S0001 và viết nhận xét; Người soạn AI.</w:t>
+            </w:r>
+          </w:p>
+        </w:tc>
+      </w:tr>
+    </w:tbl>
+    <w:p>
+      <w:pPr>
+        <w:spacing w:after="120"/>
+      </w:pPr>
+    </w:p>
+    <w:p>
+      <w:pPr>
+        <w:pStyle w:val="Heading3"/>
+        <w:keepNext/>
+        <w:keepLines/>
+        <w:pBdr>
+          <w:left w:val="single" w:color="4BACC6" w:sz="24" w:space="10"/>
+        </w:pBdr>
+        <w:spacing w:after="100" w:before="200"/>
+        <w:ind w:left="170"/>
+      </w:pPr>
+      <w:r>
+        <w:rPr>
+          <w:rFonts w:ascii="Aptos" w:cs="Aptos" w:eastAsia="Aptos" w:hAnsi="Aptos"/>
+          <w:b/>
+          <w:bCs/>
+          <w:color w:val="27343A"/>
+          <w:sz w:val="24"/>
+          <w:szCs w:val="24"/>
+        </w:rPr>
+        <w:t xml:space="preserve">Nói gì</w:t>
+      </w:r>
+    </w:p>
+    <w:p>
+      <w:pPr>
+        <w:pStyle w:val="ListParagraph"/>
+        <w:numPr>
+          <w:ilvl w:val="0"/>
+          <w:numId w:val="2"/>
+        </w:numPr>
+        <w:spacing w:after="80" w:line="276"/>
+      </w:pPr>
+      <w:r>
+        <w:rPr>
+          <w:rFonts w:ascii="Aptos" w:cs="Aptos" w:eastAsia="Aptos" w:hAnsi="Aptos"/>
+          <w:color w:val="27343A"/>
+        </w:rPr>
+        <w:t xml:space="preserve">Năm tín hiệu code quét: bán sau hạn, nhận hàng hạn ngắn bất thường, huỷ tăng gấp đôi, tồn không bán, hết hàng lặp lại. Model chọn tối đa ba và giải thích; mã tín hiệu phải nằm trong danh sách.</w:t>
+      </w:r>
+    </w:p>
+    <w:p>
+      <w:pPr>
+        <w:pStyle w:val="ListParagraph"/>
+        <w:numPr>
+          <w:ilvl w:val="0"/>
+          <w:numId w:val="2"/>
+        </w:numPr>
+        <w:spacing w:after="80" w:line="276"/>
+      </w:pPr>
+      <w:r>
+        <w:rPr>
+          <w:rFonts w:ascii="Aptos" w:cs="Aptos" w:eastAsia="Aptos" w:hAnsi="Aptos"/>
+          <w:color w:val="27343A"/>
+        </w:rPr>
+        <w:t xml:space="preserve">Lệch kiểm kê chưa đo được vì bộ dữ liệu không có phiếu kiểm kê. Nói thẳng chỗ này.</w:t>
+      </w:r>
+    </w:p>
+    <w:p>
+      <w:pPr>
+        <w:pStyle w:val="Heading2"/>
+        <w:keepNext/>
+        <w:keepLines/>
+        <w:pBdr>
+          <w:left w:val="single" w:color="4BACC6" w:sz="24" w:space="10"/>
+        </w:pBdr>
+        <w:spacing w:after="120" w:before="280"/>
+        <w:ind w:left="170"/>
+      </w:pPr>
+      <w:r>
+        <w:rPr>
+          <w:rFonts w:ascii="Aptos" w:cs="Aptos" w:eastAsia="Aptos" w:hAnsi="Aptos"/>
+          <w:b/>
+          <w:bCs/>
+          <w:color w:val="27343A"/>
+          <w:sz w:val="28"/>
+          <w:szCs w:val="28"/>
+        </w:rPr>
+        <w:t xml:space="preserve">Bước 23 · Chi phí AI đo được</w:t>
+      </w:r>
+    </w:p>
+    <w:p>
+      <w:pPr>
+        <w:spacing w:after="120" w:line="276"/>
+      </w:pPr>
+      <w:r>
+        <w:rPr>
+          <w:rFonts w:ascii="Aptos" w:cs="Aptos" w:eastAsia="Aptos" w:hAnsi="Aptos"/>
+          <w:color w:val="27343A"/>
+        </w:rPr>
+        <w:t xml:space="preserve">Vai: dung.admin · Marou</w:t>
+      </w:r>
+    </w:p>
+    <w:tbl>
+      <w:tblPr>
+        <w:tblW w:type="dxa" w:w="9638"/>
+        <w:tblBorders>
+          <w:top w:val="single" w:color="auto" w:sz="4"/>
+          <w:left w:val="single" w:color="auto" w:sz="4"/>
+          <w:bottom w:val="single" w:color="auto" w:sz="4"/>
+          <w:right w:val="single" w:color="auto" w:sz="4"/>
+          <w:insideH w:val="single" w:color="auto" w:sz="4"/>
+          <w:insideV w:val="single" w:color="auto" w:sz="4"/>
+        </w:tblBorders>
+      </w:tblPr>
+      <w:tblGrid>
+        <w:gridCol w:w="4337"/>
+        <w:gridCol w:w="5301"/>
+      </w:tblGrid>
+      <w:tr>
+        <w:trPr>
+          <w:cantSplit w:val="false"/>
+          <w:tblHeader/>
+        </w:trPr>
+        <w:tc>
+          <w:tcPr>
+            <w:tcW w:type="dxa" w:w="4337"/>
+            <w:tcBorders>
+              <w:top w:val="single" w:color="A9D5E2" w:sz="4"/>
+              <w:left w:val="single" w:color="A9D5E2" w:sz="4"/>
+              <w:bottom w:val="single" w:color="A9D5E2" w:sz="4"/>
+              <w:right w:val="single" w:color="A9D5E2" w:sz="4"/>
+            </w:tcBorders>
+            <w:shd w:fill="4BACC6" w:val="clear"/>
+            <w:tcMar>
+              <w:top w:type="dxa" w:w="113"/>
+              <w:left w:type="dxa" w:w="113"/>
+              <w:bottom w:type="dxa" w:w="113"/>
+              <w:right w:type="dxa" w:w="113"/>
+            </w:tcMar>
+          </w:tcPr>
+          <w:p>
+            <w:pPr>
+              <w:spacing w:after="0" w:line="252"/>
+            </w:pPr>
+            <w:r>
+              <w:rPr>
+                <w:rFonts w:ascii="Aptos" w:cs="Aptos" w:eastAsia="Aptos" w:hAnsi="Aptos"/>
+                <w:b/>
+                <w:bCs/>
+                <w:color w:val="27343A"/>
+                <w:sz w:val="20"/>
+                <w:szCs w:val="20"/>
+              </w:rPr>
+              <w:t xml:space="preserve">Bấm gì</w:t>
+            </w:r>
+          </w:p>
+        </w:tc>
+        <w:tc>
+          <w:tcPr>
+            <w:tcW w:type="dxa" w:w="5301"/>
+            <w:tcBorders>
+              <w:top w:val="single" w:color="A9D5E2" w:sz="4"/>
+              <w:left w:val="single" w:color="A9D5E2" w:sz="4"/>
+              <w:bottom w:val="single" w:color="A9D5E2" w:sz="4"/>
+              <w:right w:val="single" w:color="A9D5E2" w:sz="4"/>
+            </w:tcBorders>
+            <w:shd w:fill="4BACC6" w:val="clear"/>
+            <w:tcMar>
+              <w:top w:type="dxa" w:w="113"/>
+              <w:left w:type="dxa" w:w="113"/>
+              <w:bottom w:type="dxa" w:w="113"/>
+              <w:right w:type="dxa" w:w="113"/>
+            </w:tcMar>
+          </w:tcPr>
+          <w:p>
+            <w:pPr>
+              <w:spacing w:after="0" w:line="252"/>
+            </w:pPr>
+            <w:r>
+              <w:rPr>
+                <w:rFonts w:ascii="Aptos" w:cs="Aptos" w:eastAsia="Aptos" w:hAnsi="Aptos"/>
+                <w:b/>
+                <w:bCs/>
+                <w:color w:val="27343A"/>
+                <w:sz w:val="20"/>
+                <w:szCs w:val="20"/>
+              </w:rPr>
+              <w:t xml:space="preserve">Khách thấy gì</w:t>
+            </w:r>
+          </w:p>
+        </w:tc>
+      </w:tr>
+      <w:tr>
+        <w:trPr>
+          <w:cantSplit/>
+          <w:tblHeader w:val="false"/>
+        </w:trPr>
+        <w:tc>
+          <w:tcPr>
+            <w:tcW w:type="dxa" w:w="4337"/>
+            <w:tcBorders>
+              <w:top w:val="single" w:color="A9D5E2" w:sz="4"/>
+              <w:left w:val="single" w:color="A9D5E2" w:sz="4"/>
+              <w:bottom w:val="single" w:color="A9D5E2" w:sz="4"/>
+              <w:right w:val="single" w:color="A9D5E2" w:sz="4"/>
+            </w:tcBorders>
+            <w:tcMar>
+              <w:top w:type="dxa" w:w="113"/>
+              <w:left w:type="dxa" w:w="113"/>
+              <w:bottom w:type="dxa" w:w="113"/>
+              <w:right w:type="dxa" w:w="113"/>
+            </w:tcMar>
+          </w:tcPr>
+          <w:p>
+            <w:pPr>
+              <w:spacing w:after="0" w:line="252"/>
+            </w:pPr>
+            <w:r>
+              <w:rPr>
+                <w:rFonts w:ascii="Aptos" w:cs="Aptos" w:eastAsia="Aptos" w:hAnsi="Aptos"/>
+                <w:b w:val="false"/>
+                <w:bCs w:val="false"/>
+                <w:color w:val="27343A"/>
+                <w:sz w:val="20"/>
+                <w:szCs w:val="20"/>
+              </w:rPr>
+              <w:t xml:space="preserve">Nút 23. Console mở tab Cài đặt AI.</w:t>
             </w:r>
           </w:p>
         </w:tc>
@@ -10595,7 +10889,79 @@
                 <w:sz w:val="20"/>
                 <w:szCs w:val="20"/>
               </w:rPr>
-              <w:t xml:space="preserve">Trong buổi này AI ở bốn chỗ: brief chọn việc (bước 2), câu hỏi mở tự dựng chuỗi tra cứu (8), chọn phương án cho lô cận date (15), đọc tín hiệu bất thường (21). Còn lại là LS và Business Central tính, trợ lý đọc và giải thích. Tính năng không thuộc bốn nhóm tóm tắt, tạo sinh, phân tích, tự động hoá thì chúng tôi gọi đúng tên là tính năng ứng dụng.</w:t>
+              <w:t xml:space="preserve">Trong buổi này AI ở năm chỗ: brief chọn việc (bước 2), câu hỏi mở tự dựng chuỗi tra cứu (8), phân tích đề xuất bổ sung bất thường (9), chọn phương án cho lô cận date (16), đọc tín hiệu bất thường (22). Còn lại là LS và Business Central tính, trợ lý đọc và giải thích. Tính năng không thuộc bốn nhóm tóm tắt, tạo sinh, phân tích, tự động hoá thì chúng tôi gọi đúng tên là tính năng ứng dụng.</w:t>
+            </w:r>
+          </w:p>
+        </w:tc>
+      </w:tr>
+      <w:tr>
+        <w:trPr>
+          <w:cantSplit/>
+          <w:tblHeader w:val="false"/>
+        </w:trPr>
+        <w:tc>
+          <w:tcPr>
+            <w:tcW w:type="dxa" w:w="3373"/>
+            <w:tcBorders>
+              <w:top w:val="single" w:color="A9D5E2" w:sz="4"/>
+              <w:left w:val="single" w:color="A9D5E2" w:sz="4"/>
+              <w:bottom w:val="single" w:color="A9D5E2" w:sz="4"/>
+              <w:right w:val="single" w:color="A9D5E2" w:sz="4"/>
+            </w:tcBorders>
+            <w:tcMar>
+              <w:top w:type="dxa" w:w="113"/>
+              <w:left w:type="dxa" w:w="113"/>
+              <w:bottom w:type="dxa" w:w="113"/>
+              <w:right w:type="dxa" w:w="113"/>
+            </w:tcMar>
+          </w:tcPr>
+          <w:p>
+            <w:pPr>
+              <w:spacing w:after="0" w:line="252"/>
+            </w:pPr>
+            <w:r>
+              <w:rPr>
+                <w:rFonts w:ascii="Aptos" w:cs="Aptos" w:eastAsia="Aptos" w:hAnsi="Aptos"/>
+                <w:b w:val="false"/>
+                <w:bCs w:val="false"/>
+                <w:color w:val="27343A"/>
+                <w:sz w:val="20"/>
+                <w:szCs w:val="20"/>
+              </w:rPr>
+              <w:t xml:space="preserve">Khách gõ một câu không có trong kịch bản thì sao?</w:t>
+            </w:r>
+          </w:p>
+        </w:tc>
+        <w:tc>
+          <w:tcPr>
+            <w:tcW w:type="dxa" w:w="6265"/>
+            <w:tcBorders>
+              <w:top w:val="single" w:color="A9D5E2" w:sz="4"/>
+              <w:left w:val="single" w:color="A9D5E2" w:sz="4"/>
+              <w:bottom w:val="single" w:color="A9D5E2" w:sz="4"/>
+              <w:right w:val="single" w:color="A9D5E2" w:sz="4"/>
+            </w:tcBorders>
+            <w:tcMar>
+              <w:top w:type="dxa" w:w="113"/>
+              <w:left w:type="dxa" w:w="113"/>
+              <w:bottom w:type="dxa" w:w="113"/>
+              <w:right w:type="dxa" w:w="113"/>
+            </w:tcMar>
+          </w:tcPr>
+          <w:p>
+            <w:pPr>
+              <w:spacing w:after="0" w:line="252"/>
+            </w:pPr>
+            <w:r>
+              <w:rPr>
+                <w:rFonts w:ascii="Aptos" w:cs="Aptos" w:eastAsia="Aptos" w:hAnsi="Aptos"/>
+                <w:b w:val="false"/>
+                <w:bCs w:val="false"/>
+                <w:color w:val="27343A"/>
+                <w:sz w:val="20"/>
+                <w:szCs w:val="20"/>
+              </w:rPr>
+              <w:t xml:space="preserve">Cứ để khách gõ. Câu nào rule đọc chắc thì trả lời bằng dữ liệu, không tốn model; câu nào rule không giải được thì chuyển cho model tự chọn tool (tồn theo địa điểm, sức khỏe tồn kho theo tầng, LS đề xuất bổ sung, tốc độ bán, lô, khuyến mãi) rồi tổng hợp, thẻ có nút xem từng bước đã tra. Ví dụ đã chạy: “có những mặt hàng nào sắp hết hàng” từ quản lý cửa hàng.</w:t>
             </w:r>
           </w:p>
         </w:tc>
@@ -12210,7 +12576,7 @@
                 <w:sz w:val="20"/>
                 <w:szCs w:val="20"/>
               </w:rPr>
-              <w:t xml:space="preserve">Bước 17 không thấy thẻ HO106202</w:t>
+              <w:t xml:space="preserve">Bước 18 không thấy thẻ HO106202</w:t>
             </w:r>
           </w:p>
         </w:tc>
@@ -12426,7 +12792,7 @@
           <w:rFonts w:ascii="Aptos" w:cs="Aptos" w:eastAsia="Aptos" w:hAnsi="Aptos"/>
           <w:color w:val="27343A"/>
         </w:rPr>
-        <w:t xml:space="preserve">Phương án cuối cùng nếu mạng hỏng: đổi dải nguồn sang dữ liệu mô phỏng. Bộ mô phỏng neo ngày 18/09 và LS trong đó là công thức cũ, nên các bước 4, 5, 6, 13 (nhật ký tính LS) không có; các bước còn lại diễn được nhưng số khác. Nói rõ với khách là đang ở bộ mô phỏng.</w:t>
+        <w:t xml:space="preserve">Phương án cuối cùng nếu mạng hỏng: đổi dải nguồn sang dữ liệu mô phỏng. Bộ mô phỏng neo ngày 18/09 và LS trong đó là công thức cũ, nên các bước 4, 5, 6, 9, 14 (nhật ký tính LS) không có; các bước còn lại diễn được nhưng số khác. Nói rõ với khách là đang ở bộ mô phỏng.</w:t>
       </w:r>
     </w:p>
     <w:sectPr>

</xml_diff>

<commit_message>
Doi vai khong con doi BC: /api/state tra ban chup, lam moi nen, lam nong luc khoi dong; nhan AI viet / cau mau / doc tu du lieu duoi moi cau tra loi; co bat thuong viet tieng Viet; chong ghi trung de xuat khi bao sap het hai lan
</commit_message>
<xml_diff>
--- a/docs/13 Marou POC - Demo script (noi bo).docx
+++ b/docs/13 Marou POC - Demo script (noi bo).docx
@@ -3400,7 +3400,7 @@
                 <w:sz w:val="20"/>
                 <w:szCs w:val="20"/>
               </w:rPr>
-              <w:t xml:space="preserve">Không bấm Reset, không bấm +24 giờ</w:t>
+              <w:t xml:space="preserve">Bấm Reset MỘT lần lúc bắt đầu, rồi thôi</w:t>
             </w:r>
           </w:p>
         </w:tc>
@@ -3433,7 +3433,7 @@
                 <w:sz w:val="20"/>
                 <w:szCs w:val="20"/>
               </w:rPr>
-              <w:t xml:space="preserve">Khay Điều khiển demo ở góc dưới phải</w:t>
+              <w:t xml:space="preserve">Khay Điều khiển demo ở góc dưới phải, nút Reset</w:t>
             </w:r>
           </w:p>
         </w:tc>
@@ -3466,7 +3466,7 @@
                 <w:sz w:val="20"/>
                 <w:szCs w:val="20"/>
               </w:rPr>
-              <w:t xml:space="preserve">Reset xoá hộp thư; +24 giờ làm HO106202 thành quá ngày và mất cảnh báo trong ngày</w:t>
+              <w:t xml:space="preserve">Hộp thư mọi vai về màn hình chào (xoá dấu vết các lần bấm thử tối 16/09). Sau đó không bấm Reset nữa, và không bấm +24 giờ trước bước 19</w:t>
             </w:r>
           </w:p>
         </w:tc>
@@ -11000,6 +11000,78 @@
                 <w:sz w:val="20"/>
                 <w:szCs w:val="20"/>
               </w:rPr>
+              <w:t xml:space="preserve">Nhìn vào đâu để biết câu này AI viết hay câu soạn sẵn?</w:t>
+            </w:r>
+          </w:p>
+        </w:tc>
+        <w:tc>
+          <w:tcPr>
+            <w:tcW w:type="dxa" w:w="6265"/>
+            <w:tcBorders>
+              <w:top w:val="single" w:color="A9D5E2" w:sz="4"/>
+              <w:left w:val="single" w:color="A9D5E2" w:sz="4"/>
+              <w:bottom w:val="single" w:color="A9D5E2" w:sz="4"/>
+              <w:right w:val="single" w:color="A9D5E2" w:sz="4"/>
+            </w:tcBorders>
+            <w:tcMar>
+              <w:top w:type="dxa" w:w="113"/>
+              <w:left w:type="dxa" w:w="113"/>
+              <w:bottom w:type="dxa" w:w="113"/>
+              <w:right w:type="dxa" w:w="113"/>
+            </w:tcMar>
+          </w:tcPr>
+          <w:p>
+            <w:pPr>
+              <w:spacing w:after="0" w:line="252"/>
+            </w:pPr>
+            <w:r>
+              <w:rPr>
+                <w:rFonts w:ascii="Aptos" w:cs="Aptos" w:eastAsia="Aptos" w:hAnsi="Aptos"/>
+                <w:b w:val="false"/>
+                <w:bCs w:val="false"/>
+                <w:color w:val="27343A"/>
+                <w:sz w:val="20"/>
+                <w:szCs w:val="20"/>
+              </w:rPr>
+              <w:t xml:space="preserve">Nhãn nhỏ dưới mỗi câu trả lời của trợ lý: “AI viết · gpt-4.1-mini” (đỏ) là model viết và đã qua phép kiểm số; “câu mẫu” (vàng) là AI bị chặn hoặc đang tắt nên code ghép câu; “đọc từ dữ liệu, không gọi model” (xám) là rule đọc thẳng bảng. Thẻ AI còn có dòng Người soạn.</w:t>
+            </w:r>
+          </w:p>
+        </w:tc>
+      </w:tr>
+      <w:tr>
+        <w:trPr>
+          <w:cantSplit/>
+          <w:tblHeader w:val="false"/>
+        </w:trPr>
+        <w:tc>
+          <w:tcPr>
+            <w:tcW w:type="dxa" w:w="3373"/>
+            <w:tcBorders>
+              <w:top w:val="single" w:color="A9D5E2" w:sz="4"/>
+              <w:left w:val="single" w:color="A9D5E2" w:sz="4"/>
+              <w:bottom w:val="single" w:color="A9D5E2" w:sz="4"/>
+              <w:right w:val="single" w:color="A9D5E2" w:sz="4"/>
+            </w:tcBorders>
+            <w:tcMar>
+              <w:top w:type="dxa" w:w="113"/>
+              <w:left w:type="dxa" w:w="113"/>
+              <w:bottom w:type="dxa" w:w="113"/>
+              <w:right w:type="dxa" w:w="113"/>
+            </w:tcMar>
+          </w:tcPr>
+          <w:p>
+            <w:pPr>
+              <w:spacing w:after="0" w:line="252"/>
+            </w:pPr>
+            <w:r>
+              <w:rPr>
+                <w:rFonts w:ascii="Aptos" w:cs="Aptos" w:eastAsia="Aptos" w:hAnsi="Aptos"/>
+                <w:b w:val="false"/>
+                <w:bCs w:val="false"/>
+                <w:color w:val="27343A"/>
+                <w:sz w:val="20"/>
+                <w:szCs w:val="20"/>
+              </w:rPr>
               <w:t xml:space="preserve">AI có bịa số không?</w:t>
             </w:r>
           </w:p>
@@ -12504,7 +12576,7 @@
                 <w:sz w:val="20"/>
                 <w:szCs w:val="20"/>
               </w:rPr>
-              <w:t xml:space="preserve">Đang đọc dữ liệu thật từ Business Central</w:t>
+              <w:t xml:space="preserve">Đang đọc dữ liệu thật từ Business Central (brief, câu hỏi mở)</w:t>
             </w:r>
           </w:p>
         </w:tc>
@@ -12537,7 +12609,112 @@
                 <w:sz w:val="20"/>
                 <w:szCs w:val="20"/>
               </w:rPr>
-              <w:t xml:space="preserve">Nói trước khi bấm; bấm Đọc lại từ BC trước buổi họp để làm nóng bộ nhớ đệm</w:t>
+              <w:t xml:space="preserve">Nói trước khi bấm. Đổi vai hay đổi company thì không còn chậm: cột phải lấy từ bản chụp, làm mới ở luồng nền</w:t>
+            </w:r>
+          </w:p>
+        </w:tc>
+      </w:tr>
+      <w:tr>
+        <w:trPr>
+          <w:cantSplit/>
+          <w:tblHeader w:val="false"/>
+        </w:trPr>
+        <w:tc>
+          <w:tcPr>
+            <w:tcW w:type="dxa" w:w="2731"/>
+            <w:tcBorders>
+              <w:top w:val="single" w:color="A9D5E2" w:sz="4"/>
+              <w:left w:val="single" w:color="A9D5E2" w:sz="4"/>
+              <w:bottom w:val="single" w:color="A9D5E2" w:sz="4"/>
+              <w:right w:val="single" w:color="A9D5E2" w:sz="4"/>
+            </w:tcBorders>
+            <w:tcMar>
+              <w:top w:type="dxa" w:w="113"/>
+              <w:left w:type="dxa" w:w="113"/>
+              <w:bottom w:type="dxa" w:w="113"/>
+              <w:right w:type="dxa" w:w="113"/>
+            </w:tcMar>
+          </w:tcPr>
+          <w:p>
+            <w:pPr>
+              <w:spacing w:after="0" w:line="252"/>
+            </w:pPr>
+            <w:r>
+              <w:rPr>
+                <w:rFonts w:ascii="Aptos" w:cs="Aptos" w:eastAsia="Aptos" w:hAnsi="Aptos"/>
+                <w:b w:val="false"/>
+                <w:bCs w:val="false"/>
+                <w:color w:val="27343A"/>
+                <w:sz w:val="20"/>
+                <w:szCs w:val="20"/>
+              </w:rPr>
+              <w:t xml:space="preserve">Cột Theo dõi xử lý chưa cập nhật ngay sau khi Duyệt</w:t>
+            </w:r>
+          </w:p>
+        </w:tc>
+        <w:tc>
+          <w:tcPr>
+            <w:tcW w:type="dxa" w:w="3373"/>
+            <w:tcBorders>
+              <w:top w:val="single" w:color="A9D5E2" w:sz="4"/>
+              <w:left w:val="single" w:color="A9D5E2" w:sz="4"/>
+              <w:bottom w:val="single" w:color="A9D5E2" w:sz="4"/>
+              <w:right w:val="single" w:color="A9D5E2" w:sz="4"/>
+            </w:tcBorders>
+            <w:tcMar>
+              <w:top w:type="dxa" w:w="113"/>
+              <w:left w:type="dxa" w:w="113"/>
+              <w:bottom w:type="dxa" w:w="113"/>
+              <w:right w:type="dxa" w:w="113"/>
+            </w:tcMar>
+          </w:tcPr>
+          <w:p>
+            <w:pPr>
+              <w:spacing w:after="0" w:line="252"/>
+            </w:pPr>
+            <w:r>
+              <w:rPr>
+                <w:rFonts w:ascii="Aptos" w:cs="Aptos" w:eastAsia="Aptos" w:hAnsi="Aptos"/>
+                <w:b w:val="false"/>
+                <w:bCs w:val="false"/>
+                <w:color w:val="27343A"/>
+                <w:sz w:val="20"/>
+                <w:szCs w:val="20"/>
+              </w:rPr>
+              <w:t xml:space="preserve">Bản chụp làm mới mỗi 8 giây</w:t>
+            </w:r>
+          </w:p>
+        </w:tc>
+        <w:tc>
+          <w:tcPr>
+            <w:tcW w:type="dxa" w:w="3534"/>
+            <w:tcBorders>
+              <w:top w:val="single" w:color="A9D5E2" w:sz="4"/>
+              <w:left w:val="single" w:color="A9D5E2" w:sz="4"/>
+              <w:bottom w:val="single" w:color="A9D5E2" w:sz="4"/>
+              <w:right w:val="single" w:color="A9D5E2" w:sz="4"/>
+            </w:tcBorders>
+            <w:tcMar>
+              <w:top w:type="dxa" w:w="113"/>
+              <w:left w:type="dxa" w:w="113"/>
+              <w:bottom w:type="dxa" w:w="113"/>
+              <w:right w:type="dxa" w:w="113"/>
+            </w:tcMar>
+          </w:tcPr>
+          <w:p>
+            <w:pPr>
+              <w:spacing w:after="0" w:line="252"/>
+            </w:pPr>
+            <w:r>
+              <w:rPr>
+                <w:rFonts w:ascii="Aptos" w:cs="Aptos" w:eastAsia="Aptos" w:hAnsi="Aptos"/>
+                <w:b w:val="false"/>
+                <w:bCs w:val="false"/>
+                <w:color w:val="27343A"/>
+                <w:sz w:val="20"/>
+                <w:szCs w:val="20"/>
+              </w:rPr>
+              <w:t xml:space="preserve">Đợi một nhịp, không bấm lại</w:t>
             </w:r>
           </w:p>
         </w:tc>

</xml_diff>

<commit_message>
Tai lieu 13: lop AI ke lai, buoc 11 co dan dat
</commit_message>
<xml_diff>
--- a/docs/13 Marou POC - Demo script (noi bo).docx
+++ b/docs/13 Marou POC - Demo script (noi bo).docx
@@ -1161,6 +1161,43 @@
           <w:bCs/>
           <w:color w:val="27343A"/>
         </w:rPr>
+        <w:t xml:space="preserve">AI kể lại kết quả tra cứu</w:t>
+      </w:r>
+    </w:p>
+    <w:p>
+      <w:pPr>
+        <w:pBdr>
+          <w:left w:val="single" w:color="4BACC6" w:sz="36" w:space="10"/>
+        </w:pBdr>
+        <w:shd w:fill="DAEEF3" w:val="clear"/>
+        <w:spacing w:after="200" w:before="0" w:line="276"/>
+        <w:ind w:left="200" w:right="120"/>
+      </w:pPr>
+      <w:r>
+        <w:rPr>
+          <w:rFonts w:ascii="Aptos" w:cs="Aptos" w:eastAsia="Aptos" w:hAnsi="Aptos"/>
+          <w:color w:val="27343A"/>
+        </w:rPr>
+        <w:t xml:space="preserve">Với AI đang bật, mọi câu trả lời dạng dữ liệu (dự báo, vì sao LS, CTKM, đơn quá hạn, nhà cung cấp, lô hết hạn) có phần lời do model viết: điều quan trọng nhất, một hai insight, việc nên làm. Bảng số thu gọn bên dưới, bấm “Dữ liệu code đã tra” để mở. Nhãn ở chân câu trả lời cho biết câu đó AI viết, câu mẫu, hay đọc thẳng từ dữ liệu. Mỗi con số model viết đều phải có trong bảng; sai một số là hệ thống giữ nguyên câu của rule, nên thỉnh thoảng một câu không có nhãn AI: đó là phép kiểm đã chặn, nói thẳng với khách.</w:t>
+      </w:r>
+    </w:p>
+    <w:p>
+      <w:pPr>
+        <w:keepNext/>
+        <w:pBdr>
+          <w:left w:val="single" w:color="4BACC6" w:sz="36" w:space="10"/>
+        </w:pBdr>
+        <w:shd w:fill="DAEEF3" w:val="clear"/>
+        <w:spacing w:after="0" w:before="120" w:line="276"/>
+        <w:ind w:left="200" w:right="120"/>
+      </w:pPr>
+      <w:r>
+        <w:rPr>
+          <w:rFonts w:ascii="Aptos" w:cs="Aptos" w:eastAsia="Aptos" w:hAnsi="Aptos"/>
+          <w:b/>
+          <w:bCs/>
+          <w:color w:val="27343A"/>
+        </w:rPr>
         <w:t xml:space="preserve">Bản 15 phút</w:t>
       </w:r>
     </w:p>
@@ -7414,7 +7451,7 @@
                 <w:sz w:val="20"/>
                 <w:szCs w:val="20"/>
               </w:rPr>
-              <w:t xml:space="preserve">Nút 11.</w:t>
+              <w:t xml:space="preserve">Nút 11. Câu: dự báo đang lệch nhiều ở nhóm hàng nào, và vì sao.</w:t>
             </w:r>
           </w:p>
         </w:tc>
@@ -7447,7 +7484,7 @@
                 <w:sz w:val="20"/>
                 <w:szCs w:val="20"/>
               </w:rPr>
-              <w:t xml:space="preserve">Câu trả lời: Holt-Winters sai 37,0%, trung bình 28 ngày 38,0%, trung bình cùng thứ 37,2%; 20 cặp vượt ngưỡng; sai số theo điểm bán và nhóm hàng.</w:t>
+              <w:t xml:space="preserve">AI viết vài câu: nhóm BEVERAGES lệch nhất (88,9%), croissant dự báo cao hơn bán thực tế; bảng sai số theo điểm bán và nhóm hàng thu gọn bên dưới; số tổng Holt-Winters 37,0%, 74 cặp, 20 cặp cần xem.</w:t>
             </w:r>
           </w:p>
         </w:tc>
@@ -7496,6 +7533,23 @@
           <w:color w:val="27343A"/>
         </w:rPr>
         <w:t xml:space="preserve">Sai nhiều nhất là bánh croissant: dự báo cao hơn bán thực tế vì cửa hàng hay hết hàng. Đó lại nối về câu chuyện Out of Stock ở bước 5.</w:t>
+      </w:r>
+    </w:p>
+    <w:p>
+      <w:pPr>
+        <w:pStyle w:val="ListParagraph"/>
+        <w:numPr>
+          <w:ilvl w:val="0"/>
+          <w:numId w:val="2"/>
+        </w:numPr>
+        <w:spacing w:after="80" w:line="276"/>
+      </w:pPr>
+      <w:r>
+        <w:rPr>
+          <w:rFonts w:ascii="Aptos" w:cs="Aptos" w:eastAsia="Aptos" w:hAnsi="Aptos"/>
+          <w:color w:val="27343A"/>
+        </w:rPr>
+        <w:t xml:space="preserve">Model đọc bảng sai số rồi kể lại; Holt-Winters là thống kê, chưa phải AI. Nói rõ hai lớp đó.</w:t>
       </w:r>
     </w:p>
     <w:p>

</xml_diff>

<commit_message>
Mach demo xep lai theo UC2 lam trung tam, 18 buoc; tab Du bao co chu thich WAPE va Bias; the Chot ngay thanh Ngay lam viec; tai lieu 13 ban 2.3
</commit_message>
<xml_diff>
--- a/docs/13 Marou POC - Demo script (noi bo).docx
+++ b/docs/13 Marou POC - Demo script (noi bo).docx
@@ -39,7 +39,7 @@
           <w:sz w:val="28"/>
           <w:szCs w:val="28"/>
         </w:rPr>
-        <w:t xml:space="preserve">Runbook 23 bước cho buổi trình diễn 17/09/2026: dữ liệu đã tạo sẵn, bấm gì, khách thấy gì, nói gì</w:t>
+        <w:t xml:space="preserve">Runbook 18 bước cho buổi trình diễn 17/09/2026: dữ liệu đã tạo sẵn, bấm gì, khách thấy gì, nói gì</w:t>
       </w:r>
     </w:p>
     <w:p>
@@ -147,7 +147,7 @@
           <w:rFonts w:ascii="Aptos" w:cs="Aptos" w:eastAsia="Aptos" w:hAnsi="Aptos"/>
           <w:color w:val="27343A"/>
         </w:rPr>
-        <w:t xml:space="preserve">Một buổi sáng ở Dakao và Marou. Cửa hàng kêu hết hàng, LS Replenishment đã tính sẵn con số, trợ lý ghi đề xuất và giải thích, người của Marou duyệt, đơn mua tự sang Marou, Marou xuất kho, trợ lý báo cửa hàng chuẩn bị nhận và xin phép post phiếu nhận. Xen giữa là dự báo nối sang bổ sung, và một lô cận date để AI chọn phương án. Sáu phần, 23 bước, mỗi bước là một nút trên cột trái của console, bấm theo số thứ tự.</w:t>
+        <w:t xml:space="preserve">Trọng tâm là UC2 Sức khỏe tồn kho và truy xuất, xen một nhịp UC5 và một nhịp UC1 để thấy trợ lý nối các UC với nhau. Mạch: sáng nay Marou nhìn tồn kho, AI chọn ba việc; một lô cận date được AI phân tích và đề xuất chuyển sang cửa hàng bán nhanh; một cửa hàng bán lẻ kêu hết hàng, LS tính, AI đề xuất đặt mua từ Marou; dự báo và khuyến mãi nối sang bổ sung; hàng về cửa hàng qua liên công ty, trợ lý báo và xin phép post phiếu nhận; cuối cùng truy xuất lô, bất thường và chi phí. Sáu phần, 18 bước, mỗi bước là một nút trên cột trái của console, tên nút chính là câu sẽ gửi.</w:t>
       </w:r>
     </w:p>
     <w:tbl>
@@ -344,7 +344,7 @@
                 <w:sz w:val="20"/>
                 <w:szCs w:val="20"/>
               </w:rPr>
-              <w:t xml:space="preserve">1 · Nhìn toàn cảnh buổi sáng</w:t>
+              <w:t xml:space="preserve">1 · Sáng nay ở Marou: sức khỏe tồn kho</w:t>
             </w:r>
           </w:p>
         </w:tc>
@@ -443,7 +443,7 @@
                 <w:sz w:val="20"/>
                 <w:szCs w:val="20"/>
               </w:rPr>
-              <w:t xml:space="preserve">0 đến 4</w:t>
+              <w:t xml:space="preserve">0 đến 5</w:t>
             </w:r>
           </w:p>
         </w:tc>
@@ -482,7 +482,7 @@
                 <w:sz w:val="20"/>
                 <w:szCs w:val="20"/>
               </w:rPr>
-              <w:t xml:space="preserve">2 · Cửa hàng hết hàng, LS tính, AI đề xuất</w:t>
+              <w:t xml:space="preserve">2 · Một lô cận date: AI phân tích, chọn phương án</w:t>
             </w:r>
           </w:p>
         </w:tc>
@@ -515,7 +515,7 @@
                 <w:sz w:val="20"/>
                 <w:szCs w:val="20"/>
               </w:rPr>
-              <w:t xml:space="preserve">3 đến 9</w:t>
+              <w:t xml:space="preserve">3 đến 5</w:t>
             </w:r>
           </w:p>
         </w:tc>
@@ -548,7 +548,7 @@
                 <w:sz w:val="20"/>
                 <w:szCs w:val="20"/>
               </w:rPr>
-              <w:t xml:space="preserve">UC5, OOS, AI</w:t>
+              <w:t xml:space="preserve">UC2 nối UC5, AI</w:t>
             </w:r>
           </w:p>
         </w:tc>
@@ -581,7 +581,7 @@
                 <w:sz w:val="20"/>
                 <w:szCs w:val="20"/>
               </w:rPr>
-              <w:t xml:space="preserve">4 đến 15</w:t>
+              <w:t xml:space="preserve">5 đến 12</w:t>
             </w:r>
           </w:p>
         </w:tc>
@@ -620,7 +620,7 @@
                 <w:sz w:val="20"/>
                 <w:szCs w:val="20"/>
               </w:rPr>
-              <w:t xml:space="preserve">3 · Dự báo nối sang bổ sung</w:t>
+              <w:t xml:space="preserve">3 · Cửa hàng bán lẻ hết hàng: LS tính, AI đề xuất</w:t>
             </w:r>
           </w:p>
         </w:tc>
@@ -653,7 +653,7 @@
                 <w:sz w:val="20"/>
                 <w:szCs w:val="20"/>
               </w:rPr>
-              <w:t xml:space="preserve">10 đến 14</w:t>
+              <w:t xml:space="preserve">6 đến 9</w:t>
             </w:r>
           </w:p>
         </w:tc>
@@ -686,7 +686,7 @@
                 <w:sz w:val="20"/>
                 <w:szCs w:val="20"/>
               </w:rPr>
-              <w:t xml:space="preserve">UC1, UC7 nối UC5</w:t>
+              <w:t xml:space="preserve">UC5, AI</w:t>
             </w:r>
           </w:p>
         </w:tc>
@@ -719,7 +719,7 @@
                 <w:sz w:val="20"/>
                 <w:szCs w:val="20"/>
               </w:rPr>
-              <w:t xml:space="preserve">15 đến 22</w:t>
+              <w:t xml:space="preserve">12 đến 21</w:t>
             </w:r>
           </w:p>
         </w:tc>
@@ -758,7 +758,7 @@
                 <w:sz w:val="20"/>
                 <w:szCs w:val="20"/>
               </w:rPr>
-              <w:t xml:space="preserve">4 · Một lô cận date, AI chọn phương án</w:t>
+              <w:t xml:space="preserve">4 · Dự báo, một nhịp</w:t>
             </w:r>
           </w:p>
         </w:tc>
@@ -791,7 +791,7 @@
                 <w:sz w:val="20"/>
                 <w:szCs w:val="20"/>
               </w:rPr>
-              <w:t xml:space="preserve">15 đến 17</w:t>
+              <w:t xml:space="preserve">10, 11</w:t>
             </w:r>
           </w:p>
         </w:tc>
@@ -824,7 +824,7 @@
                 <w:sz w:val="20"/>
                 <w:szCs w:val="20"/>
               </w:rPr>
-              <w:t xml:space="preserve">UC2, AI</w:t>
+              <w:t xml:space="preserve">UC1, UC7 nối UC5</w:t>
             </w:r>
           </w:p>
         </w:tc>
@@ -857,7 +857,7 @@
                 <w:sz w:val="20"/>
                 <w:szCs w:val="20"/>
               </w:rPr>
-              <w:t xml:space="preserve">22 đến 27</w:t>
+              <w:t xml:space="preserve">21 đến 25</w:t>
             </w:r>
           </w:p>
         </w:tc>
@@ -896,7 +896,7 @@
                 <w:sz w:val="20"/>
                 <w:szCs w:val="20"/>
               </w:rPr>
-              <w:t xml:space="preserve">5 · Liên công ty khép vòng</w:t>
+              <w:t xml:space="preserve">5 · Hàng về cửa hàng: liên công ty khép vòng</w:t>
             </w:r>
           </w:p>
         </w:tc>
@@ -929,7 +929,7 @@
                 <w:sz w:val="20"/>
                 <w:szCs w:val="20"/>
               </w:rPr>
-              <w:t xml:space="preserve">18 đến 21</w:t>
+              <w:t xml:space="preserve">12 đến 15</w:t>
             </w:r>
           </w:p>
         </w:tc>
@@ -962,7 +962,7 @@
                 <w:sz w:val="20"/>
                 <w:szCs w:val="20"/>
               </w:rPr>
-              <w:t xml:space="preserve">A4</w:t>
+              <w:t xml:space="preserve">UC2 nhận hàng, A4</w:t>
             </w:r>
           </w:p>
         </w:tc>
@@ -995,7 +995,7 @@
                 <w:sz w:val="20"/>
                 <w:szCs w:val="20"/>
               </w:rPr>
-              <w:t xml:space="preserve">27 đến 34</w:t>
+              <w:t xml:space="preserve">25 đến 33</w:t>
             </w:r>
           </w:p>
         </w:tc>
@@ -1034,7 +1034,7 @@
                 <w:sz w:val="20"/>
                 <w:szCs w:val="20"/>
               </w:rPr>
-              <w:t xml:space="preserve">6 · Bất thường và chi phí</w:t>
+              <w:t xml:space="preserve">6 · Truy xuất, bất thường, chi phí</w:t>
             </w:r>
           </w:p>
         </w:tc>
@@ -1067,7 +1067,7 @@
                 <w:sz w:val="20"/>
                 <w:szCs w:val="20"/>
               </w:rPr>
-              <w:t xml:space="preserve">22, 23</w:t>
+              <w:t xml:space="preserve">16 đến 18</w:t>
             </w:r>
           </w:p>
         </w:tc>
@@ -1100,7 +1100,7 @@
                 <w:sz w:val="20"/>
                 <w:szCs w:val="20"/>
               </w:rPr>
-              <w:t xml:space="preserve">AI, vận hành</w:t>
+              <w:t xml:space="preserve">UC2, AI</w:t>
             </w:r>
           </w:p>
         </w:tc>
@@ -1133,7 +1133,7 @@
                 <w:sz w:val="20"/>
                 <w:szCs w:val="20"/>
               </w:rPr>
-              <w:t xml:space="preserve">34 đến 38</w:t>
+              <w:t xml:space="preserve">33 đến 38</w:t>
             </w:r>
           </w:p>
         </w:tc>
@@ -1178,7 +1178,7 @@
           <w:rFonts w:ascii="Aptos" w:cs="Aptos" w:eastAsia="Aptos" w:hAnsi="Aptos"/>
           <w:color w:val="27343A"/>
         </w:rPr>
-        <w:t xml:space="preserve">Với AI đang bật, mọi câu trả lời dạng dữ liệu (dự báo, vì sao LS, CTKM, đơn quá hạn, nhà cung cấp, lô hết hạn) có phần lời do model viết: điều quan trọng nhất, một hai insight, việc nên làm. Bảng số thu gọn bên dưới, bấm “Dữ liệu code đã tra” để mở. Nhãn ở chân câu trả lời cho biết câu đó AI viết, câu mẫu, hay đọc thẳng từ dữ liệu. Mỗi con số model viết đều phải có trong bảng; sai một số là hệ thống giữ nguyên câu của rule, nên thỉnh thoảng một câu không có nhãn AI: đó là phép kiểm đã chặn, nói thẳng với khách.</w:t>
+        <w:t xml:space="preserve">Với AI đang bật, mọi câu trả lời dạng dữ liệu (dự báo, vì sao LS, CTKM, đơn quá hạn, nhà cung cấp, lô hết hạn, truy xuất) có phần lời do model viết: điều quan trọng nhất, một hai insight, việc nên làm. Bảng số thu gọn bên dưới, bấm “Dữ liệu code đã tra” để mở. Nhãn ở chân câu trả lời cho biết câu đó AI viết, câu mẫu, hay đọc thẳng từ dữ liệu. Mỗi con số model viết đều phải có trong bảng; sai một số là hệ thống giữ nguyên câu của rule, nên thỉnh thoảng một câu không có nhãn AI: đó là phép kiểm đã chặn, nói thẳng với khách.</w:t>
       </w:r>
     </w:p>
     <w:p>
@@ -1215,7 +1215,7 @@
           <w:rFonts w:ascii="Aptos" w:cs="Aptos" w:eastAsia="Aptos" w:hAnsi="Aptos"/>
           <w:color w:val="27343A"/>
         </w:rPr>
-        <w:t xml:space="preserve">Khi bị cắt giờ, giữ các bước 2, 3, 4, 7, 9, 16, 18, 20. Đó là một vòng trọn: AI tóm tắt, cửa hàng kêu hết hàng, LS giải thích, người duyệt, AI phân tích đề xuất bất thường, AI chọn phương án, Marou xuất kho, trợ lý post phiếu nhận sau khi được duyệt.</w:t>
+        <w:t xml:space="preserve">Khi bị cắt giờ, giữ các bước 2, 3, 4, 5, 6, 8, 12, 14. Đó là một vòng trọn của UC2: AI tóm tắt, lô cận date được AI chọn phương án, người duyệt, cửa hàng kêu hết hàng, đơn sang Marou, hàng về và trợ lý post phiếu nhận sau khi được duyệt.</w:t>
       </w:r>
     </w:p>
     <w:p>
@@ -1417,7 +1417,7 @@
                 <w:sz w:val="20"/>
                 <w:szCs w:val="20"/>
               </w:rPr>
-              <w:t xml:space="preserve">Bộ dữ liệu tính lại theo Work Date 17/09/2026: Inventory Health, dự báo, scorecard, LS Replenishment, cả hai company</w:t>
+              <w:t xml:space="preserve">Bộ dữ liệu tính lại theo ngày làm việc 17/09/2026: Inventory Health, dự báo, scorecard, LS Replenishment, cả hai company</w:t>
             </w:r>
           </w:p>
         </w:tc>
@@ -1522,7 +1522,7 @@
                 <w:sz w:val="20"/>
                 <w:szCs w:val="20"/>
               </w:rPr>
-              <w:t xml:space="preserve">LS ở Dakao đề xuất 12 Ice cream cho S0002 (min-max 8/20), 7 Croissant chocolate cho S0002 (42 ngày hết hàng), 2 Choco nuts cho S0001 (tồn 0, 82 đang về)</w:t>
+              <w:t xml:space="preserve">Lô Choco pillar L260829-33310-SD tại S0010: 470 cái, hạn 13/10, bán không kịp; S0001 bán nhanh hơn</w:t>
             </w:r>
           </w:p>
         </w:tc>
@@ -1555,7 +1555,7 @@
                 <w:sz w:val="20"/>
                 <w:szCs w:val="20"/>
               </w:rPr>
-              <w:t xml:space="preserve">Journal MAROU-PO của NWV-DAKAO</w:t>
+              <w:t xml:space="preserve">Inventory Health NWV-MAROU</w:t>
             </w:r>
           </w:p>
         </w:tc>
@@ -1588,7 +1588,7 @@
                 <w:sz w:val="20"/>
                 <w:szCs w:val="20"/>
               </w:rPr>
-              <w:t xml:space="preserve">3 đến 6, 9</w:t>
+              <w:t xml:space="preserve">3 đến 5</w:t>
             </w:r>
           </w:p>
         </w:tc>
@@ -1627,7 +1627,7 @@
                 <w:sz w:val="20"/>
                 <w:szCs w:val="20"/>
               </w:rPr>
-              <w:t xml:space="preserve">Đơn mua HO106202: 82 Choco nuts từ Marou giao S0001. Đã sang Marou thành Sales Order S90015, Marou đã post xuất kho phiếu 102045 đề ngày 17/09</w:t>
+              <w:t xml:space="preserve">LS ở Dakao đề xuất 12 Ice cream cho S0002 (min-max 8/20), 7 Croissant chocolate cho S0002 (42 ngày hết hàng), 2 Choco nuts cho S0001 (tồn 0, 82 đang về)</w:t>
             </w:r>
           </w:p>
         </w:tc>
@@ -1660,7 +1660,7 @@
                 <w:sz w:val="20"/>
                 <w:szCs w:val="20"/>
               </w:rPr>
-              <w:t xml:space="preserve">NWV-DAKAO và NWV-MAROU</w:t>
+              <w:t xml:space="preserve">Journal MAROU-PO của NWV-DAKAO</w:t>
             </w:r>
           </w:p>
         </w:tc>
@@ -1693,7 +1693,7 @@
                 <w:sz w:val="20"/>
                 <w:szCs w:val="20"/>
               </w:rPr>
-              <w:t xml:space="preserve">6, 18, 19</w:t>
+              <w:t xml:space="preserve">6, 7, 9</w:t>
             </w:r>
           </w:p>
         </w:tc>
@@ -1732,7 +1732,7 @@
                 <w:sz w:val="20"/>
                 <w:szCs w:val="20"/>
               </w:rPr>
-              <w:t xml:space="preserve">Đơn mua HO106200: 1 Blueberry muffin giao S0005, Marou xuất kho phiếu 102044 ngày 16/09, chưa post nhận</w:t>
+              <w:t xml:space="preserve">Bốn CTKM và bốn Planned Event của LS: Choco bowl giảm 15% ngày 23 đến 25/09 có nhu cầu cho S0001 và S0010, cố ý thiếu S0002 và S0005; dự báo Holt-Winters 28 ngày tới đã ghi vào Retail Forecast Entry</w:t>
             </w:r>
           </w:p>
         </w:tc>
@@ -1765,7 +1765,7 @@
                 <w:sz w:val="20"/>
                 <w:szCs w:val="20"/>
               </w:rPr>
-              <w:t xml:space="preserve">NWV-DAKAO</w:t>
+              <w:t xml:space="preserve">LS Forecast Entry, Periodic Discount, Planned Event</w:t>
             </w:r>
           </w:p>
         </w:tc>
@@ -1798,7 +1798,7 @@
                 <w:sz w:val="20"/>
                 <w:szCs w:val="20"/>
               </w:rPr>
-              <w:t xml:space="preserve">18, 20</w:t>
+              <w:t xml:space="preserve">10, 11</w:t>
             </w:r>
           </w:p>
         </w:tc>
@@ -1837,7 +1837,7 @@
                 <w:sz w:val="20"/>
                 <w:szCs w:val="20"/>
               </w:rPr>
-              <w:t xml:space="preserve">Bốn CTKM và bốn Planned Event của LS: Choco bowl giảm 15% ngày 23 đến 25/09 có nhu cầu cho S0001 và S0010, cố ý thiếu S0002 và S0005</w:t>
+              <w:t xml:space="preserve">Đơn mua HO106202: 82 Choco nuts từ Marou giao S0001. Đã sang Marou thành Sales Order S90015, Marou đã post xuất kho phiếu 102045 đề ngày 17/09</w:t>
             </w:r>
           </w:p>
         </w:tc>
@@ -1870,7 +1870,7 @@
                 <w:sz w:val="20"/>
                 <w:szCs w:val="20"/>
               </w:rPr>
-              <w:t xml:space="preserve">LS Periodic Discount, Planned Event</w:t>
+              <w:t xml:space="preserve">NWV-DAKAO và NWV-MAROU</w:t>
             </w:r>
           </w:p>
         </w:tc>
@@ -1903,7 +1903,7 @@
                 <w:sz w:val="20"/>
                 <w:szCs w:val="20"/>
               </w:rPr>
-              <w:t xml:space="preserve">12 đến 14</w:t>
+              <w:t xml:space="preserve">12, 13</w:t>
             </w:r>
           </w:p>
         </w:tc>
@@ -1942,7 +1942,7 @@
                 <w:sz w:val="20"/>
                 <w:szCs w:val="20"/>
               </w:rPr>
-              <w:t xml:space="preserve">Dự báo Holt-Winters 28 ngày tới đã ghi vào Retail Forecast Entry; Choco pillar và Choco bowl tính kiểu Retail Forecast</w:t>
+              <w:t xml:space="preserve">Đơn mua HO106200: 1 Blueberry muffin giao S0005, Marou xuất kho phiếu 102044 ngày 16/09, chưa post nhận</w:t>
             </w:r>
           </w:p>
         </w:tc>
@@ -1975,7 +1975,7 @@
                 <w:sz w:val="20"/>
                 <w:szCs w:val="20"/>
               </w:rPr>
-              <w:t xml:space="preserve">LS Forecast Entry</w:t>
+              <w:t xml:space="preserve">NWV-DAKAO</w:t>
             </w:r>
           </w:p>
         </w:tc>
@@ -2008,7 +2008,7 @@
                 <w:sz w:val="20"/>
                 <w:szCs w:val="20"/>
               </w:rPr>
-              <w:t xml:space="preserve">10 đến 14</w:t>
+              <w:t xml:space="preserve">12, 14</w:t>
             </w:r>
           </w:p>
         </w:tc>
@@ -2047,7 +2047,7 @@
                 <w:sz w:val="20"/>
                 <w:szCs w:val="20"/>
               </w:rPr>
-              <w:t xml:space="preserve">Lô Choco pillar L260829-33310-SD tại S0010: 470 cái, hạn 13/10, bán không kịp; S0001 bán nhanh hơn</w:t>
+              <w:t xml:space="preserve">Lô Choco nuts L260906-33323C: Marou xuất 81 cái theo HO106202 sang S0001, hạn 22/04/2027, sổ kho ở W0003</w:t>
             </w:r>
           </w:p>
         </w:tc>
@@ -2080,7 +2080,7 @@
                 <w:sz w:val="20"/>
                 <w:szCs w:val="20"/>
               </w:rPr>
-              <w:t xml:space="preserve">Inventory Health NWV-MAROU</w:t>
+              <w:t xml:space="preserve">Item Ledger Entry NWV-MAROU</w:t>
             </w:r>
           </w:p>
         </w:tc>
@@ -2113,7 +2113,7 @@
                 <w:sz w:val="20"/>
                 <w:szCs w:val="20"/>
               </w:rPr>
-              <w:t xml:space="preserve">15 đến 17</w:t>
+              <w:t xml:space="preserve">16</w:t>
             </w:r>
           </w:p>
         </w:tc>
@@ -2304,7 +2304,7 @@
                 <w:sz w:val="20"/>
                 <w:szCs w:val="20"/>
               </w:rPr>
-              <w:t xml:space="preserve">Tính theo Work Date 18/09, không còn khớp LS. Cột Theo dõi xử lý giờ không còn dòng Rejected.</w:t>
+              <w:t xml:space="preserve">Tính theo ngày làm việc 18/09, không còn khớp LS. Cột Theo dõi xử lý giờ không còn dòng Rejected.</w:t>
             </w:r>
           </w:p>
         </w:tc>
@@ -2343,7 +2343,7 @@
                 <w:sz w:val="20"/>
                 <w:szCs w:val="20"/>
               </w:rPr>
-              <w:t xml:space="preserve">13 đề xuất huỷ lô hết hạn ở Dakao (12 chờ duyệt, 1 đã thực thi từ 14/09)</w:t>
+              <w:t xml:space="preserve">13 đề xuất huỷ lô hết hạn ở Dakao</w:t>
             </w:r>
           </w:p>
         </w:tc>
@@ -2376,7 +2376,7 @@
                 <w:sz w:val="20"/>
                 <w:szCs w:val="20"/>
               </w:rPr>
-              <w:t xml:space="preserve">Sinh ra từ các lần chạy quét sáng khi thử. Mạch demo mới không dùng luồng huỷ.</w:t>
+              <w:t xml:space="preserve">Sinh ra từ các lần chạy quét sáng khi thử. Mạch demo không dùng luồng huỷ.</w:t>
             </w:r>
           </w:p>
         </w:tc>
@@ -2415,7 +2415,7 @@
                 <w:sz w:val="20"/>
                 <w:szCs w:val="20"/>
               </w:rPr>
-              <w:t xml:space="preserve">2 đề xuất post nhận hàng còn treo (HO106200, HO106202) và các đề xuất thử tối 16/09</w:t>
+              <w:t xml:space="preserve">Các đề xuất post nhận hàng còn treo và đề xuất thử tối 16/09</w:t>
             </w:r>
           </w:p>
         </w:tc>
@@ -2448,7 +2448,7 @@
                 <w:sz w:val="20"/>
                 <w:szCs w:val="20"/>
               </w:rPr>
-              <w:t xml:space="preserve">Trợ lý ghi lại đúng lúc khi bấm Kiểm hàng Marou đã xuất kho ở bước 18.</w:t>
+              <w:t xml:space="preserve">Trợ lý ghi lại đúng lúc khi bấm Kiểm hàng Marou đã xuất kho ở bước 12.</w:t>
             </w:r>
           </w:p>
         </w:tc>
@@ -2521,78 +2521,6 @@
                 <w:szCs w:val="20"/>
               </w:rPr>
               <w:t xml:space="preserve">Rác của các lần thử, không thuộc kịch bản nào.</w:t>
-            </w:r>
-          </w:p>
-        </w:tc>
-      </w:tr>
-      <w:tr>
-        <w:trPr>
-          <w:cantSplit/>
-          <w:tblHeader w:val="false"/>
-        </w:trPr>
-        <w:tc>
-          <w:tcPr>
-            <w:tcW w:type="dxa" w:w="4819"/>
-            <w:tcBorders>
-              <w:top w:val="single" w:color="A9D5E2" w:sz="4"/>
-              <w:left w:val="single" w:color="A9D5E2" w:sz="4"/>
-              <w:bottom w:val="single" w:color="A9D5E2" w:sz="4"/>
-              <w:right w:val="single" w:color="A9D5E2" w:sz="4"/>
-            </w:tcBorders>
-            <w:tcMar>
-              <w:top w:type="dxa" w:w="113"/>
-              <w:left w:type="dxa" w:w="113"/>
-              <w:bottom w:type="dxa" w:w="113"/>
-              <w:right w:type="dxa" w:w="113"/>
-            </w:tcMar>
-          </w:tcPr>
-          <w:p>
-            <w:pPr>
-              <w:spacing w:after="0" w:line="252"/>
-            </w:pPr>
-            <w:r>
-              <w:rPr>
-                <w:rFonts w:ascii="Aptos" w:cs="Aptos" w:eastAsia="Aptos" w:hAnsi="Aptos"/>
-                <w:b w:val="false"/>
-                <w:bCs w:val="false"/>
-                <w:color w:val="27343A"/>
-                <w:sz w:val="20"/>
-                <w:szCs w:val="20"/>
-              </w:rPr>
-              <w:t xml:space="preserve">Hộp thư của trợ lý ở cả hai company (nút Reset)</w:t>
-            </w:r>
-          </w:p>
-        </w:tc>
-        <w:tc>
-          <w:tcPr>
-            <w:tcW w:type="dxa" w:w="4819"/>
-            <w:tcBorders>
-              <w:top w:val="single" w:color="A9D5E2" w:sz="4"/>
-              <w:left w:val="single" w:color="A9D5E2" w:sz="4"/>
-              <w:bottom w:val="single" w:color="A9D5E2" w:sz="4"/>
-              <w:right w:val="single" w:color="A9D5E2" w:sz="4"/>
-            </w:tcBorders>
-            <w:tcMar>
-              <w:top w:type="dxa" w:w="113"/>
-              <w:left w:type="dxa" w:w="113"/>
-              <w:bottom w:type="dxa" w:w="113"/>
-              <w:right w:type="dxa" w:w="113"/>
-            </w:tcMar>
-          </w:tcPr>
-          <w:p>
-            <w:pPr>
-              <w:spacing w:after="0" w:line="252"/>
-            </w:pPr>
-            <w:r>
-              <w:rPr>
-                <w:rFonts w:ascii="Aptos" w:cs="Aptos" w:eastAsia="Aptos" w:hAnsi="Aptos"/>
-                <w:b w:val="false"/>
-                <w:bCs w:val="false"/>
-                <w:color w:val="27343A"/>
-                <w:sz w:val="20"/>
-                <w:szCs w:val="20"/>
-              </w:rPr>
-              <w:t xml:space="preserve">Xoá lịch sử các lần thử; sáng 17/09 mọi vai bắt đầu từ màn hình chào.</w:t>
             </w:r>
           </w:p>
         </w:tc>
@@ -2873,7 +2801,7 @@
                 <w:sz w:val="20"/>
                 <w:szCs w:val="20"/>
               </w:rPr>
-              <w:t xml:space="preserve">Mở http://127.0.0.1:8188 thấy màn hình chào</w:t>
+              <w:t xml:space="preserve">Mở http://127.0.0.1:8188 thấy màn hình chào; đợi khoảng 30 giây để máy chủ làm nóng hai company</w:t>
             </w:r>
           </w:p>
         </w:tc>
@@ -2912,7 +2840,7 @@
                 <w:sz w:val="20"/>
                 <w:szCs w:val="20"/>
               </w:rPr>
-              <w:t xml:space="preserve">Nguồn dữ liệu là Business Central</w:t>
+              <w:t xml:space="preserve">Bấm Reset MỘT lần lúc bắt đầu, rồi thôi</w:t>
             </w:r>
           </w:p>
         </w:tc>
@@ -2945,7 +2873,7 @@
                 <w:sz w:val="20"/>
                 <w:szCs w:val="20"/>
               </w:rPr>
-              <w:t xml:space="preserve">Dải ngay dưới thanh tiêu đề, nút Business Central đang tô</w:t>
+              <w:t xml:space="preserve">Khay Điều khiển demo ở góc dưới phải, nút Reset</w:t>
             </w:r>
           </w:p>
         </w:tc>
@@ -2978,7 +2906,7 @@
                 <w:sz w:val="20"/>
                 <w:szCs w:val="20"/>
               </w:rPr>
-              <w:t xml:space="preserve">Dải xanh ghi Đang đọc Business Central NWV01</w:t>
+              <w:t xml:space="preserve">Hộp thư mọi vai về màn hình chào (xoá dấu vết các lần bấm thử tối 16/09). Sau đó không bấm Reset nữa, không bấm +24 giờ trước bước 13</w:t>
             </w:r>
           </w:p>
         </w:tc>
@@ -3017,7 +2945,7 @@
                 <w:sz w:val="20"/>
                 <w:szCs w:val="20"/>
               </w:rPr>
-              <w:t xml:space="preserve">Bật AI</w:t>
+              <w:t xml:space="preserve">Nguồn dữ liệu là Business Central</w:t>
             </w:r>
           </w:p>
         </w:tc>
@@ -3050,7 +2978,7 @@
                 <w:sz w:val="20"/>
                 <w:szCs w:val="20"/>
               </w:rPr>
-              <w:t xml:space="preserve">Vai Dũng (Quản trị), tab Cài đặt AI</w:t>
+              <w:t xml:space="preserve">Dải ngay dưới thanh tiêu đề, nút Business Central đang tô</w:t>
             </w:r>
           </w:p>
         </w:tc>
@@ -3083,7 +3011,7 @@
                 <w:sz w:val="20"/>
                 <w:szCs w:val="20"/>
               </w:rPr>
-              <w:t xml:space="preserve">Ô trạng thái ghi AI đang bật; trần ngày còn ít nhất 1 USD</w:t>
+              <w:t xml:space="preserve">Dải xanh ghi Đang đọc Business Central NWV01</w:t>
             </w:r>
           </w:p>
         </w:tc>
@@ -3122,7 +3050,7 @@
                 <w:sz w:val="20"/>
                 <w:szCs w:val="20"/>
               </w:rPr>
-              <w:t xml:space="preserve">Cột Theo dõi xử lý trống</w:t>
+              <w:t xml:space="preserve">Bật AI</w:t>
             </w:r>
           </w:p>
         </w:tc>
@@ -3155,7 +3083,7 @@
                 <w:sz w:val="20"/>
                 <w:szCs w:val="20"/>
               </w:rPr>
-              <w:t xml:space="preserve">Vai Hùng, xem cột phải ở cả hai company</w:t>
+              <w:t xml:space="preserve">Vai Dũng (Quản trị), tab Cài đặt AI</w:t>
             </w:r>
           </w:p>
         </w:tc>
@@ -3188,7 +3116,7 @@
                 <w:sz w:val="20"/>
                 <w:szCs w:val="20"/>
               </w:rPr>
-              <w:t xml:space="preserve">Chưa có đề xuất nào; Marou không còn dòng Rejected</w:t>
+              <w:t xml:space="preserve">Ô trạng thái ghi AI đang bật; trần ngày còn ít nhất 1 USD</w:t>
             </w:r>
           </w:p>
         </w:tc>
@@ -3227,7 +3155,7 @@
                 <w:sz w:val="20"/>
                 <w:szCs w:val="20"/>
               </w:rPr>
-              <w:t xml:space="preserve">Đơn liên công ty đúng trạng thái</w:t>
+              <w:t xml:space="preserve">Cột Theo dõi xử lý sạch</w:t>
             </w:r>
           </w:p>
         </w:tc>
@@ -3260,7 +3188,7 @@
                 <w:sz w:val="20"/>
                 <w:szCs w:val="20"/>
               </w:rPr>
-              <w:t xml:space="preserve">Chưa bấm gì trong console. Mở BC, NWV-DAKAO, Purchase Orders</w:t>
+              <w:t xml:space="preserve">Vai Hùng, xem cột phải ở cả hai company</w:t>
             </w:r>
           </w:p>
         </w:tc>
@@ -3293,7 +3221,7 @@
                 <w:sz w:val="20"/>
                 <w:szCs w:val="20"/>
               </w:rPr>
-              <w:t xml:space="preserve">HO106200 và HO106202 còn Outstanding; HO106199 không còn</w:t>
+              <w:t xml:space="preserve">Marou: chưa có đề xuất nào. Dakao: chỉ các dòng Executed của HO106200, HO106201, HO106202 và phiếu nhận 107110</w:t>
             </w:r>
           </w:p>
         </w:tc>
@@ -3399,111 +3327,6 @@
                 <w:szCs w:val="20"/>
               </w:rPr>
               <w:t xml:space="preserve">Bấm link trong thẻ là mở được, không phải đăng nhập giữa buổi</w:t>
-            </w:r>
-          </w:p>
-        </w:tc>
-      </w:tr>
-      <w:tr>
-        <w:trPr>
-          <w:cantSplit/>
-          <w:tblHeader w:val="false"/>
-        </w:trPr>
-        <w:tc>
-          <w:tcPr>
-            <w:tcW w:type="dxa" w:w="2088"/>
-            <w:tcBorders>
-              <w:top w:val="single" w:color="A9D5E2" w:sz="4"/>
-              <w:left w:val="single" w:color="A9D5E2" w:sz="4"/>
-              <w:bottom w:val="single" w:color="A9D5E2" w:sz="4"/>
-              <w:right w:val="single" w:color="A9D5E2" w:sz="4"/>
-            </w:tcBorders>
-            <w:tcMar>
-              <w:top w:type="dxa" w:w="113"/>
-              <w:left w:type="dxa" w:w="113"/>
-              <w:bottom w:type="dxa" w:w="113"/>
-              <w:right w:type="dxa" w:w="113"/>
-            </w:tcMar>
-          </w:tcPr>
-          <w:p>
-            <w:pPr>
-              <w:spacing w:after="0" w:line="252"/>
-            </w:pPr>
-            <w:r>
-              <w:rPr>
-                <w:rFonts w:ascii="Aptos" w:cs="Aptos" w:eastAsia="Aptos" w:hAnsi="Aptos"/>
-                <w:b w:val="false"/>
-                <w:bCs w:val="false"/>
-                <w:color w:val="27343A"/>
-                <w:sz w:val="20"/>
-                <w:szCs w:val="20"/>
-              </w:rPr>
-              <w:t xml:space="preserve">Bấm Reset MỘT lần lúc bắt đầu, rồi thôi</w:t>
-            </w:r>
-          </w:p>
-        </w:tc>
-        <w:tc>
-          <w:tcPr>
-            <w:tcW w:type="dxa" w:w="4176"/>
-            <w:tcBorders>
-              <w:top w:val="single" w:color="A9D5E2" w:sz="4"/>
-              <w:left w:val="single" w:color="A9D5E2" w:sz="4"/>
-              <w:bottom w:val="single" w:color="A9D5E2" w:sz="4"/>
-              <w:right w:val="single" w:color="A9D5E2" w:sz="4"/>
-            </w:tcBorders>
-            <w:tcMar>
-              <w:top w:type="dxa" w:w="113"/>
-              <w:left w:type="dxa" w:w="113"/>
-              <w:bottom w:type="dxa" w:w="113"/>
-              <w:right w:type="dxa" w:w="113"/>
-            </w:tcMar>
-          </w:tcPr>
-          <w:p>
-            <w:pPr>
-              <w:spacing w:after="0" w:line="252"/>
-            </w:pPr>
-            <w:r>
-              <w:rPr>
-                <w:rFonts w:ascii="Aptos" w:cs="Aptos" w:eastAsia="Aptos" w:hAnsi="Aptos"/>
-                <w:b w:val="false"/>
-                <w:bCs w:val="false"/>
-                <w:color w:val="27343A"/>
-                <w:sz w:val="20"/>
-                <w:szCs w:val="20"/>
-              </w:rPr>
-              <w:t xml:space="preserve">Khay Điều khiển demo ở góc dưới phải, nút Reset</w:t>
-            </w:r>
-          </w:p>
-        </w:tc>
-        <w:tc>
-          <w:tcPr>
-            <w:tcW w:type="dxa" w:w="3374"/>
-            <w:tcBorders>
-              <w:top w:val="single" w:color="A9D5E2" w:sz="4"/>
-              <w:left w:val="single" w:color="A9D5E2" w:sz="4"/>
-              <w:bottom w:val="single" w:color="A9D5E2" w:sz="4"/>
-              <w:right w:val="single" w:color="A9D5E2" w:sz="4"/>
-            </w:tcBorders>
-            <w:tcMar>
-              <w:top w:type="dxa" w:w="113"/>
-              <w:left w:type="dxa" w:w="113"/>
-              <w:bottom w:type="dxa" w:w="113"/>
-              <w:right w:type="dxa" w:w="113"/>
-            </w:tcMar>
-          </w:tcPr>
-          <w:p>
-            <w:pPr>
-              <w:spacing w:after="0" w:line="252"/>
-            </w:pPr>
-            <w:r>
-              <w:rPr>
-                <w:rFonts w:ascii="Aptos" w:cs="Aptos" w:eastAsia="Aptos" w:hAnsi="Aptos"/>
-                <w:b w:val="false"/>
-                <w:bCs w:val="false"/>
-                <w:color w:val="27343A"/>
-                <w:sz w:val="20"/>
-                <w:szCs w:val="20"/>
-              </w:rPr>
-              <w:t xml:space="preserve">Hộp thư mọi vai về màn hình chào (xoá dấu vết các lần bấm thử tối 16/09). Sau đó không bấm Reset nữa, và không bấm +24 giờ trước bước 19</w:t>
             </w:r>
           </w:p>
         </w:tc>
@@ -3830,7 +3653,7 @@
                 <w:sz w:val="20"/>
                 <w:szCs w:val="20"/>
               </w:rPr>
-              <w:t xml:space="preserve">1, 2, 4 đến 6, 8 đến 16, 22</w:t>
+              <w:t xml:space="preserve">1 đến 4, 7, 9 đến 11, 16, 17</w:t>
             </w:r>
           </w:p>
         </w:tc>
@@ -3869,7 +3692,7 @@
                 <w:sz w:val="20"/>
                 <w:szCs w:val="20"/>
               </w:rPr>
-              <w:t xml:space="preserve">minh.s0002</w:t>
+              <w:t xml:space="preserve">hung.dieuphoi</w:t>
             </w:r>
           </w:p>
         </w:tc>
@@ -3902,7 +3725,7 @@
                 <w:sz w:val="20"/>
                 <w:szCs w:val="20"/>
               </w:rPr>
-              <w:t xml:space="preserve">Quản lý Cửa hàng Hà Nội (S0002)</w:t>
+              <w:t xml:space="preserve">Điều phối kho</w:t>
             </w:r>
           </w:p>
         </w:tc>
@@ -3935,7 +3758,7 @@
                 <w:sz w:val="20"/>
                 <w:szCs w:val="20"/>
               </w:rPr>
-              <w:t xml:space="preserve">Dakao</w:t>
+              <w:t xml:space="preserve">Cả hai</w:t>
             </w:r>
           </w:p>
         </w:tc>
@@ -3968,7 +3791,7 @@
                 <w:sz w:val="20"/>
                 <w:szCs w:val="20"/>
               </w:rPr>
-              <w:t xml:space="preserve">3, 21</w:t>
+              <w:t xml:space="preserve">5, 8, 12, 14, 15</w:t>
             </w:r>
           </w:p>
         </w:tc>
@@ -4007,7 +3830,7 @@
                 <w:sz w:val="20"/>
                 <w:szCs w:val="20"/>
               </w:rPr>
-              <w:t xml:space="preserve">hung.dieuphoi</w:t>
+              <w:t xml:space="preserve">minh.s0002</w:t>
             </w:r>
           </w:p>
         </w:tc>
@@ -4040,7 +3863,7 @@
                 <w:sz w:val="20"/>
                 <w:szCs w:val="20"/>
               </w:rPr>
-              <w:t xml:space="preserve">Điều phối kho</w:t>
+              <w:t xml:space="preserve">Quản lý Cửa hàng Hà Nội (S0002)</w:t>
             </w:r>
           </w:p>
         </w:tc>
@@ -4073,7 +3896,7 @@
                 <w:sz w:val="20"/>
                 <w:szCs w:val="20"/>
               </w:rPr>
-              <w:t xml:space="preserve">Cả hai</w:t>
+              <w:t xml:space="preserve">Dakao</w:t>
             </w:r>
           </w:p>
         </w:tc>
@@ -4106,7 +3929,7 @@
                 <w:sz w:val="20"/>
                 <w:szCs w:val="20"/>
               </w:rPr>
-              <w:t xml:space="preserve">7, 17, 18, 20, 21</w:t>
+              <w:t xml:space="preserve">6, và xem hộp thư sau bước 15</w:t>
             </w:r>
           </w:p>
         </w:tc>
@@ -4244,7 +4067,7 @@
                 <w:sz w:val="20"/>
                 <w:szCs w:val="20"/>
               </w:rPr>
-              <w:t xml:space="preserve">19</w:t>
+              <w:t xml:space="preserve">13</w:t>
             </w:r>
           </w:p>
         </w:tc>
@@ -4382,7 +4205,7 @@
                 <w:sz w:val="20"/>
                 <w:szCs w:val="20"/>
               </w:rPr>
-              <w:t xml:space="preserve">23</w:t>
+              <w:t xml:space="preserve">18</w:t>
             </w:r>
           </w:p>
         </w:tc>
@@ -4427,7 +4250,7 @@
           <w:rFonts w:ascii="Aptos" w:cs="Aptos" w:eastAsia="Aptos" w:hAnsi="Aptos"/>
           <w:color w:val="27343A"/>
         </w:rPr>
-        <w:t xml:space="preserve">Bấm nút kịch bản là console tự đổi vai và đổi company cho đúng bước, rồi điền câu và gửi. Ô hướng dẫn màu vàng dưới danh sách ghi bước đó chứng minh điều gì. Các bước vẽ nét đứt là bước bấm trên thẻ trong hộp thư, console chỉ đổi vai và hiện hướng dẫn.</w:t>
+        <w:t xml:space="preserve">Bấm nút kịch bản là console tự đổi vai và đổi company cho đúng bước, rồi điền câu và gửi; tên nút chính là câu gửi đi, dòng nhỏ dưới tên là mạch chuyện. Ô hướng dẫn hiện ngay dưới nút vừa bấm. Các bước vẽ nét đứt là bước bấm trên thẻ trong hộp thư, console chỉ đổi vai và nói bấm gì. Bước gọi vòng (12, 15) báo đã gửi tin cho những ai, vì tin đi sang hộp thư người khác.</w:t>
       </w:r>
     </w:p>
     <w:p>
@@ -4455,7 +4278,7 @@
           <w:sz w:val="40"/>
           <w:szCs w:val="40"/>
         </w:rPr>
-        <w:t xml:space="preserve">3. Hai mươi ba bước</w:t>
+        <w:t xml:space="preserve">3. Mười tám bước</w:t>
       </w:r>
     </w:p>
     <w:p>
@@ -4467,7 +4290,7 @@
           <w:rFonts w:ascii="Aptos" w:cs="Aptos" w:eastAsia="Aptos" w:hAnsi="Aptos"/>
           <w:color w:val="27343A"/>
         </w:rPr>
-        <w:t xml:space="preserve">Mỗi bước bốn cột: bấm gì, khách thấy gì, nói gì. Cột khách thấy gì là dấu hiệu bước đã xong, đừng bấm tiếp khi chưa thấy.</w:t>
+        <w:t xml:space="preserve">Mỗi bước ba cột: bấm gì, khách thấy gì, nói gì. Cột khách thấy gì là dấu hiệu bước đã xong, đừng bấm tiếp khi chưa thấy.</w:t>
       </w:r>
     </w:p>
     <w:p>
@@ -4490,7 +4313,7 @@
           <w:sz w:val="28"/>
           <w:szCs w:val="28"/>
         </w:rPr>
-        <w:t xml:space="preserve">Phần 1 · Nhìn toàn cảnh buổi sáng</w:t>
+        <w:t xml:space="preserve">Phần 1 · Sáng nay ở Marou: sức khỏe tồn kho</w:t>
       </w:r>
     </w:p>
     <w:p>
@@ -4685,7 +4508,7 @@
                 <w:sz w:val="20"/>
                 <w:szCs w:val="20"/>
               </w:rPr>
-              <w:t xml:space="preserve">Bốn con số lớn ở hàng trên, bảng dòng ở dưới, thẻ Chốt ngày 17/09/2026. Bấm một tầng để lọc.</w:t>
+              <w:t xml:space="preserve">Bốn con số lớn ở hàng trên, bảng dòng ở dưới, thẻ Ngày làm việc 17/09/2026. Bấm một tầng để lọc.</w:t>
             </w:r>
           </w:p>
         </w:tc>
@@ -5084,7 +4907,7 @@
           <w:sz w:val="28"/>
           <w:szCs w:val="28"/>
         </w:rPr>
-        <w:t xml:space="preserve">Phần 2 · Cửa hàng hết hàng, LS tính, AI đề xuất</w:t>
+        <w:t xml:space="preserve">Phần 2 · Một lô cận date: AI phân tích, chọn phương án</w:t>
       </w:r>
     </w:p>
     <w:p>
@@ -5107,7 +4930,7 @@
           <w:sz w:val="28"/>
           <w:szCs w:val="28"/>
         </w:rPr>
-        <w:t xml:space="preserve">Bước 3 · Minh (S0002): sắp hết Ice cream</w:t>
+        <w:t xml:space="preserve">Bước 3 · Lô nào sắp hết hạn?</w:t>
       </w:r>
     </w:p>
     <w:p>
@@ -5119,7 +4942,7 @@
           <w:rFonts w:ascii="Aptos" w:cs="Aptos" w:eastAsia="Aptos" w:hAnsi="Aptos"/>
           <w:color w:val="27343A"/>
         </w:rPr>
-        <w:t xml:space="preserve">Vai: minh.s0002 · Dakao</w:t>
+        <w:t xml:space="preserve">Vai: trang.sc · Marou</w:t>
       </w:r>
     </w:p>
     <w:tbl>
@@ -5246,7 +5069,7 @@
                 <w:sz w:val="20"/>
                 <w:szCs w:val="20"/>
               </w:rPr>
-              <w:t xml:space="preserve">Nút 3. Console đổi sang Minh, gửi câu “sắp hết Ice cream ở cửa hàng tôi”.</w:t>
+              <w:t xml:space="preserve">Nút 3.</w:t>
             </w:r>
           </w:p>
         </w:tc>
@@ -5279,7 +5102,7 @@
                 <w:sz w:val="20"/>
                 <w:szCs w:val="20"/>
               </w:rPr>
-              <w:t xml:space="preserve">Trợ lý: Ice cream tại S0002 còn 8, đủ 5,5 ngày; theo LS Replenishment đề xuất đặt mua 12 từ MAROU giao thẳng tới S0002, đang xin điều phối duyệt.</w:t>
+              <w:t xml:space="preserve">36 lô cận date, chia theo địa điểm; 5 thẻ lô giá trị lớn nhất. Thẻ Choco pillar S0010: 470 cái, 26 ngày, bán không kịp; hai nút Đề xuất giảm giá và Phương án xử lý.</w:t>
             </w:r>
           </w:p>
         </w:tc>
@@ -5327,7 +5150,7 @@
           <w:rFonts w:ascii="Aptos" w:cs="Aptos" w:eastAsia="Aptos" w:hAnsi="Aptos"/>
           <w:color w:val="27343A"/>
         </w:rPr>
-        <w:t xml:space="preserve">Cửa hàng chỉ nói một câu tự nhiên. Trợ lý nhận ra mặt hàng và cửa hàng của người hỏi, đọc con số LS đã tính, ghi một đề xuất vào Business Central và gửi người duyệt.</w:t>
+        <w:t xml:space="preserve">Câu này trợ lý đọc thẳng bảng. Điều phối thấy toàn hệ thống; quản lý cửa hàng hỏi cùng câu chỉ thấy cửa hàng mình.</w:t>
       </w:r>
     </w:p>
     <w:p>
@@ -5344,41 +5167,7 @@
           <w:rFonts w:ascii="Aptos" w:cs="Aptos" w:eastAsia="Aptos" w:hAnsi="Aptos"/>
           <w:color w:val="27343A"/>
         </w:rPr>
-        <w:t xml:space="preserve">Trợ lý không tự tính số. 12 là số của LS Replenishment, kiểu min-max: điểm đặt lại 8, mức tối đa 20.</w:t>
-      </w:r>
-    </w:p>
-    <w:p>
-      <w:pPr>
-        <w:pStyle w:val="ListParagraph"/>
-        <w:numPr>
-          <w:ilvl w:val="0"/>
-          <w:numId w:val="2"/>
-        </w:numPr>
-        <w:spacing w:after="80" w:line="276"/>
-      </w:pPr>
-      <w:r>
-        <w:rPr>
-          <w:rFonts w:ascii="Aptos" w:cs="Aptos" w:eastAsia="Aptos" w:hAnsi="Aptos"/>
-          <w:color w:val="27343A"/>
-        </w:rPr>
-        <w:t xml:space="preserve">Dakao là bán lẻ, không có kho trung tâm: đề xuất là đặt mua từ Marou, giao thẳng cửa hàng. Đây là mô hình hai đơn vị của Marou.</w:t>
-      </w:r>
-    </w:p>
-    <w:p>
-      <w:pPr>
-        <w:pBdr>
-          <w:left w:val="single" w:color="C89B72" w:sz="36" w:space="10"/>
-        </w:pBdr>
-        <w:shd w:fill="F4EEE8" w:val="clear"/>
-        <w:spacing w:after="200" w:before="120" w:line="276"/>
-        <w:ind w:left="200" w:right="120"/>
-      </w:pPr>
-      <w:r>
-        <w:rPr>
-          <w:rFonts w:ascii="Aptos" w:cs="Aptos" w:eastAsia="Aptos" w:hAnsi="Aptos"/>
-          <w:color w:val="27343A"/>
-        </w:rPr>
-        <w:t xml:space="preserve">Bước này ghi thật một đề xuất vào Business Central.</w:t>
+        <w:t xml:space="preserve">Chọn Choco pillar để đi tiếp: 470 cái mà 26 ngày nữa hết hạn, tại chỗ bán không kịp.</w:t>
       </w:r>
     </w:p>
     <w:p>
@@ -5401,7 +5190,7 @@
           <w:sz w:val="28"/>
           <w:szCs w:val="28"/>
         </w:rPr>
-        <w:t xml:space="preserve">Bước 4 · Vì sao LS ra 12 Ice cream</w:t>
+        <w:t xml:space="preserve">Bước 4 · Phương án xử lý cho Choco pillar</w:t>
       </w:r>
     </w:p>
     <w:p>
@@ -5413,7 +5202,7 @@
           <w:rFonts w:ascii="Aptos" w:cs="Aptos" w:eastAsia="Aptos" w:hAnsi="Aptos"/>
           <w:color w:val="27343A"/>
         </w:rPr>
-        <w:t xml:space="preserve">Vai: trang.sc · Dakao</w:t>
+        <w:t xml:space="preserve">Vai: trang.sc · Marou</w:t>
       </w:r>
     </w:p>
     <w:tbl>
@@ -5540,7 +5329,7 @@
                 <w:sz w:val="20"/>
                 <w:szCs w:val="20"/>
               </w:rPr>
-              <w:t xml:space="preserve">Nút 4.</w:t>
+              <w:t xml:space="preserve">Nút 4 chỉ hiện hướng dẫn. Trên thẻ Choco pillar bấm Phương án xử lý.</w:t>
             </w:r>
           </w:p>
         </w:tc>
@@ -5573,7 +5362,7 @@
                 <w:sz w:val="20"/>
                 <w:szCs w:val="20"/>
               </w:rPr>
-              <w:t xml:space="preserve">Thẻ Vì sao LS đề xuất 12 Ice cream cho S0002: Stock Levels, Reorder Point 8, Maximum Inventory 20, tồn 8, quyết định Brought to Maximum Inventory. Link mở nhật ký tính của LS.</w:t>
+              <w:t xml:space="preserve">Sau khoảng 6 giây: thẻ bảng năm phương án kèm giá trị cứu được hoặc mất, lời khuyên của model (chuyển 199 sang S0001 bán nhanh hơn), nút ghi đề xuất. Bấm nút đó.</w:t>
             </w:r>
           </w:p>
         </w:tc>
@@ -5621,7 +5410,7 @@
           <w:rFonts w:ascii="Aptos" w:cs="Aptos" w:eastAsia="Aptos" w:hAnsi="Aptos"/>
           <w:color w:val="27343A"/>
         </w:rPr>
-        <w:t xml:space="preserve">Từng bước là nhật ký tính của LS Replenishment dịch sang tiếng Việt, trợ lý không tính lại. Ai cũng đối chiếu được bằng link.</w:t>
+        <w:t xml:space="preserve">Code tính năm phương án: giữ, chuyển, chuyển kèm giảm giá, giảm giá, huỷ. Khả năng nhận của từng cửa hàng bằng bán bình quân nhân ngày còn lại trừ tồn họ đang có.</w:t>
       </w:r>
     </w:p>
     <w:p>
@@ -5638,7 +5427,24 @@
           <w:rFonts w:ascii="Aptos" w:cs="Aptos" w:eastAsia="Aptos" w:hAnsi="Aptos"/>
           <w:color w:val="27343A"/>
         </w:rPr>
-        <w:t xml:space="preserve">Tham số nằm trên Item Card của LS, Marou tự sửa, không sửa code.</w:t>
+        <w:t xml:space="preserve">Model chọn một và nói vì sao. Nó được chọn khác code, miễn nói được lý do trên số đã có. Khoá phương án phải nằm trong bảng, chữ số phải có trong dữ liệu.</w:t>
+      </w:r>
+    </w:p>
+    <w:p>
+      <w:pPr>
+        <w:pStyle w:val="ListParagraph"/>
+        <w:numPr>
+          <w:ilvl w:val="0"/>
+          <w:numId w:val="2"/>
+        </w:numPr>
+        <w:spacing w:after="80" w:line="276"/>
+      </w:pPr>
+      <w:r>
+        <w:rPr>
+          <w:rFonts w:ascii="Aptos" w:cs="Aptos" w:eastAsia="Aptos" w:hAnsi="Aptos"/>
+          <w:color w:val="27343A"/>
+        </w:rPr>
+        <w:t xml:space="preserve">Đây là UC2 nối sang UC5: hàng cận date đi về nơi bán nhanh, không phải huỷ.</w:t>
       </w:r>
     </w:p>
     <w:p>
@@ -5661,7 +5467,7 @@
           <w:sz w:val="28"/>
           <w:szCs w:val="28"/>
         </w:rPr>
-        <w:t xml:space="preserve">Bước 5 · Croissant chocolate: 42 ngày hết hàng</w:t>
+        <w:t xml:space="preserve">Bước 5 · Hùng duyệt chuyển hàng</w:t>
       </w:r>
     </w:p>
     <w:p>
@@ -5673,7 +5479,7 @@
           <w:rFonts w:ascii="Aptos" w:cs="Aptos" w:eastAsia="Aptos" w:hAnsi="Aptos"/>
           <w:color w:val="27343A"/>
         </w:rPr>
-        <w:t xml:space="preserve">Vai: trang.sc · Dakao</w:t>
+        <w:t xml:space="preserve">Vai: hung.dieuphoi · Marou</w:t>
       </w:r>
     </w:p>
     <w:tbl>
@@ -5800,7 +5606,7 @@
                 <w:sz w:val="20"/>
                 <w:szCs w:val="20"/>
               </w:rPr>
-              <w:t xml:space="preserve">Nút 5.</w:t>
+              <w:t xml:space="preserve">Nút 5 đổi sang Hùng. Bấm Duyệt chuyển hàng trên thẻ đề xuất 199 Choco pillar S0010 sang S0001.</w:t>
             </w:r>
           </w:p>
         </w:tc>
@@ -5833,7 +5639,7 @@
                 <w:sz w:val="20"/>
                 <w:szCs w:val="20"/>
               </w:rPr>
-              <w:t xml:space="preserve">Thẻ giải thích Average Usage: bán bình quân 8,6/ngày, phủ 2 ngày, tồn 11 nên mua 7. Dòng cảnh báo: LS đếm 42 trên 56 ngày là hết hàng, quá nửa cửa sổ.</w:t>
+              <w:t xml:space="preserve">Thẻ Đã duyệt kèm số Transfer Order và link mở trong BC; cột phải Transfer Order có dòng mới, trạng thái Open.</w:t>
             </w:r>
           </w:p>
         </w:tc>
@@ -5881,7 +5687,7 @@
           <w:rFonts w:ascii="Aptos" w:cs="Aptos" w:eastAsia="Aptos" w:hAnsi="Aptos"/>
           <w:color w:val="27343A"/>
         </w:rPr>
-        <w:t xml:space="preserve">Đây là Out of Stock của LS: ngày hết hàng bị bỏ khỏi bán bình quân để không kéo nhu cầu xuống. Bánh tươi huỷ cuối ngày nên tồn về 0 mỗi tối và bị đếm là hết hàng.</w:t>
+        <w:t xml:space="preserve">Đề xuất ghi vào một bảng riêng trong Business Central, trạng thái luôn vào ở Proposed. Không có đường tắt cho trợ lý ghi thẳng chứng từ.</w:t>
       </w:r>
     </w:p>
     <w:p>
@@ -5898,7 +5704,7 @@
           <w:rFonts w:ascii="Aptos" w:cs="Aptos" w:eastAsia="Aptos" w:hAnsi="Aptos"/>
           <w:color w:val="27343A"/>
         </w:rPr>
-        <w:t xml:space="preserve">Trợ lý không chỉ đọc số, nó chỉ ra chỗ cần xem lại cách LS ghi Out of Stock. Đó là insight, không phải báo cáo.</w:t>
+        <w:t xml:space="preserve">Chứng từ mang số đề xuất, kiểm toán truy ngược được từ chứng từ về đề xuất và về dòng dữ liệu gốc.</w:t>
       </w:r>
     </w:p>
     <w:p>
@@ -5921,7 +5727,30 @@
           <w:sz w:val="28"/>
           <w:szCs w:val="28"/>
         </w:rPr>
-        <w:t xml:space="preserve">Bước 6 · Choco nuts S0001: tồn 0, 82 đang về</w:t>
+        <w:t xml:space="preserve">Phần 3 · Cửa hàng bán lẻ hết hàng: LS tính, AI đề xuất</w:t>
+      </w:r>
+    </w:p>
+    <w:p>
+      <w:pPr>
+        <w:pStyle w:val="Heading2"/>
+        <w:keepNext/>
+        <w:keepLines/>
+        <w:pBdr>
+          <w:left w:val="single" w:color="4BACC6" w:sz="24" w:space="10"/>
+        </w:pBdr>
+        <w:spacing w:after="120" w:before="280"/>
+        <w:ind w:left="170"/>
+      </w:pPr>
+      <w:r>
+        <w:rPr>
+          <w:rFonts w:ascii="Aptos" w:cs="Aptos" w:eastAsia="Aptos" w:hAnsi="Aptos"/>
+          <w:b/>
+          <w:bCs/>
+          <w:color w:val="27343A"/>
+          <w:sz w:val="28"/>
+          <w:szCs w:val="28"/>
+        </w:rPr>
+        <w:t xml:space="preserve">Bước 6 · Sắp hết Ice cream ở cửa hàng tôi</w:t>
       </w:r>
     </w:p>
     <w:p>
@@ -5933,7 +5762,7 @@
           <w:rFonts w:ascii="Aptos" w:cs="Aptos" w:eastAsia="Aptos" w:hAnsi="Aptos"/>
           <w:color w:val="27343A"/>
         </w:rPr>
-        <w:t xml:space="preserve">Vai: trang.sc · Dakao</w:t>
+        <w:t xml:space="preserve">Vai: minh.s0002 · Dakao</w:t>
       </w:r>
     </w:p>
     <w:tbl>
@@ -6060,7 +5889,7 @@
                 <w:sz w:val="20"/>
                 <w:szCs w:val="20"/>
               </w:rPr>
-              <w:t xml:space="preserve">Nút 6.</w:t>
+              <w:t xml:space="preserve">Nút 6. Console đổi sang Minh và gửi câu.</w:t>
             </w:r>
           </w:p>
         </w:tc>
@@ -6093,7 +5922,7 @@
                 <w:sz w:val="20"/>
                 <w:szCs w:val="20"/>
               </w:rPr>
-              <w:t xml:space="preserve">Thẻ: tồn 0 cộng hàng mua đang về 82, bán 11,9/ngày, phủ 7 ngày, nên chỉ đề xuất thêm 2.</w:t>
+              <w:t xml:space="preserve">Trợ lý: Ice cream tại S0002 còn 8, đủ 5,5 ngày; theo LS Replenishment đề xuất đặt mua 12 từ MAROU giao thẳng tới S0002, đang xin điều phối duyệt.</w:t>
             </w:r>
           </w:p>
         </w:tc>
@@ -6141,7 +5970,7 @@
           <w:rFonts w:ascii="Aptos" w:cs="Aptos" w:eastAsia="Aptos" w:hAnsi="Aptos"/>
           <w:color w:val="27343A"/>
         </w:rPr>
-        <w:t xml:space="preserve">Cửa hàng Quận 1 đã hết Choco nuts. LS biết 82 cái đang về theo đơn HO106202, Marou đã xuất kho. Phần 5 sẽ thấy đơn này đi tiếp.</w:t>
+        <w:t xml:space="preserve">Cửa hàng chỉ nói một câu tự nhiên. Trợ lý nhận ra mặt hàng và cửa hàng của người hỏi, đọc con số LS đã tính, ghi đề xuất vào Business Central và gửi người duyệt.</w:t>
       </w:r>
     </w:p>
     <w:p>
@@ -6158,7 +5987,41 @@
           <w:rFonts w:ascii="Aptos" w:cs="Aptos" w:eastAsia="Aptos" w:hAnsi="Aptos"/>
           <w:color w:val="27343A"/>
         </w:rPr>
-        <w:t xml:space="preserve">Stock-out risk ở đây là con số có gốc: bán bình quân, ngày phủ, hàng đang về. Không phải cảm giác.</w:t>
+        <w:t xml:space="preserve">Trợ lý không tự tính số. 12 là số của LS Replenishment, kiểu min-max: điểm đặt lại 8, mức tối đa 20.</w:t>
+      </w:r>
+    </w:p>
+    <w:p>
+      <w:pPr>
+        <w:pStyle w:val="ListParagraph"/>
+        <w:numPr>
+          <w:ilvl w:val="0"/>
+          <w:numId w:val="2"/>
+        </w:numPr>
+        <w:spacing w:after="80" w:line="276"/>
+      </w:pPr>
+      <w:r>
+        <w:rPr>
+          <w:rFonts w:ascii="Aptos" w:cs="Aptos" w:eastAsia="Aptos" w:hAnsi="Aptos"/>
+          <w:color w:val="27343A"/>
+        </w:rPr>
+        <w:t xml:space="preserve">Dakao là bán lẻ, không có kho trung tâm: đề xuất là đặt mua từ Marou, giao thẳng cửa hàng. Đây là mô hình hai đơn vị của Marou.</w:t>
+      </w:r>
+    </w:p>
+    <w:p>
+      <w:pPr>
+        <w:pBdr>
+          <w:left w:val="single" w:color="C89B72" w:sz="36" w:space="10"/>
+        </w:pBdr>
+        <w:shd w:fill="F4EEE8" w:val="clear"/>
+        <w:spacing w:after="200" w:before="120" w:line="276"/>
+        <w:ind w:left="200" w:right="120"/>
+      </w:pPr>
+      <w:r>
+        <w:rPr>
+          <w:rFonts w:ascii="Aptos" w:cs="Aptos" w:eastAsia="Aptos" w:hAnsi="Aptos"/>
+          <w:color w:val="27343A"/>
+        </w:rPr>
+        <w:t xml:space="preserve">Bước này ghi thật một đề xuất vào Business Central. Bấm lần hai thì trợ lý nói đã có đề xuất, không ghi thêm.</w:t>
       </w:r>
     </w:p>
     <w:p>
@@ -6181,7 +6044,7 @@
           <w:sz w:val="28"/>
           <w:szCs w:val="28"/>
         </w:rPr>
-        <w:t xml:space="preserve">Bước 7 · Hùng duyệt đặt mua, gửi đơn sang Marou</w:t>
+        <w:t xml:space="preserve">Bước 7 · Vì sao LS đề xuất Ice cream cho S0002?</w:t>
       </w:r>
     </w:p>
     <w:p>
@@ -6193,7 +6056,7 @@
           <w:rFonts w:ascii="Aptos" w:cs="Aptos" w:eastAsia="Aptos" w:hAnsi="Aptos"/>
           <w:color w:val="27343A"/>
         </w:rPr>
-        <w:t xml:space="preserve">Vai: hung.dieuphoi · Dakao</w:t>
+        <w:t xml:space="preserve">Vai: trang.sc · Dakao</w:t>
       </w:r>
     </w:p>
     <w:tbl>
@@ -6320,7 +6183,7 @@
                 <w:sz w:val="20"/>
                 <w:szCs w:val="20"/>
               </w:rPr>
-              <w:t xml:space="preserve">Nút 7 đổi sang Hùng. Trong hộp thư: thẻ Đề xuất đặt mua Ice cream, bấm Duyệt đặt mua. Thẻ Đã tạo Purchase Order hiện nút Gửi đơn sang Marou, bấm tiếp.</w:t>
+              <w:t xml:space="preserve">Nút 7.</w:t>
             </w:r>
           </w:p>
         </w:tc>
@@ -6353,7 +6216,7 @@
                 <w:sz w:val="20"/>
                 <w:szCs w:val="20"/>
               </w:rPr>
-              <w:t xml:space="preserve">Thẻ Đã tạo Purchase Order HO1062xx kèm link mở đơn. Sau khi gửi: thẻ báo đơn Released, bên Marou có Sales Order S900xx.</w:t>
+              <w:t xml:space="preserve">AI viết vài câu: Stock Levels, Reorder Point 8, Maximum 20, tồn 8 nên mua 12; bảng nhật ký tính thu gọn bên dưới; link mở nhật ký tính của LS.</w:t>
             </w:r>
           </w:p>
         </w:tc>
@@ -6401,7 +6264,7 @@
           <w:rFonts w:ascii="Aptos" w:cs="Aptos" w:eastAsia="Aptos" w:hAnsi="Aptos"/>
           <w:color w:val="27343A"/>
         </w:rPr>
-        <w:t xml:space="preserve">Đề xuất vào một bảng riêng, trạng thái Proposed. Người bấm Duyệt là người của Marou, dưới quyền của họ. Trợ lý không có đường tắt ghi thẳng vào chứng từ.</w:t>
+        <w:t xml:space="preserve">Từng bước là nhật ký tính của LS Replenishment, trợ lý không tính lại. Ai cũng đối chiếu được bằng link.</w:t>
       </w:r>
     </w:p>
     <w:p>
@@ -6418,24 +6281,7 @@
           <w:rFonts w:ascii="Aptos" w:cs="Aptos" w:eastAsia="Aptos" w:hAnsi="Aptos"/>
           <w:color w:val="27343A"/>
         </w:rPr>
-        <w:t xml:space="preserve">Gửi đơn sang Marou là Intercompany chuẩn của Business Central: đơn mua bên Dakao thành đơn bán bên Marou, không nhập lại. Trợ lý không tự bấm nút này vì gửi kéo theo Release.</w:t>
-      </w:r>
-    </w:p>
-    <w:p>
-      <w:pPr>
-        <w:pBdr>
-          <w:left w:val="single" w:color="C89B72" w:sz="36" w:space="10"/>
-        </w:pBdr>
-        <w:shd w:fill="F4EEE8" w:val="clear"/>
-        <w:spacing w:after="200" w:before="120" w:line="276"/>
-        <w:ind w:left="200" w:right="120"/>
-      </w:pPr>
-      <w:r>
-        <w:rPr>
-          <w:rFonts w:ascii="Aptos" w:cs="Aptos" w:eastAsia="Aptos" w:hAnsi="Aptos"/>
-          <w:color w:val="27343A"/>
-        </w:rPr>
-        <w:t xml:space="preserve">Nếu chỉ muốn diễn mà không ghi, đổi dải nguồn sang mô phỏng trước khi bấm. Nhưng làm vậy thì phần 5 không khép được vòng.</w:t>
+        <w:t xml:space="preserve">Tham số nằm trên Item Card của LS, Marou tự sửa, không sửa code.</w:t>
       </w:r>
     </w:p>
     <w:p>
@@ -6458,7 +6304,7 @@
           <w:sz w:val="28"/>
           <w:szCs w:val="28"/>
         </w:rPr>
-        <w:t xml:space="preserve">Bước 8 · Câu hỏi mở cho model</w:t>
+        <w:t xml:space="preserve">Bước 8 · Hùng duyệt đặt mua, gửi đơn sang Marou</w:t>
       </w:r>
     </w:p>
     <w:p>
@@ -6470,7 +6316,7 @@
           <w:rFonts w:ascii="Aptos" w:cs="Aptos" w:eastAsia="Aptos" w:hAnsi="Aptos"/>
           <w:color w:val="27343A"/>
         </w:rPr>
-        <w:t xml:space="preserve">Vai: trang.sc · Dakao</w:t>
+        <w:t xml:space="preserve">Vai: hung.dieuphoi · Dakao</w:t>
       </w:r>
     </w:p>
     <w:tbl>
@@ -6597,7 +6443,7 @@
                 <w:sz w:val="20"/>
                 <w:szCs w:val="20"/>
               </w:rPr>
-              <w:t xml:space="preserve">Nút 8. Câu: so sánh tốc độ bán Choco nuts giữa các cửa hàng trong 30 ngày qua.</w:t>
+              <w:t xml:space="preserve">Nút 8 đổi sang Hùng. Thẻ Đề xuất đặt mua Ice cream: bấm Duyệt đặt mua. Thẻ Đã tạo Purchase Order hiện nút Gửi đơn sang Marou, bấm tiếp.</w:t>
             </w:r>
           </w:p>
         </w:tc>
@@ -6630,7 +6476,7 @@
                 <w:sz w:val="20"/>
                 <w:szCs w:val="20"/>
               </w:rPr>
-              <w:t xml:space="preserve">Sau khoảng 15 giây: bảng tốc độ bán từng cửa hàng và kết luận S0001 bán nhanh nhất. Thẻ ghi Nguồn: model tự dựng chuỗi tra cứu, 7 bước, số token, nút Xem 7 bước tôi đã tra.</w:t>
+              <w:t xml:space="preserve">Thẻ Đã tạo Purchase Order HO1062xx kèm link mở đơn. Sau khi gửi: thẻ báo đơn Released, bên Marou có Sales Order S900xx.</w:t>
             </w:r>
           </w:p>
         </w:tc>
@@ -6678,41 +6524,7 @@
           <w:rFonts w:ascii="Aptos" w:cs="Aptos" w:eastAsia="Aptos" w:hAnsi="Aptos"/>
           <w:color w:val="27343A"/>
         </w:rPr>
-        <w:t xml:space="preserve">Không có rule nào cho câu này. Model tự chọn đọc gì, đọc mấy lần, rồi trả lời. Mỗi con số chép từ kết quả tra cứu, bấm nút là thấy từng bước.</w:t>
-      </w:r>
-    </w:p>
-    <w:p>
-      <w:pPr>
-        <w:pStyle w:val="ListParagraph"/>
-        <w:numPr>
-          <w:ilvl w:val="0"/>
-          <w:numId w:val="2"/>
-        </w:numPr>
-        <w:spacing w:after="80" w:line="276"/>
-      </w:pPr>
-      <w:r>
-        <w:rPr>
-          <w:rFonts w:ascii="Aptos" w:cs="Aptos" w:eastAsia="Aptos" w:hAnsi="Aptos"/>
-          <w:color w:val="27343A"/>
-        </w:rPr>
-        <w:t xml:space="preserve">Câu này khoảng 12 nghìn token, tức chưa tới nửa cent. Chi phí xem ở bước 23.</w:t>
-      </w:r>
-    </w:p>
-    <w:p>
-      <w:pPr>
-        <w:pBdr>
-          <w:left w:val="single" w:color="C89B72" w:sz="36" w:space="10"/>
-        </w:pBdr>
-        <w:shd w:fill="F4EEE8" w:val="clear"/>
-        <w:spacing w:after="200" w:before="120" w:line="276"/>
-        <w:ind w:left="200" w:right="120"/>
-      </w:pPr>
-      <w:r>
-        <w:rPr>
-          <w:rFonts w:ascii="Aptos" w:cs="Aptos" w:eastAsia="Aptos" w:hAnsi="Aptos"/>
-          <w:color w:val="27343A"/>
-        </w:rPr>
-        <w:t xml:space="preserve">Câu hỏi có chữ “Marou” kèm “về” hay “xuất kho” sẽ bị hiểu là hỏi hàng liên công ty. Giữ đúng câu trên nút.</w:t>
+        <w:t xml:space="preserve">Gửi đơn sang Marou là Intercompany chuẩn của Business Central: đơn mua bên Dakao thành đơn bán bên Marou, không nhập lại. Trợ lý không tự bấm nút này vì gửi kéo theo Release.</w:t>
       </w:r>
     </w:p>
     <w:p>
@@ -6735,7 +6547,7 @@
           <w:sz w:val="28"/>
           <w:szCs w:val="28"/>
         </w:rPr>
-        <w:t xml:space="preserve">Bước 9 · Đề xuất bổ sung nào bất thường</w:t>
+        <w:t xml:space="preserve">Bước 9 · Tổng hợp những đề xuất bổ sung bất thường</w:t>
       </w:r>
     </w:p>
     <w:p>
@@ -6874,7 +6686,7 @@
                 <w:sz w:val="20"/>
                 <w:szCs w:val="20"/>
               </w:rPr>
-              <w:t xml:space="preserve">Nút 9. Câu: tổng hợp những đề xuất bổ sung bất thường.</w:t>
+              <w:t xml:space="preserve">Nút 9.</w:t>
             </w:r>
           </w:p>
         </w:tc>
@@ -6907,7 +6719,7 @@
                 <w:sz w:val="20"/>
                 <w:szCs w:val="20"/>
               </w:rPr>
-              <w:t xml:space="preserve">Sau khoảng 10 giây: danh sách vài dòng LS đang đề xuất mà có dấu hiệu lạ, mỗi dòng nói vì sao (số ngày hết hàng, bán bình quân, số ngày phủ, kho cấp) và việc nên làm. Thẻ ghi Nguồn: model tự dựng chuỗi tra cứu.</w:t>
+              <w:t xml:space="preserve">Sau khoảng 15 giây: danh sách đề xuất của LS theo cửa hàng, dòng nào có dấu hiệu lạ nói vì sao (hết hàng quá nửa cửa sổ tính, không có bán bình quân, tồn bằng 0) và việc nên làm. Nhãn AI viết.</w:t>
             </w:r>
           </w:p>
         </w:tc>
@@ -6972,24 +6784,7 @@
           <w:rFonts w:ascii="Aptos" w:cs="Aptos" w:eastAsia="Aptos" w:hAnsi="Aptos"/>
           <w:color w:val="27343A"/>
         </w:rPr>
-        <w:t xml:space="preserve">Code tính cờ, model diễn giải và ưu tiên. Con số nào model viết cũng phải có trong kết quả tool.</w:t>
-      </w:r>
-    </w:p>
-    <w:p>
-      <w:pPr>
-        <w:pStyle w:val="ListParagraph"/>
-        <w:numPr>
-          <w:ilvl w:val="0"/>
-          <w:numId w:val="2"/>
-        </w:numPr>
-        <w:spacing w:after="80" w:line="276"/>
-      </w:pPr>
-      <w:r>
-        <w:rPr>
-          <w:rFonts w:ascii="Aptos" w:cs="Aptos" w:eastAsia="Aptos" w:hAnsi="Aptos"/>
-          <w:color w:val="27343A"/>
-        </w:rPr>
-        <w:t xml:space="preserve">Câu này trước đây bị hiểu là tổng hợp việc hôm nay; giờ chữ bất thường đi với đề xuất là chuyển cho model.</w:t>
+        <w:t xml:space="preserve">Croissant chocolate lộ ra ở đây: LS đếm 42 trên 56 ngày là hết hàng, vì bánh tươi huỷ cuối ngày nên tồn về 0 mỗi tối. Đó là Out of Stock cần xem lại cách ghi.</w:t>
       </w:r>
     </w:p>
     <w:p>
@@ -7006,7 +6801,7 @@
           <w:rFonts w:ascii="Aptos" w:cs="Aptos" w:eastAsia="Aptos" w:hAnsi="Aptos"/>
           <w:color w:val="27343A"/>
         </w:rPr>
-        <w:t xml:space="preserve">Câu trả lời đổi theo dữ liệu, không học thuộc. Nếu model chọn dòng khác với dự kiến thì đọc lý do nó nêu, đó chính là điểm muốn cho khách thấy.</w:t>
+        <w:t xml:space="preserve">Câu trả lời đổi theo dữ liệu, không học thuộc. Nếu model chọn dòng khác với dự kiến thì đọc lý do nó nêu.</w:t>
       </w:r>
     </w:p>
     <w:p>
@@ -7029,7 +6824,7 @@
           <w:sz w:val="28"/>
           <w:szCs w:val="28"/>
         </w:rPr>
-        <w:t xml:space="preserve">Phần 3 · Dự báo nối sang bổ sung</w:t>
+        <w:t xml:space="preserve">Phần 4 · Dự báo, một nhịp</w:t>
       </w:r>
     </w:p>
     <w:p>
@@ -7052,7 +6847,7 @@
           <w:sz w:val="28"/>
           <w:szCs w:val="28"/>
         </w:rPr>
-        <w:t xml:space="preserve">Bước 10 · Tab Dự báo: ba phương pháp</w:t>
+        <w:t xml:space="preserve">Bước 10 · Dự báo Choco bowl ở S0010 sai bao nhiêu?</w:t>
       </w:r>
     </w:p>
     <w:p>
@@ -7191,7 +6986,7 @@
                 <w:sz w:val="20"/>
                 <w:szCs w:val="20"/>
               </w:rPr>
-              <w:t xml:space="preserve">Nút 10. Console mở tab Dự báo.</w:t>
+              <w:t xml:space="preserve">Nút 10. Nếu khách hỏi WAPE, Bias là gì: mở tab Dự báo, phần Cách đọc ngay dưới tiêu đề.</w:t>
             </w:r>
           </w:p>
         </w:tc>
@@ -7224,7 +7019,7 @@
                 <w:sz w:val="20"/>
                 <w:szCs w:val="20"/>
               </w:rPr>
-              <w:t xml:space="preserve">Ba phương pháp, 74 cặp, kỳ kiểm tra 21/08 đến 17/09; biểu đồ theo ngày, 28 ngày tới, ngày sự kiện tô vàng.</w:t>
+              <w:t xml:space="preserve">Thẻ Dự báo Choco bowl tại S0010: ba phương pháp, dự báo 7 ngày tới đã ghi vào Retail Forecast Entry của LS, sự kiện KM-CHOCOBOWL-09 cộng 150% từ 23 đến 25/09.</w:t>
             </w:r>
           </w:p>
         </w:tc>
@@ -7272,7 +7067,7 @@
           <w:rFonts w:ascii="Aptos" w:cs="Aptos" w:eastAsia="Aptos" w:hAnsi="Aptos"/>
           <w:color w:val="27343A"/>
         </w:rPr>
-        <w:t xml:space="preserve">Độ chính xác đo bằng WAPE trên kỳ kiểm tra 28 ngày, học 84 ngày trước đó. Ngày hết hàng và ngày có sự kiện đã khai bị bỏ khỏi phép đo.</w:t>
+        <w:t xml:space="preserve">Dự báo không nằm ở bảng riêng của NaviWorld. Nó ghi vào bảng chuẩn của LS, nên LS Replenishment dùng được ngay.</w:t>
       </w:r>
     </w:p>
     <w:p>
@@ -7289,7 +7084,7 @@
           <w:rFonts w:ascii="Aptos" w:cs="Aptos" w:eastAsia="Aptos" w:hAnsi="Aptos"/>
           <w:color w:val="27343A"/>
         </w:rPr>
-        <w:t xml:space="preserve">Holt-Winters là mô hình thống kê chuỗi thời gian, chưa phải AI. Nói thẳng.</w:t>
+        <w:t xml:space="preserve">Holt-Winters là thống kê chuỗi thời gian, chưa phải AI. Nói thẳng. AI ở đây là phần kể lại kết quả.</w:t>
       </w:r>
     </w:p>
     <w:p>
@@ -7312,7 +7107,7 @@
           <w:sz w:val="28"/>
           <w:szCs w:val="28"/>
         </w:rPr>
-        <w:t xml:space="preserve">Bước 11 · Dự báo đang sai ở đâu</w:t>
+        <w:t xml:space="preserve">Bước 11 · CTKM nào đang chạy và sắp tới?</w:t>
       </w:r>
     </w:p>
     <w:p>
@@ -7451,7 +7246,7 @@
                 <w:sz w:val="20"/>
                 <w:szCs w:val="20"/>
               </w:rPr>
-              <w:t xml:space="preserve">Nút 11. Câu: dự báo đang lệch nhiều ở nhóm hàng nào, và vì sao.</w:t>
+              <w:t xml:space="preserve">Nút 11.</w:t>
             </w:r>
           </w:p>
         </w:tc>
@@ -7484,7 +7279,7 @@
                 <w:sz w:val="20"/>
                 <w:szCs w:val="20"/>
               </w:rPr>
-              <w:t xml:space="preserve">AI viết vài câu: nhóm BEVERAGES lệch nhất (88,9%), croissant dự báo cao hơn bán thực tế; bảng sai số theo điểm bán và nhóm hàng thu gọn bên dưới; số tổng Holt-Winters 37,0%, 74 cặp, 20 cặp cần xem.</w:t>
+              <w:t xml:space="preserve">AI viết vài câu: 3 đang chạy, 2 sắp tới, 2 CTKM thiếu nhu cầu trong LS; Choco bowl giảm 15% có Planned Event cho S0001, S0010 nhưng S0002, S0005 chưa có.</w:t>
             </w:r>
           </w:p>
         </w:tc>
@@ -7532,7 +7327,7 @@
           <w:rFonts w:ascii="Aptos" w:cs="Aptos" w:eastAsia="Aptos" w:hAnsi="Aptos"/>
           <w:color w:val="27343A"/>
         </w:rPr>
-        <w:t xml:space="preserve">Sai nhiều nhất là bánh croissant: dự báo cao hơn bán thực tế vì cửa hàng hay hết hàng. Đó lại nối về câu chuyện Out of Stock ở bước 5.</w:t>
+        <w:t xml:space="preserve">Trợ lý đọc Periodic Discount của LS và soi xem LS đã cộng nhu cầu khuyến mãi cho cửa hàng nào. Thiếu thì nói rõ: cửa hàng đó sẽ thiếu hàng đúng ngày khuyến mãi.</w:t>
       </w:r>
     </w:p>
     <w:p>
@@ -7549,7 +7344,7 @@
           <w:rFonts w:ascii="Aptos" w:cs="Aptos" w:eastAsia="Aptos" w:hAnsi="Aptos"/>
           <w:color w:val="27343A"/>
         </w:rPr>
-        <w:t xml:space="preserve">Model đọc bảng sai số rồi kể lại; Holt-Winters là thống kê, chưa phải AI. Nói rõ hai lớp đó.</w:t>
+        <w:t xml:space="preserve">Lỗ hổng này tôi cố ý để lại trong dữ liệu để thấy trợ lý bắt được.</w:t>
       </w:r>
     </w:p>
     <w:p>
@@ -7572,7 +7367,30 @@
           <w:sz w:val="28"/>
           <w:szCs w:val="28"/>
         </w:rPr>
-        <w:t xml:space="preserve">Bước 12 · Choco bowl S0010: 7 ngày tới và CTKM</w:t>
+        <w:t xml:space="preserve">Phần 5 · Hàng về cửa hàng: liên công ty khép vòng</w:t>
+      </w:r>
+    </w:p>
+    <w:p>
+      <w:pPr>
+        <w:pStyle w:val="Heading2"/>
+        <w:keepNext/>
+        <w:keepLines/>
+        <w:pBdr>
+          <w:left w:val="single" w:color="4BACC6" w:sz="24" w:space="10"/>
+        </w:pBdr>
+        <w:spacing w:after="120" w:before="280"/>
+        <w:ind w:left="170"/>
+      </w:pPr>
+      <w:r>
+        <w:rPr>
+          <w:rFonts w:ascii="Aptos" w:cs="Aptos" w:eastAsia="Aptos" w:hAnsi="Aptos"/>
+          <w:b/>
+          <w:bCs/>
+          <w:color w:val="27343A"/>
+          <w:sz w:val="28"/>
+          <w:szCs w:val="28"/>
+        </w:rPr>
+        <w:t xml:space="preserve">Bước 12 · Kiểm hàng Marou đã xuất kho</w:t>
       </w:r>
     </w:p>
     <w:p>
@@ -7584,7 +7402,7 @@
           <w:rFonts w:ascii="Aptos" w:cs="Aptos" w:eastAsia="Aptos" w:hAnsi="Aptos"/>
           <w:color w:val="27343A"/>
         </w:rPr>
-        <w:t xml:space="preserve">Vai: trang.sc · Dakao</w:t>
+        <w:t xml:space="preserve">Vai: hung.dieuphoi · Dakao</w:t>
       </w:r>
     </w:p>
     <w:tbl>
@@ -7711,7 +7529,7 @@
                 <w:sz w:val="20"/>
                 <w:szCs w:val="20"/>
               </w:rPr>
-              <w:t xml:space="preserve">Nút 12.</w:t>
+              <w:t xml:space="preserve">Nút 12. Console gọi vòng kiểm đơn liên công ty và báo đã gửi tin cho những ai.</w:t>
             </w:r>
           </w:p>
         </w:tc>
@@ -7744,7 +7562,7 @@
                 <w:sz w:val="20"/>
                 <w:szCs w:val="20"/>
               </w:rPr>
-              <w:t xml:space="preserve">Thẻ Dự báo Choco bowl tại S0010: dự báo 7 ngày tới đã ghi vào Retail Forecast Entry của LS (tổng 25,2), sự kiện KM-CHOCOBOWL-09 cộng 150% từ 23 đến 25/09.</w:t>
+              <w:t xml:space="preserve">Thẻ Marou đã xuất kho đơn HO106202 (82 Choco nuts, giao Cửa hàng Quận 1, phiếu 102045); dòng đơn HO106200 xuất từ 16/09 chưa post nhận kèm thẻ Cho trợ lý post nhận hàng; dòng đã gửi email.</w:t>
             </w:r>
           </w:p>
         </w:tc>
@@ -7792,7 +7610,7 @@
           <w:rFonts w:ascii="Aptos" w:cs="Aptos" w:eastAsia="Aptos" w:hAnsi="Aptos"/>
           <w:color w:val="27343A"/>
         </w:rPr>
-        <w:t xml:space="preserve">Dự báo không nằm ở bảng riêng của NaviWorld. Nó ghi vào bảng chuẩn của LS, nên LS Replenishment dùng được ngay.</w:t>
+        <w:t xml:space="preserve">Bên Marou không có gì tự động, người kho post xuất kho như mọi ngày. Bên Dakao, trợ lý đọc sang company bên kia bằng Intercompany và nối hai chứng từ.</w:t>
       </w:r>
     </w:p>
     <w:p>
@@ -7809,7 +7627,24 @@
           <w:rFonts w:ascii="Aptos" w:cs="Aptos" w:eastAsia="Aptos" w:hAnsi="Aptos"/>
           <w:color w:val="27343A"/>
         </w:rPr>
-        <w:t xml:space="preserve">Sự kiện lấy từ Planned Sales Demand của LS, cũng bảng chuẩn.</w:t>
+        <w:t xml:space="preserve">Xuất kho trong ngày thì chỉ báo. Qua ngày hôm sau vẫn chưa post nhận thì nhắc lại và xin phép post thay. Không ai duyệt thì không có gì được post.</w:t>
+      </w:r>
+    </w:p>
+    <w:p>
+      <w:pPr>
+        <w:pStyle w:val="ListParagraph"/>
+        <w:numPr>
+          <w:ilvl w:val="0"/>
+          <w:numId w:val="2"/>
+        </w:numPr>
+        <w:spacing w:after="80" w:line="276"/>
+      </w:pPr>
+      <w:r>
+        <w:rPr>
+          <w:rFonts w:ascii="Aptos" w:cs="Aptos" w:eastAsia="Aptos" w:hAnsi="Aptos"/>
+          <w:color w:val="27343A"/>
+        </w:rPr>
+        <w:t xml:space="preserve">Đây là vấn đề số một trong khảo sát: hàng về mà chứng từ dồn tới cuối tháng, Marou đang thuê người ngoài để post.</w:t>
       </w:r>
     </w:p>
     <w:p>
@@ -7832,7 +7667,7 @@
           <w:sz w:val="28"/>
           <w:szCs w:val="28"/>
         </w:rPr>
-        <w:t xml:space="preserve">Bước 13 · CTKM đang chạy và sắp tới</w:t>
+        <w:t xml:space="preserve">Bước 13 · Lan (S0001) nhận tin chuẩn bị nhận hàng</w:t>
       </w:r>
     </w:p>
     <w:p>
@@ -7844,7 +7679,7 @@
           <w:rFonts w:ascii="Aptos" w:cs="Aptos" w:eastAsia="Aptos" w:hAnsi="Aptos"/>
           <w:color w:val="27343A"/>
         </w:rPr>
-        <w:t xml:space="preserve">Vai: trang.sc · Dakao</w:t>
+        <w:t xml:space="preserve">Vai: lan.s0001 · Dakao</w:t>
       </w:r>
     </w:p>
     <w:tbl>
@@ -7971,7 +7806,7 @@
                 <w:sz w:val="20"/>
                 <w:szCs w:val="20"/>
               </w:rPr>
-              <w:t xml:space="preserve">Nút 13.</w:t>
+              <w:t xml:space="preserve">Nút 13 đổi sang Lan.</w:t>
             </w:r>
           </w:p>
         </w:tc>
@@ -8004,7 +7839,7 @@
                 <w:sz w:val="20"/>
                 <w:szCs w:val="20"/>
               </w:rPr>
-              <w:t xml:space="preserve">Thẻ CTKM: 3 đang chạy, 2 sắp tới, 2 CTKM thiếu nhu cầu trong LS. Dòng cảnh báo: Choco bowl giảm 15% có Planned Event cho S0001, S0010 nhưng S0002, S0005 chưa có.</w:t>
+              <w:t xml:space="preserve">Hộp thư Lan có thẻ Marou đã xuất kho đơn HO106202: Choco nuts 82, giao Cửa hàng Quận 1, link mở đơn mua. Email cùng nội dung đã tới hộp thư.</w:t>
             </w:r>
           </w:p>
         </w:tc>
@@ -8052,7 +7887,7 @@
           <w:rFonts w:ascii="Aptos" w:cs="Aptos" w:eastAsia="Aptos" w:hAnsi="Aptos"/>
           <w:color w:val="27343A"/>
         </w:rPr>
-        <w:t xml:space="preserve">Trợ lý đọc Periodic Discount của LS và soi xem LS đã cộng nhu cầu khuyến mãi cho cửa hàng nào. Thiếu thì nói rõ: LS sẽ tính như ngày thường và cửa hàng đó sẽ thiếu hàng đúng ngày khuyến mãi.</w:t>
+        <w:t xml:space="preserve">Cửa hàng Quận 1 đang hết Choco nuts; giờ họ biết 82 cái đang tới, trước khi xe về.</w:t>
       </w:r>
     </w:p>
     <w:p>
@@ -8069,7 +7904,7 @@
           <w:rFonts w:ascii="Aptos" w:cs="Aptos" w:eastAsia="Aptos" w:hAnsi="Aptos"/>
           <w:color w:val="27343A"/>
         </w:rPr>
-        <w:t xml:space="preserve">Lỗ hổng này tôi cố ý để lại trong dữ liệu để thấy trợ lý bắt được.</w:t>
+        <w:t xml:space="preserve">Thẻ không có số lô: bán lẻ không quản lý lô, trợ lý không đẩy số lô ra cho cửa hàng.</w:t>
       </w:r>
     </w:p>
     <w:p>
@@ -8092,7 +7927,7 @@
           <w:sz w:val="28"/>
           <w:szCs w:val="28"/>
         </w:rPr>
-        <w:t xml:space="preserve">Bước 14 · LS cộng khuyến mãi vào dự báo</w:t>
+        <w:t xml:space="preserve">Bước 14 · Hùng duyệt cho trợ lý post nhận HO106200</w:t>
       </w:r>
     </w:p>
     <w:p>
@@ -8104,7 +7939,7 @@
           <w:rFonts w:ascii="Aptos" w:cs="Aptos" w:eastAsia="Aptos" w:hAnsi="Aptos"/>
           <w:color w:val="27343A"/>
         </w:rPr>
-        <w:t xml:space="preserve">Vai: trang.sc · Dakao</w:t>
+        <w:t xml:space="preserve">Vai: hung.dieuphoi · Dakao</w:t>
       </w:r>
     </w:p>
     <w:tbl>
@@ -8231,7 +8066,7 @@
                 <w:sz w:val="20"/>
                 <w:szCs w:val="20"/>
               </w:rPr>
-              <w:t xml:space="preserve">Nút 14.</w:t>
+              <w:t xml:space="preserve">Nút 14 đổi sang Hùng. Trên thẻ Cho trợ lý post nhận hàng đơn HO106200, bấm Duyệt cho post nhận hàng.</w:t>
             </w:r>
           </w:p>
         </w:tc>
@@ -8264,7 +8099,7 @@
                 <w:sz w:val="20"/>
                 <w:szCs w:val="20"/>
               </w:rPr>
-              <w:t xml:space="preserve">Thẻ Vì sao LS đề xuất 2 Choco bowl cho S0010: kiểu Retail Forecast, dự báo 25,17 trong cửa sổ phủ, chỉnh theo Planned Sales Demand thành 35,22, trừ tồn 34.</w:t>
+              <w:t xml:space="preserve">Thẻ Đã post phiếu nhận 1071xx kèm link mở phiếu nhận trong BC. Mở link: phiếu nhận đã post, đúng mặt hàng và số lượng của đơn mua.</w:t>
             </w:r>
           </w:p>
         </w:tc>
@@ -8312,7 +8147,58 @@
           <w:rFonts w:ascii="Aptos" w:cs="Aptos" w:eastAsia="Aptos" w:hAnsi="Aptos"/>
           <w:color w:val="27343A"/>
         </w:rPr>
-        <w:t xml:space="preserve">Đây là chỗ UC1 nối sang UC5: dự báo của NaviWorld, sự kiện của Marou, phép tính của LS, và trợ lý kể lại cả chuỗi bằng một thẻ.</w:t>
+        <w:t xml:space="preserve">Đây là loại đề xuất duy nhất mà việc duyệt làm Business Central post thật một chứng từ. Mọi loại khác dừng ở chứng từ nháp.</w:t>
+      </w:r>
+    </w:p>
+    <w:p>
+      <w:pPr>
+        <w:pStyle w:val="ListParagraph"/>
+        <w:numPr>
+          <w:ilvl w:val="0"/>
+          <w:numId w:val="2"/>
+        </w:numPr>
+        <w:spacing w:after="80" w:line="276"/>
+      </w:pPr>
+      <w:r>
+        <w:rPr>
+          <w:rFonts w:ascii="Aptos" w:cs="Aptos" w:eastAsia="Aptos" w:hAnsi="Aptos"/>
+          <w:color w:val="27343A"/>
+        </w:rPr>
+        <w:t xml:space="preserve">Quyền post nằm trong permission set riêng, gán tay. Không gán thì bấm Duyệt báo thiếu quyền, không âm thầm bỏ qua.</w:t>
+      </w:r>
+    </w:p>
+    <w:p>
+      <w:pPr>
+        <w:pStyle w:val="ListParagraph"/>
+        <w:numPr>
+          <w:ilvl w:val="0"/>
+          <w:numId w:val="2"/>
+        </w:numPr>
+        <w:spacing w:after="80" w:line="276"/>
+      </w:pPr>
+      <w:r>
+        <w:rPr>
+          <w:rFonts w:ascii="Aptos" w:cs="Aptos" w:eastAsia="Aptos" w:hAnsi="Aptos"/>
+          <w:color w:val="27343A"/>
+        </w:rPr>
+        <w:t xml:space="preserve">Số lượng lấy từ đơn mua. Mặt hàng bên mua có bật quản lý lô thì số lô lấy từ sổ kho bên bán, không bịa; bán lẻ không bật thì phiếu post bình thường.</w:t>
+      </w:r>
+    </w:p>
+    <w:p>
+      <w:pPr>
+        <w:pBdr>
+          <w:left w:val="single" w:color="C89B72" w:sz="36" w:space="10"/>
+        </w:pBdr>
+        <w:shd w:fill="F4EEE8" w:val="clear"/>
+        <w:spacing w:after="200" w:before="120" w:line="276"/>
+        <w:ind w:left="200" w:right="120"/>
+      </w:pPr>
+      <w:r>
+        <w:rPr>
+          <w:rFonts w:ascii="Aptos" w:cs="Aptos" w:eastAsia="Aptos" w:hAnsi="Aptos"/>
+          <w:color w:val="27343A"/>
+        </w:rPr>
+        <w:t xml:space="preserve">HO106200 xuất kho ngày 16/09 nên tối 16/09 nó còn là “trong ngày” và chưa có thẻ đề xuất; sáng 17/09 mới có. Đừng thấy tối nay thiếu thẻ mà tưởng hỏng.</w:t>
       </w:r>
     </w:p>
     <w:p>
@@ -8335,30 +8221,7 @@
           <w:sz w:val="28"/>
           <w:szCs w:val="28"/>
         </w:rPr>
-        <w:t xml:space="preserve">Phần 4 · Một lô cận date, AI chọn phương án</w:t>
-      </w:r>
-    </w:p>
-    <w:p>
-      <w:pPr>
-        <w:pStyle w:val="Heading2"/>
-        <w:keepNext/>
-        <w:keepLines/>
-        <w:pBdr>
-          <w:left w:val="single" w:color="4BACC6" w:sz="24" w:space="10"/>
-        </w:pBdr>
-        <w:spacing w:after="120" w:before="280"/>
-        <w:ind w:left="170"/>
-      </w:pPr>
-      <w:r>
-        <w:rPr>
-          <w:rFonts w:ascii="Aptos" w:cs="Aptos" w:eastAsia="Aptos" w:hAnsi="Aptos"/>
-          <w:b/>
-          <w:bCs/>
-          <w:color w:val="27343A"/>
-          <w:sz w:val="28"/>
-          <w:szCs w:val="28"/>
-        </w:rPr>
-        <w:t xml:space="preserve">Bước 15 · Lô nào sắp hết hạn</w:t>
+        <w:t xml:space="preserve">Bước 15 · Marou xuất kho đơn Ice cream vừa gửi</w:t>
       </w:r>
     </w:p>
     <w:p>
@@ -8370,7 +8233,7 @@
           <w:rFonts w:ascii="Aptos" w:cs="Aptos" w:eastAsia="Aptos" w:hAnsi="Aptos"/>
           <w:color w:val="27343A"/>
         </w:rPr>
-        <w:t xml:space="preserve">Vai: trang.sc · Marou</w:t>
+        <w:t xml:space="preserve">Vai: hung.dieuphoi · Dakao, rồi xem hộp thư Minh</w:t>
       </w:r>
     </w:p>
     <w:tbl>
@@ -8497,7 +8360,7 @@
                 <w:sz w:val="20"/>
                 <w:szCs w:val="20"/>
               </w:rPr>
-              <w:t xml:space="preserve">Nút 15. Console đổi về Marou.</w:t>
+              <w:t xml:space="preserve">Nút 15. Nút demo post xuất kho thay người kho Marou cho đơn Ice cream ở bước 8. Sau đó bấm vai Minh.</w:t>
             </w:r>
           </w:p>
         </w:tc>
@@ -8530,7 +8393,7 @@
                 <w:sz w:val="20"/>
                 <w:szCs w:val="20"/>
               </w:rPr>
-              <w:t xml:space="preserve">36 lô cận date, chia theo địa điểm; 5 thẻ lô giá trị lớn nhất. Thẻ Choco pillar S0010: 470 cái, 26 ngày, bán không kịp; hai nút Đề xuất giảm giá và Phương án xử lý.</w:t>
+              <w:t xml:space="preserve">Console báo đã gửi tin cho Minh, Hùng, Trang. Hộp thư Minh có thẻ chuẩn bị nhận 12 Ice cream.</w:t>
             </w:r>
           </w:p>
         </w:tc>
@@ -8578,7 +8441,41 @@
           <w:rFonts w:ascii="Aptos" w:cs="Aptos" w:eastAsia="Aptos" w:hAnsi="Aptos"/>
           <w:color w:val="27343A"/>
         </w:rPr>
-        <w:t xml:space="preserve">Câu này không gọi model, trợ lý đọc thẳng bảng. Điều phối thấy toàn hệ thống; quản lý cửa hàng hỏi cùng câu chỉ thấy cửa hàng mình.</w:t>
+        <w:t xml:space="preserve">Vòng khép lại: mười lăm phút trước Minh gõ một câu là sắp hết Ice cream; giờ hàng đã rời kho Marou và Minh được báo trước.</w:t>
+      </w:r>
+    </w:p>
+    <w:p>
+      <w:pPr>
+        <w:pStyle w:val="ListParagraph"/>
+        <w:numPr>
+          <w:ilvl w:val="0"/>
+          <w:numId w:val="2"/>
+        </w:numPr>
+        <w:spacing w:after="80" w:line="276"/>
+      </w:pPr>
+      <w:r>
+        <w:rPr>
+          <w:rFonts w:ascii="Aptos" w:cs="Aptos" w:eastAsia="Aptos" w:hAnsi="Aptos"/>
+          <w:color w:val="27343A"/>
+        </w:rPr>
+        <w:t xml:space="preserve">Nút này là công cụ demo, không thuộc sản phẩm. Trên hệ thật đó là người kho Marou bấm Post Shipment.</w:t>
+      </w:r>
+    </w:p>
+    <w:p>
+      <w:pPr>
+        <w:pBdr>
+          <w:left w:val="single" w:color="C89B72" w:sz="36" w:space="10"/>
+        </w:pBdr>
+        <w:shd w:fill="F4EEE8" w:val="clear"/>
+        <w:spacing w:after="200" w:before="120" w:line="276"/>
+        <w:ind w:left="200" w:right="120"/>
+      </w:pPr>
+      <w:r>
+        <w:rPr>
+          <w:rFonts w:ascii="Aptos" w:cs="Aptos" w:eastAsia="Aptos" w:hAnsi="Aptos"/>
+          <w:color w:val="27343A"/>
+        </w:rPr>
+        <w:t xml:space="preserve">Cần đơn Ice cream ở bước 8 đã gửi sang Marou; chưa gửi thì nút báo không còn đơn nào chờ xuất kho.</w:t>
       </w:r>
     </w:p>
     <w:p>
@@ -8601,7 +8498,30 @@
           <w:sz w:val="28"/>
           <w:szCs w:val="28"/>
         </w:rPr>
-        <w:t xml:space="preserve">Bước 16 · Phương án xử lý cho Choco pillar</w:t>
+        <w:t xml:space="preserve">Phần 6 · Truy xuất, bất thường, chi phí</w:t>
+      </w:r>
+    </w:p>
+    <w:p>
+      <w:pPr>
+        <w:pStyle w:val="Heading2"/>
+        <w:keepNext/>
+        <w:keepLines/>
+        <w:pBdr>
+          <w:left w:val="single" w:color="4BACC6" w:sz="24" w:space="10"/>
+        </w:pBdr>
+        <w:spacing w:after="120" w:before="280"/>
+        <w:ind w:left="170"/>
+      </w:pPr>
+      <w:r>
+        <w:rPr>
+          <w:rFonts w:ascii="Aptos" w:cs="Aptos" w:eastAsia="Aptos" w:hAnsi="Aptos"/>
+          <w:b/>
+          <w:bCs/>
+          <w:color w:val="27343A"/>
+          <w:sz w:val="28"/>
+          <w:szCs w:val="28"/>
+        </w:rPr>
+        <w:t xml:space="preserve">Bước 16 · Truy xuất lô L260906-33323C</w:t>
       </w:r>
     </w:p>
     <w:p>
@@ -8740,7 +8660,7 @@
                 <w:sz w:val="20"/>
                 <w:szCs w:val="20"/>
               </w:rPr>
-              <w:t xml:space="preserve">Nút 16 chỉ hiện hướng dẫn. Trên thẻ Choco pillar bấm Phương án xử lý.</w:t>
+              <w:t xml:space="preserve">Nút 16. Console đổi về Marou.</w:t>
             </w:r>
           </w:p>
         </w:tc>
@@ -8773,7 +8693,7 @@
                 <w:sz w:val="20"/>
                 <w:szCs w:val="20"/>
               </w:rPr>
-              <w:t xml:space="preserve">Sau khoảng 6 giây: thẻ bảng năm phương án kèm giá trị cứu được hoặc mất, lời khuyên của model (chuyển 199 sang S0001 bán nhanh hơn), nút ghi đề xuất.</w:t>
+              <w:t xml:space="preserve">AI kể lại hành trình lô Choco nuts: nhập kho W0003, xuất 81 cái theo đơn liên công ty HO106202 sang Cửa hàng Quận 1, còn tồn ở đâu; bảng Item Ledger Entry thu gọn bên dưới.</w:t>
             </w:r>
           </w:p>
         </w:tc>
@@ -8821,7 +8741,7 @@
           <w:rFonts w:ascii="Aptos" w:cs="Aptos" w:eastAsia="Aptos" w:hAnsi="Aptos"/>
           <w:color w:val="27343A"/>
         </w:rPr>
-        <w:t xml:space="preserve">Code tính năm phương án: giữ, chuyển, chuyển kèm giảm giá, giảm giá, huỷ. Khả năng nhận của từng cửa hàng bằng bán bình quân nhân ngày còn lại trừ tồn họ đang có.</w:t>
+        <w:t xml:space="preserve">Đây là phần traceability của UC2: một lô có vấn đề thì biết ngay nó nằm ở những địa điểm nào và còn bao nhiêu, thu hồi lấy lại ở đâu.</w:t>
       </w:r>
     </w:p>
     <w:p>
@@ -8838,24 +8758,24 @@
           <w:rFonts w:ascii="Aptos" w:cs="Aptos" w:eastAsia="Aptos" w:hAnsi="Aptos"/>
           <w:color w:val="27343A"/>
         </w:rPr>
-        <w:t xml:space="preserve">Model chọn một và nói vì sao. Nó được chọn khác code, miễn nói được lý do trên số đã có. Khoá phương án phải nằm trong bảng, chữ số phải có trong dữ liệu.</w:t>
-      </w:r>
-    </w:p>
-    <w:p>
-      <w:pPr>
-        <w:pStyle w:val="ListParagraph"/>
-        <w:numPr>
-          <w:ilvl w:val="0"/>
-          <w:numId w:val="2"/>
-        </w:numPr>
-        <w:spacing w:after="80" w:line="276"/>
-      </w:pPr>
-      <w:r>
-        <w:rPr>
-          <w:rFonts w:ascii="Aptos" w:cs="Aptos" w:eastAsia="Aptos" w:hAnsi="Aptos"/>
-          <w:color w:val="27343A"/>
-        </w:rPr>
-        <w:t xml:space="preserve">Đây cũng là UC5 nhìn từ UC2: hàng cận date đi về nơi bán nhanh, không phải huỷ.</w:t>
+        <w:t xml:space="preserve">Lô này chính là lô vừa đi ở phần 5: Marou chọn lô còn hạn (22/04/2027) để xuất, bên bán quản lý lô còn bên bán lẻ chỉ thấy mặt hàng và số lượng.</w:t>
+      </w:r>
+    </w:p>
+    <w:p>
+      <w:pPr>
+        <w:pBdr>
+          <w:left w:val="single" w:color="C89B72" w:sz="36" w:space="10"/>
+        </w:pBdr>
+        <w:shd w:fill="F4EEE8" w:val="clear"/>
+        <w:spacing w:after="200" w:before="120" w:line="276"/>
+        <w:ind w:left="200" w:right="120"/>
+      </w:pPr>
+      <w:r>
+        <w:rPr>
+          <w:rFonts w:ascii="Aptos" w:cs="Aptos" w:eastAsia="Aptos" w:hAnsi="Aptos"/>
+          <w:color w:val="27343A"/>
+        </w:rPr>
+        <w:t xml:space="preserve">Lô L260908-33110B (đơn HO106201 hôm 16/09) cũng truy được nhưng là lô đã quá hạn, bị chọn trước khi sửa quy tắc FEFO; đừng dùng lô đó trên sân khấu.</w:t>
       </w:r>
     </w:p>
     <w:p>
@@ -8878,7 +8798,7 @@
           <w:sz w:val="28"/>
           <w:szCs w:val="28"/>
         </w:rPr>
-        <w:t xml:space="preserve">Bước 17 · Hùng duyệt chuyển hàng</w:t>
+        <w:t xml:space="preserve">Bước 17 · Có gì bất thường trong 28 ngày qua không?</w:t>
       </w:r>
     </w:p>
     <w:p>
@@ -8890,7 +8810,7 @@
           <w:rFonts w:ascii="Aptos" w:cs="Aptos" w:eastAsia="Aptos" w:hAnsi="Aptos"/>
           <w:color w:val="27343A"/>
         </w:rPr>
-        <w:t xml:space="preserve">Vai: hung.dieuphoi · Marou</w:t>
+        <w:t xml:space="preserve">Vai: trang.sc · Dakao</w:t>
       </w:r>
     </w:p>
     <w:tbl>
@@ -9017,7 +8937,7 @@
                 <w:sz w:val="20"/>
                 <w:szCs w:val="20"/>
               </w:rPr>
-              <w:t xml:space="preserve">Nút 17 đổi sang Hùng. Bấm Duyệt chuyển hàng trên thẻ đề xuất 199 Choco pillar S0010 sang S0001.</w:t>
+              <w:t xml:space="preserve">Nút 17.</w:t>
             </w:r>
           </w:p>
         </w:tc>
@@ -9050,7 +8970,7 @@
                 <w:sz w:val="20"/>
                 <w:szCs w:val="20"/>
               </w:rPr>
-              <w:t xml:space="preserve">Thẻ Đã duyệt kèm số Transfer Order và link mở trong BC; cột phải Transfer Order có dòng mới, trạng thái Open.</w:t>
+              <w:t xml:space="preserve">Câu trả lời do AI viết: ưu tiên ba tín hiệu ở S0001 (nhận hàng hạn quá ngắn); danh sách 16 tín hiệu thu gọn bên dưới.</w:t>
             </w:r>
           </w:p>
         </w:tc>
@@ -9098,7 +9018,24 @@
           <w:rFonts w:ascii="Aptos" w:cs="Aptos" w:eastAsia="Aptos" w:hAnsi="Aptos"/>
           <w:color w:val="27343A"/>
         </w:rPr>
-        <w:t xml:space="preserve">Chứng từ mang số đề xuất, kiểm toán truy ngược được từ chứng từ về đề xuất và về dòng dữ liệu gốc.</w:t>
+        <w:t xml:space="preserve">Năm tín hiệu code quét: bán sau hạn, nhận hàng hạn ngắn bất thường, huỷ tăng gấp đôi, tồn không bán, hết hàng lặp lại. Model chọn tối đa ba và giải thích; mã tín hiệu phải nằm trong danh sách.</w:t>
+      </w:r>
+    </w:p>
+    <w:p>
+      <w:pPr>
+        <w:pStyle w:val="ListParagraph"/>
+        <w:numPr>
+          <w:ilvl w:val="0"/>
+          <w:numId w:val="2"/>
+        </w:numPr>
+        <w:spacing w:after="80" w:line="276"/>
+      </w:pPr>
+      <w:r>
+        <w:rPr>
+          <w:rFonts w:ascii="Aptos" w:cs="Aptos" w:eastAsia="Aptos" w:hAnsi="Aptos"/>
+          <w:color w:val="27343A"/>
+        </w:rPr>
+        <w:t xml:space="preserve">Lệch kiểm kê chưa đo được vì bộ dữ liệu không có phiếu kiểm kê. Nói thẳng chỗ này.</w:t>
       </w:r>
     </w:p>
     <w:p>
@@ -9121,30 +9058,7 @@
           <w:sz w:val="28"/>
           <w:szCs w:val="28"/>
         </w:rPr>
-        <w:t xml:space="preserve">Phần 5 · Liên công ty khép vòng</w:t>
-      </w:r>
-    </w:p>
-    <w:p>
-      <w:pPr>
-        <w:pStyle w:val="Heading2"/>
-        <w:keepNext/>
-        <w:keepLines/>
-        <w:pBdr>
-          <w:left w:val="single" w:color="4BACC6" w:sz="24" w:space="10"/>
-        </w:pBdr>
-        <w:spacing w:after="120" w:before="280"/>
-        <w:ind w:left="170"/>
-      </w:pPr>
-      <w:r>
-        <w:rPr>
-          <w:rFonts w:ascii="Aptos" w:cs="Aptos" w:eastAsia="Aptos" w:hAnsi="Aptos"/>
-          <w:b/>
-          <w:bCs/>
-          <w:color w:val="27343A"/>
-          <w:sz w:val="28"/>
-          <w:szCs w:val="28"/>
-        </w:rPr>
-        <w:t xml:space="preserve">Bước 18 · Kiểm hàng Marou đã xuất kho</w:t>
+        <w:t xml:space="preserve">Bước 18 · Chi phí AI đo được</w:t>
       </w:r>
     </w:p>
     <w:p>
@@ -9156,7 +9070,7 @@
           <w:rFonts w:ascii="Aptos" w:cs="Aptos" w:eastAsia="Aptos" w:hAnsi="Aptos"/>
           <w:color w:val="27343A"/>
         </w:rPr>
-        <w:t xml:space="preserve">Vai: hung.dieuphoi · Dakao</w:t>
+        <w:t xml:space="preserve">Vai: dung.admin · Marou</w:t>
       </w:r>
     </w:p>
     <w:tbl>
@@ -9283,1381 +9197,7 @@
                 <w:sz w:val="20"/>
                 <w:szCs w:val="20"/>
               </w:rPr>
-              <w:t xml:space="preserve">Nút 18. Console gọi vòng kiểm đơn liên công ty.</w:t>
-            </w:r>
-          </w:p>
-        </w:tc>
-        <w:tc>
-          <w:tcPr>
-            <w:tcW w:type="dxa" w:w="5301"/>
-            <w:tcBorders>
-              <w:top w:val="single" w:color="A9D5E2" w:sz="4"/>
-              <w:left w:val="single" w:color="A9D5E2" w:sz="4"/>
-              <w:bottom w:val="single" w:color="A9D5E2" w:sz="4"/>
-              <w:right w:val="single" w:color="A9D5E2" w:sz="4"/>
-            </w:tcBorders>
-            <w:tcMar>
-              <w:top w:type="dxa" w:w="113"/>
-              <w:left w:type="dxa" w:w="113"/>
-              <w:bottom w:type="dxa" w:w="113"/>
-              <w:right w:type="dxa" w:w="113"/>
-            </w:tcMar>
-          </w:tcPr>
-          <w:p>
-            <w:pPr>
-              <w:spacing w:after="0" w:line="252"/>
-            </w:pPr>
-            <w:r>
-              <w:rPr>
-                <w:rFonts w:ascii="Aptos" w:cs="Aptos" w:eastAsia="Aptos" w:hAnsi="Aptos"/>
-                <w:b w:val="false"/>
-                <w:bCs w:val="false"/>
-                <w:color w:val="27343A"/>
-                <w:sz w:val="20"/>
-                <w:szCs w:val="20"/>
-              </w:rPr>
-              <w:t xml:space="preserve">Ba thứ: thẻ Marou đã xuất kho đơn HO106202 (82 Choco nuts, giao Cửa hàng Quận 1, phiếu 102045 ngày 17/09); dòng đơn HO106200 xuất từ 16/09 chưa post nhận kèm thẻ Cho trợ lý post nhận hàng; dòng đã gửi email.</w:t>
-            </w:r>
-          </w:p>
-        </w:tc>
-      </w:tr>
-    </w:tbl>
-    <w:p>
-      <w:pPr>
-        <w:spacing w:after="120"/>
-      </w:pPr>
-    </w:p>
-    <w:p>
-      <w:pPr>
-        <w:pStyle w:val="Heading3"/>
-        <w:keepNext/>
-        <w:keepLines/>
-        <w:pBdr>
-          <w:left w:val="single" w:color="4BACC6" w:sz="24" w:space="10"/>
-        </w:pBdr>
-        <w:spacing w:after="100" w:before="200"/>
-        <w:ind w:left="170"/>
-      </w:pPr>
-      <w:r>
-        <w:rPr>
-          <w:rFonts w:ascii="Aptos" w:cs="Aptos" w:eastAsia="Aptos" w:hAnsi="Aptos"/>
-          <w:b/>
-          <w:bCs/>
-          <w:color w:val="27343A"/>
-          <w:sz w:val="24"/>
-          <w:szCs w:val="24"/>
-        </w:rPr>
-        <w:t xml:space="preserve">Nói gì</w:t>
-      </w:r>
-    </w:p>
-    <w:p>
-      <w:pPr>
-        <w:pStyle w:val="ListParagraph"/>
-        <w:numPr>
-          <w:ilvl w:val="0"/>
-          <w:numId w:val="2"/>
-        </w:numPr>
-        <w:spacing w:after="80" w:line="276"/>
-      </w:pPr>
-      <w:r>
-        <w:rPr>
-          <w:rFonts w:ascii="Aptos" w:cs="Aptos" w:eastAsia="Aptos" w:hAnsi="Aptos"/>
-          <w:color w:val="27343A"/>
-        </w:rPr>
-        <w:t xml:space="preserve">Bên Marou không có gì tự động, người kho post xuất kho như mọi ngày. Bên Dakao, trợ lý đọc sang company bên kia bằng Intercompany và nối hai chứng từ.</w:t>
-      </w:r>
-    </w:p>
-    <w:p>
-      <w:pPr>
-        <w:pStyle w:val="ListParagraph"/>
-        <w:numPr>
-          <w:ilvl w:val="0"/>
-          <w:numId w:val="2"/>
-        </w:numPr>
-        <w:spacing w:after="80" w:line="276"/>
-      </w:pPr>
-      <w:r>
-        <w:rPr>
-          <w:rFonts w:ascii="Aptos" w:cs="Aptos" w:eastAsia="Aptos" w:hAnsi="Aptos"/>
-          <w:color w:val="27343A"/>
-        </w:rPr>
-        <w:t xml:space="preserve">Xuất kho trong ngày thì chỉ báo. Qua ngày hôm sau vẫn chưa post nhận thì nhắc lại và xin phép post thay. Không ai duyệt thì không có gì được post.</w:t>
-      </w:r>
-    </w:p>
-    <w:p>
-      <w:pPr>
-        <w:pStyle w:val="ListParagraph"/>
-        <w:numPr>
-          <w:ilvl w:val="0"/>
-          <w:numId w:val="2"/>
-        </w:numPr>
-        <w:spacing w:after="80" w:line="276"/>
-      </w:pPr>
-      <w:r>
-        <w:rPr>
-          <w:rFonts w:ascii="Aptos" w:cs="Aptos" w:eastAsia="Aptos" w:hAnsi="Aptos"/>
-          <w:color w:val="27343A"/>
-        </w:rPr>
-        <w:t xml:space="preserve">Đây là vấn đề số một trong khảo sát: hàng về mà chứng từ dồn tới cuối tháng, Marou đang thuê người ngoài để post.</w:t>
-      </w:r>
-    </w:p>
-    <w:p>
-      <w:pPr>
-        <w:pStyle w:val="Heading2"/>
-        <w:keepNext/>
-        <w:keepLines/>
-        <w:pBdr>
-          <w:left w:val="single" w:color="4BACC6" w:sz="24" w:space="10"/>
-        </w:pBdr>
-        <w:spacing w:after="120" w:before="280"/>
-        <w:ind w:left="170"/>
-      </w:pPr>
-      <w:r>
-        <w:rPr>
-          <w:rFonts w:ascii="Aptos" w:cs="Aptos" w:eastAsia="Aptos" w:hAnsi="Aptos"/>
-          <w:b/>
-          <w:bCs/>
-          <w:color w:val="27343A"/>
-          <w:sz w:val="28"/>
-          <w:szCs w:val="28"/>
-        </w:rPr>
-        <w:t xml:space="preserve">Bước 19 · Lan (S0001) nhận tin chuẩn bị nhận hàng</w:t>
-      </w:r>
-    </w:p>
-    <w:p>
-      <w:pPr>
-        <w:spacing w:after="120" w:line="276"/>
-      </w:pPr>
-      <w:r>
-        <w:rPr>
-          <w:rFonts w:ascii="Aptos" w:cs="Aptos" w:eastAsia="Aptos" w:hAnsi="Aptos"/>
-          <w:color w:val="27343A"/>
-        </w:rPr>
-        <w:t xml:space="preserve">Vai: lan.s0001 · Dakao</w:t>
-      </w:r>
-    </w:p>
-    <w:tbl>
-      <w:tblPr>
-        <w:tblW w:type="dxa" w:w="9638"/>
-        <w:tblBorders>
-          <w:top w:val="single" w:color="auto" w:sz="4"/>
-          <w:left w:val="single" w:color="auto" w:sz="4"/>
-          <w:bottom w:val="single" w:color="auto" w:sz="4"/>
-          <w:right w:val="single" w:color="auto" w:sz="4"/>
-          <w:insideH w:val="single" w:color="auto" w:sz="4"/>
-          <w:insideV w:val="single" w:color="auto" w:sz="4"/>
-        </w:tblBorders>
-      </w:tblPr>
-      <w:tblGrid>
-        <w:gridCol w:w="4337"/>
-        <w:gridCol w:w="5301"/>
-      </w:tblGrid>
-      <w:tr>
-        <w:trPr>
-          <w:cantSplit w:val="false"/>
-          <w:tblHeader/>
-        </w:trPr>
-        <w:tc>
-          <w:tcPr>
-            <w:tcW w:type="dxa" w:w="4337"/>
-            <w:tcBorders>
-              <w:top w:val="single" w:color="A9D5E2" w:sz="4"/>
-              <w:left w:val="single" w:color="A9D5E2" w:sz="4"/>
-              <w:bottom w:val="single" w:color="A9D5E2" w:sz="4"/>
-              <w:right w:val="single" w:color="A9D5E2" w:sz="4"/>
-            </w:tcBorders>
-            <w:shd w:fill="4BACC6" w:val="clear"/>
-            <w:tcMar>
-              <w:top w:type="dxa" w:w="113"/>
-              <w:left w:type="dxa" w:w="113"/>
-              <w:bottom w:type="dxa" w:w="113"/>
-              <w:right w:type="dxa" w:w="113"/>
-            </w:tcMar>
-          </w:tcPr>
-          <w:p>
-            <w:pPr>
-              <w:spacing w:after="0" w:line="252"/>
-            </w:pPr>
-            <w:r>
-              <w:rPr>
-                <w:rFonts w:ascii="Aptos" w:cs="Aptos" w:eastAsia="Aptos" w:hAnsi="Aptos"/>
-                <w:b/>
-                <w:bCs/>
-                <w:color w:val="27343A"/>
-                <w:sz w:val="20"/>
-                <w:szCs w:val="20"/>
-              </w:rPr>
-              <w:t xml:space="preserve">Bấm gì</w:t>
-            </w:r>
-          </w:p>
-        </w:tc>
-        <w:tc>
-          <w:tcPr>
-            <w:tcW w:type="dxa" w:w="5301"/>
-            <w:tcBorders>
-              <w:top w:val="single" w:color="A9D5E2" w:sz="4"/>
-              <w:left w:val="single" w:color="A9D5E2" w:sz="4"/>
-              <w:bottom w:val="single" w:color="A9D5E2" w:sz="4"/>
-              <w:right w:val="single" w:color="A9D5E2" w:sz="4"/>
-            </w:tcBorders>
-            <w:shd w:fill="4BACC6" w:val="clear"/>
-            <w:tcMar>
-              <w:top w:type="dxa" w:w="113"/>
-              <w:left w:type="dxa" w:w="113"/>
-              <w:bottom w:type="dxa" w:w="113"/>
-              <w:right w:type="dxa" w:w="113"/>
-            </w:tcMar>
-          </w:tcPr>
-          <w:p>
-            <w:pPr>
-              <w:spacing w:after="0" w:line="252"/>
-            </w:pPr>
-            <w:r>
-              <w:rPr>
-                <w:rFonts w:ascii="Aptos" w:cs="Aptos" w:eastAsia="Aptos" w:hAnsi="Aptos"/>
-                <w:b/>
-                <w:bCs/>
-                <w:color w:val="27343A"/>
-                <w:sz w:val="20"/>
-                <w:szCs w:val="20"/>
-              </w:rPr>
-              <w:t xml:space="preserve">Khách thấy gì</w:t>
-            </w:r>
-          </w:p>
-        </w:tc>
-      </w:tr>
-      <w:tr>
-        <w:trPr>
-          <w:cantSplit/>
-          <w:tblHeader w:val="false"/>
-        </w:trPr>
-        <w:tc>
-          <w:tcPr>
-            <w:tcW w:type="dxa" w:w="4337"/>
-            <w:tcBorders>
-              <w:top w:val="single" w:color="A9D5E2" w:sz="4"/>
-              <w:left w:val="single" w:color="A9D5E2" w:sz="4"/>
-              <w:bottom w:val="single" w:color="A9D5E2" w:sz="4"/>
-              <w:right w:val="single" w:color="A9D5E2" w:sz="4"/>
-            </w:tcBorders>
-            <w:tcMar>
-              <w:top w:type="dxa" w:w="113"/>
-              <w:left w:type="dxa" w:w="113"/>
-              <w:bottom w:type="dxa" w:w="113"/>
-              <w:right w:type="dxa" w:w="113"/>
-            </w:tcMar>
-          </w:tcPr>
-          <w:p>
-            <w:pPr>
-              <w:spacing w:after="0" w:line="252"/>
-            </w:pPr>
-            <w:r>
-              <w:rPr>
-                <w:rFonts w:ascii="Aptos" w:cs="Aptos" w:eastAsia="Aptos" w:hAnsi="Aptos"/>
-                <w:b w:val="false"/>
-                <w:bCs w:val="false"/>
-                <w:color w:val="27343A"/>
-                <w:sz w:val="20"/>
-                <w:szCs w:val="20"/>
-              </w:rPr>
-              <w:t xml:space="preserve">Nút 19 đổi sang Lan.</w:t>
-            </w:r>
-          </w:p>
-        </w:tc>
-        <w:tc>
-          <w:tcPr>
-            <w:tcW w:type="dxa" w:w="5301"/>
-            <w:tcBorders>
-              <w:top w:val="single" w:color="A9D5E2" w:sz="4"/>
-              <w:left w:val="single" w:color="A9D5E2" w:sz="4"/>
-              <w:bottom w:val="single" w:color="A9D5E2" w:sz="4"/>
-              <w:right w:val="single" w:color="A9D5E2" w:sz="4"/>
-            </w:tcBorders>
-            <w:tcMar>
-              <w:top w:type="dxa" w:w="113"/>
-              <w:left w:type="dxa" w:w="113"/>
-              <w:bottom w:type="dxa" w:w="113"/>
-              <w:right w:type="dxa" w:w="113"/>
-            </w:tcMar>
-          </w:tcPr>
-          <w:p>
-            <w:pPr>
-              <w:spacing w:after="0" w:line="252"/>
-            </w:pPr>
-            <w:r>
-              <w:rPr>
-                <w:rFonts w:ascii="Aptos" w:cs="Aptos" w:eastAsia="Aptos" w:hAnsi="Aptos"/>
-                <w:b w:val="false"/>
-                <w:bCs w:val="false"/>
-                <w:color w:val="27343A"/>
-                <w:sz w:val="20"/>
-                <w:szCs w:val="20"/>
-              </w:rPr>
-              <w:t xml:space="preserve">Hộp thư Lan có thẻ Marou đã xuất kho đơn HO106202: Choco nuts 82, giao Cửa hàng Quận 1, link mở đơn mua. Email cùng nội dung đã tới hộp thư.</w:t>
-            </w:r>
-          </w:p>
-        </w:tc>
-      </w:tr>
-    </w:tbl>
-    <w:p>
-      <w:pPr>
-        <w:spacing w:after="120"/>
-      </w:pPr>
-    </w:p>
-    <w:p>
-      <w:pPr>
-        <w:pStyle w:val="Heading3"/>
-        <w:keepNext/>
-        <w:keepLines/>
-        <w:pBdr>
-          <w:left w:val="single" w:color="4BACC6" w:sz="24" w:space="10"/>
-        </w:pBdr>
-        <w:spacing w:after="100" w:before="200"/>
-        <w:ind w:left="170"/>
-      </w:pPr>
-      <w:r>
-        <w:rPr>
-          <w:rFonts w:ascii="Aptos" w:cs="Aptos" w:eastAsia="Aptos" w:hAnsi="Aptos"/>
-          <w:b/>
-          <w:bCs/>
-          <w:color w:val="27343A"/>
-          <w:sz w:val="24"/>
-          <w:szCs w:val="24"/>
-        </w:rPr>
-        <w:t xml:space="preserve">Nói gì</w:t>
-      </w:r>
-    </w:p>
-    <w:p>
-      <w:pPr>
-        <w:pStyle w:val="ListParagraph"/>
-        <w:numPr>
-          <w:ilvl w:val="0"/>
-          <w:numId w:val="2"/>
-        </w:numPr>
-        <w:spacing w:after="80" w:line="276"/>
-      </w:pPr>
-      <w:r>
-        <w:rPr>
-          <w:rFonts w:ascii="Aptos" w:cs="Aptos" w:eastAsia="Aptos" w:hAnsi="Aptos"/>
-          <w:color w:val="27343A"/>
-        </w:rPr>
-        <w:t xml:space="preserve">Cửa hàng ở bước 6 đang hết Choco nuts; giờ họ biết 82 cái đang tới, trước khi xe về.</w:t>
-      </w:r>
-    </w:p>
-    <w:p>
-      <w:pPr>
-        <w:pStyle w:val="ListParagraph"/>
-        <w:numPr>
-          <w:ilvl w:val="0"/>
-          <w:numId w:val="2"/>
-        </w:numPr>
-        <w:spacing w:after="80" w:line="276"/>
-      </w:pPr>
-      <w:r>
-        <w:rPr>
-          <w:rFonts w:ascii="Aptos" w:cs="Aptos" w:eastAsia="Aptos" w:hAnsi="Aptos"/>
-          <w:color w:val="27343A"/>
-        </w:rPr>
-        <w:t xml:space="preserve">Thẻ không có số lô: bán lẻ không quản lý lô, trợ lý không đẩy số lô ra cho cửa hàng.</w:t>
-      </w:r>
-    </w:p>
-    <w:p>
-      <w:pPr>
-        <w:pStyle w:val="Heading2"/>
-        <w:keepNext/>
-        <w:keepLines/>
-        <w:pBdr>
-          <w:left w:val="single" w:color="4BACC6" w:sz="24" w:space="10"/>
-        </w:pBdr>
-        <w:spacing w:after="120" w:before="280"/>
-        <w:ind w:left="170"/>
-      </w:pPr>
-      <w:r>
-        <w:rPr>
-          <w:rFonts w:ascii="Aptos" w:cs="Aptos" w:eastAsia="Aptos" w:hAnsi="Aptos"/>
-          <w:b/>
-          <w:bCs/>
-          <w:color w:val="27343A"/>
-          <w:sz w:val="28"/>
-          <w:szCs w:val="28"/>
-        </w:rPr>
-        <w:t xml:space="preserve">Bước 20 · Hùng duyệt cho trợ lý post nhận HO106200</w:t>
-      </w:r>
-    </w:p>
-    <w:p>
-      <w:pPr>
-        <w:spacing w:after="120" w:line="276"/>
-      </w:pPr>
-      <w:r>
-        <w:rPr>
-          <w:rFonts w:ascii="Aptos" w:cs="Aptos" w:eastAsia="Aptos" w:hAnsi="Aptos"/>
-          <w:color w:val="27343A"/>
-        </w:rPr>
-        <w:t xml:space="preserve">Vai: hung.dieuphoi · Dakao</w:t>
-      </w:r>
-    </w:p>
-    <w:tbl>
-      <w:tblPr>
-        <w:tblW w:type="dxa" w:w="9638"/>
-        <w:tblBorders>
-          <w:top w:val="single" w:color="auto" w:sz="4"/>
-          <w:left w:val="single" w:color="auto" w:sz="4"/>
-          <w:bottom w:val="single" w:color="auto" w:sz="4"/>
-          <w:right w:val="single" w:color="auto" w:sz="4"/>
-          <w:insideH w:val="single" w:color="auto" w:sz="4"/>
-          <w:insideV w:val="single" w:color="auto" w:sz="4"/>
-        </w:tblBorders>
-      </w:tblPr>
-      <w:tblGrid>
-        <w:gridCol w:w="4337"/>
-        <w:gridCol w:w="5301"/>
-      </w:tblGrid>
-      <w:tr>
-        <w:trPr>
-          <w:cantSplit w:val="false"/>
-          <w:tblHeader/>
-        </w:trPr>
-        <w:tc>
-          <w:tcPr>
-            <w:tcW w:type="dxa" w:w="4337"/>
-            <w:tcBorders>
-              <w:top w:val="single" w:color="A9D5E2" w:sz="4"/>
-              <w:left w:val="single" w:color="A9D5E2" w:sz="4"/>
-              <w:bottom w:val="single" w:color="A9D5E2" w:sz="4"/>
-              <w:right w:val="single" w:color="A9D5E2" w:sz="4"/>
-            </w:tcBorders>
-            <w:shd w:fill="4BACC6" w:val="clear"/>
-            <w:tcMar>
-              <w:top w:type="dxa" w:w="113"/>
-              <w:left w:type="dxa" w:w="113"/>
-              <w:bottom w:type="dxa" w:w="113"/>
-              <w:right w:type="dxa" w:w="113"/>
-            </w:tcMar>
-          </w:tcPr>
-          <w:p>
-            <w:pPr>
-              <w:spacing w:after="0" w:line="252"/>
-            </w:pPr>
-            <w:r>
-              <w:rPr>
-                <w:rFonts w:ascii="Aptos" w:cs="Aptos" w:eastAsia="Aptos" w:hAnsi="Aptos"/>
-                <w:b/>
-                <w:bCs/>
-                <w:color w:val="27343A"/>
-                <w:sz w:val="20"/>
-                <w:szCs w:val="20"/>
-              </w:rPr>
-              <w:t xml:space="preserve">Bấm gì</w:t>
-            </w:r>
-          </w:p>
-        </w:tc>
-        <w:tc>
-          <w:tcPr>
-            <w:tcW w:type="dxa" w:w="5301"/>
-            <w:tcBorders>
-              <w:top w:val="single" w:color="A9D5E2" w:sz="4"/>
-              <w:left w:val="single" w:color="A9D5E2" w:sz="4"/>
-              <w:bottom w:val="single" w:color="A9D5E2" w:sz="4"/>
-              <w:right w:val="single" w:color="A9D5E2" w:sz="4"/>
-            </w:tcBorders>
-            <w:shd w:fill="4BACC6" w:val="clear"/>
-            <w:tcMar>
-              <w:top w:type="dxa" w:w="113"/>
-              <w:left w:type="dxa" w:w="113"/>
-              <w:bottom w:type="dxa" w:w="113"/>
-              <w:right w:type="dxa" w:w="113"/>
-            </w:tcMar>
-          </w:tcPr>
-          <w:p>
-            <w:pPr>
-              <w:spacing w:after="0" w:line="252"/>
-            </w:pPr>
-            <w:r>
-              <w:rPr>
-                <w:rFonts w:ascii="Aptos" w:cs="Aptos" w:eastAsia="Aptos" w:hAnsi="Aptos"/>
-                <w:b/>
-                <w:bCs/>
-                <w:color w:val="27343A"/>
-                <w:sz w:val="20"/>
-                <w:szCs w:val="20"/>
-              </w:rPr>
-              <w:t xml:space="preserve">Khách thấy gì</w:t>
-            </w:r>
-          </w:p>
-        </w:tc>
-      </w:tr>
-      <w:tr>
-        <w:trPr>
-          <w:cantSplit/>
-          <w:tblHeader w:val="false"/>
-        </w:trPr>
-        <w:tc>
-          <w:tcPr>
-            <w:tcW w:type="dxa" w:w="4337"/>
-            <w:tcBorders>
-              <w:top w:val="single" w:color="A9D5E2" w:sz="4"/>
-              <w:left w:val="single" w:color="A9D5E2" w:sz="4"/>
-              <w:bottom w:val="single" w:color="A9D5E2" w:sz="4"/>
-              <w:right w:val="single" w:color="A9D5E2" w:sz="4"/>
-            </w:tcBorders>
-            <w:tcMar>
-              <w:top w:type="dxa" w:w="113"/>
-              <w:left w:type="dxa" w:w="113"/>
-              <w:bottom w:type="dxa" w:w="113"/>
-              <w:right w:type="dxa" w:w="113"/>
-            </w:tcMar>
-          </w:tcPr>
-          <w:p>
-            <w:pPr>
-              <w:spacing w:after="0" w:line="252"/>
-            </w:pPr>
-            <w:r>
-              <w:rPr>
-                <w:rFonts w:ascii="Aptos" w:cs="Aptos" w:eastAsia="Aptos" w:hAnsi="Aptos"/>
-                <w:b w:val="false"/>
-                <w:bCs w:val="false"/>
-                <w:color w:val="27343A"/>
-                <w:sz w:val="20"/>
-                <w:szCs w:val="20"/>
-              </w:rPr>
-              <w:t xml:space="preserve">Nút 20 đổi sang Hùng. Trên thẻ Cho trợ lý post nhận hàng đơn HO106200, bấm Duyệt cho post nhận hàng.</w:t>
-            </w:r>
-          </w:p>
-        </w:tc>
-        <w:tc>
-          <w:tcPr>
-            <w:tcW w:type="dxa" w:w="5301"/>
-            <w:tcBorders>
-              <w:top w:val="single" w:color="A9D5E2" w:sz="4"/>
-              <w:left w:val="single" w:color="A9D5E2" w:sz="4"/>
-              <w:bottom w:val="single" w:color="A9D5E2" w:sz="4"/>
-              <w:right w:val="single" w:color="A9D5E2" w:sz="4"/>
-            </w:tcBorders>
-            <w:tcMar>
-              <w:top w:type="dxa" w:w="113"/>
-              <w:left w:type="dxa" w:w="113"/>
-              <w:bottom w:type="dxa" w:w="113"/>
-              <w:right w:type="dxa" w:w="113"/>
-            </w:tcMar>
-          </w:tcPr>
-          <w:p>
-            <w:pPr>
-              <w:spacing w:after="0" w:line="252"/>
-            </w:pPr>
-            <w:r>
-              <w:rPr>
-                <w:rFonts w:ascii="Aptos" w:cs="Aptos" w:eastAsia="Aptos" w:hAnsi="Aptos"/>
-                <w:b w:val="false"/>
-                <w:bCs w:val="false"/>
-                <w:color w:val="27343A"/>
-                <w:sz w:val="20"/>
-                <w:szCs w:val="20"/>
-              </w:rPr>
-              <w:t xml:space="preserve">Thẻ Đã post phiếu nhận 1071xx kèm link mở phiếu nhận trong BC. Mở link: phiếu nhận đã post, đúng mặt hàng và số lượng của đơn mua.</w:t>
-            </w:r>
-          </w:p>
-        </w:tc>
-      </w:tr>
-    </w:tbl>
-    <w:p>
-      <w:pPr>
-        <w:spacing w:after="120"/>
-      </w:pPr>
-    </w:p>
-    <w:p>
-      <w:pPr>
-        <w:pStyle w:val="Heading3"/>
-        <w:keepNext/>
-        <w:keepLines/>
-        <w:pBdr>
-          <w:left w:val="single" w:color="4BACC6" w:sz="24" w:space="10"/>
-        </w:pBdr>
-        <w:spacing w:after="100" w:before="200"/>
-        <w:ind w:left="170"/>
-      </w:pPr>
-      <w:r>
-        <w:rPr>
-          <w:rFonts w:ascii="Aptos" w:cs="Aptos" w:eastAsia="Aptos" w:hAnsi="Aptos"/>
-          <w:b/>
-          <w:bCs/>
-          <w:color w:val="27343A"/>
-          <w:sz w:val="24"/>
-          <w:szCs w:val="24"/>
-        </w:rPr>
-        <w:t xml:space="preserve">Nói gì</w:t>
-      </w:r>
-    </w:p>
-    <w:p>
-      <w:pPr>
-        <w:pStyle w:val="ListParagraph"/>
-        <w:numPr>
-          <w:ilvl w:val="0"/>
-          <w:numId w:val="2"/>
-        </w:numPr>
-        <w:spacing w:after="80" w:line="276"/>
-      </w:pPr>
-      <w:r>
-        <w:rPr>
-          <w:rFonts w:ascii="Aptos" w:cs="Aptos" w:eastAsia="Aptos" w:hAnsi="Aptos"/>
-          <w:color w:val="27343A"/>
-        </w:rPr>
-        <w:t xml:space="preserve">Đây là loại đề xuất duy nhất mà việc duyệt làm Business Central post thật một chứng từ. Mọi loại khác dừng ở chứng từ nháp.</w:t>
-      </w:r>
-    </w:p>
-    <w:p>
-      <w:pPr>
-        <w:pStyle w:val="ListParagraph"/>
-        <w:numPr>
-          <w:ilvl w:val="0"/>
-          <w:numId w:val="2"/>
-        </w:numPr>
-        <w:spacing w:after="80" w:line="276"/>
-      </w:pPr>
-      <w:r>
-        <w:rPr>
-          <w:rFonts w:ascii="Aptos" w:cs="Aptos" w:eastAsia="Aptos" w:hAnsi="Aptos"/>
-          <w:color w:val="27343A"/>
-        </w:rPr>
-        <w:t xml:space="preserve">Quyền post nằm trong permission set riêng, gán tay. Không gán thì bấm Duyệt báo thiếu quyền, không âm thầm bỏ qua.</w:t>
-      </w:r>
-    </w:p>
-    <w:p>
-      <w:pPr>
-        <w:pStyle w:val="ListParagraph"/>
-        <w:numPr>
-          <w:ilvl w:val="0"/>
-          <w:numId w:val="2"/>
-        </w:numPr>
-        <w:spacing w:after="80" w:line="276"/>
-      </w:pPr>
-      <w:r>
-        <w:rPr>
-          <w:rFonts w:ascii="Aptos" w:cs="Aptos" w:eastAsia="Aptos" w:hAnsi="Aptos"/>
-          <w:color w:val="27343A"/>
-        </w:rPr>
-        <w:t xml:space="preserve">Số lượng lấy từ đơn mua. Mặt hàng bên mua có bật quản lý lô thì số lô lấy từ sổ kho bên bán, không bịa; bán lẻ không bật thì phiếu post bình thường.</w:t>
-      </w:r>
-    </w:p>
-    <w:p>
-      <w:pPr>
-        <w:pStyle w:val="Heading2"/>
-        <w:keepNext/>
-        <w:keepLines/>
-        <w:pBdr>
-          <w:left w:val="single" w:color="4BACC6" w:sz="24" w:space="10"/>
-        </w:pBdr>
-        <w:spacing w:after="120" w:before="280"/>
-        <w:ind w:left="170"/>
-      </w:pPr>
-      <w:r>
-        <w:rPr>
-          <w:rFonts w:ascii="Aptos" w:cs="Aptos" w:eastAsia="Aptos" w:hAnsi="Aptos"/>
-          <w:b/>
-          <w:bCs/>
-          <w:color w:val="27343A"/>
-          <w:sz w:val="28"/>
-          <w:szCs w:val="28"/>
-        </w:rPr>
-        <w:t xml:space="preserve">Bước 21 · Marou xuất kho đơn Ice cream vừa gửi</w:t>
-      </w:r>
-    </w:p>
-    <w:p>
-      <w:pPr>
-        <w:spacing w:after="120" w:line="276"/>
-      </w:pPr>
-      <w:r>
-        <w:rPr>
-          <w:rFonts w:ascii="Aptos" w:cs="Aptos" w:eastAsia="Aptos" w:hAnsi="Aptos"/>
-          <w:color w:val="27343A"/>
-        </w:rPr>
-        <w:t xml:space="preserve">Vai: hung.dieuphoi · Dakao, rồi xem hộp thư Minh</w:t>
-      </w:r>
-    </w:p>
-    <w:tbl>
-      <w:tblPr>
-        <w:tblW w:type="dxa" w:w="9638"/>
-        <w:tblBorders>
-          <w:top w:val="single" w:color="auto" w:sz="4"/>
-          <w:left w:val="single" w:color="auto" w:sz="4"/>
-          <w:bottom w:val="single" w:color="auto" w:sz="4"/>
-          <w:right w:val="single" w:color="auto" w:sz="4"/>
-          <w:insideH w:val="single" w:color="auto" w:sz="4"/>
-          <w:insideV w:val="single" w:color="auto" w:sz="4"/>
-        </w:tblBorders>
-      </w:tblPr>
-      <w:tblGrid>
-        <w:gridCol w:w="4337"/>
-        <w:gridCol w:w="5301"/>
-      </w:tblGrid>
-      <w:tr>
-        <w:trPr>
-          <w:cantSplit w:val="false"/>
-          <w:tblHeader/>
-        </w:trPr>
-        <w:tc>
-          <w:tcPr>
-            <w:tcW w:type="dxa" w:w="4337"/>
-            <w:tcBorders>
-              <w:top w:val="single" w:color="A9D5E2" w:sz="4"/>
-              <w:left w:val="single" w:color="A9D5E2" w:sz="4"/>
-              <w:bottom w:val="single" w:color="A9D5E2" w:sz="4"/>
-              <w:right w:val="single" w:color="A9D5E2" w:sz="4"/>
-            </w:tcBorders>
-            <w:shd w:fill="4BACC6" w:val="clear"/>
-            <w:tcMar>
-              <w:top w:type="dxa" w:w="113"/>
-              <w:left w:type="dxa" w:w="113"/>
-              <w:bottom w:type="dxa" w:w="113"/>
-              <w:right w:type="dxa" w:w="113"/>
-            </w:tcMar>
-          </w:tcPr>
-          <w:p>
-            <w:pPr>
-              <w:spacing w:after="0" w:line="252"/>
-            </w:pPr>
-            <w:r>
-              <w:rPr>
-                <w:rFonts w:ascii="Aptos" w:cs="Aptos" w:eastAsia="Aptos" w:hAnsi="Aptos"/>
-                <w:b/>
-                <w:bCs/>
-                <w:color w:val="27343A"/>
-                <w:sz w:val="20"/>
-                <w:szCs w:val="20"/>
-              </w:rPr>
-              <w:t xml:space="preserve">Bấm gì</w:t>
-            </w:r>
-          </w:p>
-        </w:tc>
-        <w:tc>
-          <w:tcPr>
-            <w:tcW w:type="dxa" w:w="5301"/>
-            <w:tcBorders>
-              <w:top w:val="single" w:color="A9D5E2" w:sz="4"/>
-              <w:left w:val="single" w:color="A9D5E2" w:sz="4"/>
-              <w:bottom w:val="single" w:color="A9D5E2" w:sz="4"/>
-              <w:right w:val="single" w:color="A9D5E2" w:sz="4"/>
-            </w:tcBorders>
-            <w:shd w:fill="4BACC6" w:val="clear"/>
-            <w:tcMar>
-              <w:top w:type="dxa" w:w="113"/>
-              <w:left w:type="dxa" w:w="113"/>
-              <w:bottom w:type="dxa" w:w="113"/>
-              <w:right w:type="dxa" w:w="113"/>
-            </w:tcMar>
-          </w:tcPr>
-          <w:p>
-            <w:pPr>
-              <w:spacing w:after="0" w:line="252"/>
-            </w:pPr>
-            <w:r>
-              <w:rPr>
-                <w:rFonts w:ascii="Aptos" w:cs="Aptos" w:eastAsia="Aptos" w:hAnsi="Aptos"/>
-                <w:b/>
-                <w:bCs/>
-                <w:color w:val="27343A"/>
-                <w:sz w:val="20"/>
-                <w:szCs w:val="20"/>
-              </w:rPr>
-              <w:t xml:space="preserve">Khách thấy gì</w:t>
-            </w:r>
-          </w:p>
-        </w:tc>
-      </w:tr>
-      <w:tr>
-        <w:trPr>
-          <w:cantSplit/>
-          <w:tblHeader w:val="false"/>
-        </w:trPr>
-        <w:tc>
-          <w:tcPr>
-            <w:tcW w:type="dxa" w:w="4337"/>
-            <w:tcBorders>
-              <w:top w:val="single" w:color="A9D5E2" w:sz="4"/>
-              <w:left w:val="single" w:color="A9D5E2" w:sz="4"/>
-              <w:bottom w:val="single" w:color="A9D5E2" w:sz="4"/>
-              <w:right w:val="single" w:color="A9D5E2" w:sz="4"/>
-            </w:tcBorders>
-            <w:tcMar>
-              <w:top w:type="dxa" w:w="113"/>
-              <w:left w:type="dxa" w:w="113"/>
-              <w:bottom w:type="dxa" w:w="113"/>
-              <w:right w:type="dxa" w:w="113"/>
-            </w:tcMar>
-          </w:tcPr>
-          <w:p>
-            <w:pPr>
-              <w:spacing w:after="0" w:line="252"/>
-            </w:pPr>
-            <w:r>
-              <w:rPr>
-                <w:rFonts w:ascii="Aptos" w:cs="Aptos" w:eastAsia="Aptos" w:hAnsi="Aptos"/>
-                <w:b w:val="false"/>
-                <w:bCs w:val="false"/>
-                <w:color w:val="27343A"/>
-                <w:sz w:val="20"/>
-                <w:szCs w:val="20"/>
-              </w:rPr>
-              <w:t xml:space="preserve">Nút 21. Nút demo post xuất kho thay người kho Marou cho đơn Ice cream ở bước 7. Sau đó bấm vai Minh.</w:t>
-            </w:r>
-          </w:p>
-        </w:tc>
-        <w:tc>
-          <w:tcPr>
-            <w:tcW w:type="dxa" w:w="5301"/>
-            <w:tcBorders>
-              <w:top w:val="single" w:color="A9D5E2" w:sz="4"/>
-              <w:left w:val="single" w:color="A9D5E2" w:sz="4"/>
-              <w:bottom w:val="single" w:color="A9D5E2" w:sz="4"/>
-              <w:right w:val="single" w:color="A9D5E2" w:sz="4"/>
-            </w:tcBorders>
-            <w:tcMar>
-              <w:top w:type="dxa" w:w="113"/>
-              <w:left w:type="dxa" w:w="113"/>
-              <w:bottom w:type="dxa" w:w="113"/>
-              <w:right w:type="dxa" w:w="113"/>
-            </w:tcMar>
-          </w:tcPr>
-          <w:p>
-            <w:pPr>
-              <w:spacing w:after="0" w:line="252"/>
-            </w:pPr>
-            <w:r>
-              <w:rPr>
-                <w:rFonts w:ascii="Aptos" w:cs="Aptos" w:eastAsia="Aptos" w:hAnsi="Aptos"/>
-                <w:b w:val="false"/>
-                <w:bCs w:val="false"/>
-                <w:color w:val="27343A"/>
-                <w:sz w:val="20"/>
-                <w:szCs w:val="20"/>
-              </w:rPr>
-              <w:t xml:space="preserve">Trợ lý báo Marou đã xuất kho, số phiếu giao hàng. Hộp thư Minh có thẻ chuẩn bị nhận 12 Ice cream.</w:t>
-            </w:r>
-          </w:p>
-        </w:tc>
-      </w:tr>
-    </w:tbl>
-    <w:p>
-      <w:pPr>
-        <w:spacing w:after="120"/>
-      </w:pPr>
-    </w:p>
-    <w:p>
-      <w:pPr>
-        <w:pStyle w:val="Heading3"/>
-        <w:keepNext/>
-        <w:keepLines/>
-        <w:pBdr>
-          <w:left w:val="single" w:color="4BACC6" w:sz="24" w:space="10"/>
-        </w:pBdr>
-        <w:spacing w:after="100" w:before="200"/>
-        <w:ind w:left="170"/>
-      </w:pPr>
-      <w:r>
-        <w:rPr>
-          <w:rFonts w:ascii="Aptos" w:cs="Aptos" w:eastAsia="Aptos" w:hAnsi="Aptos"/>
-          <w:b/>
-          <w:bCs/>
-          <w:color w:val="27343A"/>
-          <w:sz w:val="24"/>
-          <w:szCs w:val="24"/>
-        </w:rPr>
-        <w:t xml:space="preserve">Nói gì</w:t>
-      </w:r>
-    </w:p>
-    <w:p>
-      <w:pPr>
-        <w:pStyle w:val="ListParagraph"/>
-        <w:numPr>
-          <w:ilvl w:val="0"/>
-          <w:numId w:val="2"/>
-        </w:numPr>
-        <w:spacing w:after="80" w:line="276"/>
-      </w:pPr>
-      <w:r>
-        <w:rPr>
-          <w:rFonts w:ascii="Aptos" w:cs="Aptos" w:eastAsia="Aptos" w:hAnsi="Aptos"/>
-          <w:color w:val="27343A"/>
-        </w:rPr>
-        <w:t xml:space="preserve">Vòng khép lại: 20 phút trước Minh gõ một câu là sắp hết Ice cream; giờ hàng đã rời kho Marou và Minh được báo trước.</w:t>
-      </w:r>
-    </w:p>
-    <w:p>
-      <w:pPr>
-        <w:pStyle w:val="ListParagraph"/>
-        <w:numPr>
-          <w:ilvl w:val="0"/>
-          <w:numId w:val="2"/>
-        </w:numPr>
-        <w:spacing w:after="80" w:line="276"/>
-      </w:pPr>
-      <w:r>
-        <w:rPr>
-          <w:rFonts w:ascii="Aptos" w:cs="Aptos" w:eastAsia="Aptos" w:hAnsi="Aptos"/>
-          <w:color w:val="27343A"/>
-        </w:rPr>
-        <w:t xml:space="preserve">Nút này là công cụ demo, không thuộc sản phẩm. Trên hệ thật đó là người kho Marou bấm Post Shipment.</w:t>
-      </w:r>
-    </w:p>
-    <w:p>
-      <w:pPr>
-        <w:pBdr>
-          <w:left w:val="single" w:color="C89B72" w:sz="36" w:space="10"/>
-        </w:pBdr>
-        <w:shd w:fill="F4EEE8" w:val="clear"/>
-        <w:spacing w:after="200" w:before="120" w:line="276"/>
-        <w:ind w:left="200" w:right="120"/>
-      </w:pPr>
-      <w:r>
-        <w:rPr>
-          <w:rFonts w:ascii="Aptos" w:cs="Aptos" w:eastAsia="Aptos" w:hAnsi="Aptos"/>
-          <w:color w:val="27343A"/>
-        </w:rPr>
-        <w:t xml:space="preserve">Muốn diễn tiếp cảnh hôm sau: bấm +24 giờ trong khay demo rồi bấm lại nút 18, trợ lý nhắc và ghi đề xuất post nhận cho đơn Ice cream. Chỉ làm sau khi xong bước 19, vì +24 giờ làm HO106202 thành quá ngày.</w:t>
-      </w:r>
-    </w:p>
-    <w:p>
-      <w:pPr>
-        <w:pStyle w:val="Heading2"/>
-        <w:keepNext/>
-        <w:keepLines/>
-        <w:pBdr>
-          <w:left w:val="single" w:color="4BACC6" w:sz="24" w:space="10"/>
-        </w:pBdr>
-        <w:spacing w:after="120" w:before="280"/>
-        <w:ind w:left="170"/>
-      </w:pPr>
-      <w:r>
-        <w:rPr>
-          <w:rFonts w:ascii="Aptos" w:cs="Aptos" w:eastAsia="Aptos" w:hAnsi="Aptos"/>
-          <w:b/>
-          <w:bCs/>
-          <w:color w:val="27343A"/>
-          <w:sz w:val="28"/>
-          <w:szCs w:val="28"/>
-        </w:rPr>
-        <w:t xml:space="preserve">Phần 6 · Bất thường và chi phí</w:t>
-      </w:r>
-    </w:p>
-    <w:p>
-      <w:pPr>
-        <w:pStyle w:val="Heading2"/>
-        <w:keepNext/>
-        <w:keepLines/>
-        <w:pBdr>
-          <w:left w:val="single" w:color="4BACC6" w:sz="24" w:space="10"/>
-        </w:pBdr>
-        <w:spacing w:after="120" w:before="280"/>
-        <w:ind w:left="170"/>
-      </w:pPr>
-      <w:r>
-        <w:rPr>
-          <w:rFonts w:ascii="Aptos" w:cs="Aptos" w:eastAsia="Aptos" w:hAnsi="Aptos"/>
-          <w:b/>
-          <w:bCs/>
-          <w:color w:val="27343A"/>
-          <w:sz w:val="28"/>
-          <w:szCs w:val="28"/>
-        </w:rPr>
-        <w:t xml:space="preserve">Bước 22 · Có gì bất thường 28 ngày qua</w:t>
-      </w:r>
-    </w:p>
-    <w:p>
-      <w:pPr>
-        <w:spacing w:after="120" w:line="276"/>
-      </w:pPr>
-      <w:r>
-        <w:rPr>
-          <w:rFonts w:ascii="Aptos" w:cs="Aptos" w:eastAsia="Aptos" w:hAnsi="Aptos"/>
-          <w:color w:val="27343A"/>
-        </w:rPr>
-        <w:t xml:space="preserve">Vai: trang.sc · Dakao</w:t>
-      </w:r>
-    </w:p>
-    <w:tbl>
-      <w:tblPr>
-        <w:tblW w:type="dxa" w:w="9638"/>
-        <w:tblBorders>
-          <w:top w:val="single" w:color="auto" w:sz="4"/>
-          <w:left w:val="single" w:color="auto" w:sz="4"/>
-          <w:bottom w:val="single" w:color="auto" w:sz="4"/>
-          <w:right w:val="single" w:color="auto" w:sz="4"/>
-          <w:insideH w:val="single" w:color="auto" w:sz="4"/>
-          <w:insideV w:val="single" w:color="auto" w:sz="4"/>
-        </w:tblBorders>
-      </w:tblPr>
-      <w:tblGrid>
-        <w:gridCol w:w="4337"/>
-        <w:gridCol w:w="5301"/>
-      </w:tblGrid>
-      <w:tr>
-        <w:trPr>
-          <w:cantSplit w:val="false"/>
-          <w:tblHeader/>
-        </w:trPr>
-        <w:tc>
-          <w:tcPr>
-            <w:tcW w:type="dxa" w:w="4337"/>
-            <w:tcBorders>
-              <w:top w:val="single" w:color="A9D5E2" w:sz="4"/>
-              <w:left w:val="single" w:color="A9D5E2" w:sz="4"/>
-              <w:bottom w:val="single" w:color="A9D5E2" w:sz="4"/>
-              <w:right w:val="single" w:color="A9D5E2" w:sz="4"/>
-            </w:tcBorders>
-            <w:shd w:fill="4BACC6" w:val="clear"/>
-            <w:tcMar>
-              <w:top w:type="dxa" w:w="113"/>
-              <w:left w:type="dxa" w:w="113"/>
-              <w:bottom w:type="dxa" w:w="113"/>
-              <w:right w:type="dxa" w:w="113"/>
-            </w:tcMar>
-          </w:tcPr>
-          <w:p>
-            <w:pPr>
-              <w:spacing w:after="0" w:line="252"/>
-            </w:pPr>
-            <w:r>
-              <w:rPr>
-                <w:rFonts w:ascii="Aptos" w:cs="Aptos" w:eastAsia="Aptos" w:hAnsi="Aptos"/>
-                <w:b/>
-                <w:bCs/>
-                <w:color w:val="27343A"/>
-                <w:sz w:val="20"/>
-                <w:szCs w:val="20"/>
-              </w:rPr>
-              <w:t xml:space="preserve">Bấm gì</w:t>
-            </w:r>
-          </w:p>
-        </w:tc>
-        <w:tc>
-          <w:tcPr>
-            <w:tcW w:type="dxa" w:w="5301"/>
-            <w:tcBorders>
-              <w:top w:val="single" w:color="A9D5E2" w:sz="4"/>
-              <w:left w:val="single" w:color="A9D5E2" w:sz="4"/>
-              <w:bottom w:val="single" w:color="A9D5E2" w:sz="4"/>
-              <w:right w:val="single" w:color="A9D5E2" w:sz="4"/>
-            </w:tcBorders>
-            <w:shd w:fill="4BACC6" w:val="clear"/>
-            <w:tcMar>
-              <w:top w:type="dxa" w:w="113"/>
-              <w:left w:type="dxa" w:w="113"/>
-              <w:bottom w:type="dxa" w:w="113"/>
-              <w:right w:type="dxa" w:w="113"/>
-            </w:tcMar>
-          </w:tcPr>
-          <w:p>
-            <w:pPr>
-              <w:spacing w:after="0" w:line="252"/>
-            </w:pPr>
-            <w:r>
-              <w:rPr>
-                <w:rFonts w:ascii="Aptos" w:cs="Aptos" w:eastAsia="Aptos" w:hAnsi="Aptos"/>
-                <w:b/>
-                <w:bCs/>
-                <w:color w:val="27343A"/>
-                <w:sz w:val="20"/>
-                <w:szCs w:val="20"/>
-              </w:rPr>
-              <w:t xml:space="preserve">Khách thấy gì</w:t>
-            </w:r>
-          </w:p>
-        </w:tc>
-      </w:tr>
-      <w:tr>
-        <w:trPr>
-          <w:cantSplit/>
-          <w:tblHeader w:val="false"/>
-        </w:trPr>
-        <w:tc>
-          <w:tcPr>
-            <w:tcW w:type="dxa" w:w="4337"/>
-            <w:tcBorders>
-              <w:top w:val="single" w:color="A9D5E2" w:sz="4"/>
-              <w:left w:val="single" w:color="A9D5E2" w:sz="4"/>
-              <w:bottom w:val="single" w:color="A9D5E2" w:sz="4"/>
-              <w:right w:val="single" w:color="A9D5E2" w:sz="4"/>
-            </w:tcBorders>
-            <w:tcMar>
-              <w:top w:type="dxa" w:w="113"/>
-              <w:left w:type="dxa" w:w="113"/>
-              <w:bottom w:type="dxa" w:w="113"/>
-              <w:right w:type="dxa" w:w="113"/>
-            </w:tcMar>
-          </w:tcPr>
-          <w:p>
-            <w:pPr>
-              <w:spacing w:after="0" w:line="252"/>
-            </w:pPr>
-            <w:r>
-              <w:rPr>
-                <w:rFonts w:ascii="Aptos" w:cs="Aptos" w:eastAsia="Aptos" w:hAnsi="Aptos"/>
-                <w:b w:val="false"/>
-                <w:bCs w:val="false"/>
-                <w:color w:val="27343A"/>
-                <w:sz w:val="20"/>
-                <w:szCs w:val="20"/>
-              </w:rPr>
-              <w:t xml:space="preserve">Nút 22.</w:t>
-            </w:r>
-          </w:p>
-        </w:tc>
-        <w:tc>
-          <w:tcPr>
-            <w:tcW w:type="dxa" w:w="5301"/>
-            <w:tcBorders>
-              <w:top w:val="single" w:color="A9D5E2" w:sz="4"/>
-              <w:left w:val="single" w:color="A9D5E2" w:sz="4"/>
-              <w:bottom w:val="single" w:color="A9D5E2" w:sz="4"/>
-              <w:right w:val="single" w:color="A9D5E2" w:sz="4"/>
-            </w:tcBorders>
-            <w:tcMar>
-              <w:top w:type="dxa" w:w="113"/>
-              <w:left w:type="dxa" w:w="113"/>
-              <w:bottom w:type="dxa" w:w="113"/>
-              <w:right w:type="dxa" w:w="113"/>
-            </w:tcMar>
-          </w:tcPr>
-          <w:p>
-            <w:pPr>
-              <w:spacing w:after="0" w:line="252"/>
-            </w:pPr>
-            <w:r>
-              <w:rPr>
-                <w:rFonts w:ascii="Aptos" w:cs="Aptos" w:eastAsia="Aptos" w:hAnsi="Aptos"/>
-                <w:b w:val="false"/>
-                <w:bCs w:val="false"/>
-                <w:color w:val="27343A"/>
-                <w:sz w:val="20"/>
-                <w:szCs w:val="20"/>
-              </w:rPr>
-              <w:t xml:space="preserve">Thẻ 16 tín hiệu bất thường: 15 nhận hàng hạn quá ngắn, 1 hết hàng lặp lại; model ưu tiên ba tín hiệu ở S0001 và viết nhận xét; Người soạn AI.</w:t>
-            </w:r>
-          </w:p>
-        </w:tc>
-      </w:tr>
-    </w:tbl>
-    <w:p>
-      <w:pPr>
-        <w:spacing w:after="120"/>
-      </w:pPr>
-    </w:p>
-    <w:p>
-      <w:pPr>
-        <w:pStyle w:val="Heading3"/>
-        <w:keepNext/>
-        <w:keepLines/>
-        <w:pBdr>
-          <w:left w:val="single" w:color="4BACC6" w:sz="24" w:space="10"/>
-        </w:pBdr>
-        <w:spacing w:after="100" w:before="200"/>
-        <w:ind w:left="170"/>
-      </w:pPr>
-      <w:r>
-        <w:rPr>
-          <w:rFonts w:ascii="Aptos" w:cs="Aptos" w:eastAsia="Aptos" w:hAnsi="Aptos"/>
-          <w:b/>
-          <w:bCs/>
-          <w:color w:val="27343A"/>
-          <w:sz w:val="24"/>
-          <w:szCs w:val="24"/>
-        </w:rPr>
-        <w:t xml:space="preserve">Nói gì</w:t>
-      </w:r>
-    </w:p>
-    <w:p>
-      <w:pPr>
-        <w:pStyle w:val="ListParagraph"/>
-        <w:numPr>
-          <w:ilvl w:val="0"/>
-          <w:numId w:val="2"/>
-        </w:numPr>
-        <w:spacing w:after="80" w:line="276"/>
-      </w:pPr>
-      <w:r>
-        <w:rPr>
-          <w:rFonts w:ascii="Aptos" w:cs="Aptos" w:eastAsia="Aptos" w:hAnsi="Aptos"/>
-          <w:color w:val="27343A"/>
-        </w:rPr>
-        <w:t xml:space="preserve">Năm tín hiệu code quét: bán sau hạn, nhận hàng hạn ngắn bất thường, huỷ tăng gấp đôi, tồn không bán, hết hàng lặp lại. Model chọn tối đa ba và giải thích; mã tín hiệu phải nằm trong danh sách.</w:t>
-      </w:r>
-    </w:p>
-    <w:p>
-      <w:pPr>
-        <w:pStyle w:val="ListParagraph"/>
-        <w:numPr>
-          <w:ilvl w:val="0"/>
-          <w:numId w:val="2"/>
-        </w:numPr>
-        <w:spacing w:after="80" w:line="276"/>
-      </w:pPr>
-      <w:r>
-        <w:rPr>
-          <w:rFonts w:ascii="Aptos" w:cs="Aptos" w:eastAsia="Aptos" w:hAnsi="Aptos"/>
-          <w:color w:val="27343A"/>
-        </w:rPr>
-        <w:t xml:space="preserve">Lệch kiểm kê chưa đo được vì bộ dữ liệu không có phiếu kiểm kê. Nói thẳng chỗ này.</w:t>
-      </w:r>
-    </w:p>
-    <w:p>
-      <w:pPr>
-        <w:pStyle w:val="Heading2"/>
-        <w:keepNext/>
-        <w:keepLines/>
-        <w:pBdr>
-          <w:left w:val="single" w:color="4BACC6" w:sz="24" w:space="10"/>
-        </w:pBdr>
-        <w:spacing w:after="120" w:before="280"/>
-        <w:ind w:left="170"/>
-      </w:pPr>
-      <w:r>
-        <w:rPr>
-          <w:rFonts w:ascii="Aptos" w:cs="Aptos" w:eastAsia="Aptos" w:hAnsi="Aptos"/>
-          <w:b/>
-          <w:bCs/>
-          <w:color w:val="27343A"/>
-          <w:sz w:val="28"/>
-          <w:szCs w:val="28"/>
-        </w:rPr>
-        <w:t xml:space="preserve">Bước 23 · Chi phí AI đo được</w:t>
-      </w:r>
-    </w:p>
-    <w:p>
-      <w:pPr>
-        <w:spacing w:after="120" w:line="276"/>
-      </w:pPr>
-      <w:r>
-        <w:rPr>
-          <w:rFonts w:ascii="Aptos" w:cs="Aptos" w:eastAsia="Aptos" w:hAnsi="Aptos"/>
-          <w:color w:val="27343A"/>
-        </w:rPr>
-        <w:t xml:space="preserve">Vai: dung.admin · Marou</w:t>
-      </w:r>
-    </w:p>
-    <w:tbl>
-      <w:tblPr>
-        <w:tblW w:type="dxa" w:w="9638"/>
-        <w:tblBorders>
-          <w:top w:val="single" w:color="auto" w:sz="4"/>
-          <w:left w:val="single" w:color="auto" w:sz="4"/>
-          <w:bottom w:val="single" w:color="auto" w:sz="4"/>
-          <w:right w:val="single" w:color="auto" w:sz="4"/>
-          <w:insideH w:val="single" w:color="auto" w:sz="4"/>
-          <w:insideV w:val="single" w:color="auto" w:sz="4"/>
-        </w:tblBorders>
-      </w:tblPr>
-      <w:tblGrid>
-        <w:gridCol w:w="4337"/>
-        <w:gridCol w:w="5301"/>
-      </w:tblGrid>
-      <w:tr>
-        <w:trPr>
-          <w:cantSplit w:val="false"/>
-          <w:tblHeader/>
-        </w:trPr>
-        <w:tc>
-          <w:tcPr>
-            <w:tcW w:type="dxa" w:w="4337"/>
-            <w:tcBorders>
-              <w:top w:val="single" w:color="A9D5E2" w:sz="4"/>
-              <w:left w:val="single" w:color="A9D5E2" w:sz="4"/>
-              <w:bottom w:val="single" w:color="A9D5E2" w:sz="4"/>
-              <w:right w:val="single" w:color="A9D5E2" w:sz="4"/>
-            </w:tcBorders>
-            <w:shd w:fill="4BACC6" w:val="clear"/>
-            <w:tcMar>
-              <w:top w:type="dxa" w:w="113"/>
-              <w:left w:type="dxa" w:w="113"/>
-              <w:bottom w:type="dxa" w:w="113"/>
-              <w:right w:type="dxa" w:w="113"/>
-            </w:tcMar>
-          </w:tcPr>
-          <w:p>
-            <w:pPr>
-              <w:spacing w:after="0" w:line="252"/>
-            </w:pPr>
-            <w:r>
-              <w:rPr>
-                <w:rFonts w:ascii="Aptos" w:cs="Aptos" w:eastAsia="Aptos" w:hAnsi="Aptos"/>
-                <w:b/>
-                <w:bCs/>
-                <w:color w:val="27343A"/>
-                <w:sz w:val="20"/>
-                <w:szCs w:val="20"/>
-              </w:rPr>
-              <w:t xml:space="preserve">Bấm gì</w:t>
-            </w:r>
-          </w:p>
-        </w:tc>
-        <w:tc>
-          <w:tcPr>
-            <w:tcW w:type="dxa" w:w="5301"/>
-            <w:tcBorders>
-              <w:top w:val="single" w:color="A9D5E2" w:sz="4"/>
-              <w:left w:val="single" w:color="A9D5E2" w:sz="4"/>
-              <w:bottom w:val="single" w:color="A9D5E2" w:sz="4"/>
-              <w:right w:val="single" w:color="A9D5E2" w:sz="4"/>
-            </w:tcBorders>
-            <w:shd w:fill="4BACC6" w:val="clear"/>
-            <w:tcMar>
-              <w:top w:type="dxa" w:w="113"/>
-              <w:left w:type="dxa" w:w="113"/>
-              <w:bottom w:type="dxa" w:w="113"/>
-              <w:right w:type="dxa" w:w="113"/>
-            </w:tcMar>
-          </w:tcPr>
-          <w:p>
-            <w:pPr>
-              <w:spacing w:after="0" w:line="252"/>
-            </w:pPr>
-            <w:r>
-              <w:rPr>
-                <w:rFonts w:ascii="Aptos" w:cs="Aptos" w:eastAsia="Aptos" w:hAnsi="Aptos"/>
-                <w:b/>
-                <w:bCs/>
-                <w:color w:val="27343A"/>
-                <w:sz w:val="20"/>
-                <w:szCs w:val="20"/>
-              </w:rPr>
-              <w:t xml:space="preserve">Khách thấy gì</w:t>
-            </w:r>
-          </w:p>
-        </w:tc>
-      </w:tr>
-      <w:tr>
-        <w:trPr>
-          <w:cantSplit/>
-          <w:tblHeader w:val="false"/>
-        </w:trPr>
-        <w:tc>
-          <w:tcPr>
-            <w:tcW w:type="dxa" w:w="4337"/>
-            <w:tcBorders>
-              <w:top w:val="single" w:color="A9D5E2" w:sz="4"/>
-              <w:left w:val="single" w:color="A9D5E2" w:sz="4"/>
-              <w:bottom w:val="single" w:color="A9D5E2" w:sz="4"/>
-              <w:right w:val="single" w:color="A9D5E2" w:sz="4"/>
-            </w:tcBorders>
-            <w:tcMar>
-              <w:top w:type="dxa" w:w="113"/>
-              <w:left w:type="dxa" w:w="113"/>
-              <w:bottom w:type="dxa" w:w="113"/>
-              <w:right w:type="dxa" w:w="113"/>
-            </w:tcMar>
-          </w:tcPr>
-          <w:p>
-            <w:pPr>
-              <w:spacing w:after="0" w:line="252"/>
-            </w:pPr>
-            <w:r>
-              <w:rPr>
-                <w:rFonts w:ascii="Aptos" w:cs="Aptos" w:eastAsia="Aptos" w:hAnsi="Aptos"/>
-                <w:b w:val="false"/>
-                <w:bCs w:val="false"/>
-                <w:color w:val="27343A"/>
-                <w:sz w:val="20"/>
-                <w:szCs w:val="20"/>
-              </w:rPr>
-              <w:t xml:space="preserve">Nút 23. Console mở tab Cài đặt AI.</w:t>
+              <w:t xml:space="preserve">Nút 18. Console mở tab Cài đặt AI.</w:t>
             </w:r>
           </w:p>
         </w:tc>
@@ -10943,7 +9483,7 @@
                 <w:sz w:val="20"/>
                 <w:szCs w:val="20"/>
               </w:rPr>
-              <w:t xml:space="preserve">Trong buổi này AI ở năm chỗ: brief chọn việc (bước 2), câu hỏi mở tự dựng chuỗi tra cứu (8), phân tích đề xuất bổ sung bất thường (9), chọn phương án cho lô cận date (16), đọc tín hiệu bất thường (22). Còn lại là LS và Business Central tính, trợ lý đọc và giải thích. Tính năng không thuộc bốn nhóm tóm tắt, tạo sinh, phân tích, tự động hoá thì chúng tôi gọi đúng tên là tính năng ứng dụng.</w:t>
+              <w:t xml:space="preserve">Trong buổi này AI ở năm chỗ: brief chọn việc (bước 2), chọn phương án cho lô cận date (4), phân tích đề xuất bổ sung bất thường (9), đọc tín hiệu bất thường (17), và kể lại mọi kết quả tra cứu bằng lời (7, 10, 11, 16). Còn lại là LS và Business Central tính, trợ lý đọc và giải thích. Tính năng không thuộc bốn nhóm tóm tắt, tạo sinh, phân tích, tự động hoá thì chúng tôi gọi đúng tên là tính năng ứng dụng.</w:t>
             </w:r>
           </w:p>
         </w:tc>
@@ -12282,7 +10822,7 @@
                 <w:sz w:val="20"/>
                 <w:szCs w:val="20"/>
               </w:rPr>
-              <w:t xml:space="preserve">Bước 3 trả lời “chuyển từ W0003” thay vì đặt mua từ MAROU</w:t>
+              <w:t xml:space="preserve">Bước 6 trả lời “chuyển từ W0003” thay vì đặt mua từ MAROU</w:t>
             </w:r>
           </w:p>
         </w:tc>
@@ -12348,7 +10888,7 @@
                 <w:sz w:val="20"/>
                 <w:szCs w:val="20"/>
               </w:rPr>
-              <w:t xml:space="preserve">Nhìn dải nguồn: nút Dakao (bán lẻ) phải đang tô. Bấm lại nút 3</w:t>
+              <w:t xml:space="preserve">Nhìn dải nguồn: nút Dakao (bán lẻ) phải đang tô. Bấm lại nút 6</w:t>
             </w:r>
           </w:p>
         </w:tc>
@@ -12387,7 +10927,7 @@
                 <w:sz w:val="20"/>
                 <w:szCs w:val="20"/>
               </w:rPr>
-              <w:t xml:space="preserve">Bước 8 trả lời về hàng liên công ty</w:t>
+              <w:t xml:space="preserve">Câu hỏi mở trả lời về hàng liên công ty</w:t>
             </w:r>
           </w:p>
         </w:tc>
@@ -12807,7 +11347,7 @@
                 <w:sz w:val="20"/>
                 <w:szCs w:val="20"/>
               </w:rPr>
-              <w:t xml:space="preserve">Bước 18 không thấy thẻ HO106202</w:t>
+              <w:t xml:space="preserve">Bước 12 không thấy thẻ HO106202</w:t>
             </w:r>
           </w:p>
         </w:tc>
@@ -13023,7 +11563,7 @@
           <w:rFonts w:ascii="Aptos" w:cs="Aptos" w:eastAsia="Aptos" w:hAnsi="Aptos"/>
           <w:color w:val="27343A"/>
         </w:rPr>
-        <w:t xml:space="preserve">Phương án cuối cùng nếu mạng hỏng: đổi dải nguồn sang dữ liệu mô phỏng. Bộ mô phỏng neo ngày 18/09 và LS trong đó là công thức cũ, nên các bước 4, 5, 6, 9, 14 (nhật ký tính LS) không có; các bước còn lại diễn được nhưng số khác. Nói rõ với khách là đang ở bộ mô phỏng.</w:t>
+        <w:t xml:space="preserve">Phương án cuối cùng nếu mạng hỏng: đổi dải nguồn sang dữ liệu mô phỏng. Bộ mô phỏng neo ngày 18/09 và LS trong đó là công thức cũ, nên các bước 7, 9 (nhật ký tính LS) không có; các bước còn lại diễn được nhưng số khác. Nói rõ với khách là đang ở bộ mô phỏng.</w:t>
       </w:r>
     </w:p>
     <w:sectPr>

</xml_diff>

<commit_message>
Email cho nguoi duyet do AI soan; D4 tu cau chat; lich nen tu bao Marou xuat kho; TO chuyen thang khi khong co In-Transit; planner co ngu canh doan chat, tool CTKM va hang ban cham; kich ban 20 buoc UC2 len dau; favicon linh vat; giu am bang nang; QA script
</commit_message>
<xml_diff>
--- a/docs/13 Marou POC - Demo script (noi bo).docx
+++ b/docs/13 Marou POC - Demo script (noi bo).docx
@@ -5362,7 +5362,7 @@
                 <w:sz w:val="20"/>
                 <w:szCs w:val="20"/>
               </w:rPr>
-              <w:t xml:space="preserve">Sau khoảng 6 giây: thẻ bảng năm phương án kèm giá trị cứu được hoặc mất, lời khuyên của model (chuyển 199 sang S0001 bán nhanh hơn), nút ghi đề xuất. Bấm nút đó.</w:t>
+              <w:t xml:space="preserve">Sau khoảng 6 giây: thẻ bảng năm phương án kèm giá trị cứu được hoặc mất, lời khuyên của model (chuyển 199 sang S0001 bán nhanh hơn), nút ghi đề xuất. Bấm nút đó. Sau khi ghi: thẻ Email cho người duyệt, phần lời do AI viết, kênh SMTP đã gửi.</w:t>
             </w:r>
           </w:p>
         </w:tc>
@@ -5445,6 +5445,23 @@
           <w:color w:val="27343A"/>
         </w:rPr>
         <w:t xml:space="preserve">Đây là UC2 nối sang UC5: hàng cận date đi về nơi bán nhanh, không phải huỷ.</w:t>
+      </w:r>
+    </w:p>
+    <w:p>
+      <w:pPr>
+        <w:pStyle w:val="ListParagraph"/>
+        <w:numPr>
+          <w:ilvl w:val="0"/>
+          <w:numId w:val="2"/>
+        </w:numPr>
+        <w:spacing w:after="80" w:line="276"/>
+      </w:pPr>
+      <w:r>
+        <w:rPr>
+          <w:rFonts w:ascii="Aptos" w:cs="Aptos" w:eastAsia="Aptos" w:hAnsi="Aptos"/>
+          <w:color w:val="27343A"/>
+        </w:rPr>
+        <w:t xml:space="preserve">Người duyệt được gọi hai đường: thẻ trong chat cho ai đang mở trợ lý, email cho ai không mở. Code điền bảng số liệu và link BC; AI chỉ viết đoạn mở đầu và đoạn kết, mỗi con số phải có trong dữ liệu, sai thì dùng mẫu và ghi rõ.</w:t>
       </w:r>
     </w:p>
     <w:p>
@@ -10204,6 +10221,78 @@
                 <w:szCs w:val="20"/>
               </w:rPr>
               <w:t xml:space="preserve">Hai đơn vị đang dùng chung một bộ dữ liệu mô phỏng nên bên Dakao vẫn còn bật quản lý lô. Trợ lý xử lý số lô chỉ khi mặt hàng bên mua có bật, và không đẩy số lô ra cho cửa hàng. Cho cửa hàng giữ lô hay không là quyết định của Marou.</w:t>
+            </w:r>
+          </w:p>
+        </w:tc>
+      </w:tr>
+      <w:tr>
+        <w:trPr>
+          <w:cantSplit/>
+          <w:tblHeader w:val="false"/>
+        </w:trPr>
+        <w:tc>
+          <w:tcPr>
+            <w:tcW w:type="dxa" w:w="3373"/>
+            <w:tcBorders>
+              <w:top w:val="single" w:color="A9D5E2" w:sz="4"/>
+              <w:left w:val="single" w:color="A9D5E2" w:sz="4"/>
+              <w:bottom w:val="single" w:color="A9D5E2" w:sz="4"/>
+              <w:right w:val="single" w:color="A9D5E2" w:sz="4"/>
+            </w:tcBorders>
+            <w:tcMar>
+              <w:top w:type="dxa" w:w="113"/>
+              <w:left w:type="dxa" w:w="113"/>
+              <w:bottom w:type="dxa" w:w="113"/>
+              <w:right w:type="dxa" w:w="113"/>
+            </w:tcMar>
+          </w:tcPr>
+          <w:p>
+            <w:pPr>
+              <w:spacing w:after="0" w:line="252"/>
+            </w:pPr>
+            <w:r>
+              <w:rPr>
+                <w:rFonts w:ascii="Aptos" w:cs="Aptos" w:eastAsia="Aptos" w:hAnsi="Aptos"/>
+                <w:b w:val="false"/>
+                <w:bCs w:val="false"/>
+                <w:color w:val="27343A"/>
+                <w:sz w:val="20"/>
+                <w:szCs w:val="20"/>
+              </w:rPr>
+              <w:t xml:space="preserve">Email báo người duyệt có phải AI viết không?</w:t>
+            </w:r>
+          </w:p>
+        </w:tc>
+        <w:tc>
+          <w:tcPr>
+            <w:tcW w:type="dxa" w:w="6265"/>
+            <w:tcBorders>
+              <w:top w:val="single" w:color="A9D5E2" w:sz="4"/>
+              <w:left w:val="single" w:color="A9D5E2" w:sz="4"/>
+              <w:bottom w:val="single" w:color="A9D5E2" w:sz="4"/>
+              <w:right w:val="single" w:color="A9D5E2" w:sz="4"/>
+            </w:tcBorders>
+            <w:tcMar>
+              <w:top w:type="dxa" w:w="113"/>
+              <w:left w:type="dxa" w:w="113"/>
+              <w:bottom w:type="dxa" w:w="113"/>
+              <w:right w:type="dxa" w:w="113"/>
+            </w:tcMar>
+          </w:tcPr>
+          <w:p>
+            <w:pPr>
+              <w:spacing w:after="0" w:line="252"/>
+            </w:pPr>
+            <w:r>
+              <w:rPr>
+                <w:rFonts w:ascii="Aptos" w:cs="Aptos" w:eastAsia="Aptos" w:hAnsi="Aptos"/>
+                <w:b w:val="false"/>
+                <w:bCs w:val="false"/>
+                <w:color w:val="27343A"/>
+                <w:sz w:val="20"/>
+                <w:szCs w:val="20"/>
+              </w:rPr>
+              <w:t xml:space="preserve">Có, phần lời. Bảng mặt hàng, lô, tồn, giá trị, tầng, policy và link Business Central do code điền; AI viết hai đoạn mở đầu và kết, mỗi chữ số phải có trong dữ liệu đưa nó, không thì thư dùng mẫu và thẻ ghi rõ. Thẻ Email cho người duyệt trong chat của người đề nghị hiện đúng hai đoạn đó kèm nhãn nguồn.</w:t>
             </w:r>
           </w:p>
         </w:tc>
@@ -11637,7 +11726,7 @@
         <w:sz w:val="18"/>
         <w:szCs w:val="18"/>
       </w:rPr>
-      <w:t xml:space="preserve">Demo script · Bản 2.0, 16/09/2026</w:t>
+      <w:t xml:space="preserve">Demo script · Bản 2.4, 16/09/2026</w:t>
     </w:r>
     <w:r>
       <w:rPr>

</xml_diff>

<commit_message>
QA 20 buoc kich ban 17/09: TO chuyen thang, poll khong ve tin company cu, CTKM va ban cham cho planner, ngu canh doan chat, kiem so danh sach dia diem, giu am bang nang, lich nen bao xuat kho sua moc; script ban 3.0, slide v4, anh kb17
</commit_message>
<xml_diff>
--- a/docs/13 Marou POC - Demo script (noi bo).docx
+++ b/docs/13 Marou POC - Demo script (noi bo).docx
@@ -24,7 +24,7 @@
           <w:sz w:val="52"/>
           <w:szCs w:val="52"/>
         </w:rPr>
-        <w:t xml:space="preserve">Demo script: một buổi sáng ở Dakao và Marou</w:t>
+        <w:t xml:space="preserve">Demo script: một buổi sáng ở Marou và Dakao</w:t>
       </w:r>
     </w:p>
     <w:p>
@@ -39,7 +39,7 @@
           <w:sz w:val="28"/>
           <w:szCs w:val="28"/>
         </w:rPr>
-        <w:t xml:space="preserve">Runbook 18 bước cho buổi trình diễn 17/09/2026: dữ liệu đã tạo sẵn, bấm gì, khách thấy gì, nói gì</w:t>
+        <w:t xml:space="preserve">Runbook 20 bước cho buổi trình diễn 17/09/2026: dữ liệu đã tạo sẵn, bấm gì, khách thấy gì, nói gì</w:t>
       </w:r>
     </w:p>
     <w:p>
@@ -84,7 +84,7 @@
           <w:sz w:val="20"/>
           <w:szCs w:val="20"/>
         </w:rPr>
-        <w:t xml:space="preserve">Soạn tối 16/09/2026. Thứ tự bước trùng với cột Kịch bản demo trên console.</w:t>
+        <w:t xml:space="preserve">Soạn rạng sáng 17/09/2026, sau khi chạy thử cả 20 bước trên dữ liệu thật. Thứ tự bước trùng với cột Kịch bản demo trên console.</w:t>
       </w:r>
     </w:p>
     <w:p>
@@ -99,7 +99,7 @@
           <w:sz w:val="20"/>
           <w:szCs w:val="20"/>
         </w:rPr>
-        <w:t xml:space="preserve">Đi kèm bộ slide 12; slide có speaker note, tài liệu này có thao tác.</w:t>
+        <w:t xml:space="preserve">Đi kèm bộ slide rút gọn; slide có speaker note, tài liệu này có thao tác.</w:t>
       </w:r>
     </w:p>
     <w:p>
@@ -147,7 +147,7 @@
           <w:rFonts w:ascii="Aptos" w:cs="Aptos" w:eastAsia="Aptos" w:hAnsi="Aptos"/>
           <w:color w:val="27343A"/>
         </w:rPr>
-        <w:t xml:space="preserve">Trọng tâm là UC2 Sức khỏe tồn kho và truy xuất, xen một nhịp UC5 và một nhịp UC1 để thấy trợ lý nối các UC với nhau. Mạch: sáng nay Marou nhìn tồn kho, AI chọn ba việc; một lô cận date được AI phân tích và đề xuất chuyển sang cửa hàng bán nhanh; một cửa hàng bán lẻ kêu hết hàng, LS tính, AI đề xuất đặt mua từ Marou; dự báo và khuyến mãi nối sang bổ sung; hàng về cửa hàng qua liên công ty, trợ lý báo và xin phép post phiếu nhận; cuối cùng truy xuất lô, bất thường và chi phí. Sáu phần, 18 bước, mỗi bước là một nút trên cột trái của console, tên nút chính là câu sẽ gửi.</w:t>
+        <w:t xml:space="preserve">Trọng tâm là UC2 Sức khỏe tồn kho và truy xuất. Ba phần đầu toàn UC2: sáng nay Marou nhìn tồn kho và AI chọn ba việc; một lô cận date được AI phân tích và đề xuất chuyển sang cửa hàng bán nhanh; rồi người dùng hỏi tự do (hàng nào chậm luân chuyển, nên chạy CTKM gì), truy xuất một lô và quét bất thường. Sau đó mới nối sang UC5 (cửa hàng bán lẻ hết hàng, LS tính, AI đề xuất đặt mua từ Marou), UC1 (dự báo và khuyến mãi), và vòng liên công ty khép lại khi hàng về cửa hàng. Bảy phần, 20 bước, mỗi bước là một nút trên cột trái của console, tên nút chính là câu sẽ gửi.</w:t>
       </w:r>
     </w:p>
     <w:tbl>
@@ -163,10 +163,10 @@
         </w:tblBorders>
       </w:tblPr>
       <w:tblGrid>
-        <w:gridCol w:w="3695"/>
+        <w:gridCol w:w="3855"/>
+        <w:gridCol w:w="1606"/>
+        <w:gridCol w:w="2410"/>
         <w:gridCol w:w="1767"/>
-        <w:gridCol w:w="2410"/>
-        <w:gridCol w:w="1766"/>
       </w:tblGrid>
       <w:tr>
         <w:trPr>
@@ -175,7 +175,7 @@
         </w:trPr>
         <w:tc>
           <w:tcPr>
-            <w:tcW w:type="dxa" w:w="3695"/>
+            <w:tcW w:type="dxa" w:w="3855"/>
             <w:tcBorders>
               <w:top w:val="single" w:color="A9D5E2" w:sz="4"/>
               <w:left w:val="single" w:color="A9D5E2" w:sz="4"/>
@@ -209,7 +209,7 @@
         </w:tc>
         <w:tc>
           <w:tcPr>
-            <w:tcW w:type="dxa" w:w="1767"/>
+            <w:tcW w:type="dxa" w:w="1606"/>
             <w:tcBorders>
               <w:top w:val="single" w:color="A9D5E2" w:sz="4"/>
               <w:left w:val="single" w:color="A9D5E2" w:sz="4"/>
@@ -277,7 +277,7 @@
         </w:tc>
         <w:tc>
           <w:tcPr>
-            <w:tcW w:type="dxa" w:w="1766"/>
+            <w:tcW w:type="dxa" w:w="1767"/>
             <w:tcBorders>
               <w:top w:val="single" w:color="A9D5E2" w:sz="4"/>
               <w:left w:val="single" w:color="A9D5E2" w:sz="4"/>
@@ -317,7 +317,7 @@
         </w:trPr>
         <w:tc>
           <w:tcPr>
-            <w:tcW w:type="dxa" w:w="3695"/>
+            <w:tcW w:type="dxa" w:w="3855"/>
             <w:tcBorders>
               <w:top w:val="single" w:color="A9D5E2" w:sz="4"/>
               <w:left w:val="single" w:color="A9D5E2" w:sz="4"/>
@@ -350,6 +350,72 @@
         </w:tc>
         <w:tc>
           <w:tcPr>
+            <w:tcW w:type="dxa" w:w="1606"/>
+            <w:tcBorders>
+              <w:top w:val="single" w:color="A9D5E2" w:sz="4"/>
+              <w:left w:val="single" w:color="A9D5E2" w:sz="4"/>
+              <w:bottom w:val="single" w:color="A9D5E2" w:sz="4"/>
+              <w:right w:val="single" w:color="A9D5E2" w:sz="4"/>
+            </w:tcBorders>
+            <w:tcMar>
+              <w:top w:type="dxa" w:w="113"/>
+              <w:left w:type="dxa" w:w="113"/>
+              <w:bottom w:type="dxa" w:w="113"/>
+              <w:right w:type="dxa" w:w="113"/>
+            </w:tcMar>
+          </w:tcPr>
+          <w:p>
+            <w:pPr>
+              <w:spacing w:after="0" w:line="252"/>
+            </w:pPr>
+            <w:r>
+              <w:rPr>
+                <w:rFonts w:ascii="Aptos" w:cs="Aptos" w:eastAsia="Aptos" w:hAnsi="Aptos"/>
+                <w:b w:val="false"/>
+                <w:bCs w:val="false"/>
+                <w:color w:val="27343A"/>
+                <w:sz w:val="20"/>
+                <w:szCs w:val="20"/>
+              </w:rPr>
+              <w:t xml:space="preserve">1, 2</w:t>
+            </w:r>
+          </w:p>
+        </w:tc>
+        <w:tc>
+          <w:tcPr>
+            <w:tcW w:type="dxa" w:w="2410"/>
+            <w:tcBorders>
+              <w:top w:val="single" w:color="A9D5E2" w:sz="4"/>
+              <w:left w:val="single" w:color="A9D5E2" w:sz="4"/>
+              <w:bottom w:val="single" w:color="A9D5E2" w:sz="4"/>
+              <w:right w:val="single" w:color="A9D5E2" w:sz="4"/>
+            </w:tcBorders>
+            <w:tcMar>
+              <w:top w:type="dxa" w:w="113"/>
+              <w:left w:type="dxa" w:w="113"/>
+              <w:bottom w:type="dxa" w:w="113"/>
+              <w:right w:type="dxa" w:w="113"/>
+            </w:tcMar>
+          </w:tcPr>
+          <w:p>
+            <w:pPr>
+              <w:spacing w:after="0" w:line="252"/>
+            </w:pPr>
+            <w:r>
+              <w:rPr>
+                <w:rFonts w:ascii="Aptos" w:cs="Aptos" w:eastAsia="Aptos" w:hAnsi="Aptos"/>
+                <w:b w:val="false"/>
+                <w:bCs w:val="false"/>
+                <w:color w:val="27343A"/>
+                <w:sz w:val="20"/>
+                <w:szCs w:val="20"/>
+              </w:rPr>
+              <w:t xml:space="preserve">UC2, AI</w:t>
+            </w:r>
+          </w:p>
+        </w:tc>
+        <w:tc>
+          <w:tcPr>
             <w:tcW w:type="dxa" w:w="1767"/>
             <w:tcBorders>
               <w:top w:val="single" w:color="A9D5E2" w:sz="4"/>
@@ -377,73 +443,7 @@
                 <w:sz w:val="20"/>
                 <w:szCs w:val="20"/>
               </w:rPr>
-              <w:t xml:space="preserve">1, 2</w:t>
-            </w:r>
-          </w:p>
-        </w:tc>
-        <w:tc>
-          <w:tcPr>
-            <w:tcW w:type="dxa" w:w="2410"/>
-            <w:tcBorders>
-              <w:top w:val="single" w:color="A9D5E2" w:sz="4"/>
-              <w:left w:val="single" w:color="A9D5E2" w:sz="4"/>
-              <w:bottom w:val="single" w:color="A9D5E2" w:sz="4"/>
-              <w:right w:val="single" w:color="A9D5E2" w:sz="4"/>
-            </w:tcBorders>
-            <w:tcMar>
-              <w:top w:type="dxa" w:w="113"/>
-              <w:left w:type="dxa" w:w="113"/>
-              <w:bottom w:type="dxa" w:w="113"/>
-              <w:right w:type="dxa" w:w="113"/>
-            </w:tcMar>
-          </w:tcPr>
-          <w:p>
-            <w:pPr>
-              <w:spacing w:after="0" w:line="252"/>
-            </w:pPr>
-            <w:r>
-              <w:rPr>
-                <w:rFonts w:ascii="Aptos" w:cs="Aptos" w:eastAsia="Aptos" w:hAnsi="Aptos"/>
-                <w:b w:val="false"/>
-                <w:bCs w:val="false"/>
-                <w:color w:val="27343A"/>
-                <w:sz w:val="20"/>
-                <w:szCs w:val="20"/>
-              </w:rPr>
-              <w:t xml:space="preserve">UC2, AI</w:t>
-            </w:r>
-          </w:p>
-        </w:tc>
-        <w:tc>
-          <w:tcPr>
-            <w:tcW w:type="dxa" w:w="1766"/>
-            <w:tcBorders>
-              <w:top w:val="single" w:color="A9D5E2" w:sz="4"/>
-              <w:left w:val="single" w:color="A9D5E2" w:sz="4"/>
-              <w:bottom w:val="single" w:color="A9D5E2" w:sz="4"/>
-              <w:right w:val="single" w:color="A9D5E2" w:sz="4"/>
-            </w:tcBorders>
-            <w:tcMar>
-              <w:top w:type="dxa" w:w="113"/>
-              <w:left w:type="dxa" w:w="113"/>
-              <w:bottom w:type="dxa" w:w="113"/>
-              <w:right w:type="dxa" w:w="113"/>
-            </w:tcMar>
-          </w:tcPr>
-          <w:p>
-            <w:pPr>
-              <w:spacing w:after="0" w:line="252"/>
-            </w:pPr>
-            <w:r>
-              <w:rPr>
-                <w:rFonts w:ascii="Aptos" w:cs="Aptos" w:eastAsia="Aptos" w:hAnsi="Aptos"/>
-                <w:b w:val="false"/>
-                <w:bCs w:val="false"/>
-                <w:color w:val="27343A"/>
-                <w:sz w:val="20"/>
-                <w:szCs w:val="20"/>
-              </w:rPr>
-              <w:t xml:space="preserve">0 đến 5</w:t>
+              <w:t xml:space="preserve">0 đến 4</w:t>
             </w:r>
           </w:p>
         </w:tc>
@@ -455,7 +455,7 @@
         </w:trPr>
         <w:tc>
           <w:tcPr>
-            <w:tcW w:type="dxa" w:w="3695"/>
+            <w:tcW w:type="dxa" w:w="3855"/>
             <w:tcBorders>
               <w:top w:val="single" w:color="A9D5E2" w:sz="4"/>
               <w:left w:val="single" w:color="A9D5E2" w:sz="4"/>
@@ -488,6 +488,72 @@
         </w:tc>
         <w:tc>
           <w:tcPr>
+            <w:tcW w:type="dxa" w:w="1606"/>
+            <w:tcBorders>
+              <w:top w:val="single" w:color="A9D5E2" w:sz="4"/>
+              <w:left w:val="single" w:color="A9D5E2" w:sz="4"/>
+              <w:bottom w:val="single" w:color="A9D5E2" w:sz="4"/>
+              <w:right w:val="single" w:color="A9D5E2" w:sz="4"/>
+            </w:tcBorders>
+            <w:tcMar>
+              <w:top w:type="dxa" w:w="113"/>
+              <w:left w:type="dxa" w:w="113"/>
+              <w:bottom w:type="dxa" w:w="113"/>
+              <w:right w:type="dxa" w:w="113"/>
+            </w:tcMar>
+          </w:tcPr>
+          <w:p>
+            <w:pPr>
+              <w:spacing w:after="0" w:line="252"/>
+            </w:pPr>
+            <w:r>
+              <w:rPr>
+                <w:rFonts w:ascii="Aptos" w:cs="Aptos" w:eastAsia="Aptos" w:hAnsi="Aptos"/>
+                <w:b w:val="false"/>
+                <w:bCs w:val="false"/>
+                <w:color w:val="27343A"/>
+                <w:sz w:val="20"/>
+                <w:szCs w:val="20"/>
+              </w:rPr>
+              <w:t xml:space="preserve">3 đến 5</w:t>
+            </w:r>
+          </w:p>
+        </w:tc>
+        <w:tc>
+          <w:tcPr>
+            <w:tcW w:type="dxa" w:w="2410"/>
+            <w:tcBorders>
+              <w:top w:val="single" w:color="A9D5E2" w:sz="4"/>
+              <w:left w:val="single" w:color="A9D5E2" w:sz="4"/>
+              <w:bottom w:val="single" w:color="A9D5E2" w:sz="4"/>
+              <w:right w:val="single" w:color="A9D5E2" w:sz="4"/>
+            </w:tcBorders>
+            <w:tcMar>
+              <w:top w:type="dxa" w:w="113"/>
+              <w:left w:type="dxa" w:w="113"/>
+              <w:bottom w:type="dxa" w:w="113"/>
+              <w:right w:type="dxa" w:w="113"/>
+            </w:tcMar>
+          </w:tcPr>
+          <w:p>
+            <w:pPr>
+              <w:spacing w:after="0" w:line="252"/>
+            </w:pPr>
+            <w:r>
+              <w:rPr>
+                <w:rFonts w:ascii="Aptos" w:cs="Aptos" w:eastAsia="Aptos" w:hAnsi="Aptos"/>
+                <w:b w:val="false"/>
+                <w:bCs w:val="false"/>
+                <w:color w:val="27343A"/>
+                <w:sz w:val="20"/>
+                <w:szCs w:val="20"/>
+              </w:rPr>
+              <w:t xml:space="preserve">UC2 nối UC5, AI</w:t>
+            </w:r>
+          </w:p>
+        </w:tc>
+        <w:tc>
+          <w:tcPr>
             <w:tcW w:type="dxa" w:w="1767"/>
             <w:tcBorders>
               <w:top w:val="single" w:color="A9D5E2" w:sz="4"/>
@@ -515,73 +581,7 @@
                 <w:sz w:val="20"/>
                 <w:szCs w:val="20"/>
               </w:rPr>
-              <w:t xml:space="preserve">3 đến 5</w:t>
-            </w:r>
-          </w:p>
-        </w:tc>
-        <w:tc>
-          <w:tcPr>
-            <w:tcW w:type="dxa" w:w="2410"/>
-            <w:tcBorders>
-              <w:top w:val="single" w:color="A9D5E2" w:sz="4"/>
-              <w:left w:val="single" w:color="A9D5E2" w:sz="4"/>
-              <w:bottom w:val="single" w:color="A9D5E2" w:sz="4"/>
-              <w:right w:val="single" w:color="A9D5E2" w:sz="4"/>
-            </w:tcBorders>
-            <w:tcMar>
-              <w:top w:type="dxa" w:w="113"/>
-              <w:left w:type="dxa" w:w="113"/>
-              <w:bottom w:type="dxa" w:w="113"/>
-              <w:right w:type="dxa" w:w="113"/>
-            </w:tcMar>
-          </w:tcPr>
-          <w:p>
-            <w:pPr>
-              <w:spacing w:after="0" w:line="252"/>
-            </w:pPr>
-            <w:r>
-              <w:rPr>
-                <w:rFonts w:ascii="Aptos" w:cs="Aptos" w:eastAsia="Aptos" w:hAnsi="Aptos"/>
-                <w:b w:val="false"/>
-                <w:bCs w:val="false"/>
-                <w:color w:val="27343A"/>
-                <w:sz w:val="20"/>
-                <w:szCs w:val="20"/>
-              </w:rPr>
-              <w:t xml:space="preserve">UC2 nối UC5, AI</w:t>
-            </w:r>
-          </w:p>
-        </w:tc>
-        <w:tc>
-          <w:tcPr>
-            <w:tcW w:type="dxa" w:w="1766"/>
-            <w:tcBorders>
-              <w:top w:val="single" w:color="A9D5E2" w:sz="4"/>
-              <w:left w:val="single" w:color="A9D5E2" w:sz="4"/>
-              <w:bottom w:val="single" w:color="A9D5E2" w:sz="4"/>
-              <w:right w:val="single" w:color="A9D5E2" w:sz="4"/>
-            </w:tcBorders>
-            <w:tcMar>
-              <w:top w:type="dxa" w:w="113"/>
-              <w:left w:type="dxa" w:w="113"/>
-              <w:bottom w:type="dxa" w:w="113"/>
-              <w:right w:type="dxa" w:w="113"/>
-            </w:tcMar>
-          </w:tcPr>
-          <w:p>
-            <w:pPr>
-              <w:spacing w:after="0" w:line="252"/>
-            </w:pPr>
-            <w:r>
-              <w:rPr>
-                <w:rFonts w:ascii="Aptos" w:cs="Aptos" w:eastAsia="Aptos" w:hAnsi="Aptos"/>
-                <w:b w:val="false"/>
-                <w:bCs w:val="false"/>
-                <w:color w:val="27343A"/>
-                <w:sz w:val="20"/>
-                <w:szCs w:val="20"/>
-              </w:rPr>
-              <w:t xml:space="preserve">5 đến 12</w:t>
+              <w:t xml:space="preserve">4 đến 10</w:t>
             </w:r>
           </w:p>
         </w:tc>
@@ -593,34 +593,100 @@
         </w:trPr>
         <w:tc>
           <w:tcPr>
-            <w:tcW w:type="dxa" w:w="3695"/>
-            <w:tcBorders>
-              <w:top w:val="single" w:color="A9D5E2" w:sz="4"/>
-              <w:left w:val="single" w:color="A9D5E2" w:sz="4"/>
-              <w:bottom w:val="single" w:color="A9D5E2" w:sz="4"/>
-              <w:right w:val="single" w:color="A9D5E2" w:sz="4"/>
-            </w:tcBorders>
-            <w:tcMar>
-              <w:top w:type="dxa" w:w="113"/>
-              <w:left w:type="dxa" w:w="113"/>
-              <w:bottom w:type="dxa" w:w="113"/>
-              <w:right w:type="dxa" w:w="113"/>
-            </w:tcMar>
-          </w:tcPr>
-          <w:p>
-            <w:pPr>
-              <w:spacing w:after="0" w:line="252"/>
-            </w:pPr>
-            <w:r>
-              <w:rPr>
-                <w:rFonts w:ascii="Aptos" w:cs="Aptos" w:eastAsia="Aptos" w:hAnsi="Aptos"/>
-                <w:b w:val="false"/>
-                <w:bCs w:val="false"/>
-                <w:color w:val="27343A"/>
-                <w:sz w:val="20"/>
-                <w:szCs w:val="20"/>
-              </w:rPr>
-              <w:t xml:space="preserve">3 · Cửa hàng bán lẻ hết hàng: LS tính, AI đề xuất</w:t>
+            <w:tcW w:type="dxa" w:w="3855"/>
+            <w:tcBorders>
+              <w:top w:val="single" w:color="A9D5E2" w:sz="4"/>
+              <w:left w:val="single" w:color="A9D5E2" w:sz="4"/>
+              <w:bottom w:val="single" w:color="A9D5E2" w:sz="4"/>
+              <w:right w:val="single" w:color="A9D5E2" w:sz="4"/>
+            </w:tcBorders>
+            <w:tcMar>
+              <w:top w:type="dxa" w:w="113"/>
+              <w:left w:type="dxa" w:w="113"/>
+              <w:bottom w:type="dxa" w:w="113"/>
+              <w:right w:type="dxa" w:w="113"/>
+            </w:tcMar>
+          </w:tcPr>
+          <w:p>
+            <w:pPr>
+              <w:spacing w:after="0" w:line="252"/>
+            </w:pPr>
+            <w:r>
+              <w:rPr>
+                <w:rFonts w:ascii="Aptos" w:cs="Aptos" w:eastAsia="Aptos" w:hAnsi="Aptos"/>
+                <w:b w:val="false"/>
+                <w:bCs w:val="false"/>
+                <w:color w:val="27343A"/>
+                <w:sz w:val="20"/>
+                <w:szCs w:val="20"/>
+              </w:rPr>
+              <w:t xml:space="preserve">3 · Hỏi tự do trên tồn kho: chậm luân chuyển, CTKM, truy xuất, bất thường</w:t>
+            </w:r>
+          </w:p>
+        </w:tc>
+        <w:tc>
+          <w:tcPr>
+            <w:tcW w:type="dxa" w:w="1606"/>
+            <w:tcBorders>
+              <w:top w:val="single" w:color="A9D5E2" w:sz="4"/>
+              <w:left w:val="single" w:color="A9D5E2" w:sz="4"/>
+              <w:bottom w:val="single" w:color="A9D5E2" w:sz="4"/>
+              <w:right w:val="single" w:color="A9D5E2" w:sz="4"/>
+            </w:tcBorders>
+            <w:tcMar>
+              <w:top w:type="dxa" w:w="113"/>
+              <w:left w:type="dxa" w:w="113"/>
+              <w:bottom w:type="dxa" w:w="113"/>
+              <w:right w:type="dxa" w:w="113"/>
+            </w:tcMar>
+          </w:tcPr>
+          <w:p>
+            <w:pPr>
+              <w:spacing w:after="0" w:line="252"/>
+            </w:pPr>
+            <w:r>
+              <w:rPr>
+                <w:rFonts w:ascii="Aptos" w:cs="Aptos" w:eastAsia="Aptos" w:hAnsi="Aptos"/>
+                <w:b w:val="false"/>
+                <w:bCs w:val="false"/>
+                <w:color w:val="27343A"/>
+                <w:sz w:val="20"/>
+                <w:szCs w:val="20"/>
+              </w:rPr>
+              <w:t xml:space="preserve">6 đến 9</w:t>
+            </w:r>
+          </w:p>
+        </w:tc>
+        <w:tc>
+          <w:tcPr>
+            <w:tcW w:type="dxa" w:w="2410"/>
+            <w:tcBorders>
+              <w:top w:val="single" w:color="A9D5E2" w:sz="4"/>
+              <w:left w:val="single" w:color="A9D5E2" w:sz="4"/>
+              <w:bottom w:val="single" w:color="A9D5E2" w:sz="4"/>
+              <w:right w:val="single" w:color="A9D5E2" w:sz="4"/>
+            </w:tcBorders>
+            <w:tcMar>
+              <w:top w:type="dxa" w:w="113"/>
+              <w:left w:type="dxa" w:w="113"/>
+              <w:bottom w:type="dxa" w:w="113"/>
+              <w:right w:type="dxa" w:w="113"/>
+            </w:tcMar>
+          </w:tcPr>
+          <w:p>
+            <w:pPr>
+              <w:spacing w:after="0" w:line="252"/>
+            </w:pPr>
+            <w:r>
+              <w:rPr>
+                <w:rFonts w:ascii="Aptos" w:cs="Aptos" w:eastAsia="Aptos" w:hAnsi="Aptos"/>
+                <w:b w:val="false"/>
+                <w:bCs w:val="false"/>
+                <w:color w:val="27343A"/>
+                <w:sz w:val="20"/>
+                <w:szCs w:val="20"/>
+              </w:rPr>
+              <w:t xml:space="preserve">UC2, AI</w:t>
             </w:r>
           </w:p>
         </w:tc>
@@ -653,73 +719,7 @@
                 <w:sz w:val="20"/>
                 <w:szCs w:val="20"/>
               </w:rPr>
-              <w:t xml:space="preserve">6 đến 9</w:t>
-            </w:r>
-          </w:p>
-        </w:tc>
-        <w:tc>
-          <w:tcPr>
-            <w:tcW w:type="dxa" w:w="2410"/>
-            <w:tcBorders>
-              <w:top w:val="single" w:color="A9D5E2" w:sz="4"/>
-              <w:left w:val="single" w:color="A9D5E2" w:sz="4"/>
-              <w:bottom w:val="single" w:color="A9D5E2" w:sz="4"/>
-              <w:right w:val="single" w:color="A9D5E2" w:sz="4"/>
-            </w:tcBorders>
-            <w:tcMar>
-              <w:top w:type="dxa" w:w="113"/>
-              <w:left w:type="dxa" w:w="113"/>
-              <w:bottom w:type="dxa" w:w="113"/>
-              <w:right w:type="dxa" w:w="113"/>
-            </w:tcMar>
-          </w:tcPr>
-          <w:p>
-            <w:pPr>
-              <w:spacing w:after="0" w:line="252"/>
-            </w:pPr>
-            <w:r>
-              <w:rPr>
-                <w:rFonts w:ascii="Aptos" w:cs="Aptos" w:eastAsia="Aptos" w:hAnsi="Aptos"/>
-                <w:b w:val="false"/>
-                <w:bCs w:val="false"/>
-                <w:color w:val="27343A"/>
-                <w:sz w:val="20"/>
-                <w:szCs w:val="20"/>
-              </w:rPr>
-              <w:t xml:space="preserve">UC5, AI</w:t>
-            </w:r>
-          </w:p>
-        </w:tc>
-        <w:tc>
-          <w:tcPr>
-            <w:tcW w:type="dxa" w:w="1766"/>
-            <w:tcBorders>
-              <w:top w:val="single" w:color="A9D5E2" w:sz="4"/>
-              <w:left w:val="single" w:color="A9D5E2" w:sz="4"/>
-              <w:bottom w:val="single" w:color="A9D5E2" w:sz="4"/>
-              <w:right w:val="single" w:color="A9D5E2" w:sz="4"/>
-            </w:tcBorders>
-            <w:tcMar>
-              <w:top w:type="dxa" w:w="113"/>
-              <w:left w:type="dxa" w:w="113"/>
-              <w:bottom w:type="dxa" w:w="113"/>
-              <w:right w:type="dxa" w:w="113"/>
-            </w:tcMar>
-          </w:tcPr>
-          <w:p>
-            <w:pPr>
-              <w:spacing w:after="0" w:line="252"/>
-            </w:pPr>
-            <w:r>
-              <w:rPr>
-                <w:rFonts w:ascii="Aptos" w:cs="Aptos" w:eastAsia="Aptos" w:hAnsi="Aptos"/>
-                <w:b w:val="false"/>
-                <w:bCs w:val="false"/>
-                <w:color w:val="27343A"/>
-                <w:sz w:val="20"/>
-                <w:szCs w:val="20"/>
-              </w:rPr>
-              <w:t xml:space="preserve">12 đến 21</w:t>
+              <w:t xml:space="preserve">10 đến 19</w:t>
             </w:r>
           </w:p>
         </w:tc>
@@ -731,34 +731,100 @@
         </w:trPr>
         <w:tc>
           <w:tcPr>
-            <w:tcW w:type="dxa" w:w="3695"/>
-            <w:tcBorders>
-              <w:top w:val="single" w:color="A9D5E2" w:sz="4"/>
-              <w:left w:val="single" w:color="A9D5E2" w:sz="4"/>
-              <w:bottom w:val="single" w:color="A9D5E2" w:sz="4"/>
-              <w:right w:val="single" w:color="A9D5E2" w:sz="4"/>
-            </w:tcBorders>
-            <w:tcMar>
-              <w:top w:type="dxa" w:w="113"/>
-              <w:left w:type="dxa" w:w="113"/>
-              <w:bottom w:type="dxa" w:w="113"/>
-              <w:right w:type="dxa" w:w="113"/>
-            </w:tcMar>
-          </w:tcPr>
-          <w:p>
-            <w:pPr>
-              <w:spacing w:after="0" w:line="252"/>
-            </w:pPr>
-            <w:r>
-              <w:rPr>
-                <w:rFonts w:ascii="Aptos" w:cs="Aptos" w:eastAsia="Aptos" w:hAnsi="Aptos"/>
-                <w:b w:val="false"/>
-                <w:bCs w:val="false"/>
-                <w:color w:val="27343A"/>
-                <w:sz w:val="20"/>
-                <w:szCs w:val="20"/>
-              </w:rPr>
-              <w:t xml:space="preserve">4 · Dự báo, một nhịp</w:t>
+            <w:tcW w:type="dxa" w:w="3855"/>
+            <w:tcBorders>
+              <w:top w:val="single" w:color="A9D5E2" w:sz="4"/>
+              <w:left w:val="single" w:color="A9D5E2" w:sz="4"/>
+              <w:bottom w:val="single" w:color="A9D5E2" w:sz="4"/>
+              <w:right w:val="single" w:color="A9D5E2" w:sz="4"/>
+            </w:tcBorders>
+            <w:tcMar>
+              <w:top w:type="dxa" w:w="113"/>
+              <w:left w:type="dxa" w:w="113"/>
+              <w:bottom w:type="dxa" w:w="113"/>
+              <w:right w:type="dxa" w:w="113"/>
+            </w:tcMar>
+          </w:tcPr>
+          <w:p>
+            <w:pPr>
+              <w:spacing w:after="0" w:line="252"/>
+            </w:pPr>
+            <w:r>
+              <w:rPr>
+                <w:rFonts w:ascii="Aptos" w:cs="Aptos" w:eastAsia="Aptos" w:hAnsi="Aptos"/>
+                <w:b w:val="false"/>
+                <w:bCs w:val="false"/>
+                <w:color w:val="27343A"/>
+                <w:sz w:val="20"/>
+                <w:szCs w:val="20"/>
+              </w:rPr>
+              <w:t xml:space="preserve">4 · Cửa hàng bán lẻ hết hàng: LS tính, AI đề xuất</w:t>
+            </w:r>
+          </w:p>
+        </w:tc>
+        <w:tc>
+          <w:tcPr>
+            <w:tcW w:type="dxa" w:w="1606"/>
+            <w:tcBorders>
+              <w:top w:val="single" w:color="A9D5E2" w:sz="4"/>
+              <w:left w:val="single" w:color="A9D5E2" w:sz="4"/>
+              <w:bottom w:val="single" w:color="A9D5E2" w:sz="4"/>
+              <w:right w:val="single" w:color="A9D5E2" w:sz="4"/>
+            </w:tcBorders>
+            <w:tcMar>
+              <w:top w:type="dxa" w:w="113"/>
+              <w:left w:type="dxa" w:w="113"/>
+              <w:bottom w:type="dxa" w:w="113"/>
+              <w:right w:type="dxa" w:w="113"/>
+            </w:tcMar>
+          </w:tcPr>
+          <w:p>
+            <w:pPr>
+              <w:spacing w:after="0" w:line="252"/>
+            </w:pPr>
+            <w:r>
+              <w:rPr>
+                <w:rFonts w:ascii="Aptos" w:cs="Aptos" w:eastAsia="Aptos" w:hAnsi="Aptos"/>
+                <w:b w:val="false"/>
+                <w:bCs w:val="false"/>
+                <w:color w:val="27343A"/>
+                <w:sz w:val="20"/>
+                <w:szCs w:val="20"/>
+              </w:rPr>
+              <w:t xml:space="preserve">10 đến 13</w:t>
+            </w:r>
+          </w:p>
+        </w:tc>
+        <w:tc>
+          <w:tcPr>
+            <w:tcW w:type="dxa" w:w="2410"/>
+            <w:tcBorders>
+              <w:top w:val="single" w:color="A9D5E2" w:sz="4"/>
+              <w:left w:val="single" w:color="A9D5E2" w:sz="4"/>
+              <w:bottom w:val="single" w:color="A9D5E2" w:sz="4"/>
+              <w:right w:val="single" w:color="A9D5E2" w:sz="4"/>
+            </w:tcBorders>
+            <w:tcMar>
+              <w:top w:type="dxa" w:w="113"/>
+              <w:left w:type="dxa" w:w="113"/>
+              <w:bottom w:type="dxa" w:w="113"/>
+              <w:right w:type="dxa" w:w="113"/>
+            </w:tcMar>
+          </w:tcPr>
+          <w:p>
+            <w:pPr>
+              <w:spacing w:after="0" w:line="252"/>
+            </w:pPr>
+            <w:r>
+              <w:rPr>
+                <w:rFonts w:ascii="Aptos" w:cs="Aptos" w:eastAsia="Aptos" w:hAnsi="Aptos"/>
+                <w:b w:val="false"/>
+                <w:bCs w:val="false"/>
+                <w:color w:val="27343A"/>
+                <w:sz w:val="20"/>
+                <w:szCs w:val="20"/>
+              </w:rPr>
+              <w:t xml:space="preserve">UC5, AI</w:t>
             </w:r>
           </w:p>
         </w:tc>
@@ -791,73 +857,7 @@
                 <w:sz w:val="20"/>
                 <w:szCs w:val="20"/>
               </w:rPr>
-              <w:t xml:space="preserve">10, 11</w:t>
-            </w:r>
-          </w:p>
-        </w:tc>
-        <w:tc>
-          <w:tcPr>
-            <w:tcW w:type="dxa" w:w="2410"/>
-            <w:tcBorders>
-              <w:top w:val="single" w:color="A9D5E2" w:sz="4"/>
-              <w:left w:val="single" w:color="A9D5E2" w:sz="4"/>
-              <w:bottom w:val="single" w:color="A9D5E2" w:sz="4"/>
-              <w:right w:val="single" w:color="A9D5E2" w:sz="4"/>
-            </w:tcBorders>
-            <w:tcMar>
-              <w:top w:type="dxa" w:w="113"/>
-              <w:left w:type="dxa" w:w="113"/>
-              <w:bottom w:type="dxa" w:w="113"/>
-              <w:right w:type="dxa" w:w="113"/>
-            </w:tcMar>
-          </w:tcPr>
-          <w:p>
-            <w:pPr>
-              <w:spacing w:after="0" w:line="252"/>
-            </w:pPr>
-            <w:r>
-              <w:rPr>
-                <w:rFonts w:ascii="Aptos" w:cs="Aptos" w:eastAsia="Aptos" w:hAnsi="Aptos"/>
-                <w:b w:val="false"/>
-                <w:bCs w:val="false"/>
-                <w:color w:val="27343A"/>
-                <w:sz w:val="20"/>
-                <w:szCs w:val="20"/>
-              </w:rPr>
-              <w:t xml:space="preserve">UC1, UC7 nối UC5</w:t>
-            </w:r>
-          </w:p>
-        </w:tc>
-        <w:tc>
-          <w:tcPr>
-            <w:tcW w:type="dxa" w:w="1766"/>
-            <w:tcBorders>
-              <w:top w:val="single" w:color="A9D5E2" w:sz="4"/>
-              <w:left w:val="single" w:color="A9D5E2" w:sz="4"/>
-              <w:bottom w:val="single" w:color="A9D5E2" w:sz="4"/>
-              <w:right w:val="single" w:color="A9D5E2" w:sz="4"/>
-            </w:tcBorders>
-            <w:tcMar>
-              <w:top w:type="dxa" w:w="113"/>
-              <w:left w:type="dxa" w:w="113"/>
-              <w:bottom w:type="dxa" w:w="113"/>
-              <w:right w:type="dxa" w:w="113"/>
-            </w:tcMar>
-          </w:tcPr>
-          <w:p>
-            <w:pPr>
-              <w:spacing w:after="0" w:line="252"/>
-            </w:pPr>
-            <w:r>
-              <w:rPr>
-                <w:rFonts w:ascii="Aptos" w:cs="Aptos" w:eastAsia="Aptos" w:hAnsi="Aptos"/>
-                <w:b w:val="false"/>
-                <w:bCs w:val="false"/>
-                <w:color w:val="27343A"/>
-                <w:sz w:val="20"/>
-                <w:szCs w:val="20"/>
-              </w:rPr>
-              <w:t xml:space="preserve">21 đến 25</w:t>
+              <w:t xml:space="preserve">19 đến 27</w:t>
             </w:r>
           </w:p>
         </w:tc>
@@ -869,34 +869,100 @@
         </w:trPr>
         <w:tc>
           <w:tcPr>
-            <w:tcW w:type="dxa" w:w="3695"/>
-            <w:tcBorders>
-              <w:top w:val="single" w:color="A9D5E2" w:sz="4"/>
-              <w:left w:val="single" w:color="A9D5E2" w:sz="4"/>
-              <w:bottom w:val="single" w:color="A9D5E2" w:sz="4"/>
-              <w:right w:val="single" w:color="A9D5E2" w:sz="4"/>
-            </w:tcBorders>
-            <w:tcMar>
-              <w:top w:type="dxa" w:w="113"/>
-              <w:left w:type="dxa" w:w="113"/>
-              <w:bottom w:type="dxa" w:w="113"/>
-              <w:right w:type="dxa" w:w="113"/>
-            </w:tcMar>
-          </w:tcPr>
-          <w:p>
-            <w:pPr>
-              <w:spacing w:after="0" w:line="252"/>
-            </w:pPr>
-            <w:r>
-              <w:rPr>
-                <w:rFonts w:ascii="Aptos" w:cs="Aptos" w:eastAsia="Aptos" w:hAnsi="Aptos"/>
-                <w:b w:val="false"/>
-                <w:bCs w:val="false"/>
-                <w:color w:val="27343A"/>
-                <w:sz w:val="20"/>
-                <w:szCs w:val="20"/>
-              </w:rPr>
-              <w:t xml:space="preserve">5 · Hàng về cửa hàng: liên công ty khép vòng</w:t>
+            <w:tcW w:type="dxa" w:w="3855"/>
+            <w:tcBorders>
+              <w:top w:val="single" w:color="A9D5E2" w:sz="4"/>
+              <w:left w:val="single" w:color="A9D5E2" w:sz="4"/>
+              <w:bottom w:val="single" w:color="A9D5E2" w:sz="4"/>
+              <w:right w:val="single" w:color="A9D5E2" w:sz="4"/>
+            </w:tcBorders>
+            <w:tcMar>
+              <w:top w:type="dxa" w:w="113"/>
+              <w:left w:type="dxa" w:w="113"/>
+              <w:bottom w:type="dxa" w:w="113"/>
+              <w:right w:type="dxa" w:w="113"/>
+            </w:tcMar>
+          </w:tcPr>
+          <w:p>
+            <w:pPr>
+              <w:spacing w:after="0" w:line="252"/>
+            </w:pPr>
+            <w:r>
+              <w:rPr>
+                <w:rFonts w:ascii="Aptos" w:cs="Aptos" w:eastAsia="Aptos" w:hAnsi="Aptos"/>
+                <w:b w:val="false"/>
+                <w:bCs w:val="false"/>
+                <w:color w:val="27343A"/>
+                <w:sz w:val="20"/>
+                <w:szCs w:val="20"/>
+              </w:rPr>
+              <w:t xml:space="preserve">5 · Dự báo, một nhịp</w:t>
+            </w:r>
+          </w:p>
+        </w:tc>
+        <w:tc>
+          <w:tcPr>
+            <w:tcW w:type="dxa" w:w="1606"/>
+            <w:tcBorders>
+              <w:top w:val="single" w:color="A9D5E2" w:sz="4"/>
+              <w:left w:val="single" w:color="A9D5E2" w:sz="4"/>
+              <w:bottom w:val="single" w:color="A9D5E2" w:sz="4"/>
+              <w:right w:val="single" w:color="A9D5E2" w:sz="4"/>
+            </w:tcBorders>
+            <w:tcMar>
+              <w:top w:type="dxa" w:w="113"/>
+              <w:left w:type="dxa" w:w="113"/>
+              <w:bottom w:type="dxa" w:w="113"/>
+              <w:right w:type="dxa" w:w="113"/>
+            </w:tcMar>
+          </w:tcPr>
+          <w:p>
+            <w:pPr>
+              <w:spacing w:after="0" w:line="252"/>
+            </w:pPr>
+            <w:r>
+              <w:rPr>
+                <w:rFonts w:ascii="Aptos" w:cs="Aptos" w:eastAsia="Aptos" w:hAnsi="Aptos"/>
+                <w:b w:val="false"/>
+                <w:bCs w:val="false"/>
+                <w:color w:val="27343A"/>
+                <w:sz w:val="20"/>
+                <w:szCs w:val="20"/>
+              </w:rPr>
+              <w:t xml:space="preserve">14, 15</w:t>
+            </w:r>
+          </w:p>
+        </w:tc>
+        <w:tc>
+          <w:tcPr>
+            <w:tcW w:type="dxa" w:w="2410"/>
+            <w:tcBorders>
+              <w:top w:val="single" w:color="A9D5E2" w:sz="4"/>
+              <w:left w:val="single" w:color="A9D5E2" w:sz="4"/>
+              <w:bottom w:val="single" w:color="A9D5E2" w:sz="4"/>
+              <w:right w:val="single" w:color="A9D5E2" w:sz="4"/>
+            </w:tcBorders>
+            <w:tcMar>
+              <w:top w:type="dxa" w:w="113"/>
+              <w:left w:type="dxa" w:w="113"/>
+              <w:bottom w:type="dxa" w:w="113"/>
+              <w:right w:type="dxa" w:w="113"/>
+            </w:tcMar>
+          </w:tcPr>
+          <w:p>
+            <w:pPr>
+              <w:spacing w:after="0" w:line="252"/>
+            </w:pPr>
+            <w:r>
+              <w:rPr>
+                <w:rFonts w:ascii="Aptos" w:cs="Aptos" w:eastAsia="Aptos" w:hAnsi="Aptos"/>
+                <w:b w:val="false"/>
+                <w:bCs w:val="false"/>
+                <w:color w:val="27343A"/>
+                <w:sz w:val="20"/>
+                <w:szCs w:val="20"/>
+              </w:rPr>
+              <w:t xml:space="preserve">UC1, UC7 nối UC5</w:t>
             </w:r>
           </w:p>
         </w:tc>
@@ -929,73 +995,7 @@
                 <w:sz w:val="20"/>
                 <w:szCs w:val="20"/>
               </w:rPr>
-              <w:t xml:space="preserve">12 đến 15</w:t>
-            </w:r>
-          </w:p>
-        </w:tc>
-        <w:tc>
-          <w:tcPr>
-            <w:tcW w:type="dxa" w:w="2410"/>
-            <w:tcBorders>
-              <w:top w:val="single" w:color="A9D5E2" w:sz="4"/>
-              <w:left w:val="single" w:color="A9D5E2" w:sz="4"/>
-              <w:bottom w:val="single" w:color="A9D5E2" w:sz="4"/>
-              <w:right w:val="single" w:color="A9D5E2" w:sz="4"/>
-            </w:tcBorders>
-            <w:tcMar>
-              <w:top w:type="dxa" w:w="113"/>
-              <w:left w:type="dxa" w:w="113"/>
-              <w:bottom w:type="dxa" w:w="113"/>
-              <w:right w:type="dxa" w:w="113"/>
-            </w:tcMar>
-          </w:tcPr>
-          <w:p>
-            <w:pPr>
-              <w:spacing w:after="0" w:line="252"/>
-            </w:pPr>
-            <w:r>
-              <w:rPr>
-                <w:rFonts w:ascii="Aptos" w:cs="Aptos" w:eastAsia="Aptos" w:hAnsi="Aptos"/>
-                <w:b w:val="false"/>
-                <w:bCs w:val="false"/>
-                <w:color w:val="27343A"/>
-                <w:sz w:val="20"/>
-                <w:szCs w:val="20"/>
-              </w:rPr>
-              <w:t xml:space="preserve">UC2 nhận hàng, A4</w:t>
-            </w:r>
-          </w:p>
-        </w:tc>
-        <w:tc>
-          <w:tcPr>
-            <w:tcW w:type="dxa" w:w="1766"/>
-            <w:tcBorders>
-              <w:top w:val="single" w:color="A9D5E2" w:sz="4"/>
-              <w:left w:val="single" w:color="A9D5E2" w:sz="4"/>
-              <w:bottom w:val="single" w:color="A9D5E2" w:sz="4"/>
-              <w:right w:val="single" w:color="A9D5E2" w:sz="4"/>
-            </w:tcBorders>
-            <w:tcMar>
-              <w:top w:type="dxa" w:w="113"/>
-              <w:left w:type="dxa" w:w="113"/>
-              <w:bottom w:type="dxa" w:w="113"/>
-              <w:right w:type="dxa" w:w="113"/>
-            </w:tcMar>
-          </w:tcPr>
-          <w:p>
-            <w:pPr>
-              <w:spacing w:after="0" w:line="252"/>
-            </w:pPr>
-            <w:r>
-              <w:rPr>
-                <w:rFonts w:ascii="Aptos" w:cs="Aptos" w:eastAsia="Aptos" w:hAnsi="Aptos"/>
-                <w:b w:val="false"/>
-                <w:bCs w:val="false"/>
-                <w:color w:val="27343A"/>
-                <w:sz w:val="20"/>
-                <w:szCs w:val="20"/>
-              </w:rPr>
-              <w:t xml:space="preserve">25 đến 33</w:t>
+              <w:t xml:space="preserve">27 đến 31</w:t>
             </w:r>
           </w:p>
         </w:tc>
@@ -1007,34 +1007,100 @@
         </w:trPr>
         <w:tc>
           <w:tcPr>
-            <w:tcW w:type="dxa" w:w="3695"/>
-            <w:tcBorders>
-              <w:top w:val="single" w:color="A9D5E2" w:sz="4"/>
-              <w:left w:val="single" w:color="A9D5E2" w:sz="4"/>
-              <w:bottom w:val="single" w:color="A9D5E2" w:sz="4"/>
-              <w:right w:val="single" w:color="A9D5E2" w:sz="4"/>
-            </w:tcBorders>
-            <w:tcMar>
-              <w:top w:type="dxa" w:w="113"/>
-              <w:left w:type="dxa" w:w="113"/>
-              <w:bottom w:type="dxa" w:w="113"/>
-              <w:right w:type="dxa" w:w="113"/>
-            </w:tcMar>
-          </w:tcPr>
-          <w:p>
-            <w:pPr>
-              <w:spacing w:after="0" w:line="252"/>
-            </w:pPr>
-            <w:r>
-              <w:rPr>
-                <w:rFonts w:ascii="Aptos" w:cs="Aptos" w:eastAsia="Aptos" w:hAnsi="Aptos"/>
-                <w:b w:val="false"/>
-                <w:bCs w:val="false"/>
-                <w:color w:val="27343A"/>
-                <w:sz w:val="20"/>
-                <w:szCs w:val="20"/>
-              </w:rPr>
-              <w:t xml:space="preserve">6 · Truy xuất, bất thường, chi phí</w:t>
+            <w:tcW w:type="dxa" w:w="3855"/>
+            <w:tcBorders>
+              <w:top w:val="single" w:color="A9D5E2" w:sz="4"/>
+              <w:left w:val="single" w:color="A9D5E2" w:sz="4"/>
+              <w:bottom w:val="single" w:color="A9D5E2" w:sz="4"/>
+              <w:right w:val="single" w:color="A9D5E2" w:sz="4"/>
+            </w:tcBorders>
+            <w:tcMar>
+              <w:top w:type="dxa" w:w="113"/>
+              <w:left w:type="dxa" w:w="113"/>
+              <w:bottom w:type="dxa" w:w="113"/>
+              <w:right w:type="dxa" w:w="113"/>
+            </w:tcMar>
+          </w:tcPr>
+          <w:p>
+            <w:pPr>
+              <w:spacing w:after="0" w:line="252"/>
+            </w:pPr>
+            <w:r>
+              <w:rPr>
+                <w:rFonts w:ascii="Aptos" w:cs="Aptos" w:eastAsia="Aptos" w:hAnsi="Aptos"/>
+                <w:b w:val="false"/>
+                <w:bCs w:val="false"/>
+                <w:color w:val="27343A"/>
+                <w:sz w:val="20"/>
+                <w:szCs w:val="20"/>
+              </w:rPr>
+              <w:t xml:space="preserve">6 · Hàng về cửa hàng: liên công ty khép vòng</w:t>
+            </w:r>
+          </w:p>
+        </w:tc>
+        <w:tc>
+          <w:tcPr>
+            <w:tcW w:type="dxa" w:w="1606"/>
+            <w:tcBorders>
+              <w:top w:val="single" w:color="A9D5E2" w:sz="4"/>
+              <w:left w:val="single" w:color="A9D5E2" w:sz="4"/>
+              <w:bottom w:val="single" w:color="A9D5E2" w:sz="4"/>
+              <w:right w:val="single" w:color="A9D5E2" w:sz="4"/>
+            </w:tcBorders>
+            <w:tcMar>
+              <w:top w:type="dxa" w:w="113"/>
+              <w:left w:type="dxa" w:w="113"/>
+              <w:bottom w:type="dxa" w:w="113"/>
+              <w:right w:type="dxa" w:w="113"/>
+            </w:tcMar>
+          </w:tcPr>
+          <w:p>
+            <w:pPr>
+              <w:spacing w:after="0" w:line="252"/>
+            </w:pPr>
+            <w:r>
+              <w:rPr>
+                <w:rFonts w:ascii="Aptos" w:cs="Aptos" w:eastAsia="Aptos" w:hAnsi="Aptos"/>
+                <w:b w:val="false"/>
+                <w:bCs w:val="false"/>
+                <w:color w:val="27343A"/>
+                <w:sz w:val="20"/>
+                <w:szCs w:val="20"/>
+              </w:rPr>
+              <w:t xml:space="preserve">16 đến 19</w:t>
+            </w:r>
+          </w:p>
+        </w:tc>
+        <w:tc>
+          <w:tcPr>
+            <w:tcW w:type="dxa" w:w="2410"/>
+            <w:tcBorders>
+              <w:top w:val="single" w:color="A9D5E2" w:sz="4"/>
+              <w:left w:val="single" w:color="A9D5E2" w:sz="4"/>
+              <w:bottom w:val="single" w:color="A9D5E2" w:sz="4"/>
+              <w:right w:val="single" w:color="A9D5E2" w:sz="4"/>
+            </w:tcBorders>
+            <w:tcMar>
+              <w:top w:type="dxa" w:w="113"/>
+              <w:left w:type="dxa" w:w="113"/>
+              <w:bottom w:type="dxa" w:w="113"/>
+              <w:right w:type="dxa" w:w="113"/>
+            </w:tcMar>
+          </w:tcPr>
+          <w:p>
+            <w:pPr>
+              <w:spacing w:after="0" w:line="252"/>
+            </w:pPr>
+            <w:r>
+              <w:rPr>
+                <w:rFonts w:ascii="Aptos" w:cs="Aptos" w:eastAsia="Aptos" w:hAnsi="Aptos"/>
+                <w:b w:val="false"/>
+                <w:bCs w:val="false"/>
+                <w:color w:val="27343A"/>
+                <w:sz w:val="20"/>
+                <w:szCs w:val="20"/>
+              </w:rPr>
+              <w:t xml:space="preserve">UC2 nhận hàng, A4</w:t>
             </w:r>
           </w:p>
         </w:tc>
@@ -1067,7 +1133,79 @@
                 <w:sz w:val="20"/>
                 <w:szCs w:val="20"/>
               </w:rPr>
-              <w:t xml:space="preserve">16 đến 18</w:t>
+              <w:t xml:space="preserve">31 đến 38</w:t>
+            </w:r>
+          </w:p>
+        </w:tc>
+      </w:tr>
+      <w:tr>
+        <w:trPr>
+          <w:cantSplit/>
+          <w:tblHeader w:val="false"/>
+        </w:trPr>
+        <w:tc>
+          <w:tcPr>
+            <w:tcW w:type="dxa" w:w="3855"/>
+            <w:tcBorders>
+              <w:top w:val="single" w:color="A9D5E2" w:sz="4"/>
+              <w:left w:val="single" w:color="A9D5E2" w:sz="4"/>
+              <w:bottom w:val="single" w:color="A9D5E2" w:sz="4"/>
+              <w:right w:val="single" w:color="A9D5E2" w:sz="4"/>
+            </w:tcBorders>
+            <w:tcMar>
+              <w:top w:type="dxa" w:w="113"/>
+              <w:left w:type="dxa" w:w="113"/>
+              <w:bottom w:type="dxa" w:w="113"/>
+              <w:right w:type="dxa" w:w="113"/>
+            </w:tcMar>
+          </w:tcPr>
+          <w:p>
+            <w:pPr>
+              <w:spacing w:after="0" w:line="252"/>
+            </w:pPr>
+            <w:r>
+              <w:rPr>
+                <w:rFonts w:ascii="Aptos" w:cs="Aptos" w:eastAsia="Aptos" w:hAnsi="Aptos"/>
+                <w:b w:val="false"/>
+                <w:bCs w:val="false"/>
+                <w:color w:val="27343A"/>
+                <w:sz w:val="20"/>
+                <w:szCs w:val="20"/>
+              </w:rPr>
+              <w:t xml:space="preserve">7 · Vận hành</w:t>
+            </w:r>
+          </w:p>
+        </w:tc>
+        <w:tc>
+          <w:tcPr>
+            <w:tcW w:type="dxa" w:w="1606"/>
+            <w:tcBorders>
+              <w:top w:val="single" w:color="A9D5E2" w:sz="4"/>
+              <w:left w:val="single" w:color="A9D5E2" w:sz="4"/>
+              <w:bottom w:val="single" w:color="A9D5E2" w:sz="4"/>
+              <w:right w:val="single" w:color="A9D5E2" w:sz="4"/>
+            </w:tcBorders>
+            <w:tcMar>
+              <w:top w:type="dxa" w:w="113"/>
+              <w:left w:type="dxa" w:w="113"/>
+              <w:bottom w:type="dxa" w:w="113"/>
+              <w:right w:type="dxa" w:w="113"/>
+            </w:tcMar>
+          </w:tcPr>
+          <w:p>
+            <w:pPr>
+              <w:spacing w:after="0" w:line="252"/>
+            </w:pPr>
+            <w:r>
+              <w:rPr>
+                <w:rFonts w:ascii="Aptos" w:cs="Aptos" w:eastAsia="Aptos" w:hAnsi="Aptos"/>
+                <w:b w:val="false"/>
+                <w:bCs w:val="false"/>
+                <w:color w:val="27343A"/>
+                <w:sz w:val="20"/>
+                <w:szCs w:val="20"/>
+              </w:rPr>
+              <w:t xml:space="preserve">20</w:t>
             </w:r>
           </w:p>
         </w:tc>
@@ -1100,40 +1238,40 @@
                 <w:sz w:val="20"/>
                 <w:szCs w:val="20"/>
               </w:rPr>
-              <w:t xml:space="preserve">UC2, AI</w:t>
-            </w:r>
-          </w:p>
-        </w:tc>
-        <w:tc>
-          <w:tcPr>
-            <w:tcW w:type="dxa" w:w="1766"/>
-            <w:tcBorders>
-              <w:top w:val="single" w:color="A9D5E2" w:sz="4"/>
-              <w:left w:val="single" w:color="A9D5E2" w:sz="4"/>
-              <w:bottom w:val="single" w:color="A9D5E2" w:sz="4"/>
-              <w:right w:val="single" w:color="A9D5E2" w:sz="4"/>
-            </w:tcBorders>
-            <w:tcMar>
-              <w:top w:type="dxa" w:w="113"/>
-              <w:left w:type="dxa" w:w="113"/>
-              <w:bottom w:type="dxa" w:w="113"/>
-              <w:right w:type="dxa" w:w="113"/>
-            </w:tcMar>
-          </w:tcPr>
-          <w:p>
-            <w:pPr>
-              <w:spacing w:after="0" w:line="252"/>
-            </w:pPr>
-            <w:r>
-              <w:rPr>
-                <w:rFonts w:ascii="Aptos" w:cs="Aptos" w:eastAsia="Aptos" w:hAnsi="Aptos"/>
-                <w:b w:val="false"/>
-                <w:bCs w:val="false"/>
-                <w:color w:val="27343A"/>
-                <w:sz w:val="20"/>
-                <w:szCs w:val="20"/>
-              </w:rPr>
-              <w:t xml:space="preserve">33 đến 38</w:t>
+              <w:t xml:space="preserve">Chi phí AI</w:t>
+            </w:r>
+          </w:p>
+        </w:tc>
+        <w:tc>
+          <w:tcPr>
+            <w:tcW w:type="dxa" w:w="1767"/>
+            <w:tcBorders>
+              <w:top w:val="single" w:color="A9D5E2" w:sz="4"/>
+              <w:left w:val="single" w:color="A9D5E2" w:sz="4"/>
+              <w:bottom w:val="single" w:color="A9D5E2" w:sz="4"/>
+              <w:right w:val="single" w:color="A9D5E2" w:sz="4"/>
+            </w:tcBorders>
+            <w:tcMar>
+              <w:top w:type="dxa" w:w="113"/>
+              <w:left w:type="dxa" w:w="113"/>
+              <w:bottom w:type="dxa" w:w="113"/>
+              <w:right w:type="dxa" w:w="113"/>
+            </w:tcMar>
+          </w:tcPr>
+          <w:p>
+            <w:pPr>
+              <w:spacing w:after="0" w:line="252"/>
+            </w:pPr>
+            <w:r>
+              <w:rPr>
+                <w:rFonts w:ascii="Aptos" w:cs="Aptos" w:eastAsia="Aptos" w:hAnsi="Aptos"/>
+                <w:b w:val="false"/>
+                <w:bCs w:val="false"/>
+                <w:color w:val="27343A"/>
+                <w:sz w:val="20"/>
+                <w:szCs w:val="20"/>
+              </w:rPr>
+              <w:t xml:space="preserve">38 đến 40</w:t>
             </w:r>
           </w:p>
         </w:tc>
@@ -1178,7 +1316,7 @@
           <w:rFonts w:ascii="Aptos" w:cs="Aptos" w:eastAsia="Aptos" w:hAnsi="Aptos"/>
           <w:color w:val="27343A"/>
         </w:rPr>
-        <w:t xml:space="preserve">Với AI đang bật, mọi câu trả lời dạng dữ liệu (dự báo, vì sao LS, CTKM, đơn quá hạn, nhà cung cấp, lô hết hạn, truy xuất) có phần lời do model viết: điều quan trọng nhất, một hai insight, việc nên làm. Bảng số thu gọn bên dưới, bấm “Dữ liệu code đã tra” để mở. Nhãn ở chân câu trả lời cho biết câu đó AI viết, câu mẫu, hay đọc thẳng từ dữ liệu. Mỗi con số model viết đều phải có trong bảng; sai một số là hệ thống giữ nguyên câu của rule, nên thỉnh thoảng một câu không có nhãn AI: đó là phép kiểm đã chặn, nói thẳng với khách.</w:t>
+        <w:t xml:space="preserve">Với AI đang bật, câu trả lời dạng dữ liệu (dự báo, vì sao LS, CTKM, truy xuất) có phần lời do model viết: điều quan trọng nhất, một hai insight, việc nên làm. Bảng số thu gọn bên dưới, bấm “Dữ liệu code đã tra” để mở. Nhãn ở chân câu trả lời cho biết câu đó AI viết, câu mẫu, hay đọc thẳng từ dữ liệu. Mỗi con số model viết đều phải có trong bảng; sai một số là hệ thống giữ nguyên câu của rule, nên thỉnh thoảng một câu không có nhãn AI: đó là phép kiểm đã chặn, nói thẳng với khách.</w:t>
       </w:r>
     </w:p>
     <w:p>
@@ -1198,7 +1336,7 @@
           <w:bCs/>
           <w:color w:val="27343A"/>
         </w:rPr>
-        <w:t xml:space="preserve">Bản 15 phút</w:t>
+        <w:t xml:space="preserve">Bản 20 phút</w:t>
       </w:r>
     </w:p>
     <w:p>
@@ -1215,7 +1353,7 @@
           <w:rFonts w:ascii="Aptos" w:cs="Aptos" w:eastAsia="Aptos" w:hAnsi="Aptos"/>
           <w:color w:val="27343A"/>
         </w:rPr>
-        <w:t xml:space="preserve">Khi bị cắt giờ, giữ các bước 2, 3, 4, 5, 6, 8, 12, 14. Đó là một vòng trọn của UC2: AI tóm tắt, lô cận date được AI chọn phương án, người duyệt, cửa hàng kêu hết hàng, đơn sang Marou, hàng về và trợ lý post phiếu nhận sau khi được duyệt.</w:t>
+        <w:t xml:space="preserve">Khi bị cắt giờ, giữ các bước 2, 3, 4, 5, 6, 7, 8, 10, 12, 16, 18. Đó là UC2 trọn vẹn (AI tóm tắt, AI chọn phương án cho lô cận date, người duyệt, câu hỏi tự do, truy xuất) cộng một vòng UC5 và liên công ty ngắn.</w:t>
       </w:r>
     </w:p>
     <w:p>
@@ -1255,7 +1393,7 @@
           <w:rFonts w:ascii="Aptos" w:cs="Aptos" w:eastAsia="Aptos" w:hAnsi="Aptos"/>
           <w:color w:val="27343A"/>
         </w:rPr>
-        <w:t xml:space="preserve">Tối 16/09 tôi dựng sẵn trạng thái dưới đây trên Business Central NWV01. Không phải làm lại gì trước buổi họp, chỉ kiểm.</w:t>
+        <w:t xml:space="preserve">Đêm 16/09 tôi dựng sẵn trạng thái dưới đây trên Business Central NWV01, chạy thử cả 20 bước trên chính dữ liệu này, rồi dọn mọi chứng từ do lần chạy thử sinh ra. Không phải làm lại gì trước buổi họp, chỉ kiểm theo mục 2.</w:t>
       </w:r>
     </w:p>
     <w:tbl>
@@ -1417,7 +1555,7 @@
                 <w:sz w:val="20"/>
                 <w:szCs w:val="20"/>
               </w:rPr>
-              <w:t xml:space="preserve">Bộ dữ liệu tính lại theo ngày làm việc 17/09/2026: Inventory Health, dự báo, scorecard, LS Replenishment, cả hai company</w:t>
+              <w:t xml:space="preserve">Bộ dữ liệu tính theo ngày làm việc 17/09/2026: Inventory Health, dự báo, scorecard, LS Replenishment, cả hai company</w:t>
             </w:r>
           </w:p>
         </w:tc>
@@ -1522,7 +1660,7 @@
                 <w:sz w:val="20"/>
                 <w:szCs w:val="20"/>
               </w:rPr>
-              <w:t xml:space="preserve">Lô Choco pillar L260829-33310-SD tại S0010: 470 cái, hạn 13/10, bán không kịp; S0001 bán nhanh hơn</w:t>
+              <w:t xml:space="preserve">Lô Choco pillar L260829-33310-SD tại S0010: 470 cái, 26 ngày nữa hết hạn, bán không kịp; S0001 bán nhanh hơn</w:t>
             </w:r>
           </w:p>
         </w:tc>
@@ -1627,7 +1765,7 @@
                 <w:sz w:val="20"/>
                 <w:szCs w:val="20"/>
               </w:rPr>
-              <w:t xml:space="preserve">LS ở Dakao đề xuất 12 Ice cream cho S0002 (min-max 8/20), 7 Croissant chocolate cho S0002 (42 ngày hết hàng), 2 Choco nuts cho S0001 (tồn 0, 82 đang về)</w:t>
+              <w:t xml:space="preserve">Ice cream strawberry: 109 ngày không bán ở S0001, S0002, S0013 và kho; ba CTKM đang chạy không có mặt hàng này</w:t>
             </w:r>
           </w:p>
         </w:tc>
@@ -1660,7 +1798,7 @@
                 <w:sz w:val="20"/>
                 <w:szCs w:val="20"/>
               </w:rPr>
-              <w:t xml:space="preserve">Journal MAROU-PO của NWV-DAKAO</w:t>
+              <w:t xml:space="preserve">Inventory Health và Periodic Discount NWV-DAKAO</w:t>
             </w:r>
           </w:p>
         </w:tc>
@@ -1693,7 +1831,7 @@
                 <w:sz w:val="20"/>
                 <w:szCs w:val="20"/>
               </w:rPr>
-              <w:t xml:space="preserve">6, 7, 9</w:t>
+              <w:t xml:space="preserve">6, 7</w:t>
             </w:r>
           </w:p>
         </w:tc>
@@ -1732,7 +1870,7 @@
                 <w:sz w:val="20"/>
                 <w:szCs w:val="20"/>
               </w:rPr>
-              <w:t xml:space="preserve">Bốn CTKM và bốn Planned Event của LS: Choco bowl giảm 15% ngày 23 đến 25/09 có nhu cầu cho S0001 và S0010, cố ý thiếu S0002 và S0005; dự báo Holt-Winters 28 ngày tới đã ghi vào Retail Forecast Entry</w:t>
+              <w:t xml:space="preserve">Lô Choco nuts L260906-33323C: Marou xuất 81 cái theo HO106202 sang S0001, hạn 22/04/2027</w:t>
             </w:r>
           </w:p>
         </w:tc>
@@ -1765,7 +1903,7 @@
                 <w:sz w:val="20"/>
                 <w:szCs w:val="20"/>
               </w:rPr>
-              <w:t xml:space="preserve">LS Forecast Entry, Periodic Discount, Planned Event</w:t>
+              <w:t xml:space="preserve">Item Ledger Entry NWV-MAROU</w:t>
             </w:r>
           </w:p>
         </w:tc>
@@ -1798,7 +1936,7 @@
                 <w:sz w:val="20"/>
                 <w:szCs w:val="20"/>
               </w:rPr>
-              <w:t xml:space="preserve">10, 11</w:t>
+              <w:t xml:space="preserve">8</w:t>
             </w:r>
           </w:p>
         </w:tc>
@@ -1837,7 +1975,7 @@
                 <w:sz w:val="20"/>
                 <w:szCs w:val="20"/>
               </w:rPr>
-              <w:t xml:space="preserve">Đơn mua HO106202: 82 Choco nuts từ Marou giao S0001. Đã sang Marou thành Sales Order S90015, Marou đã post xuất kho phiếu 102045 đề ngày 17/09</w:t>
+              <w:t xml:space="preserve">LS ở Dakao đề xuất 12 Ice cream cho S0002 (min-max 8/20), 7 Croissant chocolate cho S0002 (hết hàng quá nửa cửa sổ tính), 2 Choco nuts cho S0001</w:t>
             </w:r>
           </w:p>
         </w:tc>
@@ -1870,7 +2008,7 @@
                 <w:sz w:val="20"/>
                 <w:szCs w:val="20"/>
               </w:rPr>
-              <w:t xml:space="preserve">NWV-DAKAO và NWV-MAROU</w:t>
+              <w:t xml:space="preserve">Journal MAROU-PO của NWV-DAKAO</w:t>
             </w:r>
           </w:p>
         </w:tc>
@@ -1903,7 +2041,7 @@
                 <w:sz w:val="20"/>
                 <w:szCs w:val="20"/>
               </w:rPr>
-              <w:t xml:space="preserve">12, 13</w:t>
+              <w:t xml:space="preserve">10, 11, 13</w:t>
             </w:r>
           </w:p>
         </w:tc>
@@ -1942,7 +2080,7 @@
                 <w:sz w:val="20"/>
                 <w:szCs w:val="20"/>
               </w:rPr>
-              <w:t xml:space="preserve">Đơn mua HO106200: 1 Blueberry muffin giao S0005, Marou xuất kho phiếu 102044 ngày 16/09, chưa post nhận</w:t>
+              <w:t xml:space="preserve">Bốn CTKM và bốn Planned Event của LS: Choco bowl giảm 15% ngày 23 đến 25/09 có nhu cầu cho S0001 và S0010, cố ý thiếu S0002 và S0005; dự báo Holt-Winters 28 ngày tới đã ghi vào Retail Forecast Entry</w:t>
             </w:r>
           </w:p>
         </w:tc>
@@ -1975,7 +2113,7 @@
                 <w:sz w:val="20"/>
                 <w:szCs w:val="20"/>
               </w:rPr>
-              <w:t xml:space="preserve">NWV-DAKAO</w:t>
+              <w:t xml:space="preserve">LS Forecast Entry, Periodic Discount, Planned Event</w:t>
             </w:r>
           </w:p>
         </w:tc>
@@ -2008,7 +2146,7 @@
                 <w:sz w:val="20"/>
                 <w:szCs w:val="20"/>
               </w:rPr>
-              <w:t xml:space="preserve">12, 14</w:t>
+              <w:t xml:space="preserve">14, 15</w:t>
             </w:r>
           </w:p>
         </w:tc>
@@ -2047,7 +2185,7 @@
                 <w:sz w:val="20"/>
                 <w:szCs w:val="20"/>
               </w:rPr>
-              <w:t xml:space="preserve">Lô Choco nuts L260906-33323C: Marou xuất 81 cái theo HO106202 sang S0001, hạn 22/04/2027, sổ kho ở W0003</w:t>
+              <w:t xml:space="preserve">Đơn mua HO106202: 82 Choco nuts từ Marou giao S0001; Marou đã post xuất kho phiếu 102045 ngày 17/09</w:t>
             </w:r>
           </w:p>
         </w:tc>
@@ -2080,7 +2218,7 @@
                 <w:sz w:val="20"/>
                 <w:szCs w:val="20"/>
               </w:rPr>
-              <w:t xml:space="preserve">Item Ledger Entry NWV-MAROU</w:t>
+              <w:t xml:space="preserve">NWV-DAKAO và NWV-MAROU</w:t>
             </w:r>
           </w:p>
         </w:tc>
@@ -2113,7 +2251,217 @@
                 <w:sz w:val="20"/>
                 <w:szCs w:val="20"/>
               </w:rPr>
-              <w:t xml:space="preserve">16</w:t>
+              <w:t xml:space="preserve">16, 17</w:t>
+            </w:r>
+          </w:p>
+        </w:tc>
+      </w:tr>
+      <w:tr>
+        <w:trPr>
+          <w:cantSplit/>
+          <w:tblHeader w:val="false"/>
+        </w:trPr>
+        <w:tc>
+          <w:tcPr>
+            <w:tcW w:type="dxa" w:w="5140"/>
+            <w:tcBorders>
+              <w:top w:val="single" w:color="A9D5E2" w:sz="4"/>
+              <w:left w:val="single" w:color="A9D5E2" w:sz="4"/>
+              <w:bottom w:val="single" w:color="A9D5E2" w:sz="4"/>
+              <w:right w:val="single" w:color="A9D5E2" w:sz="4"/>
+            </w:tcBorders>
+            <w:tcMar>
+              <w:top w:type="dxa" w:w="113"/>
+              <w:left w:type="dxa" w:w="113"/>
+              <w:bottom w:type="dxa" w:w="113"/>
+              <w:right w:type="dxa" w:w="113"/>
+            </w:tcMar>
+          </w:tcPr>
+          <w:p>
+            <w:pPr>
+              <w:spacing w:after="0" w:line="252"/>
+            </w:pPr>
+            <w:r>
+              <w:rPr>
+                <w:rFonts w:ascii="Aptos" w:cs="Aptos" w:eastAsia="Aptos" w:hAnsi="Aptos"/>
+                <w:b w:val="false"/>
+                <w:bCs w:val="false"/>
+                <w:color w:val="27343A"/>
+                <w:sz w:val="20"/>
+                <w:szCs w:val="20"/>
+              </w:rPr>
+              <w:t xml:space="preserve">Đơn mua HO106200: 1 Blueberry muffin giao S0005, Marou xuất kho phiếu 102044 ngày 16/09, chưa post nhận</w:t>
+            </w:r>
+          </w:p>
+        </w:tc>
+        <w:tc>
+          <w:tcPr>
+            <w:tcW w:type="dxa" w:w="2731"/>
+            <w:tcBorders>
+              <w:top w:val="single" w:color="A9D5E2" w:sz="4"/>
+              <w:left w:val="single" w:color="A9D5E2" w:sz="4"/>
+              <w:bottom w:val="single" w:color="A9D5E2" w:sz="4"/>
+              <w:right w:val="single" w:color="A9D5E2" w:sz="4"/>
+            </w:tcBorders>
+            <w:tcMar>
+              <w:top w:type="dxa" w:w="113"/>
+              <w:left w:type="dxa" w:w="113"/>
+              <w:bottom w:type="dxa" w:w="113"/>
+              <w:right w:type="dxa" w:w="113"/>
+            </w:tcMar>
+          </w:tcPr>
+          <w:p>
+            <w:pPr>
+              <w:spacing w:after="0" w:line="252"/>
+            </w:pPr>
+            <w:r>
+              <w:rPr>
+                <w:rFonts w:ascii="Aptos" w:cs="Aptos" w:eastAsia="Aptos" w:hAnsi="Aptos"/>
+                <w:b w:val="false"/>
+                <w:bCs w:val="false"/>
+                <w:color w:val="27343A"/>
+                <w:sz w:val="20"/>
+                <w:szCs w:val="20"/>
+              </w:rPr>
+              <w:t xml:space="preserve">NWV-DAKAO</w:t>
+            </w:r>
+          </w:p>
+        </w:tc>
+        <w:tc>
+          <w:tcPr>
+            <w:tcW w:type="dxa" w:w="1767"/>
+            <w:tcBorders>
+              <w:top w:val="single" w:color="A9D5E2" w:sz="4"/>
+              <w:left w:val="single" w:color="A9D5E2" w:sz="4"/>
+              <w:bottom w:val="single" w:color="A9D5E2" w:sz="4"/>
+              <w:right w:val="single" w:color="A9D5E2" w:sz="4"/>
+            </w:tcBorders>
+            <w:tcMar>
+              <w:top w:type="dxa" w:w="113"/>
+              <w:left w:type="dxa" w:w="113"/>
+              <w:bottom w:type="dxa" w:w="113"/>
+              <w:right w:type="dxa" w:w="113"/>
+            </w:tcMar>
+          </w:tcPr>
+          <w:p>
+            <w:pPr>
+              <w:spacing w:after="0" w:line="252"/>
+            </w:pPr>
+            <w:r>
+              <w:rPr>
+                <w:rFonts w:ascii="Aptos" w:cs="Aptos" w:eastAsia="Aptos" w:hAnsi="Aptos"/>
+                <w:b w:val="false"/>
+                <w:bCs w:val="false"/>
+                <w:color w:val="27343A"/>
+                <w:sz w:val="20"/>
+                <w:szCs w:val="20"/>
+              </w:rPr>
+              <w:t xml:space="preserve">16, 18</w:t>
+            </w:r>
+          </w:p>
+        </w:tc>
+      </w:tr>
+      <w:tr>
+        <w:trPr>
+          <w:cantSplit/>
+          <w:tblHeader w:val="false"/>
+        </w:trPr>
+        <w:tc>
+          <w:tcPr>
+            <w:tcW w:type="dxa" w:w="5140"/>
+            <w:tcBorders>
+              <w:top w:val="single" w:color="A9D5E2" w:sz="4"/>
+              <w:left w:val="single" w:color="A9D5E2" w:sz="4"/>
+              <w:bottom w:val="single" w:color="A9D5E2" w:sz="4"/>
+              <w:right w:val="single" w:color="A9D5E2" w:sz="4"/>
+            </w:tcBorders>
+            <w:tcMar>
+              <w:top w:type="dxa" w:w="113"/>
+              <w:left w:type="dxa" w:w="113"/>
+              <w:bottom w:type="dxa" w:w="113"/>
+              <w:right w:type="dxa" w:w="113"/>
+            </w:tcMar>
+          </w:tcPr>
+          <w:p>
+            <w:pPr>
+              <w:spacing w:after="0" w:line="252"/>
+            </w:pPr>
+            <w:r>
+              <w:rPr>
+                <w:rFonts w:ascii="Aptos" w:cs="Aptos" w:eastAsia="Aptos" w:hAnsi="Aptos"/>
+                <w:b w:val="false"/>
+                <w:bCs w:val="false"/>
+                <w:color w:val="27343A"/>
+                <w:sz w:val="20"/>
+                <w:szCs w:val="20"/>
+              </w:rPr>
+              <w:t xml:space="preserve">Đơn mua HO106203: 5 Choco bowl giao S0010, đã sang Marou thành Sales Order S90016, kho xuất và lô đã gán sẵn, CHƯA post xuất kho</w:t>
+            </w:r>
+          </w:p>
+        </w:tc>
+        <w:tc>
+          <w:tcPr>
+            <w:tcW w:type="dxa" w:w="2731"/>
+            <w:tcBorders>
+              <w:top w:val="single" w:color="A9D5E2" w:sz="4"/>
+              <w:left w:val="single" w:color="A9D5E2" w:sz="4"/>
+              <w:bottom w:val="single" w:color="A9D5E2" w:sz="4"/>
+              <w:right w:val="single" w:color="A9D5E2" w:sz="4"/>
+            </w:tcBorders>
+            <w:tcMar>
+              <w:top w:type="dxa" w:w="113"/>
+              <w:left w:type="dxa" w:w="113"/>
+              <w:bottom w:type="dxa" w:w="113"/>
+              <w:right w:type="dxa" w:w="113"/>
+            </w:tcMar>
+          </w:tcPr>
+          <w:p>
+            <w:pPr>
+              <w:spacing w:after="0" w:line="252"/>
+            </w:pPr>
+            <w:r>
+              <w:rPr>
+                <w:rFonts w:ascii="Aptos" w:cs="Aptos" w:eastAsia="Aptos" w:hAnsi="Aptos"/>
+                <w:b w:val="false"/>
+                <w:bCs w:val="false"/>
+                <w:color w:val="27343A"/>
+                <w:sz w:val="20"/>
+                <w:szCs w:val="20"/>
+              </w:rPr>
+              <w:t xml:space="preserve">NWV-MAROU</w:t>
+            </w:r>
+          </w:p>
+        </w:tc>
+        <w:tc>
+          <w:tcPr>
+            <w:tcW w:type="dxa" w:w="1767"/>
+            <w:tcBorders>
+              <w:top w:val="single" w:color="A9D5E2" w:sz="4"/>
+              <w:left w:val="single" w:color="A9D5E2" w:sz="4"/>
+              <w:bottom w:val="single" w:color="A9D5E2" w:sz="4"/>
+              <w:right w:val="single" w:color="A9D5E2" w:sz="4"/>
+            </w:tcBorders>
+            <w:tcMar>
+              <w:top w:type="dxa" w:w="113"/>
+              <w:left w:type="dxa" w:w="113"/>
+              <w:bottom w:type="dxa" w:w="113"/>
+              <w:right w:type="dxa" w:w="113"/>
+            </w:tcMar>
+          </w:tcPr>
+          <w:p>
+            <w:pPr>
+              <w:spacing w:after="0" w:line="252"/>
+            </w:pPr>
+            <w:r>
+              <w:rPr>
+                <w:rFonts w:ascii="Aptos" w:cs="Aptos" w:eastAsia="Aptos" w:hAnsi="Aptos"/>
+                <w:b w:val="false"/>
+                <w:bCs w:val="false"/>
+                <w:color w:val="27343A"/>
+                <w:sz w:val="20"/>
+                <w:szCs w:val="20"/>
+              </w:rPr>
+              <w:t xml:space="preserve">Để bạn tự post trong BC, xem mục 3 bước 19</w:t>
             </w:r>
           </w:p>
         </w:tc>
@@ -2198,7 +2546,7 @@
                 <w:sz w:val="20"/>
                 <w:szCs w:val="20"/>
               </w:rPr>
-              <w:t xml:space="preserve">Đã xoá</w:t>
+              <w:t xml:space="preserve">Đã xoá hoặc đóng</w:t>
             </w:r>
           </w:p>
         </w:tc>
@@ -2271,7 +2619,7 @@
                 <w:sz w:val="20"/>
                 <w:szCs w:val="20"/>
               </w:rPr>
-              <w:t xml:space="preserve">19 đề xuất chuyển hàng đã từ chối ở Marou, 7 đề xuất đặt mua đã từ chối ở Dakao</w:t>
+              <w:t xml:space="preserve">Đề xuất huỷ Croissant plain ở Marou và đề xuất đặt mua Ice cream ở Dakao từ lần bạn chạy thử tối 16/09</w:t>
             </w:r>
           </w:p>
         </w:tc>
@@ -2304,7 +2652,7 @@
                 <w:sz w:val="20"/>
                 <w:szCs w:val="20"/>
               </w:rPr>
-              <w:t xml:space="preserve">Tính theo ngày làm việc 18/09, không còn khớp LS. Cột Theo dõi xử lý giờ không còn dòng Rejected.</w:t>
+              <w:t xml:space="preserve">Để bước 4 và bước 10 ghi đề xuất mới, không bị báo “đã có đề xuất”.</w:t>
             </w:r>
           </w:p>
         </w:tc>
@@ -2343,7 +2691,7 @@
                 <w:sz w:val="20"/>
                 <w:szCs w:val="20"/>
               </w:rPr>
-              <w:t xml:space="preserve">13 đề xuất huỷ lô hết hạn ở Dakao</w:t>
+              <w:t xml:space="preserve">Transfer Order HO1039 và đề xuất chuyển Choco pillar của lần QA</w:t>
             </w:r>
           </w:p>
         </w:tc>
@@ -2376,7 +2724,7 @@
                 <w:sz w:val="20"/>
                 <w:szCs w:val="20"/>
               </w:rPr>
-              <w:t xml:space="preserve">Sinh ra từ các lần chạy quét sáng khi thử. Mạch demo không dùng luồng huỷ.</w:t>
+              <w:t xml:space="preserve">Bước 5 sẽ tạo lại đúng trước mặt khách.</w:t>
             </w:r>
           </w:p>
         </w:tc>
@@ -2415,7 +2763,7 @@
                 <w:sz w:val="20"/>
                 <w:szCs w:val="20"/>
               </w:rPr>
-              <w:t xml:space="preserve">Các đề xuất post nhận hàng còn treo và đề xuất thử tối 16/09</w:t>
+              <w:t xml:space="preserve">Đơn thử HO106204 (10 Choco pillar, S0005) và HO106205 (12 Ice cream, S0002): đã xuất kho và đã post nhận (phiếu 107111, 107112), đề xuất liên quan đã xoá</w:t>
             </w:r>
           </w:p>
         </w:tc>
@@ -2448,7 +2796,7 @@
                 <w:sz w:val="20"/>
                 <w:szCs w:val="20"/>
               </w:rPr>
-              <w:t xml:space="preserve">Trợ lý ghi lại đúng lúc khi bấm Kiểm hàng Marou đã xuất kho ở bước 12.</w:t>
+              <w:t xml:space="preserve">Hai đơn dùng để kiểm lịch nền báo xuất kho và nút Marou xuất kho. Đóng lại để bước 16 chỉ còn HO106202 và HO106200.</w:t>
             </w:r>
           </w:p>
         </w:tc>
@@ -2487,7 +2835,7 @@
                 <w:sz w:val="20"/>
                 <w:szCs w:val="20"/>
               </w:rPr>
-              <w:t xml:space="preserve">Đơn mua HO106199 (1 muffin, tạo trước khi có Intercompany) và hai dòng Item Journal rỗng SL260918</w:t>
+              <w:t xml:space="preserve">Đề xuất post nhận HO106200 sinh ra khi QA bước 16</w:t>
             </w:r>
           </w:p>
         </w:tc>
@@ -2520,7 +2868,7 @@
                 <w:sz w:val="20"/>
                 <w:szCs w:val="20"/>
               </w:rPr>
-              <w:t xml:space="preserve">Rác của các lần thử, không thuộc kịch bản nào.</w:t>
+              <w:t xml:space="preserve">Bước 16 sẽ ghi lại đúng lúc bấm.</w:t>
             </w:r>
           </w:p>
         </w:tc>
@@ -2545,7 +2893,7 @@
           <w:rFonts w:ascii="Aptos" w:cs="Aptos" w:eastAsia="Aptos" w:hAnsi="Aptos"/>
           <w:color w:val="27343A"/>
         </w:rPr>
-        <w:t xml:space="preserve">Lịch quét nền 07:30 (quét sáng UC2, nhắc post 08:00) đang TẠM DỪNG bằng khoá tam_dung trong runs/lich-nhac.json. Không tạm dừng thì khởi động máy chủ sau 07:30 là nó chạy ngay, ghi tới 10 đề xuất huỷ mỗi company và gửi email trước giờ họp. Sau demo xoá khoá đó là lịch chạy lại.</w:t>
+        <w:t xml:space="preserve">Lịch quét nền 07:30 (quét sáng UC2, nhắc post 08:00) đang TẠM DỪNG bằng khoá tam_dung trong runs/lich-nhac.json. Riêng việc đọc phiếu giao hàng liên công ty mỗi phút vẫn chạy, vì nó chỉ báo, không ghi gì. Sau demo xoá khoá tam_dung là lịch sáng chạy lại.</w:t>
       </w:r>
     </w:p>
     <w:p>
@@ -2801,7 +3149,7 @@
                 <w:sz w:val="20"/>
                 <w:szCs w:val="20"/>
               </w:rPr>
-              <w:t xml:space="preserve">Mở http://127.0.0.1:8188 thấy màn hình chào; đợi khoảng 30 giây để máy chủ làm nóng hai company</w:t>
+              <w:t xml:space="preserve">Mở http://127.0.0.1:8188 thấy màn hình chào, tab trình duyệt có icon linh vật; đợi khoảng 1 phút để máy chủ đọc trước các bảng nặng của hai company</w:t>
             </w:r>
           </w:p>
         </w:tc>
@@ -2906,7 +3254,7 @@
                 <w:sz w:val="20"/>
                 <w:szCs w:val="20"/>
               </w:rPr>
-              <w:t xml:space="preserve">Hộp thư mọi vai về màn hình chào (xoá dấu vết các lần bấm thử tối 16/09). Sau đó không bấm Reset nữa, không bấm +24 giờ trước bước 13</w:t>
+              <w:t xml:space="preserve">Hộp thư mọi vai về màn hình chào. Sau đó không bấm Reset nữa, không bấm +24 giờ</w:t>
             </w:r>
           </w:p>
         </w:tc>
@@ -3221,7 +3569,7 @@
                 <w:sz w:val="20"/>
                 <w:szCs w:val="20"/>
               </w:rPr>
-              <w:t xml:space="preserve">Marou: chưa có đề xuất nào. Dakao: chỉ các dòng Executed của HO106200, HO106201, HO106202 và phiếu nhận 107110</w:t>
+              <w:t xml:space="preserve">Marou: chưa có đề xuất nào. Dakao: bốn dòng Executed (HO106200, HO106201, HO106202, phiếu nhận 107110)</w:t>
             </w:r>
           </w:p>
         </w:tc>
@@ -3293,7 +3641,7 @@
                 <w:sz w:val="20"/>
                 <w:szCs w:val="20"/>
               </w:rPr>
-              <w:t xml:space="preserve">Một tab trình duyệt riêng, đăng nhập NWV01</w:t>
+              <w:t xml:space="preserve">Một tab trình duyệt riêng, đăng nhập NWV01, company NWV-MAROU</w:t>
             </w:r>
           </w:p>
         </w:tc>
@@ -3326,7 +3674,7 @@
                 <w:sz w:val="20"/>
                 <w:szCs w:val="20"/>
               </w:rPr>
-              <w:t xml:space="preserve">Bấm link trong thẻ là mở được, không phải đăng nhập giữa buổi</w:t>
+              <w:t xml:space="preserve">Bấm link trong thẻ là mở được; muốn tự post xuất kho HO106203 thì mở sẵn Sales Order S90016</w:t>
             </w:r>
           </w:p>
         </w:tc>
@@ -3653,7 +4001,7 @@
                 <w:sz w:val="20"/>
                 <w:szCs w:val="20"/>
               </w:rPr>
-              <w:t xml:space="preserve">1 đến 4, 7, 9 đến 11, 16, 17</w:t>
+              <w:t xml:space="preserve">1 đến 4, 6 đến 9, 11, 13 đến 15</w:t>
             </w:r>
           </w:p>
         </w:tc>
@@ -3791,7 +4139,7 @@
                 <w:sz w:val="20"/>
                 <w:szCs w:val="20"/>
               </w:rPr>
-              <w:t xml:space="preserve">5, 8, 12, 14, 15</w:t>
+              <w:t xml:space="preserve">5, 12, 16, 18, 19</w:t>
             </w:r>
           </w:p>
         </w:tc>
@@ -3929,7 +4277,7 @@
                 <w:sz w:val="20"/>
                 <w:szCs w:val="20"/>
               </w:rPr>
-              <w:t xml:space="preserve">6, và xem hộp thư sau bước 15</w:t>
+              <w:t xml:space="preserve">10, và xem hộp thư sau bước 19</w:t>
             </w:r>
           </w:p>
         </w:tc>
@@ -4067,7 +4415,7 @@
                 <w:sz w:val="20"/>
                 <w:szCs w:val="20"/>
               </w:rPr>
-              <w:t xml:space="preserve">13</w:t>
+              <w:t xml:space="preserve">17</w:t>
             </w:r>
           </w:p>
         </w:tc>
@@ -4205,7 +4553,7 @@
                 <w:sz w:val="20"/>
                 <w:szCs w:val="20"/>
               </w:rPr>
-              <w:t xml:space="preserve">18</w:t>
+              <w:t xml:space="preserve">20</w:t>
             </w:r>
           </w:p>
         </w:tc>
@@ -4250,7 +4598,7 @@
           <w:rFonts w:ascii="Aptos" w:cs="Aptos" w:eastAsia="Aptos" w:hAnsi="Aptos"/>
           <w:color w:val="27343A"/>
         </w:rPr>
-        <w:t xml:space="preserve">Bấm nút kịch bản là console tự đổi vai và đổi company cho đúng bước, rồi điền câu và gửi; tên nút chính là câu gửi đi, dòng nhỏ dưới tên là mạch chuyện. Ô hướng dẫn hiện ngay dưới nút vừa bấm. Các bước vẽ nét đứt là bước bấm trên thẻ trong hộp thư, console chỉ đổi vai và nói bấm gì. Bước gọi vòng (12, 15) báo đã gửi tin cho những ai, vì tin đi sang hộp thư người khác.</w:t>
+        <w:t xml:space="preserve">Bấm nút kịch bản là console tự đổi vai và đổi company cho đúng bước, rồi điền câu và gửi; tên nút chính là câu gửi đi, dòng nhỏ dưới tên là mạch chuyện. Ô hướng dẫn hiện ngay dưới nút vừa bấm. Các bước vẽ nét đứt là bước bấm trên thẻ trong hộp thư, console chỉ đổi vai và nói bấm gì. Bước gọi vòng (16, 19) báo đã gửi tin cho những ai, vì tin đi sang hộp thư người khác.</w:t>
       </w:r>
     </w:p>
     <w:p>
@@ -4278,7 +4626,7 @@
           <w:sz w:val="40"/>
           <w:szCs w:val="40"/>
         </w:rPr>
-        <w:t xml:space="preserve">3. Mười tám bước</w:t>
+        <w:t xml:space="preserve">3. Hai mươi bước</w:t>
       </w:r>
     </w:p>
     <w:p>
@@ -4290,7 +4638,7 @@
           <w:rFonts w:ascii="Aptos" w:cs="Aptos" w:eastAsia="Aptos" w:hAnsi="Aptos"/>
           <w:color w:val="27343A"/>
         </w:rPr>
-        <w:t xml:space="preserve">Mỗi bước ba cột: bấm gì, khách thấy gì, nói gì. Cột khách thấy gì là dấu hiệu bước đã xong, đừng bấm tiếp khi chưa thấy.</w:t>
+        <w:t xml:space="preserve">Mỗi bước ba cột: bấm gì, khách thấy gì, nói gì. Cột khách thấy gì là dấu hiệu bước đã xong, đừng bấm tiếp khi chưa thấy. Thời gian ghi trong từng bước là số đo khi chạy thử đêm 16/09 trên dữ liệu thật.</w:t>
       </w:r>
     </w:p>
     <w:p>
@@ -4508,7 +4856,7 @@
                 <w:sz w:val="20"/>
                 <w:szCs w:val="20"/>
               </w:rPr>
-              <w:t xml:space="preserve">Bốn con số lớn ở hàng trên, bảng dòng ở dưới, thẻ Ngày làm việc 17/09/2026. Bấm một tầng để lọc.</w:t>
+              <w:t xml:space="preserve">Bốn con số lớn ở hàng trên, bảng dòng ở dưới, thẻ Ngày làm việc 17/09/2026. 166 dòng, 38% giá trị tồn nằm ở bốn tầng xấu. Bấm một tầng để lọc.</w:t>
             </w:r>
           </w:p>
         </w:tc>
@@ -4785,7 +5133,7 @@
                 <w:sz w:val="20"/>
                 <w:szCs w:val="20"/>
               </w:rPr>
-              <w:t xml:space="preserve">Sau khoảng 20 giây: thẻ Ba việc quan trọng nhất sáng nay, dòng Người soạn ghi AI (gpt-4.1-mini), rồi các thẻ dòng bên dưới.</w:t>
+              <w:t xml:space="preserve">Sau khoảng 30 giây: thẻ Ba việc quan trọng nhất sáng nay, dòng Người soạn ghi AI (gpt-4.1-mini), rồi các thẻ lô hết hạn, CTKM sắp tới, đơn mua quá hạn.</w:t>
             </w:r>
           </w:p>
         </w:tc>
@@ -4884,7 +5232,7 @@
           <w:rFonts w:ascii="Aptos" w:cs="Aptos" w:eastAsia="Aptos" w:hAnsi="Aptos"/>
           <w:color w:val="27343A"/>
         </w:rPr>
-        <w:t xml:space="preserve">Phần lớn 20 giây là đọc Business Central. Nói trước để người xem không tưởng máy treo.</w:t>
+        <w:t xml:space="preserve">Phần lớn thời gian là đọc Business Central. Nói trước để người xem không tưởng máy treo.</w:t>
       </w:r>
     </w:p>
     <w:p>
@@ -5102,7 +5450,7 @@
                 <w:sz w:val="20"/>
                 <w:szCs w:val="20"/>
               </w:rPr>
-              <w:t xml:space="preserve">36 lô cận date, chia theo địa điểm; 5 thẻ lô giá trị lớn nhất. Thẻ Choco pillar S0010: 470 cái, 26 ngày, bán không kịp; hai nút Đề xuất giảm giá và Phương án xử lý.</w:t>
+              <w:t xml:space="preserve">Khoảng 5 giây: 36 lô cận date, chia theo địa điểm; 5 thẻ lô giá trị lớn nhất. Thẻ Choco pillar S0010: 470 cái, 26 ngày, bán không kịp; hai nút Đề xuất giảm giá và Phương án xử lý.</w:t>
             </w:r>
           </w:p>
         </w:tc>
@@ -5190,7 +5538,7 @@
           <w:sz w:val="28"/>
           <w:szCs w:val="28"/>
         </w:rPr>
-        <w:t xml:space="preserve">Bước 4 · Phương án xử lý cho Choco pillar</w:t>
+        <w:t xml:space="preserve">Bước 4 · Phương án xử lý cho Choco pillar ở S0010</w:t>
       </w:r>
     </w:p>
     <w:p>
@@ -5329,7 +5677,7 @@
                 <w:sz w:val="20"/>
                 <w:szCs w:val="20"/>
               </w:rPr>
-              <w:t xml:space="preserve">Nút 4 chỉ hiện hướng dẫn. Trên thẻ Choco pillar bấm Phương án xử lý.</w:t>
+              <w:t xml:space="preserve">Nút 4 gửi câu “phương án xử lý cho Choco pillar ở S0010” (cùng kết quả với nút Phương án xử lý trên thẻ lô). Trên thẻ trả về, bấm nút Ghi đề xuất: Chuyển.</w:t>
             </w:r>
           </w:p>
         </w:tc>
@@ -5362,7 +5710,7 @@
                 <w:sz w:val="20"/>
                 <w:szCs w:val="20"/>
               </w:rPr>
-              <w:t xml:space="preserve">Sau khoảng 6 giây: thẻ bảng năm phương án kèm giá trị cứu được hoặc mất, lời khuyên của model (chuyển 199 sang S0001 bán nhanh hơn), nút ghi đề xuất. Bấm nút đó. Sau khi ghi: thẻ Email cho người duyệt, phần lời do AI viết, kênh SMTP đã gửi.</w:t>
+              <w:t xml:space="preserve">Khoảng 5 giây: bảng năm phương án kèm giá trị cứu được hoặc mất, lời khuyên của model (chuyển 187 sang S0001, không còn phần dư). Sau khi ghi (khoảng 15 giây): câu đã ghi đề xuất, thẻ Email cho người duyệt với hai đoạn AI viết, kênh SMTP đã gửi.</w:t>
             </w:r>
           </w:p>
         </w:tc>
@@ -5427,7 +5775,7 @@
           <w:rFonts w:ascii="Aptos" w:cs="Aptos" w:eastAsia="Aptos" w:hAnsi="Aptos"/>
           <w:color w:val="27343A"/>
         </w:rPr>
-        <w:t xml:space="preserve">Model chọn một và nói vì sao. Nó được chọn khác code, miễn nói được lý do trên số đã có. Khoá phương án phải nằm trong bảng, chữ số phải có trong dữ liệu.</w:t>
+        <w:t xml:space="preserve">Model chọn một và nói vì sao. Khoá phương án phải nằm trong bảng, chữ số phải có trong dữ liệu, không được thêm đơn vị tiền, không được chọn giữ khi giữ vẫn còn dư. Vi phạm là về câu mẫu.</w:t>
       </w:r>
     </w:p>
     <w:p>
@@ -5461,7 +5809,7 @@
           <w:rFonts w:ascii="Aptos" w:cs="Aptos" w:eastAsia="Aptos" w:hAnsi="Aptos"/>
           <w:color w:val="27343A"/>
         </w:rPr>
-        <w:t xml:space="preserve">Người duyệt được gọi hai đường: thẻ trong chat cho ai đang mở trợ lý, email cho ai không mở. Code điền bảng số liệu và link BC; AI chỉ viết đoạn mở đầu và đoạn kết, mỗi con số phải có trong dữ liệu, sai thì dùng mẫu và ghi rõ.</w:t>
+        <w:t xml:space="preserve">Người duyệt được gọi hai đường: thẻ trong chat cho ai đang mở trợ lý, email cho ai không mở. Code điền bảng số liệu và link BC; AI chỉ viết đoạn mở đầu và đoạn kết.</w:t>
       </w:r>
     </w:p>
     <w:p>
@@ -5623,7 +5971,7 @@
                 <w:sz w:val="20"/>
                 <w:szCs w:val="20"/>
               </w:rPr>
-              <w:t xml:space="preserve">Nút 5 đổi sang Hùng. Bấm Duyệt chuyển hàng trên thẻ đề xuất 199 Choco pillar S0010 sang S0001.</w:t>
+              <w:t xml:space="preserve">Nút 5 đổi sang Hùng. Bấm Duyệt chuyển hàng trên thẻ đề xuất Choco pillar S0010 sang S0001.</w:t>
             </w:r>
           </w:p>
         </w:tc>
@@ -5656,7 +6004,7 @@
                 <w:sz w:val="20"/>
                 <w:szCs w:val="20"/>
               </w:rPr>
-              <w:t xml:space="preserve">Thẻ Đã duyệt kèm số Transfer Order và link mở trong BC; cột phải Transfer Order có dòng mới, trạng thái Open.</w:t>
+              <w:t xml:space="preserve">Khoảng 5 giây: Đã duyệt, Transfer Order HO10xx tạo dưới tên Hùng, trạng thái Open; cột phải Transfer Order có dòng mới.</w:t>
             </w:r>
           </w:p>
         </w:tc>
@@ -5726,6 +6074,23 @@
     </w:p>
     <w:p>
       <w:pPr>
+        <w:pStyle w:val="ListParagraph"/>
+        <w:numPr>
+          <w:ilvl w:val="0"/>
+          <w:numId w:val="2"/>
+        </w:numPr>
+        <w:spacing w:after="80" w:line="276"/>
+      </w:pPr>
+      <w:r>
+        <w:rPr>
+          <w:rFonts w:ascii="Aptos" w:cs="Aptos" w:eastAsia="Aptos" w:hAnsi="Aptos"/>
+          <w:color w:val="27343A"/>
+        </w:rPr>
+        <w:t xml:space="preserve">Hai cửa hàng chưa có tuyến vận chuyển qua kho trung chuyển nên Business Central tạo lệnh chuyển thẳng. Có Transfer Route thì BC tự điền kho trung chuyển.</w:t>
+      </w:r>
+    </w:p>
+    <w:p>
+      <w:pPr>
         <w:pStyle w:val="Heading2"/>
         <w:keepNext/>
         <w:keepLines/>
@@ -5744,7 +6109,7 @@
           <w:sz w:val="28"/>
           <w:szCs w:val="28"/>
         </w:rPr>
-        <w:t xml:space="preserve">Phần 3 · Cửa hàng bán lẻ hết hàng: LS tính, AI đề xuất</w:t>
+        <w:t xml:space="preserve">Phần 3 · Hỏi tự do trên tồn kho: chậm luân chuyển, CTKM, truy xuất, bất thường</w:t>
       </w:r>
     </w:p>
     <w:p>
@@ -5767,7 +6132,7 @@
           <w:sz w:val="28"/>
           <w:szCs w:val="28"/>
         </w:rPr>
-        <w:t xml:space="preserve">Bước 6 · Sắp hết Ice cream ở cửa hàng tôi</w:t>
+        <w:t xml:space="preserve">Bước 6 · Mặt hàng nào chậm luân chuyển ở các cửa hàng?</w:t>
       </w:r>
     </w:p>
     <w:p>
@@ -5779,7 +6144,7 @@
           <w:rFonts w:ascii="Aptos" w:cs="Aptos" w:eastAsia="Aptos" w:hAnsi="Aptos"/>
           <w:color w:val="27343A"/>
         </w:rPr>
-        <w:t xml:space="preserve">Vai: minh.s0002 · Dakao</w:t>
+        <w:t xml:space="preserve">Vai: trang.sc · Dakao</w:t>
       </w:r>
     </w:p>
     <w:tbl>
@@ -5906,7 +6271,7 @@
                 <w:sz w:val="20"/>
                 <w:szCs w:val="20"/>
               </w:rPr>
-              <w:t xml:space="preserve">Nút 6. Console đổi sang Minh và gửi câu.</w:t>
+              <w:t xml:space="preserve">Nút 6. Có thể mời khách gõ câu của họ thay cho câu trên nút.</w:t>
             </w:r>
           </w:p>
         </w:tc>
@@ -5939,7 +6304,7 @@
                 <w:sz w:val="20"/>
                 <w:szCs w:val="20"/>
               </w:rPr>
-              <w:t xml:space="preserve">Trợ lý: Ice cream tại S0002 còn 8, đủ 5,5 ngày; theo LS Replenishment đề xuất đặt mua 12 từ MAROU giao thẳng tới S0002, đang xin điều phối duyệt.</w:t>
+              <w:t xml:space="preserve">Khoảng 10 đến 20 giây: AI liệt kê Ice cream strawberry ở S0001, S0002, S0013, mỗi cửa hàng một dòng: tồn, giá trị, 109 ngày không bán. Thẻ Kế hoạch tôi dựng từ dữ liệu có nút xem từng bước đã tra.</w:t>
             </w:r>
           </w:p>
         </w:tc>
@@ -5987,7 +6352,7 @@
           <w:rFonts w:ascii="Aptos" w:cs="Aptos" w:eastAsia="Aptos" w:hAnsi="Aptos"/>
           <w:color w:val="27343A"/>
         </w:rPr>
-        <w:t xml:space="preserve">Cửa hàng chỉ nói một câu tự nhiên. Trợ lý nhận ra mặt hàng và cửa hàng của người hỏi, đọc con số LS đã tính, ghi đề xuất vào Business Central và gửi người duyệt.</w:t>
+        <w:t xml:space="preserve">Không có kịch bản viết sẵn cho câu này. Model tự chọn tool: đọc bảng sức khỏe tồn kho xếp theo số ngày tồn đủ bán và số ngày không bán, không chỉ nhìn tầng Chậm luân chuyển.</w:t>
       </w:r>
     </w:p>
     <w:p>
@@ -6004,24 +6369,7 @@
           <w:rFonts w:ascii="Aptos" w:cs="Aptos" w:eastAsia="Aptos" w:hAnsi="Aptos"/>
           <w:color w:val="27343A"/>
         </w:rPr>
-        <w:t xml:space="preserve">Trợ lý không tự tính số. 12 là số của LS Replenishment, kiểu min-max: điểm đặt lại 8, mức tối đa 20.</w:t>
-      </w:r>
-    </w:p>
-    <w:p>
-      <w:pPr>
-        <w:pStyle w:val="ListParagraph"/>
-        <w:numPr>
-          <w:ilvl w:val="0"/>
-          <w:numId w:val="2"/>
-        </w:numPr>
-        <w:spacing w:after="80" w:line="276"/>
-      </w:pPr>
-      <w:r>
-        <w:rPr>
-          <w:rFonts w:ascii="Aptos" w:cs="Aptos" w:eastAsia="Aptos" w:hAnsi="Aptos"/>
-          <w:color w:val="27343A"/>
-        </w:rPr>
-        <w:t xml:space="preserve">Dakao là bán lẻ, không có kho trung tâm: đề xuất là đặt mua từ Marou, giao thẳng cửa hàng. Đây là mô hình hai đơn vị của Marou.</w:t>
+        <w:t xml:space="preserve">Bấm Xem bước tôi đã tra để khách thấy model gọi tool gì với tham số gì. Mỗi con số trong câu trả lời đã được code đối chiếu với kết quả tool.</w:t>
       </w:r>
     </w:p>
     <w:p>
@@ -6038,7 +6386,7 @@
           <w:rFonts w:ascii="Aptos" w:cs="Aptos" w:eastAsia="Aptos" w:hAnsi="Aptos"/>
           <w:color w:val="27343A"/>
         </w:rPr>
-        <w:t xml:space="preserve">Bước này ghi thật một đề xuất vào Business Central. Bấm lần hai thì trợ lý nói đã có đề xuất, không ghi thêm.</w:t>
+        <w:t xml:space="preserve">Câu trả lời đổi theo cách model đọc dữ liệu, không học thuộc. Nếu thẻ có dòng Kiểm tra số thì đọc to: đó là code bắt model viết số không có trong dữ liệu.</w:t>
       </w:r>
     </w:p>
     <w:p>
@@ -6061,7 +6409,7 @@
           <w:sz w:val="28"/>
           <w:szCs w:val="28"/>
         </w:rPr>
-        <w:t xml:space="preserve">Bước 7 · Vì sao LS đề xuất Ice cream cho S0002?</w:t>
+        <w:t xml:space="preserve">Bước 7 · Đề xuất CTKM để bán các mặt hàng này</w:t>
       </w:r>
     </w:p>
     <w:p>
@@ -6200,7 +6548,7 @@
                 <w:sz w:val="20"/>
                 <w:szCs w:val="20"/>
               </w:rPr>
-              <w:t xml:space="preserve">Nút 7.</w:t>
+              <w:t xml:space="preserve">Nút 7, trong CÙNG đoạn chat với bước 6.</w:t>
             </w:r>
           </w:p>
         </w:tc>
@@ -6233,7 +6581,7 @@
                 <w:sz w:val="20"/>
                 <w:szCs w:val="20"/>
               </w:rPr>
-              <w:t xml:space="preserve">AI viết vài câu: Stock Levels, Reorder Point 8, Maximum 20, tồn 8 nên mua 12; bảng nhật ký tính thu gọn bên dưới; link mở nhật ký tính của LS.</w:t>
+              <w:t xml:space="preserve">Khoảng 30 giây: đề xuất cho Ice cream strawberry (giảm giá, combo hoặc đưa ra khu trưng bày ở cửa hàng nào, vì sao), rồi ghi chú ba CTKM đang chạy không có mặt hàng này. Không có mức giảm phần trăm.</w:t>
             </w:r>
           </w:p>
         </w:tc>
@@ -6281,7 +6629,7 @@
           <w:rFonts w:ascii="Aptos" w:cs="Aptos" w:eastAsia="Aptos" w:hAnsi="Aptos"/>
           <w:color w:val="27343A"/>
         </w:rPr>
-        <w:t xml:space="preserve">Từng bước là nhật ký tính của LS Replenishment, trợ lý không tính lại. Ai cũng đối chiếu được bằng link.</w:t>
+        <w:t xml:space="preserve">Câu nối tiếp: trợ lý đưa vài tin gần nhất của đoạn chat cho model để hiểu “các mặt hàng này”. Model đọc lại tồn kho và CTKM của LS, không nhớ số từ câu trước.</w:t>
       </w:r>
     </w:p>
     <w:p>
@@ -6298,7 +6646,24 @@
           <w:rFonts w:ascii="Aptos" w:cs="Aptos" w:eastAsia="Aptos" w:hAnsi="Aptos"/>
           <w:color w:val="27343A"/>
         </w:rPr>
-        <w:t xml:space="preserve">Tham số nằm trên Item Card của LS, Marou tự sửa, không sửa code.</w:t>
+        <w:t xml:space="preserve">Mức giảm bao nhiêu phần trăm là quy tắc của Marou, chưa có. Trợ lý nói rõ người phụ trách chốt, không bịa. Khi Marou có chính sách giá, đưa vào làm dữ liệu cho model.</w:t>
+      </w:r>
+    </w:p>
+    <w:p>
+      <w:pPr>
+        <w:pBdr>
+          <w:left w:val="single" w:color="C89B72" w:sz="36" w:space="10"/>
+        </w:pBdr>
+        <w:shd w:fill="F4EEE8" w:val="clear"/>
+        <w:spacing w:after="200" w:before="120" w:line="276"/>
+        <w:ind w:left="200" w:right="120"/>
+      </w:pPr>
+      <w:r>
+        <w:rPr>
+          <w:rFonts w:ascii="Aptos" w:cs="Aptos" w:eastAsia="Aptos" w:hAnsi="Aptos"/>
+          <w:color w:val="27343A"/>
+        </w:rPr>
+        <w:t xml:space="preserve">Bước này gọi model nhiều lượt nhất (khoảng 13 nghìn token). Nói trước câu dẫn trong lúc chờ.</w:t>
       </w:r>
     </w:p>
     <w:p>
@@ -6321,7 +6686,7 @@
           <w:sz w:val="28"/>
           <w:szCs w:val="28"/>
         </w:rPr>
-        <w:t xml:space="preserve">Bước 8 · Hùng duyệt đặt mua, gửi đơn sang Marou</w:t>
+        <w:t xml:space="preserve">Bước 8 · Truy xuất lô L260906-33323C</w:t>
       </w:r>
     </w:p>
     <w:p>
@@ -6333,7 +6698,7 @@
           <w:rFonts w:ascii="Aptos" w:cs="Aptos" w:eastAsia="Aptos" w:hAnsi="Aptos"/>
           <w:color w:val="27343A"/>
         </w:rPr>
-        <w:t xml:space="preserve">Vai: hung.dieuphoi · Dakao</w:t>
+        <w:t xml:space="preserve">Vai: trang.sc · Marou</w:t>
       </w:r>
     </w:p>
     <w:tbl>
@@ -6460,7 +6825,7 @@
                 <w:sz w:val="20"/>
                 <w:szCs w:val="20"/>
               </w:rPr>
-              <w:t xml:space="preserve">Nút 8 đổi sang Hùng. Thẻ Đề xuất đặt mua Ice cream: bấm Duyệt đặt mua. Thẻ Đã tạo Purchase Order hiện nút Gửi đơn sang Marou, bấm tiếp.</w:t>
+              <w:t xml:space="preserve">Nút 8. Console đổi về Marou.</w:t>
             </w:r>
           </w:p>
         </w:tc>
@@ -6493,7 +6858,7 @@
                 <w:sz w:val="20"/>
                 <w:szCs w:val="20"/>
               </w:rPr>
-              <w:t xml:space="preserve">Thẻ Đã tạo Purchase Order HO1062xx kèm link mở đơn. Sau khi gửi: thẻ báo đơn Released, bên Marou có Sales Order S900xx.</w:t>
+              <w:t xml:space="preserve">Khoảng 6 giây: AI kể lại hành trình lô Choco nuts: nhập 110 về W0003, 81 đã xuất, còn 29, hạn 22/04/2027, thu hồi lấy lại ở đâu; bảng Item Ledger Entry thu gọn bên dưới.</w:t>
             </w:r>
           </w:p>
         </w:tc>
@@ -6541,7 +6906,41 @@
           <w:rFonts w:ascii="Aptos" w:cs="Aptos" w:eastAsia="Aptos" w:hAnsi="Aptos"/>
           <w:color w:val="27343A"/>
         </w:rPr>
-        <w:t xml:space="preserve">Gửi đơn sang Marou là Intercompany chuẩn của Business Central: đơn mua bên Dakao thành đơn bán bên Marou, không nhập lại. Trợ lý không tự bấm nút này vì gửi kéo theo Release.</w:t>
+        <w:t xml:space="preserve">Đây là phần traceability của UC2: một lô có vấn đề thì biết ngay nó nằm ở những địa điểm nào và còn bao nhiêu.</w:t>
+      </w:r>
+    </w:p>
+    <w:p>
+      <w:pPr>
+        <w:pStyle w:val="ListParagraph"/>
+        <w:numPr>
+          <w:ilvl w:val="0"/>
+          <w:numId w:val="2"/>
+        </w:numPr>
+        <w:spacing w:after="80" w:line="276"/>
+      </w:pPr>
+      <w:r>
+        <w:rPr>
+          <w:rFonts w:ascii="Aptos" w:cs="Aptos" w:eastAsia="Aptos" w:hAnsi="Aptos"/>
+          <w:color w:val="27343A"/>
+        </w:rPr>
+        <w:t xml:space="preserve">81 cái này đi sang Cửa hàng Quận 1 theo đơn liên công ty HO106202; phần 6 sẽ thấy cửa hàng được báo.</w:t>
+      </w:r>
+    </w:p>
+    <w:p>
+      <w:pPr>
+        <w:pBdr>
+          <w:left w:val="single" w:color="C89B72" w:sz="36" w:space="10"/>
+        </w:pBdr>
+        <w:shd w:fill="F4EEE8" w:val="clear"/>
+        <w:spacing w:after="200" w:before="120" w:line="276"/>
+        <w:ind w:left="200" w:right="120"/>
+      </w:pPr>
+      <w:r>
+        <w:rPr>
+          <w:rFonts w:ascii="Aptos" w:cs="Aptos" w:eastAsia="Aptos" w:hAnsi="Aptos"/>
+          <w:color w:val="27343A"/>
+        </w:rPr>
+        <w:t xml:space="preserve">Đừng dùng lô L260908-33110B: lô đó đã quá hạn, bị chọn trước khi sửa quy tắc FEFO.</w:t>
       </w:r>
     </w:p>
     <w:p>
@@ -6564,7 +6963,7 @@
           <w:sz w:val="28"/>
           <w:szCs w:val="28"/>
         </w:rPr>
-        <w:t xml:space="preserve">Bước 9 · Tổng hợp những đề xuất bổ sung bất thường</w:t>
+        <w:t xml:space="preserve">Bước 9 · Có gì bất thường trong 28 ngày qua không?</w:t>
       </w:r>
     </w:p>
     <w:p>
@@ -6736,7 +7135,7 @@
                 <w:sz w:val="20"/>
                 <w:szCs w:val="20"/>
               </w:rPr>
-              <w:t xml:space="preserve">Sau khoảng 15 giây: danh sách đề xuất của LS theo cửa hàng, dòng nào có dấu hiệu lạ nói vì sao (hết hàng quá nửa cửa sổ tính, không có bán bình quân, tồn bằng 0) và việc nên làm. Nhãn AI viết.</w:t>
+              <w:t xml:space="preserve">Khoảng 20 giây: AI ưu tiên ba tín hiệu ở S0001 (nhận hàng hạn quá ngắn, lặp 6 đến 7 lần) và nói vì sao; danh sách 16 tín hiệu thu gọn bên dưới.</w:t>
             </w:r>
           </w:p>
         </w:tc>
@@ -6784,7 +7183,7 @@
           <w:rFonts w:ascii="Aptos" w:cs="Aptos" w:eastAsia="Aptos" w:hAnsi="Aptos"/>
           <w:color w:val="27343A"/>
         </w:rPr>
-        <w:t xml:space="preserve">Đây là nhóm Khám phá và phân tích insight. Không ai viết sẵn câu trả lời: model gọi tool đọc toàn bộ đề xuất của LS, đọc các cờ do code tính, chọn dòng đáng xem và giải thích.</w:t>
+        <w:t xml:space="preserve">Năm tín hiệu code quét: bán sau hạn, nhận hàng hạn ngắn bất thường, huỷ tăng gấp đôi, tồn không bán, hết hàng lặp lại. Model chọn tối đa ba và giải thích; mã tín hiệu phải nằm trong danh sách.</w:t>
       </w:r>
     </w:p>
     <w:p>
@@ -6801,24 +7200,7 @@
           <w:rFonts w:ascii="Aptos" w:cs="Aptos" w:eastAsia="Aptos" w:hAnsi="Aptos"/>
           <w:color w:val="27343A"/>
         </w:rPr>
-        <w:t xml:space="preserve">Croissant chocolate lộ ra ở đây: LS đếm 42 trên 56 ngày là hết hàng, vì bánh tươi huỷ cuối ngày nên tồn về 0 mỗi tối. Đó là Out of Stock cần xem lại cách ghi.</w:t>
-      </w:r>
-    </w:p>
-    <w:p>
-      <w:pPr>
-        <w:pBdr>
-          <w:left w:val="single" w:color="C89B72" w:sz="36" w:space="10"/>
-        </w:pBdr>
-        <w:shd w:fill="F4EEE8" w:val="clear"/>
-        <w:spacing w:after="200" w:before="120" w:line="276"/>
-        <w:ind w:left="200" w:right="120"/>
-      </w:pPr>
-      <w:r>
-        <w:rPr>
-          <w:rFonts w:ascii="Aptos" w:cs="Aptos" w:eastAsia="Aptos" w:hAnsi="Aptos"/>
-          <w:color w:val="27343A"/>
-        </w:rPr>
-        <w:t xml:space="preserve">Câu trả lời đổi theo dữ liệu, không học thuộc. Nếu model chọn dòng khác với dự kiến thì đọc lý do nó nêu.</w:t>
+        <w:t xml:space="preserve">Lệch kiểm kê chưa đo được vì bộ dữ liệu không có phiếu kiểm kê. Nói thẳng chỗ này.</w:t>
       </w:r>
     </w:p>
     <w:p>
@@ -6841,7 +7223,7 @@
           <w:sz w:val="28"/>
           <w:szCs w:val="28"/>
         </w:rPr>
-        <w:t xml:space="preserve">Phần 4 · Dự báo, một nhịp</w:t>
+        <w:t xml:space="preserve">Phần 4 · Cửa hàng bán lẻ hết hàng: LS tính, AI đề xuất</w:t>
       </w:r>
     </w:p>
     <w:p>
@@ -6864,7 +7246,7 @@
           <w:sz w:val="28"/>
           <w:szCs w:val="28"/>
         </w:rPr>
-        <w:t xml:space="preserve">Bước 10 · Dự báo Choco bowl ở S0010 sai bao nhiêu?</w:t>
+        <w:t xml:space="preserve">Bước 10 · Sắp hết Ice cream ở cửa hàng tôi</w:t>
       </w:r>
     </w:p>
     <w:p>
@@ -6876,7 +7258,7 @@
           <w:rFonts w:ascii="Aptos" w:cs="Aptos" w:eastAsia="Aptos" w:hAnsi="Aptos"/>
           <w:color w:val="27343A"/>
         </w:rPr>
-        <w:t xml:space="preserve">Vai: trang.sc · Dakao</w:t>
+        <w:t xml:space="preserve">Vai: minh.s0002 · Dakao</w:t>
       </w:r>
     </w:p>
     <w:tbl>
@@ -7003,7 +7385,7 @@
                 <w:sz w:val="20"/>
                 <w:szCs w:val="20"/>
               </w:rPr>
-              <w:t xml:space="preserve">Nút 10. Nếu khách hỏi WAPE, Bias là gì: mở tab Dự báo, phần Cách đọc ngay dưới tiêu đề.</w:t>
+              <w:t xml:space="preserve">Nút 10. Console đổi sang Minh và gửi câu.</w:t>
             </w:r>
           </w:p>
         </w:tc>
@@ -7036,7 +7418,7 @@
                 <w:sz w:val="20"/>
                 <w:szCs w:val="20"/>
               </w:rPr>
-              <w:t xml:space="preserve">Thẻ Dự báo Choco bowl tại S0010: ba phương pháp, dự báo 7 ngày tới đã ghi vào Retail Forecast Entry của LS, sự kiện KM-CHOCOBOWL-09 cộng 150% từ 23 đến 25/09.</w:t>
+              <w:t xml:space="preserve">Khoảng 20 giây: Ice cream tại S0002 còn 8, đủ 5,5 ngày; theo LS Replenishment đề xuất đặt mua 12 từ MAROU giao thẳng tới S0002, đang xin điều phối duyệt.</w:t>
             </w:r>
           </w:p>
         </w:tc>
@@ -7084,7 +7466,7 @@
           <w:rFonts w:ascii="Aptos" w:cs="Aptos" w:eastAsia="Aptos" w:hAnsi="Aptos"/>
           <w:color w:val="27343A"/>
         </w:rPr>
-        <w:t xml:space="preserve">Dự báo không nằm ở bảng riêng của NaviWorld. Nó ghi vào bảng chuẩn của LS, nên LS Replenishment dùng được ngay.</w:t>
+        <w:t xml:space="preserve">Cửa hàng chỉ nói một câu tự nhiên. Trợ lý nhận ra mặt hàng và cửa hàng của người hỏi, đọc con số LS đã tính, ghi đề xuất vào Business Central và gửi người duyệt.</w:t>
       </w:r>
     </w:p>
     <w:p>
@@ -7101,7 +7483,41 @@
           <w:rFonts w:ascii="Aptos" w:cs="Aptos" w:eastAsia="Aptos" w:hAnsi="Aptos"/>
           <w:color w:val="27343A"/>
         </w:rPr>
-        <w:t xml:space="preserve">Holt-Winters là thống kê chuỗi thời gian, chưa phải AI. Nói thẳng. AI ở đây là phần kể lại kết quả.</w:t>
+        <w:t xml:space="preserve">Trợ lý không tự tính số. 12 là số của LS Replenishment, kiểu min-max: điểm đặt lại 8, mức tối đa 20.</w:t>
+      </w:r>
+    </w:p>
+    <w:p>
+      <w:pPr>
+        <w:pStyle w:val="ListParagraph"/>
+        <w:numPr>
+          <w:ilvl w:val="0"/>
+          <w:numId w:val="2"/>
+        </w:numPr>
+        <w:spacing w:after="80" w:line="276"/>
+      </w:pPr>
+      <w:r>
+        <w:rPr>
+          <w:rFonts w:ascii="Aptos" w:cs="Aptos" w:eastAsia="Aptos" w:hAnsi="Aptos"/>
+          <w:color w:val="27343A"/>
+        </w:rPr>
+        <w:t xml:space="preserve">Dakao là bán lẻ, không có kho trung tâm: đề xuất là đặt mua từ Marou, giao thẳng cửa hàng.</w:t>
+      </w:r>
+    </w:p>
+    <w:p>
+      <w:pPr>
+        <w:pBdr>
+          <w:left w:val="single" w:color="C89B72" w:sz="36" w:space="10"/>
+        </w:pBdr>
+        <w:shd w:fill="F4EEE8" w:val="clear"/>
+        <w:spacing w:after="200" w:before="120" w:line="276"/>
+        <w:ind w:left="200" w:right="120"/>
+      </w:pPr>
+      <w:r>
+        <w:rPr>
+          <w:rFonts w:ascii="Aptos" w:cs="Aptos" w:eastAsia="Aptos" w:hAnsi="Aptos"/>
+          <w:color w:val="27343A"/>
+        </w:rPr>
+        <w:t xml:space="preserve">Bước này ghi thật một đề xuất vào Business Central. Bấm lần hai thì trợ lý nói đã có đề xuất, không ghi thêm.</w:t>
       </w:r>
     </w:p>
     <w:p>
@@ -7124,7 +7540,7 @@
           <w:sz w:val="28"/>
           <w:szCs w:val="28"/>
         </w:rPr>
-        <w:t xml:space="preserve">Bước 11 · CTKM nào đang chạy và sắp tới?</w:t>
+        <w:t xml:space="preserve">Bước 11 · Vì sao LS đề xuất Ice cream cho S0002?</w:t>
       </w:r>
     </w:p>
     <w:p>
@@ -7296,7 +7712,7 @@
                 <w:sz w:val="20"/>
                 <w:szCs w:val="20"/>
               </w:rPr>
-              <w:t xml:space="preserve">AI viết vài câu: 3 đang chạy, 2 sắp tới, 2 CTKM thiếu nhu cầu trong LS; Choco bowl giảm 15% có Planned Event cho S0001, S0010 nhưng S0002, S0005 chưa có.</w:t>
+              <w:t xml:space="preserve">Khoảng 13 giây: AI viết vài câu: Stock Levels, đưa lên mức tối đa 20, tồn khả dụng 8 nên mua 12, quyết định Brought to Maximum Inventory; bảng nhật ký tính thu gọn bên dưới.</w:t>
             </w:r>
           </w:p>
         </w:tc>
@@ -7344,7 +7760,7 @@
           <w:rFonts w:ascii="Aptos" w:cs="Aptos" w:eastAsia="Aptos" w:hAnsi="Aptos"/>
           <w:color w:val="27343A"/>
         </w:rPr>
-        <w:t xml:space="preserve">Trợ lý đọc Periodic Discount của LS và soi xem LS đã cộng nhu cầu khuyến mãi cho cửa hàng nào. Thiếu thì nói rõ: cửa hàng đó sẽ thiếu hàng đúng ngày khuyến mãi.</w:t>
+        <w:t xml:space="preserve">Từng bước là nhật ký tính của LS Replenishment, trợ lý không tính lại. Ai cũng đối chiếu được bằng link.</w:t>
       </w:r>
     </w:p>
     <w:p>
@@ -7361,7 +7777,7 @@
           <w:rFonts w:ascii="Aptos" w:cs="Aptos" w:eastAsia="Aptos" w:hAnsi="Aptos"/>
           <w:color w:val="27343A"/>
         </w:rPr>
-        <w:t xml:space="preserve">Lỗ hổng này tôi cố ý để lại trong dữ liệu để thấy trợ lý bắt được.</w:t>
+        <w:t xml:space="preserve">Tham số nằm trên Item Card của LS, Marou tự sửa, không sửa code.</w:t>
       </w:r>
     </w:p>
     <w:p>
@@ -7384,30 +7800,7 @@
           <w:sz w:val="28"/>
           <w:szCs w:val="28"/>
         </w:rPr>
-        <w:t xml:space="preserve">Phần 5 · Hàng về cửa hàng: liên công ty khép vòng</w:t>
-      </w:r>
-    </w:p>
-    <w:p>
-      <w:pPr>
-        <w:pStyle w:val="Heading2"/>
-        <w:keepNext/>
-        <w:keepLines/>
-        <w:pBdr>
-          <w:left w:val="single" w:color="4BACC6" w:sz="24" w:space="10"/>
-        </w:pBdr>
-        <w:spacing w:after="120" w:before="280"/>
-        <w:ind w:left="170"/>
-      </w:pPr>
-      <w:r>
-        <w:rPr>
-          <w:rFonts w:ascii="Aptos" w:cs="Aptos" w:eastAsia="Aptos" w:hAnsi="Aptos"/>
-          <w:b/>
-          <w:bCs/>
-          <w:color w:val="27343A"/>
-          <w:sz w:val="28"/>
-          <w:szCs w:val="28"/>
-        </w:rPr>
-        <w:t xml:space="preserve">Bước 12 · Kiểm hàng Marou đã xuất kho</w:t>
+        <w:t xml:space="preserve">Bước 12 · Hùng duyệt đặt mua, gửi đơn sang Marou</w:t>
       </w:r>
     </w:p>
     <w:p>
@@ -7546,7 +7939,7 @@
                 <w:sz w:val="20"/>
                 <w:szCs w:val="20"/>
               </w:rPr>
-              <w:t xml:space="preserve">Nút 12. Console gọi vòng kiểm đơn liên công ty và báo đã gửi tin cho những ai.</w:t>
+              <w:t xml:space="preserve">Nút 12 đổi sang Hùng. Thẻ Đề xuất đặt mua Ice cream: bấm Duyệt đặt mua. Thẻ Đã tạo Purchase Order hiện nút Gửi đơn sang Marou, bấm tiếp.</w:t>
             </w:r>
           </w:p>
         </w:tc>
@@ -7579,7 +7972,7 @@
                 <w:sz w:val="20"/>
                 <w:szCs w:val="20"/>
               </w:rPr>
-              <w:t xml:space="preserve">Thẻ Marou đã xuất kho đơn HO106202 (82 Choco nuts, giao Cửa hàng Quận 1, phiếu 102045); dòng đơn HO106200 xuất từ 16/09 chưa post nhận kèm thẻ Cho trợ lý post nhận hàng; dòng đã gửi email.</w:t>
+              <w:t xml:space="preserve">Khoảng 6 giây: Purchase Order HO1062xx Open. Sau khi gửi (2 giây): đơn Released, bên Marou tự sinh Sales Order.</w:t>
             </w:r>
           </w:p>
         </w:tc>
@@ -7627,41 +8020,7 @@
           <w:rFonts w:ascii="Aptos" w:cs="Aptos" w:eastAsia="Aptos" w:hAnsi="Aptos"/>
           <w:color w:val="27343A"/>
         </w:rPr>
-        <w:t xml:space="preserve">Bên Marou không có gì tự động, người kho post xuất kho như mọi ngày. Bên Dakao, trợ lý đọc sang company bên kia bằng Intercompany và nối hai chứng từ.</w:t>
-      </w:r>
-    </w:p>
-    <w:p>
-      <w:pPr>
-        <w:pStyle w:val="ListParagraph"/>
-        <w:numPr>
-          <w:ilvl w:val="0"/>
-          <w:numId w:val="2"/>
-        </w:numPr>
-        <w:spacing w:after="80" w:line="276"/>
-      </w:pPr>
-      <w:r>
-        <w:rPr>
-          <w:rFonts w:ascii="Aptos" w:cs="Aptos" w:eastAsia="Aptos" w:hAnsi="Aptos"/>
-          <w:color w:val="27343A"/>
-        </w:rPr>
-        <w:t xml:space="preserve">Xuất kho trong ngày thì chỉ báo. Qua ngày hôm sau vẫn chưa post nhận thì nhắc lại và xin phép post thay. Không ai duyệt thì không có gì được post.</w:t>
-      </w:r>
-    </w:p>
-    <w:p>
-      <w:pPr>
-        <w:pStyle w:val="ListParagraph"/>
-        <w:numPr>
-          <w:ilvl w:val="0"/>
-          <w:numId w:val="2"/>
-        </w:numPr>
-        <w:spacing w:after="80" w:line="276"/>
-      </w:pPr>
-      <w:r>
-        <w:rPr>
-          <w:rFonts w:ascii="Aptos" w:cs="Aptos" w:eastAsia="Aptos" w:hAnsi="Aptos"/>
-          <w:color w:val="27343A"/>
-        </w:rPr>
-        <w:t xml:space="preserve">Đây là vấn đề số một trong khảo sát: hàng về mà chứng từ dồn tới cuối tháng, Marou đang thuê người ngoài để post.</w:t>
+        <w:t xml:space="preserve">Gửi đơn sang Marou là Intercompany chuẩn của Business Central: đơn mua bên Dakao thành đơn bán bên Marou, không nhập lại. Trợ lý không tự bấm nút này vì gửi kéo theo Release.</w:t>
       </w:r>
     </w:p>
     <w:p>
@@ -7684,7 +8043,7 @@
           <w:sz w:val="28"/>
           <w:szCs w:val="28"/>
         </w:rPr>
-        <w:t xml:space="preserve">Bước 13 · Lan (S0001) nhận tin chuẩn bị nhận hàng</w:t>
+        <w:t xml:space="preserve">Bước 13 · Tổng hợp những đề xuất bổ sung bất thường</w:t>
       </w:r>
     </w:p>
     <w:p>
@@ -7696,7 +8055,7 @@
           <w:rFonts w:ascii="Aptos" w:cs="Aptos" w:eastAsia="Aptos" w:hAnsi="Aptos"/>
           <w:color w:val="27343A"/>
         </w:rPr>
-        <w:t xml:space="preserve">Vai: lan.s0001 · Dakao</w:t>
+        <w:t xml:space="preserve">Vai: trang.sc · Dakao</w:t>
       </w:r>
     </w:p>
     <w:tbl>
@@ -7823,7 +8182,7 @@
                 <w:sz w:val="20"/>
                 <w:szCs w:val="20"/>
               </w:rPr>
-              <w:t xml:space="preserve">Nút 13 đổi sang Lan.</w:t>
+              <w:t xml:space="preserve">Nút 13.</w:t>
             </w:r>
           </w:p>
         </w:tc>
@@ -7856,7 +8215,7 @@
                 <w:sz w:val="20"/>
                 <w:szCs w:val="20"/>
               </w:rPr>
-              <w:t xml:space="preserve">Hộp thư Lan có thẻ Marou đã xuất kho đơn HO106202: Choco nuts 82, giao Cửa hàng Quận 1, link mở đơn mua. Email cùng nội dung đã tới hộp thư.</w:t>
+              <w:t xml:space="preserve">Khoảng 13 giây: danh sách đề xuất LS có dấu hiệu lạ, mỗi cửa hàng một dòng, nói vì sao (hết hàng quá nửa cửa sổ tính, không có bán bình quân, tồn bằng 0). Nhãn AI viết.</w:t>
             </w:r>
           </w:p>
         </w:tc>
@@ -7904,7 +8263,7 @@
           <w:rFonts w:ascii="Aptos" w:cs="Aptos" w:eastAsia="Aptos" w:hAnsi="Aptos"/>
           <w:color w:val="27343A"/>
         </w:rPr>
-        <w:t xml:space="preserve">Cửa hàng Quận 1 đang hết Choco nuts; giờ họ biết 82 cái đang tới, trước khi xe về.</w:t>
+        <w:t xml:space="preserve">Nhóm Khám phá và phân tích insight. Không ai viết sẵn câu trả lời: model gọi tool đọc toàn bộ đề xuất của LS, đọc các cờ do code tính, chọn dòng đáng xem và giải thích.</w:t>
       </w:r>
     </w:p>
     <w:p>
@@ -7921,7 +8280,24 @@
           <w:rFonts w:ascii="Aptos" w:cs="Aptos" w:eastAsia="Aptos" w:hAnsi="Aptos"/>
           <w:color w:val="27343A"/>
         </w:rPr>
-        <w:t xml:space="preserve">Thẻ không có số lô: bán lẻ không quản lý lô, trợ lý không đẩy số lô ra cho cửa hàng.</w:t>
+        <w:t xml:space="preserve">Croissant chocolate lộ ra ở đây: bánh tươi huỷ cuối ngày nên tồn về 0 mỗi tối, LS đếm là hết hàng. Đó là cách ghi Out of Stock cần xem lại.</w:t>
+      </w:r>
+    </w:p>
+    <w:p>
+      <w:pPr>
+        <w:pBdr>
+          <w:left w:val="single" w:color="C89B72" w:sz="36" w:space="10"/>
+        </w:pBdr>
+        <w:shd w:fill="F4EEE8" w:val="clear"/>
+        <w:spacing w:after="200" w:before="120" w:line="276"/>
+        <w:ind w:left="200" w:right="120"/>
+      </w:pPr>
+      <w:r>
+        <w:rPr>
+          <w:rFonts w:ascii="Aptos" w:cs="Aptos" w:eastAsia="Aptos" w:hAnsi="Aptos"/>
+          <w:color w:val="27343A"/>
+        </w:rPr>
+        <w:t xml:space="preserve">Câu trả lời đổi theo dữ liệu. Nếu model chọn dòng khác thì đọc lý do nó nêu.</w:t>
       </w:r>
     </w:p>
     <w:p>
@@ -7944,7 +8320,30 @@
           <w:sz w:val="28"/>
           <w:szCs w:val="28"/>
         </w:rPr>
-        <w:t xml:space="preserve">Bước 14 · Hùng duyệt cho trợ lý post nhận HO106200</w:t>
+        <w:t xml:space="preserve">Phần 5 · Dự báo, một nhịp</w:t>
+      </w:r>
+    </w:p>
+    <w:p>
+      <w:pPr>
+        <w:pStyle w:val="Heading2"/>
+        <w:keepNext/>
+        <w:keepLines/>
+        <w:pBdr>
+          <w:left w:val="single" w:color="4BACC6" w:sz="24" w:space="10"/>
+        </w:pBdr>
+        <w:spacing w:after="120" w:before="280"/>
+        <w:ind w:left="170"/>
+      </w:pPr>
+      <w:r>
+        <w:rPr>
+          <w:rFonts w:ascii="Aptos" w:cs="Aptos" w:eastAsia="Aptos" w:hAnsi="Aptos"/>
+          <w:b/>
+          <w:bCs/>
+          <w:color w:val="27343A"/>
+          <w:sz w:val="28"/>
+          <w:szCs w:val="28"/>
+        </w:rPr>
+        <w:t xml:space="preserve">Bước 14 · Dự báo Choco bowl ở S0010 sai bao nhiêu?</w:t>
       </w:r>
     </w:p>
     <w:p>
@@ -7956,7 +8355,7 @@
           <w:rFonts w:ascii="Aptos" w:cs="Aptos" w:eastAsia="Aptos" w:hAnsi="Aptos"/>
           <w:color w:val="27343A"/>
         </w:rPr>
-        <w:t xml:space="preserve">Vai: hung.dieuphoi · Dakao</w:t>
+        <w:t xml:space="preserve">Vai: trang.sc · Dakao</w:t>
       </w:r>
     </w:p>
     <w:tbl>
@@ -8083,7 +8482,7 @@
                 <w:sz w:val="20"/>
                 <w:szCs w:val="20"/>
               </w:rPr>
-              <w:t xml:space="preserve">Nút 14 đổi sang Hùng. Trên thẻ Cho trợ lý post nhận hàng đơn HO106200, bấm Duyệt cho post nhận hàng.</w:t>
+              <w:t xml:space="preserve">Nút 14. Nếu khách hỏi WAPE, Bias là gì: mở tab Dự báo, phần Cách đọc ngay dưới tiêu đề.</w:t>
             </w:r>
           </w:p>
         </w:tc>
@@ -8116,7 +8515,7 @@
                 <w:sz w:val="20"/>
                 <w:szCs w:val="20"/>
               </w:rPr>
-              <w:t xml:space="preserve">Thẻ Đã post phiếu nhận 1071xx kèm link mở phiếu nhận trong BC. Mở link: phiếu nhận đã post, đúng mặt hàng và số lượng của đơn mua.</w:t>
+              <w:t xml:space="preserve">Khoảng 10 giây: AI nói phương pháp sai ít nhất (trung bình cùng thứ 8 tuần, 26,2%), xu hướng dự báo thấp hơn thực tế, và việc nên làm; bảng ba phương pháp, dự báo 7 ngày tới và sự kiện khuyến mãi thu gọn bên dưới.</w:t>
             </w:r>
           </w:p>
         </w:tc>
@@ -8164,7 +8563,7 @@
           <w:rFonts w:ascii="Aptos" w:cs="Aptos" w:eastAsia="Aptos" w:hAnsi="Aptos"/>
           <w:color w:val="27343A"/>
         </w:rPr>
-        <w:t xml:space="preserve">Đây là loại đề xuất duy nhất mà việc duyệt làm Business Central post thật một chứng từ. Mọi loại khác dừng ở chứng từ nháp.</w:t>
+        <w:t xml:space="preserve">Dự báo không nằm ở bảng riêng của NaviWorld. Nó ghi vào Retail Forecast Entry của LS, nên LS Replenishment dùng được ngay.</w:t>
       </w:r>
     </w:p>
     <w:p>
@@ -8181,41 +8580,7 @@
           <w:rFonts w:ascii="Aptos" w:cs="Aptos" w:eastAsia="Aptos" w:hAnsi="Aptos"/>
           <w:color w:val="27343A"/>
         </w:rPr>
-        <w:t xml:space="preserve">Quyền post nằm trong permission set riêng, gán tay. Không gán thì bấm Duyệt báo thiếu quyền, không âm thầm bỏ qua.</w:t>
-      </w:r>
-    </w:p>
-    <w:p>
-      <w:pPr>
-        <w:pStyle w:val="ListParagraph"/>
-        <w:numPr>
-          <w:ilvl w:val="0"/>
-          <w:numId w:val="2"/>
-        </w:numPr>
-        <w:spacing w:after="80" w:line="276"/>
-      </w:pPr>
-      <w:r>
-        <w:rPr>
-          <w:rFonts w:ascii="Aptos" w:cs="Aptos" w:eastAsia="Aptos" w:hAnsi="Aptos"/>
-          <w:color w:val="27343A"/>
-        </w:rPr>
-        <w:t xml:space="preserve">Số lượng lấy từ đơn mua. Mặt hàng bên mua có bật quản lý lô thì số lô lấy từ sổ kho bên bán, không bịa; bán lẻ không bật thì phiếu post bình thường.</w:t>
-      </w:r>
-    </w:p>
-    <w:p>
-      <w:pPr>
-        <w:pBdr>
-          <w:left w:val="single" w:color="C89B72" w:sz="36" w:space="10"/>
-        </w:pBdr>
-        <w:shd w:fill="F4EEE8" w:val="clear"/>
-        <w:spacing w:after="200" w:before="120" w:line="276"/>
-        <w:ind w:left="200" w:right="120"/>
-      </w:pPr>
-      <w:r>
-        <w:rPr>
-          <w:rFonts w:ascii="Aptos" w:cs="Aptos" w:eastAsia="Aptos" w:hAnsi="Aptos"/>
-          <w:color w:val="27343A"/>
-        </w:rPr>
-        <w:t xml:space="preserve">HO106200 xuất kho ngày 16/09 nên tối 16/09 nó còn là “trong ngày” và chưa có thẻ đề xuất; sáng 17/09 mới có. Đừng thấy tối nay thiếu thẻ mà tưởng hỏng.</w:t>
+        <w:t xml:space="preserve">Holt-Winters là thống kê chuỗi thời gian, chưa phải AI. Nói thẳng. AI ở đây là phần kể lại kết quả.</w:t>
       </w:r>
     </w:p>
     <w:p>
@@ -8238,7 +8603,7 @@
           <w:sz w:val="28"/>
           <w:szCs w:val="28"/>
         </w:rPr>
-        <w:t xml:space="preserve">Bước 15 · Marou xuất kho đơn Ice cream vừa gửi</w:t>
+        <w:t xml:space="preserve">Bước 15 · CTKM nào đang chạy và sắp tới?</w:t>
       </w:r>
     </w:p>
     <w:p>
@@ -8250,7 +8615,7 @@
           <w:rFonts w:ascii="Aptos" w:cs="Aptos" w:eastAsia="Aptos" w:hAnsi="Aptos"/>
           <w:color w:val="27343A"/>
         </w:rPr>
-        <w:t xml:space="preserve">Vai: hung.dieuphoi · Dakao, rồi xem hộp thư Minh</w:t>
+        <w:t xml:space="preserve">Vai: trang.sc · Dakao</w:t>
       </w:r>
     </w:p>
     <w:tbl>
@@ -8377,7 +8742,7 @@
                 <w:sz w:val="20"/>
                 <w:szCs w:val="20"/>
               </w:rPr>
-              <w:t xml:space="preserve">Nút 15. Nút demo post xuất kho thay người kho Marou cho đơn Ice cream ở bước 8. Sau đó bấm vai Minh.</w:t>
+              <w:t xml:space="preserve">Nút 15.</w:t>
             </w:r>
           </w:p>
         </w:tc>
@@ -8410,7 +8775,7 @@
                 <w:sz w:val="20"/>
                 <w:szCs w:val="20"/>
               </w:rPr>
-              <w:t xml:space="preserve">Console báo đã gửi tin cho Minh, Hùng, Trang. Hộp thư Minh có thẻ chuẩn bị nhận 12 Ice cream.</w:t>
+              <w:t xml:space="preserve">AI viết vài câu: 3 đang chạy, 2 sắp tới, 2 CTKM thiếu nhu cầu trong LS; Choco bowl giảm 15% có Planned Event cho S0001, S0010 nhưng S0002, S0005 chưa có.</w:t>
             </w:r>
           </w:p>
         </w:tc>
@@ -8458,7 +8823,7 @@
           <w:rFonts w:ascii="Aptos" w:cs="Aptos" w:eastAsia="Aptos" w:hAnsi="Aptos"/>
           <w:color w:val="27343A"/>
         </w:rPr>
-        <w:t xml:space="preserve">Vòng khép lại: mười lăm phút trước Minh gõ một câu là sắp hết Ice cream; giờ hàng đã rời kho Marou và Minh được báo trước.</w:t>
+        <w:t xml:space="preserve">Trợ lý đọc Periodic Discount của LS và soi xem LS đã cộng nhu cầu khuyến mãi cho cửa hàng nào. Thiếu thì nói rõ: cửa hàng đó sẽ thiếu hàng đúng ngày khuyến mãi.</w:t>
       </w:r>
     </w:p>
     <w:p>
@@ -8475,24 +8840,7 @@
           <w:rFonts w:ascii="Aptos" w:cs="Aptos" w:eastAsia="Aptos" w:hAnsi="Aptos"/>
           <w:color w:val="27343A"/>
         </w:rPr>
-        <w:t xml:space="preserve">Nút này là công cụ demo, không thuộc sản phẩm. Trên hệ thật đó là người kho Marou bấm Post Shipment.</w:t>
-      </w:r>
-    </w:p>
-    <w:p>
-      <w:pPr>
-        <w:pBdr>
-          <w:left w:val="single" w:color="C89B72" w:sz="36" w:space="10"/>
-        </w:pBdr>
-        <w:shd w:fill="F4EEE8" w:val="clear"/>
-        <w:spacing w:after="200" w:before="120" w:line="276"/>
-        <w:ind w:left="200" w:right="120"/>
-      </w:pPr>
-      <w:r>
-        <w:rPr>
-          <w:rFonts w:ascii="Aptos" w:cs="Aptos" w:eastAsia="Aptos" w:hAnsi="Aptos"/>
-          <w:color w:val="27343A"/>
-        </w:rPr>
-        <w:t xml:space="preserve">Cần đơn Ice cream ở bước 8 đã gửi sang Marou; chưa gửi thì nút báo không còn đơn nào chờ xuất kho.</w:t>
+        <w:t xml:space="preserve">Lỗ hổng này tôi cố ý để lại trong dữ liệu để thấy trợ lý bắt được.</w:t>
       </w:r>
     </w:p>
     <w:p>
@@ -8515,7 +8863,7 @@
           <w:sz w:val="28"/>
           <w:szCs w:val="28"/>
         </w:rPr>
-        <w:t xml:space="preserve">Phần 6 · Truy xuất, bất thường, chi phí</w:t>
+        <w:t xml:space="preserve">Phần 6 · Hàng về cửa hàng: liên công ty khép vòng</w:t>
       </w:r>
     </w:p>
     <w:p>
@@ -8538,7 +8886,7 @@
           <w:sz w:val="28"/>
           <w:szCs w:val="28"/>
         </w:rPr>
-        <w:t xml:space="preserve">Bước 16 · Truy xuất lô L260906-33323C</w:t>
+        <w:t xml:space="preserve">Bước 16 · Kiểm hàng Marou đã xuất kho</w:t>
       </w:r>
     </w:p>
     <w:p>
@@ -8550,7 +8898,7 @@
           <w:rFonts w:ascii="Aptos" w:cs="Aptos" w:eastAsia="Aptos" w:hAnsi="Aptos"/>
           <w:color w:val="27343A"/>
         </w:rPr>
-        <w:t xml:space="preserve">Vai: trang.sc · Marou</w:t>
+        <w:t xml:space="preserve">Vai: hung.dieuphoi · Dakao</w:t>
       </w:r>
     </w:p>
     <w:tbl>
@@ -8677,7 +9025,7 @@
                 <w:sz w:val="20"/>
                 <w:szCs w:val="20"/>
               </w:rPr>
-              <w:t xml:space="preserve">Nút 16. Console đổi về Marou.</w:t>
+              <w:t xml:space="preserve">Nút 16. Console gọi vòng kiểm đơn liên công ty và báo đã gửi tin cho những ai.</w:t>
             </w:r>
           </w:p>
         </w:tc>
@@ -8710,7 +9058,7 @@
                 <w:sz w:val="20"/>
                 <w:szCs w:val="20"/>
               </w:rPr>
-              <w:t xml:space="preserve">AI kể lại hành trình lô Choco nuts: nhập kho W0003, xuất 81 cái theo đơn liên công ty HO106202 sang Cửa hàng Quận 1, còn tồn ở đâu; bảng Item Ledger Entry thu gọn bên dưới.</w:t>
+              <w:t xml:space="preserve">Khoảng 10 giây: thẻ Marou đã xuất kho đơn HO106202 (82 Choco nuts, giao Cửa hàng Quận 1); dòng đơn HO106200 xuất từ 16/09 chưa post nhận kèm thẻ Cho trợ lý post nhận hàng; dòng đã gửi email. Console: đã gửi tin cho Hùng, Lan, Trang, Tuấn.</w:t>
             </w:r>
           </w:p>
         </w:tc>
@@ -8758,7 +9106,7 @@
           <w:rFonts w:ascii="Aptos" w:cs="Aptos" w:eastAsia="Aptos" w:hAnsi="Aptos"/>
           <w:color w:val="27343A"/>
         </w:rPr>
-        <w:t xml:space="preserve">Đây là phần traceability của UC2: một lô có vấn đề thì biết ngay nó nằm ở những địa điểm nào và còn bao nhiêu, thu hồi lấy lại ở đâu.</w:t>
+        <w:t xml:space="preserve">Bên Marou không có gì tự động, người kho post xuất kho như mọi ngày. Bên Dakao, trợ lý đọc sang company bên kia và nối hai chứng từ: phiếu giao hàng bên Marou mang số đơn mua bên Dakao ở External Document No.</w:t>
       </w:r>
     </w:p>
     <w:p>
@@ -8775,24 +9123,24 @@
           <w:rFonts w:ascii="Aptos" w:cs="Aptos" w:eastAsia="Aptos" w:hAnsi="Aptos"/>
           <w:color w:val="27343A"/>
         </w:rPr>
-        <w:t xml:space="preserve">Lô này chính là lô vừa đi ở phần 5: Marou chọn lô còn hạn (22/04/2027) để xuất, bên bán quản lý lô còn bên bán lẻ chỉ thấy mặt hàng và số lượng.</w:t>
-      </w:r>
-    </w:p>
-    <w:p>
-      <w:pPr>
-        <w:pBdr>
-          <w:left w:val="single" w:color="C89B72" w:sz="36" w:space="10"/>
-        </w:pBdr>
-        <w:shd w:fill="F4EEE8" w:val="clear"/>
-        <w:spacing w:after="200" w:before="120" w:line="276"/>
-        <w:ind w:left="200" w:right="120"/>
-      </w:pPr>
-      <w:r>
-        <w:rPr>
-          <w:rFonts w:ascii="Aptos" w:cs="Aptos" w:eastAsia="Aptos" w:hAnsi="Aptos"/>
-          <w:color w:val="27343A"/>
-        </w:rPr>
-        <w:t xml:space="preserve">Lô L260908-33110B (đơn HO106201 hôm 16/09) cũng truy được nhưng là lô đã quá hạn, bị chọn trước khi sửa quy tắc FEFO; đừng dùng lô đó trên sân khấu.</w:t>
+        <w:t xml:space="preserve">Xuất kho trong ngày thì chỉ báo. Qua ngày hôm sau vẫn chưa post nhận thì nhắc lại và xin phép post thay. Không ai duyệt thì không có gì được post.</w:t>
+      </w:r>
+    </w:p>
+    <w:p>
+      <w:pPr>
+        <w:pStyle w:val="ListParagraph"/>
+        <w:numPr>
+          <w:ilvl w:val="0"/>
+          <w:numId w:val="2"/>
+        </w:numPr>
+        <w:spacing w:after="80" w:line="276"/>
+      </w:pPr>
+      <w:r>
+        <w:rPr>
+          <w:rFonts w:ascii="Aptos" w:cs="Aptos" w:eastAsia="Aptos" w:hAnsi="Aptos"/>
+          <w:color w:val="27343A"/>
+        </w:rPr>
+        <w:t xml:space="preserve">Đây là vấn đề số một trong khảo sát: hàng về mà chứng từ dồn tới cuối tháng, Marou đang thuê người ngoài để post.</w:t>
       </w:r>
     </w:p>
     <w:p>
@@ -8815,7 +9163,7 @@
           <w:sz w:val="28"/>
           <w:szCs w:val="28"/>
         </w:rPr>
-        <w:t xml:space="preserve">Bước 17 · Có gì bất thường trong 28 ngày qua không?</w:t>
+        <w:t xml:space="preserve">Bước 17 · Lan (S0001) nhận tin chuẩn bị nhận hàng</w:t>
       </w:r>
     </w:p>
     <w:p>
@@ -8827,7 +9175,7 @@
           <w:rFonts w:ascii="Aptos" w:cs="Aptos" w:eastAsia="Aptos" w:hAnsi="Aptos"/>
           <w:color w:val="27343A"/>
         </w:rPr>
-        <w:t xml:space="preserve">Vai: trang.sc · Dakao</w:t>
+        <w:t xml:space="preserve">Vai: lan.s0001 · Dakao</w:t>
       </w:r>
     </w:p>
     <w:tbl>
@@ -8954,7 +9302,7 @@
                 <w:sz w:val="20"/>
                 <w:szCs w:val="20"/>
               </w:rPr>
-              <w:t xml:space="preserve">Nút 17.</w:t>
+              <w:t xml:space="preserve">Nút 17 đổi sang Lan.</w:t>
             </w:r>
           </w:p>
         </w:tc>
@@ -8987,7 +9335,7 @@
                 <w:sz w:val="20"/>
                 <w:szCs w:val="20"/>
               </w:rPr>
-              <w:t xml:space="preserve">Câu trả lời do AI viết: ưu tiên ba tín hiệu ở S0001 (nhận hàng hạn quá ngắn); danh sách 16 tín hiệu thu gọn bên dưới.</w:t>
+              <w:t xml:space="preserve">Hộp thư Lan có thẻ Marou đã xuất kho đơn HO106202: Choco nuts 82, giao Cửa hàng Quận 1, link mở đơn mua. Email cùng nội dung đã tới hộp thư.</w:t>
             </w:r>
           </w:p>
         </w:tc>
@@ -9035,7 +9383,7 @@
           <w:rFonts w:ascii="Aptos" w:cs="Aptos" w:eastAsia="Aptos" w:hAnsi="Aptos"/>
           <w:color w:val="27343A"/>
         </w:rPr>
-        <w:t xml:space="preserve">Năm tín hiệu code quét: bán sau hạn, nhận hàng hạn ngắn bất thường, huỷ tăng gấp đôi, tồn không bán, hết hàng lặp lại. Model chọn tối đa ba và giải thích; mã tín hiệu phải nằm trong danh sách.</w:t>
+        <w:t xml:space="preserve">Cửa hàng Quận 1 đang hết Choco nuts; giờ họ biết 82 cái đang tới, trước khi xe về.</w:t>
       </w:r>
     </w:p>
     <w:p>
@@ -9052,7 +9400,7 @@
           <w:rFonts w:ascii="Aptos" w:cs="Aptos" w:eastAsia="Aptos" w:hAnsi="Aptos"/>
           <w:color w:val="27343A"/>
         </w:rPr>
-        <w:t xml:space="preserve">Lệch kiểm kê chưa đo được vì bộ dữ liệu không có phiếu kiểm kê. Nói thẳng chỗ này.</w:t>
+        <w:t xml:space="preserve">Thẻ không có số lô: bán lẻ không quản lý lô, trợ lý không đẩy số lô ra cho cửa hàng.</w:t>
       </w:r>
     </w:p>
     <w:p>
@@ -9075,7 +9423,7 @@
           <w:sz w:val="28"/>
           <w:szCs w:val="28"/>
         </w:rPr>
-        <w:t xml:space="preserve">Bước 18 · Chi phí AI đo được</w:t>
+        <w:t xml:space="preserve">Bước 18 · Hùng duyệt cho trợ lý post nhận HO106200</w:t>
       </w:r>
     </w:p>
     <w:p>
@@ -9087,7 +9435,7 @@
           <w:rFonts w:ascii="Aptos" w:cs="Aptos" w:eastAsia="Aptos" w:hAnsi="Aptos"/>
           <w:color w:val="27343A"/>
         </w:rPr>
-        <w:t xml:space="preserve">Vai: dung.admin · Marou</w:t>
+        <w:t xml:space="preserve">Vai: hung.dieuphoi · Dakao</w:t>
       </w:r>
     </w:p>
     <w:tbl>
@@ -9214,7 +9562,7 @@
                 <w:sz w:val="20"/>
                 <w:szCs w:val="20"/>
               </w:rPr>
-              <w:t xml:space="preserve">Nút 18. Console mở tab Cài đặt AI.</w:t>
+              <w:t xml:space="preserve">Nút 18 đổi sang Hùng. Trên thẻ Cho trợ lý post nhận hàng đơn HO106200, bấm Duyệt cho post nhận hàng.</w:t>
             </w:r>
           </w:p>
         </w:tc>
@@ -9247,7 +9595,601 @@
                 <w:sz w:val="20"/>
                 <w:szCs w:val="20"/>
               </w:rPr>
-              <w:t xml:space="preserve">Token vào, token ra, ước tính tiền theo ngày và theo việc; công tắc bật tắt AI; trần chi phí sửa được tại chỗ.</w:t>
+              <w:t xml:space="preserve">Thẻ Đã post phiếu nhận 1071xx kèm link mở phiếu nhận trong BC. Mở link: phiếu nhận đã post, đúng mặt hàng và số lượng của đơn mua.</w:t>
+            </w:r>
+          </w:p>
+        </w:tc>
+      </w:tr>
+    </w:tbl>
+    <w:p>
+      <w:pPr>
+        <w:spacing w:after="120"/>
+      </w:pPr>
+    </w:p>
+    <w:p>
+      <w:pPr>
+        <w:pStyle w:val="Heading3"/>
+        <w:keepNext/>
+        <w:keepLines/>
+        <w:pBdr>
+          <w:left w:val="single" w:color="4BACC6" w:sz="24" w:space="10"/>
+        </w:pBdr>
+        <w:spacing w:after="100" w:before="200"/>
+        <w:ind w:left="170"/>
+      </w:pPr>
+      <w:r>
+        <w:rPr>
+          <w:rFonts w:ascii="Aptos" w:cs="Aptos" w:eastAsia="Aptos" w:hAnsi="Aptos"/>
+          <w:b/>
+          <w:bCs/>
+          <w:color w:val="27343A"/>
+          <w:sz w:val="24"/>
+          <w:szCs w:val="24"/>
+        </w:rPr>
+        <w:t xml:space="preserve">Nói gì</w:t>
+      </w:r>
+    </w:p>
+    <w:p>
+      <w:pPr>
+        <w:pStyle w:val="ListParagraph"/>
+        <w:numPr>
+          <w:ilvl w:val="0"/>
+          <w:numId w:val="2"/>
+        </w:numPr>
+        <w:spacing w:after="80" w:line="276"/>
+      </w:pPr>
+      <w:r>
+        <w:rPr>
+          <w:rFonts w:ascii="Aptos" w:cs="Aptos" w:eastAsia="Aptos" w:hAnsi="Aptos"/>
+          <w:color w:val="27343A"/>
+        </w:rPr>
+        <w:t xml:space="preserve">Đây là loại đề xuất duy nhất mà việc duyệt làm Business Central post thật một chứng từ. Mọi loại khác dừng ở chứng từ nháp.</w:t>
+      </w:r>
+    </w:p>
+    <w:p>
+      <w:pPr>
+        <w:pStyle w:val="ListParagraph"/>
+        <w:numPr>
+          <w:ilvl w:val="0"/>
+          <w:numId w:val="2"/>
+        </w:numPr>
+        <w:spacing w:after="80" w:line="276"/>
+      </w:pPr>
+      <w:r>
+        <w:rPr>
+          <w:rFonts w:ascii="Aptos" w:cs="Aptos" w:eastAsia="Aptos" w:hAnsi="Aptos"/>
+          <w:color w:val="27343A"/>
+        </w:rPr>
+        <w:t xml:space="preserve">Quyền post nằm trong permission set riêng, gán tay. Không gán thì bấm Duyệt báo thiếu quyền, không âm thầm bỏ qua.</w:t>
+      </w:r>
+    </w:p>
+    <w:p>
+      <w:pPr>
+        <w:pStyle w:val="ListParagraph"/>
+        <w:numPr>
+          <w:ilvl w:val="0"/>
+          <w:numId w:val="2"/>
+        </w:numPr>
+        <w:spacing w:after="80" w:line="276"/>
+      </w:pPr>
+      <w:r>
+        <w:rPr>
+          <w:rFonts w:ascii="Aptos" w:cs="Aptos" w:eastAsia="Aptos" w:hAnsi="Aptos"/>
+          <w:color w:val="27343A"/>
+        </w:rPr>
+        <w:t xml:space="preserve">Số lượng lấy từ đơn mua; số lô, nếu bên mua còn bật quản lý lô, lấy từ sổ kho bên bán, không bịa.</w:t>
+      </w:r>
+    </w:p>
+    <w:p>
+      <w:pPr>
+        <w:pStyle w:val="Heading2"/>
+        <w:keepNext/>
+        <w:keepLines/>
+        <w:pBdr>
+          <w:left w:val="single" w:color="4BACC6" w:sz="24" w:space="10"/>
+        </w:pBdr>
+        <w:spacing w:after="120" w:before="280"/>
+        <w:ind w:left="170"/>
+      </w:pPr>
+      <w:r>
+        <w:rPr>
+          <w:rFonts w:ascii="Aptos" w:cs="Aptos" w:eastAsia="Aptos" w:hAnsi="Aptos"/>
+          <w:b/>
+          <w:bCs/>
+          <w:color w:val="27343A"/>
+          <w:sz w:val="28"/>
+          <w:szCs w:val="28"/>
+        </w:rPr>
+        <w:t xml:space="preserve">Bước 19 · Marou xuất kho đơn Ice cream vừa gửi</w:t>
+      </w:r>
+    </w:p>
+    <w:p>
+      <w:pPr>
+        <w:spacing w:after="120" w:line="276"/>
+      </w:pPr>
+      <w:r>
+        <w:rPr>
+          <w:rFonts w:ascii="Aptos" w:cs="Aptos" w:eastAsia="Aptos" w:hAnsi="Aptos"/>
+          <w:color w:val="27343A"/>
+        </w:rPr>
+        <w:t xml:space="preserve">Vai: hung.dieuphoi · Dakao, rồi xem hộp thư Minh</w:t>
+      </w:r>
+    </w:p>
+    <w:tbl>
+      <w:tblPr>
+        <w:tblW w:type="dxa" w:w="9638"/>
+        <w:tblBorders>
+          <w:top w:val="single" w:color="auto" w:sz="4"/>
+          <w:left w:val="single" w:color="auto" w:sz="4"/>
+          <w:bottom w:val="single" w:color="auto" w:sz="4"/>
+          <w:right w:val="single" w:color="auto" w:sz="4"/>
+          <w:insideH w:val="single" w:color="auto" w:sz="4"/>
+          <w:insideV w:val="single" w:color="auto" w:sz="4"/>
+        </w:tblBorders>
+      </w:tblPr>
+      <w:tblGrid>
+        <w:gridCol w:w="4337"/>
+        <w:gridCol w:w="5301"/>
+      </w:tblGrid>
+      <w:tr>
+        <w:trPr>
+          <w:cantSplit w:val="false"/>
+          <w:tblHeader/>
+        </w:trPr>
+        <w:tc>
+          <w:tcPr>
+            <w:tcW w:type="dxa" w:w="4337"/>
+            <w:tcBorders>
+              <w:top w:val="single" w:color="A9D5E2" w:sz="4"/>
+              <w:left w:val="single" w:color="A9D5E2" w:sz="4"/>
+              <w:bottom w:val="single" w:color="A9D5E2" w:sz="4"/>
+              <w:right w:val="single" w:color="A9D5E2" w:sz="4"/>
+            </w:tcBorders>
+            <w:shd w:fill="4BACC6" w:val="clear"/>
+            <w:tcMar>
+              <w:top w:type="dxa" w:w="113"/>
+              <w:left w:type="dxa" w:w="113"/>
+              <w:bottom w:type="dxa" w:w="113"/>
+              <w:right w:type="dxa" w:w="113"/>
+            </w:tcMar>
+          </w:tcPr>
+          <w:p>
+            <w:pPr>
+              <w:spacing w:after="0" w:line="252"/>
+            </w:pPr>
+            <w:r>
+              <w:rPr>
+                <w:rFonts w:ascii="Aptos" w:cs="Aptos" w:eastAsia="Aptos" w:hAnsi="Aptos"/>
+                <w:b/>
+                <w:bCs/>
+                <w:color w:val="27343A"/>
+                <w:sz w:val="20"/>
+                <w:szCs w:val="20"/>
+              </w:rPr>
+              <w:t xml:space="preserve">Bấm gì</w:t>
+            </w:r>
+          </w:p>
+        </w:tc>
+        <w:tc>
+          <w:tcPr>
+            <w:tcW w:type="dxa" w:w="5301"/>
+            <w:tcBorders>
+              <w:top w:val="single" w:color="A9D5E2" w:sz="4"/>
+              <w:left w:val="single" w:color="A9D5E2" w:sz="4"/>
+              <w:bottom w:val="single" w:color="A9D5E2" w:sz="4"/>
+              <w:right w:val="single" w:color="A9D5E2" w:sz="4"/>
+            </w:tcBorders>
+            <w:shd w:fill="4BACC6" w:val="clear"/>
+            <w:tcMar>
+              <w:top w:type="dxa" w:w="113"/>
+              <w:left w:type="dxa" w:w="113"/>
+              <w:bottom w:type="dxa" w:w="113"/>
+              <w:right w:type="dxa" w:w="113"/>
+            </w:tcMar>
+          </w:tcPr>
+          <w:p>
+            <w:pPr>
+              <w:spacing w:after="0" w:line="252"/>
+            </w:pPr>
+            <w:r>
+              <w:rPr>
+                <w:rFonts w:ascii="Aptos" w:cs="Aptos" w:eastAsia="Aptos" w:hAnsi="Aptos"/>
+                <w:b/>
+                <w:bCs/>
+                <w:color w:val="27343A"/>
+                <w:sz w:val="20"/>
+                <w:szCs w:val="20"/>
+              </w:rPr>
+              <w:t xml:space="preserve">Khách thấy gì</w:t>
+            </w:r>
+          </w:p>
+        </w:tc>
+      </w:tr>
+      <w:tr>
+        <w:trPr>
+          <w:cantSplit/>
+          <w:tblHeader w:val="false"/>
+        </w:trPr>
+        <w:tc>
+          <w:tcPr>
+            <w:tcW w:type="dxa" w:w="4337"/>
+            <w:tcBorders>
+              <w:top w:val="single" w:color="A9D5E2" w:sz="4"/>
+              <w:left w:val="single" w:color="A9D5E2" w:sz="4"/>
+              <w:bottom w:val="single" w:color="A9D5E2" w:sz="4"/>
+              <w:right w:val="single" w:color="A9D5E2" w:sz="4"/>
+            </w:tcBorders>
+            <w:tcMar>
+              <w:top w:type="dxa" w:w="113"/>
+              <w:left w:type="dxa" w:w="113"/>
+              <w:bottom w:type="dxa" w:w="113"/>
+              <w:right w:type="dxa" w:w="113"/>
+            </w:tcMar>
+          </w:tcPr>
+          <w:p>
+            <w:pPr>
+              <w:spacing w:after="0" w:line="252"/>
+            </w:pPr>
+            <w:r>
+              <w:rPr>
+                <w:rFonts w:ascii="Aptos" w:cs="Aptos" w:eastAsia="Aptos" w:hAnsi="Aptos"/>
+                <w:b w:val="false"/>
+                <w:bCs w:val="false"/>
+                <w:color w:val="27343A"/>
+                <w:sz w:val="20"/>
+                <w:szCs w:val="20"/>
+              </w:rPr>
+              <w:t xml:space="preserve">Hai cách. Cách an toàn: nút 19, nút demo post xuất kho thay người kho Marou cho đơn Ice cream ở bước 12. Cách thật: mở Business Central company NWV-MAROU, Sales Order S90016 (đơn HO106203, 5 Choco bowl, lô đã gán sẵn), bấm Post, chọn Ship; rồi đợi tối đa một phút, không bấm gì trên trợ lý.</w:t>
+            </w:r>
+          </w:p>
+        </w:tc>
+        <w:tc>
+          <w:tcPr>
+            <w:tcW w:type="dxa" w:w="5301"/>
+            <w:tcBorders>
+              <w:top w:val="single" w:color="A9D5E2" w:sz="4"/>
+              <w:left w:val="single" w:color="A9D5E2" w:sz="4"/>
+              <w:bottom w:val="single" w:color="A9D5E2" w:sz="4"/>
+              <w:right w:val="single" w:color="A9D5E2" w:sz="4"/>
+            </w:tcBorders>
+            <w:tcMar>
+              <w:top w:type="dxa" w:w="113"/>
+              <w:left w:type="dxa" w:w="113"/>
+              <w:bottom w:type="dxa" w:w="113"/>
+              <w:right w:type="dxa" w:w="113"/>
+            </w:tcMar>
+          </w:tcPr>
+          <w:p>
+            <w:pPr>
+              <w:spacing w:after="0" w:line="252"/>
+            </w:pPr>
+            <w:r>
+              <w:rPr>
+                <w:rFonts w:ascii="Aptos" w:cs="Aptos" w:eastAsia="Aptos" w:hAnsi="Aptos"/>
+                <w:b w:val="false"/>
+                <w:bCs w:val="false"/>
+                <w:color w:val="27343A"/>
+                <w:sz w:val="20"/>
+                <w:szCs w:val="20"/>
+              </w:rPr>
+              <w:t xml:space="preserve">Nút 19: khoảng 12 giây, console báo đã gửi tin cho Hùng, Minh, Trang; hộp thư Minh có thẻ chuẩn bị nhận 12 Ice cream. Cách thật: trong vòng một phút hộp thư Hà (S0010), Hùng, Trang tự có thẻ Marou đã xuất kho đơn HO106203 và email tới.</w:t>
+            </w:r>
+          </w:p>
+        </w:tc>
+      </w:tr>
+    </w:tbl>
+    <w:p>
+      <w:pPr>
+        <w:spacing w:after="120"/>
+      </w:pPr>
+    </w:p>
+    <w:p>
+      <w:pPr>
+        <w:pStyle w:val="Heading3"/>
+        <w:keepNext/>
+        <w:keepLines/>
+        <w:pBdr>
+          <w:left w:val="single" w:color="4BACC6" w:sz="24" w:space="10"/>
+        </w:pBdr>
+        <w:spacing w:after="100" w:before="200"/>
+        <w:ind w:left="170"/>
+      </w:pPr>
+      <w:r>
+        <w:rPr>
+          <w:rFonts w:ascii="Aptos" w:cs="Aptos" w:eastAsia="Aptos" w:hAnsi="Aptos"/>
+          <w:b/>
+          <w:bCs/>
+          <w:color w:val="27343A"/>
+          <w:sz w:val="24"/>
+          <w:szCs w:val="24"/>
+        </w:rPr>
+        <w:t xml:space="preserve">Nói gì</w:t>
+      </w:r>
+    </w:p>
+    <w:p>
+      <w:pPr>
+        <w:pStyle w:val="ListParagraph"/>
+        <w:numPr>
+          <w:ilvl w:val="0"/>
+          <w:numId w:val="2"/>
+        </w:numPr>
+        <w:spacing w:after="80" w:line="276"/>
+      </w:pPr>
+      <w:r>
+        <w:rPr>
+          <w:rFonts w:ascii="Aptos" w:cs="Aptos" w:eastAsia="Aptos" w:hAnsi="Aptos"/>
+          <w:color w:val="27343A"/>
+        </w:rPr>
+        <w:t xml:space="preserve">Vòng khép lại: Minh gõ một câu là sắp hết Ice cream; giờ hàng đã rời kho Marou và Minh được báo trước.</w:t>
+      </w:r>
+    </w:p>
+    <w:p>
+      <w:pPr>
+        <w:pStyle w:val="ListParagraph"/>
+        <w:numPr>
+          <w:ilvl w:val="0"/>
+          <w:numId w:val="2"/>
+        </w:numPr>
+        <w:spacing w:after="80" w:line="276"/>
+      </w:pPr>
+      <w:r>
+        <w:rPr>
+          <w:rFonts w:ascii="Aptos" w:cs="Aptos" w:eastAsia="Aptos" w:hAnsi="Aptos"/>
+          <w:color w:val="27343A"/>
+        </w:rPr>
+        <w:t xml:space="preserve">Cơ sở để trợ lý biết: mỗi phút nó đọc phiếu giao hàng bên Marou qua web service của app NaviWorld, phiếu nào mang số đơn mua của Dakao mà chưa từng báo thì báo cửa hàng nhận hàng và Supply Chain, gửi email. Chỉ đọc, không ghi gì.</w:t>
+      </w:r>
+    </w:p>
+    <w:p>
+      <w:pPr>
+        <w:pStyle w:val="ListParagraph"/>
+        <w:numPr>
+          <w:ilvl w:val="0"/>
+          <w:numId w:val="2"/>
+        </w:numPr>
+        <w:spacing w:after="80" w:line="276"/>
+      </w:pPr>
+      <w:r>
+        <w:rPr>
+          <w:rFonts w:ascii="Aptos" w:cs="Aptos" w:eastAsia="Aptos" w:hAnsi="Aptos"/>
+          <w:color w:val="27343A"/>
+        </w:rPr>
+        <w:t xml:space="preserve">Nút 19 là công cụ demo, không thuộc sản phẩm. Trên hệ thật đó là người kho Marou bấm Post Shipment, như cách thật ở trên.</w:t>
+      </w:r>
+    </w:p>
+    <w:p>
+      <w:pPr>
+        <w:pBdr>
+          <w:left w:val="single" w:color="C89B72" w:sz="36" w:space="10"/>
+        </w:pBdr>
+        <w:shd w:fill="F4EEE8" w:val="clear"/>
+        <w:spacing w:after="200" w:before="120" w:line="276"/>
+        <w:ind w:left="200" w:right="120"/>
+      </w:pPr>
+      <w:r>
+        <w:rPr>
+          <w:rFonts w:ascii="Aptos" w:cs="Aptos" w:eastAsia="Aptos" w:hAnsi="Aptos"/>
+          <w:color w:val="27343A"/>
+        </w:rPr>
+        <w:t xml:space="preserve">Cần đơn Ice cream ở bước 12 đã gửi sang Marou; chưa gửi thì nút xuất đơn mới nhất còn chờ (HO106203) hoặc báo không còn đơn nào. Đơn nào đã xuất trước lúc máy chủ khởi động thì lịch nền không tự báo, nút 16 vẫn báo được.</w:t>
+      </w:r>
+    </w:p>
+    <w:p>
+      <w:pPr>
+        <w:pStyle w:val="Heading2"/>
+        <w:keepNext/>
+        <w:keepLines/>
+        <w:pBdr>
+          <w:left w:val="single" w:color="4BACC6" w:sz="24" w:space="10"/>
+        </w:pBdr>
+        <w:spacing w:after="120" w:before="280"/>
+        <w:ind w:left="170"/>
+      </w:pPr>
+      <w:r>
+        <w:rPr>
+          <w:rFonts w:ascii="Aptos" w:cs="Aptos" w:eastAsia="Aptos" w:hAnsi="Aptos"/>
+          <w:b/>
+          <w:bCs/>
+          <w:color w:val="27343A"/>
+          <w:sz w:val="28"/>
+          <w:szCs w:val="28"/>
+        </w:rPr>
+        <w:t xml:space="preserve">Phần 7 · Vận hành</w:t>
+      </w:r>
+    </w:p>
+    <w:p>
+      <w:pPr>
+        <w:pStyle w:val="Heading2"/>
+        <w:keepNext/>
+        <w:keepLines/>
+        <w:pBdr>
+          <w:left w:val="single" w:color="4BACC6" w:sz="24" w:space="10"/>
+        </w:pBdr>
+        <w:spacing w:after="120" w:before="280"/>
+        <w:ind w:left="170"/>
+      </w:pPr>
+      <w:r>
+        <w:rPr>
+          <w:rFonts w:ascii="Aptos" w:cs="Aptos" w:eastAsia="Aptos" w:hAnsi="Aptos"/>
+          <w:b/>
+          <w:bCs/>
+          <w:color w:val="27343A"/>
+          <w:sz w:val="28"/>
+          <w:szCs w:val="28"/>
+        </w:rPr>
+        <w:t xml:space="preserve">Bước 20 · Chi phí AI đo được</w:t>
+      </w:r>
+    </w:p>
+    <w:p>
+      <w:pPr>
+        <w:spacing w:after="120" w:line="276"/>
+      </w:pPr>
+      <w:r>
+        <w:rPr>
+          <w:rFonts w:ascii="Aptos" w:cs="Aptos" w:eastAsia="Aptos" w:hAnsi="Aptos"/>
+          <w:color w:val="27343A"/>
+        </w:rPr>
+        <w:t xml:space="preserve">Vai: dung.admin · Marou</w:t>
+      </w:r>
+    </w:p>
+    <w:tbl>
+      <w:tblPr>
+        <w:tblW w:type="dxa" w:w="9638"/>
+        <w:tblBorders>
+          <w:top w:val="single" w:color="auto" w:sz="4"/>
+          <w:left w:val="single" w:color="auto" w:sz="4"/>
+          <w:bottom w:val="single" w:color="auto" w:sz="4"/>
+          <w:right w:val="single" w:color="auto" w:sz="4"/>
+          <w:insideH w:val="single" w:color="auto" w:sz="4"/>
+          <w:insideV w:val="single" w:color="auto" w:sz="4"/>
+        </w:tblBorders>
+      </w:tblPr>
+      <w:tblGrid>
+        <w:gridCol w:w="4337"/>
+        <w:gridCol w:w="5301"/>
+      </w:tblGrid>
+      <w:tr>
+        <w:trPr>
+          <w:cantSplit w:val="false"/>
+          <w:tblHeader/>
+        </w:trPr>
+        <w:tc>
+          <w:tcPr>
+            <w:tcW w:type="dxa" w:w="4337"/>
+            <w:tcBorders>
+              <w:top w:val="single" w:color="A9D5E2" w:sz="4"/>
+              <w:left w:val="single" w:color="A9D5E2" w:sz="4"/>
+              <w:bottom w:val="single" w:color="A9D5E2" w:sz="4"/>
+              <w:right w:val="single" w:color="A9D5E2" w:sz="4"/>
+            </w:tcBorders>
+            <w:shd w:fill="4BACC6" w:val="clear"/>
+            <w:tcMar>
+              <w:top w:type="dxa" w:w="113"/>
+              <w:left w:type="dxa" w:w="113"/>
+              <w:bottom w:type="dxa" w:w="113"/>
+              <w:right w:type="dxa" w:w="113"/>
+            </w:tcMar>
+          </w:tcPr>
+          <w:p>
+            <w:pPr>
+              <w:spacing w:after="0" w:line="252"/>
+            </w:pPr>
+            <w:r>
+              <w:rPr>
+                <w:rFonts w:ascii="Aptos" w:cs="Aptos" w:eastAsia="Aptos" w:hAnsi="Aptos"/>
+                <w:b/>
+                <w:bCs/>
+                <w:color w:val="27343A"/>
+                <w:sz w:val="20"/>
+                <w:szCs w:val="20"/>
+              </w:rPr>
+              <w:t xml:space="preserve">Bấm gì</w:t>
+            </w:r>
+          </w:p>
+        </w:tc>
+        <w:tc>
+          <w:tcPr>
+            <w:tcW w:type="dxa" w:w="5301"/>
+            <w:tcBorders>
+              <w:top w:val="single" w:color="A9D5E2" w:sz="4"/>
+              <w:left w:val="single" w:color="A9D5E2" w:sz="4"/>
+              <w:bottom w:val="single" w:color="A9D5E2" w:sz="4"/>
+              <w:right w:val="single" w:color="A9D5E2" w:sz="4"/>
+            </w:tcBorders>
+            <w:shd w:fill="4BACC6" w:val="clear"/>
+            <w:tcMar>
+              <w:top w:type="dxa" w:w="113"/>
+              <w:left w:type="dxa" w:w="113"/>
+              <w:bottom w:type="dxa" w:w="113"/>
+              <w:right w:type="dxa" w:w="113"/>
+            </w:tcMar>
+          </w:tcPr>
+          <w:p>
+            <w:pPr>
+              <w:spacing w:after="0" w:line="252"/>
+            </w:pPr>
+            <w:r>
+              <w:rPr>
+                <w:rFonts w:ascii="Aptos" w:cs="Aptos" w:eastAsia="Aptos" w:hAnsi="Aptos"/>
+                <w:b/>
+                <w:bCs/>
+                <w:color w:val="27343A"/>
+                <w:sz w:val="20"/>
+                <w:szCs w:val="20"/>
+              </w:rPr>
+              <w:t xml:space="preserve">Khách thấy gì</w:t>
+            </w:r>
+          </w:p>
+        </w:tc>
+      </w:tr>
+      <w:tr>
+        <w:trPr>
+          <w:cantSplit/>
+          <w:tblHeader w:val="false"/>
+        </w:trPr>
+        <w:tc>
+          <w:tcPr>
+            <w:tcW w:type="dxa" w:w="4337"/>
+            <w:tcBorders>
+              <w:top w:val="single" w:color="A9D5E2" w:sz="4"/>
+              <w:left w:val="single" w:color="A9D5E2" w:sz="4"/>
+              <w:bottom w:val="single" w:color="A9D5E2" w:sz="4"/>
+              <w:right w:val="single" w:color="A9D5E2" w:sz="4"/>
+            </w:tcBorders>
+            <w:tcMar>
+              <w:top w:type="dxa" w:w="113"/>
+              <w:left w:type="dxa" w:w="113"/>
+              <w:bottom w:type="dxa" w:w="113"/>
+              <w:right w:type="dxa" w:w="113"/>
+            </w:tcMar>
+          </w:tcPr>
+          <w:p>
+            <w:pPr>
+              <w:spacing w:after="0" w:line="252"/>
+            </w:pPr>
+            <w:r>
+              <w:rPr>
+                <w:rFonts w:ascii="Aptos" w:cs="Aptos" w:eastAsia="Aptos" w:hAnsi="Aptos"/>
+                <w:b w:val="false"/>
+                <w:bCs w:val="false"/>
+                <w:color w:val="27343A"/>
+                <w:sz w:val="20"/>
+                <w:szCs w:val="20"/>
+              </w:rPr>
+              <w:t xml:space="preserve">Nút 20. Console mở tab Cài đặt AI.</w:t>
+            </w:r>
+          </w:p>
+        </w:tc>
+        <w:tc>
+          <w:tcPr>
+            <w:tcW w:type="dxa" w:w="5301"/>
+            <w:tcBorders>
+              <w:top w:val="single" w:color="A9D5E2" w:sz="4"/>
+              <w:left w:val="single" w:color="A9D5E2" w:sz="4"/>
+              <w:bottom w:val="single" w:color="A9D5E2" w:sz="4"/>
+              <w:right w:val="single" w:color="A9D5E2" w:sz="4"/>
+            </w:tcBorders>
+            <w:tcMar>
+              <w:top w:type="dxa" w:w="113"/>
+              <w:left w:type="dxa" w:w="113"/>
+              <w:bottom w:type="dxa" w:w="113"/>
+              <w:right w:type="dxa" w:w="113"/>
+            </w:tcMar>
+          </w:tcPr>
+          <w:p>
+            <w:pPr>
+              <w:spacing w:after="0" w:line="252"/>
+            </w:pPr>
+            <w:r>
+              <w:rPr>
+                <w:rFonts w:ascii="Aptos" w:cs="Aptos" w:eastAsia="Aptos" w:hAnsi="Aptos"/>
+                <w:b w:val="false"/>
+                <w:bCs w:val="false"/>
+                <w:color w:val="27343A"/>
+                <w:sz w:val="20"/>
+                <w:szCs w:val="20"/>
+              </w:rPr>
+              <w:t xml:space="preserve">Token vào, token ra, ước tính tiền theo ngày và theo việc; công tắc bật tắt AI; trần chi phí sửa được tại chỗ. Cả lần chạy thử 20 bước đêm 16/09 tốn khoảng 0,08 USD.</w:t>
             </w:r>
           </w:p>
         </w:tc>
@@ -9500,7 +10442,7 @@
                 <w:sz w:val="20"/>
                 <w:szCs w:val="20"/>
               </w:rPr>
-              <w:t xml:space="preserve">Trong buổi này AI ở năm chỗ: brief chọn việc (bước 2), chọn phương án cho lô cận date (4), phân tích đề xuất bổ sung bất thường (9), đọc tín hiệu bất thường (17), và kể lại mọi kết quả tra cứu bằng lời (7, 10, 11, 16). Còn lại là LS và Business Central tính, trợ lý đọc và giải thích. Tính năng không thuộc bốn nhóm tóm tắt, tạo sinh, phân tích, tự động hoá thì chúng tôi gọi đúng tên là tính năng ứng dụng.</w:t>
+              <w:t xml:space="preserve">Trong buổi này AI ở các chỗ: brief chọn việc (bước 2), chọn phương án cho lô cận date và soạn email cho người duyệt (4), trả lời câu hỏi tự do bằng cách tự chọn tool (6, 7, 13), đọc tín hiệu bất thường (9), và kể lại kết quả tra cứu bằng lời (8, 11, 14, 15). Còn lại là LS và Business Central tính, trợ lý đọc và giải thích. Tính năng không thuộc bốn nhóm tóm tắt, tạo sinh, phân tích, tự động hoá thì chúng tôi gọi đúng tên là tính năng ứng dụng.</w:t>
             </w:r>
           </w:p>
         </w:tc>
@@ -9572,7 +10514,7 @@
                 <w:sz w:val="20"/>
                 <w:szCs w:val="20"/>
               </w:rPr>
-              <w:t xml:space="preserve">Cứ để khách gõ. Câu nào rule đọc chắc thì trả lời bằng dữ liệu, không tốn model; câu nào rule không giải được thì chuyển cho model tự chọn tool (tồn theo địa điểm, sức khỏe tồn kho theo tầng, LS đề xuất bổ sung, tốc độ bán, lô, khuyến mãi) rồi tổng hợp, thẻ có nút xem từng bước đã tra. Ví dụ đã chạy: “có những mặt hàng nào sắp hết hàng” từ quản lý cửa hàng.</w:t>
+              <w:t xml:space="preserve">Cứ để khách gõ, bước 6 và 7 chính là loại câu đó. Câu nào rule đọc chắc thì trả lời bằng dữ liệu, không tốn model; câu nào rule không giải được thì chuyển cho model tự chọn tool rồi tổng hợp, thẻ có nút xem từng bước đã tra.</w:t>
             </w:r>
           </w:p>
         </w:tc>
@@ -9611,7 +10553,7 @@
                 <w:sz w:val="20"/>
                 <w:szCs w:val="20"/>
               </w:rPr>
-              <w:t xml:space="preserve">Nhìn vào đâu để biết câu này AI viết hay câu soạn sẵn?</w:t>
+              <w:t xml:space="preserve">Sao câu cần AI trả lời chậm hơn?</w:t>
             </w:r>
           </w:p>
         </w:tc>
@@ -9644,7 +10586,7 @@
                 <w:sz w:val="20"/>
                 <w:szCs w:val="20"/>
               </w:rPr>
-              <w:t xml:space="preserve">Nhãn nhỏ dưới mỗi câu trả lời của trợ lý: “AI viết · gpt-4.1-mini” (đỏ) là model viết và đã qua phép kiểm số; “câu mẫu” (vàng) là AI bị chặn hoặc đang tắt nên code ghép câu; “đọc từ dữ liệu, không gọi model” (xám) là rule đọc thẳng bảng. Thẻ AI còn có dòng Người soạn.</w:t>
+              <w:t xml:space="preserve">Một câu hỏi tự do là nhiều lượt: model chọn tool, code đọc Business Central, model đọc kết quả rồi viết, code kiểm từng con số. Thường 10 đến 30 giây. Máy chủ đã đọc trước các bảng nặng mỗi 12 phút để phần đọc BC không phải chờ. Nhanh hơn nữa thì tăng hạn mức token mỗi phút trên Azure và hiển thị câu trả lời dần; đó là việc cấu hình khi triển khai.</w:t>
             </w:r>
           </w:p>
         </w:tc>
@@ -9683,7 +10625,7 @@
                 <w:sz w:val="20"/>
                 <w:szCs w:val="20"/>
               </w:rPr>
-              <w:t xml:space="preserve">AI có bịa số không?</w:t>
+              <w:t xml:space="preserve">Nhìn vào đâu để biết câu này AI viết hay câu soạn sẵn?</w:t>
             </w:r>
           </w:p>
         </w:tc>
@@ -9716,7 +10658,7 @@
                 <w:sz w:val="20"/>
                 <w:szCs w:val="20"/>
               </w:rPr>
-              <w:t xml:space="preserve">Không thể đưa ra con số không có trong dữ liệu. Mọi chữ số model viết đều bị đối chiếu với dữ liệu code đưa; sai một chỗ là bỏ cả đoạn và thay bằng câu mẫu, thẻ ghi rõ lý do.</w:t>
+              <w:t xml:space="preserve">Nhãn nhỏ dưới mỗi câu trả lời: “AI viết · gpt-4.1-mini” (đỏ) là model viết và đã qua phép kiểm số; “câu mẫu” (vàng) là AI bị chặn hoặc đang tắt nên code ghép câu; “đọc từ dữ liệu, không gọi model” (xám) là rule đọc thẳng bảng.</w:t>
             </w:r>
           </w:p>
         </w:tc>
@@ -9755,7 +10697,7 @@
                 <w:sz w:val="20"/>
                 <w:szCs w:val="20"/>
               </w:rPr>
-              <w:t xml:space="preserve">Trợ lý có tự ghi vào sổ không?</w:t>
+              <w:t xml:space="preserve">AI có bịa số không?</w:t>
             </w:r>
           </w:p>
         </w:tc>
@@ -9788,7 +10730,7 @@
                 <w:sz w:val="20"/>
                 <w:szCs w:val="20"/>
               </w:rPr>
-              <w:t xml:space="preserve">Chỉ một trường hợp: post phiếu nhận hàng liên công ty, và chỉ sau khi một người bấm Duyệt. Mọi loại khác dừng ở chứng từ nháp.</w:t>
+              <w:t xml:space="preserve">Mọi chữ số model viết đều bị đối chiếu với dữ liệu code đưa; sai một chỗ là bỏ cả đoạn và thay bằng câu mẫu, hoặc thẻ ghi Kiểm tra số liệt kê đúng số sai.</w:t>
             </w:r>
           </w:p>
         </w:tc>
@@ -9827,7 +10769,7 @@
                 <w:sz w:val="20"/>
                 <w:szCs w:val="20"/>
               </w:rPr>
-              <w:t xml:space="preserve">Con số bổ sung là của ai?</w:t>
+              <w:t xml:space="preserve">Trợ lý có tự ghi vào sổ không?</w:t>
             </w:r>
           </w:p>
         </w:tc>
@@ -9860,7 +10802,7 @@
                 <w:sz w:val="20"/>
                 <w:szCs w:val="20"/>
               </w:rPr>
-              <w:t xml:space="preserve">Của LS Replenishment, module có sẵn trong LS Central. Trợ lý đọc nhật ký tính của LS và kể lại, có link đối chiếu. Tham số trên Item Card, Marou tự sửa.</w:t>
+              <w:t xml:space="preserve">Chỉ một trường hợp: post phiếu nhận hàng liên công ty, và chỉ sau khi một người bấm Duyệt. Mọi loại khác dừng ở chứng từ nháp.</w:t>
             </w:r>
           </w:p>
         </w:tc>
@@ -9899,7 +10841,7 @@
                 <w:sz w:val="20"/>
                 <w:szCs w:val="20"/>
               </w:rPr>
-              <w:t xml:space="preserve">Dự báo dùng AI không?</w:t>
+              <w:t xml:space="preserve">Làm sao trợ lý biết Marou vừa post xuất kho?</w:t>
             </w:r>
           </w:p>
         </w:tc>
@@ -9932,7 +10874,7 @@
                 <w:sz w:val="20"/>
                 <w:szCs w:val="20"/>
               </w:rPr>
-              <w:t xml:space="preserve">Chưa. Holt-Winters là thống kê chuỗi thời gian, dùng làm thước đo. Kết quả ghi vào bảng chuẩn của LS nên đổi mô hình sau này không phải đổi luồng.</w:t>
+              <w:t xml:space="preserve">Mỗi phút nó đọc phiếu giao hàng bên Marou (Sales Shipment Header) qua web service chỉ đọc của app NaviWorld. Phiếu mang số đơn mua của Dakao ở External Document No., do Intercompany điền sẵn. Phiếu nào chưa từng báo thì báo cửa hàng và Supply Chain, gửi email.</w:t>
             </w:r>
           </w:p>
         </w:tc>
@@ -9971,7 +10913,7 @@
                 <w:sz w:val="20"/>
                 <w:szCs w:val="20"/>
               </w:rPr>
-              <w:t xml:space="preserve">Chi phí AI bao nhiêu?</w:t>
+              <w:t xml:space="preserve">Con số bổ sung là của ai?</w:t>
             </w:r>
           </w:p>
         </w:tc>
@@ -10004,7 +10946,7 @@
                 <w:sz w:val="20"/>
                 <w:szCs w:val="20"/>
               </w:rPr>
-              <w:t xml:space="preserve">Ngày kiểm thử 16/09 tốn dưới 0,3 USD cho vài trăm lượt gọi. Xem tab Cài đặt AI: token là số đếm thật, tiền là ước tính theo đơn giá công bố.</w:t>
+              <w:t xml:space="preserve">Của LS Replenishment, module có sẵn trong LS Central. Trợ lý đọc nhật ký tính của LS và kể lại, có link đối chiếu. Tham số trên Item Card, Marou tự sửa.</w:t>
             </w:r>
           </w:p>
         </w:tc>
@@ -10043,7 +10985,7 @@
                 <w:sz w:val="20"/>
                 <w:szCs w:val="20"/>
               </w:rPr>
-              <w:t xml:space="preserve">Tắt AI thì hệ thống còn chạy không?</w:t>
+              <w:t xml:space="preserve">Dự báo dùng AI không?</w:t>
             </w:r>
           </w:p>
         </w:tc>
@@ -10076,7 +11018,7 @@
                 <w:sz w:val="20"/>
                 <w:szCs w:val="20"/>
               </w:rPr>
-              <w:t xml:space="preserve">Còn. Số liệu, dashboard và luồng duyệt không đổi. Các đoạn văn chuyển sang câu mẫu do code ghép.</w:t>
+              <w:t xml:space="preserve">Chưa. Holt-Winters là thống kê chuỗi thời gian, dùng làm thước đo. Kết quả ghi vào bảng chuẩn của LS nên đổi mô hình sau này không phải đổi luồng.</w:t>
             </w:r>
           </w:p>
         </w:tc>
@@ -10115,7 +11057,7 @@
                 <w:sz w:val="20"/>
                 <w:szCs w:val="20"/>
               </w:rPr>
-              <w:t xml:space="preserve">Dữ liệu có ra khỏi Việt Nam không?</w:t>
+              <w:t xml:space="preserve">Chi phí AI bao nhiêu?</w:t>
             </w:r>
           </w:p>
         </w:tc>
@@ -10148,7 +11090,7 @@
                 <w:sz w:val="20"/>
                 <w:szCs w:val="20"/>
               </w:rPr>
-              <w:t xml:space="preserve">Môi trường demo dùng Azure OpenAI ở Mỹ. Khi triển khai, extension của NaviWorld tự chọn vùng xử lý, giữ được trong Asia Pacific. Ghi vào phần governance.</w:t>
+              <w:t xml:space="preserve">Chạy thử trọn 20 bước tốn khoảng 0,08 USD. Xem tab Cài đặt AI: token là số đếm thật, tiền là ước tính theo đơn giá công bố.</w:t>
             </w:r>
           </w:p>
         </w:tc>
@@ -10187,7 +11129,7 @@
                 <w:sz w:val="20"/>
                 <w:szCs w:val="20"/>
               </w:rPr>
-              <w:t xml:space="preserve">Sao bên bán lẻ Dakao cũng thấy số lô trên phiếu nhận?</w:t>
+              <w:t xml:space="preserve">Tắt AI thì hệ thống còn chạy không?</w:t>
             </w:r>
           </w:p>
         </w:tc>
@@ -10220,7 +11162,7 @@
                 <w:sz w:val="20"/>
                 <w:szCs w:val="20"/>
               </w:rPr>
-              <w:t xml:space="preserve">Hai đơn vị đang dùng chung một bộ dữ liệu mô phỏng nên bên Dakao vẫn còn bật quản lý lô. Trợ lý xử lý số lô chỉ khi mặt hàng bên mua có bật, và không đẩy số lô ra cho cửa hàng. Cho cửa hàng giữ lô hay không là quyết định của Marou.</w:t>
+              <w:t xml:space="preserve">Còn. Số liệu, dashboard và luồng duyệt không đổi. Các đoạn văn chuyển sang câu mẫu do code ghép.</w:t>
             </w:r>
           </w:p>
         </w:tc>
@@ -10259,7 +11201,7 @@
                 <w:sz w:val="20"/>
                 <w:szCs w:val="20"/>
               </w:rPr>
-              <w:t xml:space="preserve">Email báo người duyệt có phải AI viết không?</w:t>
+              <w:t xml:space="preserve">Dữ liệu có ra khỏi Việt Nam không?</w:t>
             </w:r>
           </w:p>
         </w:tc>
@@ -10292,7 +11234,7 @@
                 <w:sz w:val="20"/>
                 <w:szCs w:val="20"/>
               </w:rPr>
-              <w:t xml:space="preserve">Có, phần lời. Bảng mặt hàng, lô, tồn, giá trị, tầng, policy và link Business Central do code điền; AI viết hai đoạn mở đầu và kết, mỗi chữ số phải có trong dữ liệu đưa nó, không thì thư dùng mẫu và thẻ ghi rõ. Thẻ Email cho người duyệt trong chat của người đề nghị hiện đúng hai đoạn đó kèm nhãn nguồn.</w:t>
+              <w:t xml:space="preserve">Môi trường demo dùng Azure OpenAI ở Mỹ. Khi triển khai, extension của NaviWorld tự chọn vùng xử lý, giữ được trong Asia Pacific. Ghi vào phần governance.</w:t>
             </w:r>
           </w:p>
         </w:tc>
@@ -10331,7 +11273,7 @@
                 <w:sz w:val="20"/>
                 <w:szCs w:val="20"/>
               </w:rPr>
-              <w:t xml:space="preserve">Sao email gửi từ một địa chỉ Gmail?</w:t>
+              <w:t xml:space="preserve">Email báo người duyệt có phải AI viết không?</w:t>
             </w:r>
           </w:p>
         </w:tc>
@@ -10364,7 +11306,7 @@
                 <w:sz w:val="20"/>
                 <w:szCs w:val="20"/>
               </w:rPr>
-              <w:t xml:space="preserve">Tenant demo không có license Exchange Online nên POC gửi qua SMTP. Triển khai thật thì thư đi bằng hộp thư của Marou, cấu hình một lần.</w:t>
+              <w:t xml:space="preserve">Có, phần lời. Bảng mặt hàng, lô, tồn, giá trị, tầng, policy và link Business Central do code điền; AI viết đoạn mở đầu và đoạn kết, mỗi chữ số phải có trong dữ liệu.</w:t>
             </w:r>
           </w:p>
         </w:tc>
@@ -10403,7 +11345,7 @@
                 <w:sz w:val="20"/>
                 <w:szCs w:val="20"/>
               </w:rPr>
-              <w:t xml:space="preserve">Ngày trên email và bảng tồn kho lấy từ đâu?</w:t>
+              <w:t xml:space="preserve">Sao email gửi từ một địa chỉ Gmail?</w:t>
             </w:r>
           </w:p>
         </w:tc>
@@ -10436,7 +11378,7 @@
                 <w:sz w:val="20"/>
                 <w:szCs w:val="20"/>
               </w:rPr>
-              <w:t xml:space="preserve">Từ ngày lớp tính toán trong Business Central chạy lần gần nhất, tức 17/09. Chứng từ mua bán mang ngày thật lúc thao tác.</w:t>
+              <w:t xml:space="preserve">Tenant demo không có license Exchange Online nên POC gửi qua SMTP. Triển khai thật thì thư đi bằng hộp thư của Marou, cấu hình một lần.</w:t>
             </w:r>
           </w:p>
         </w:tc>
@@ -10734,7 +11676,7 @@
                 <w:sz w:val="20"/>
                 <w:szCs w:val="20"/>
               </w:rPr>
-              <w:t xml:space="preserve">Máy chủ đang khởi động lại sau khi sửa file</w:t>
+              <w:t xml:space="preserve">Máy chủ đang khởi động lại</w:t>
             </w:r>
           </w:p>
         </w:tc>
@@ -10806,7 +11748,7 @@
                 <w:sz w:val="20"/>
                 <w:szCs w:val="20"/>
               </w:rPr>
-              <w:t xml:space="preserve">Bấm nút kịch bản mà hộp thư trống, không có màn hình chào</w:t>
+              <w:t xml:space="preserve">Câu trả lời báo model vượt hạn mức token mỗi phút</w:t>
             </w:r>
           </w:p>
         </w:tc>
@@ -10839,7 +11781,7 @@
                 <w:sz w:val="20"/>
                 <w:szCs w:val="20"/>
               </w:rPr>
-              <w:t xml:space="preserve">Vòng đọc hộp thư chưa xong hoặc bị lỗi một thẻ</w:t>
+              <w:t xml:space="preserve">Hai câu hỏi tự do liền nhau vượt 30 nghìn token mỗi phút của Azure</w:t>
             </w:r>
           </w:p>
         </w:tc>
@@ -10872,7 +11814,7 @@
                 <w:sz w:val="20"/>
                 <w:szCs w:val="20"/>
               </w:rPr>
-              <w:t xml:space="preserve">Đã vá tối 16/09: màn hình chào luôn hiện khi hộp thư trống. Nếu vẫn trống, bấm F5</w:t>
+              <w:t xml:space="preserve">Nói thêm một câu dẫn rồi bấm lại sau khoảng một phút. Tránh bấm 6, 7, 13 sát nhau</w:t>
             </w:r>
           </w:p>
         </w:tc>
@@ -10911,7 +11853,7 @@
                 <w:sz w:val="20"/>
                 <w:szCs w:val="20"/>
               </w:rPr>
-              <w:t xml:space="preserve">Bước 6 trả lời “chuyển từ W0003” thay vì đặt mua từ MAROU</w:t>
+              <w:t xml:space="preserve">Bước 10 trả lời “chuyển từ W0003” thay vì đặt mua từ MAROU</w:t>
             </w:r>
           </w:p>
         </w:tc>
@@ -10977,7 +11919,7 @@
                 <w:sz w:val="20"/>
                 <w:szCs w:val="20"/>
               </w:rPr>
-              <w:t xml:space="preserve">Nhìn dải nguồn: nút Dakao (bán lẻ) phải đang tô. Bấm lại nút 6</w:t>
+              <w:t xml:space="preserve">Nhìn dải nguồn: nút Dakao (bán lẻ) phải đang tô. Bấm lại nút 10</w:t>
             </w:r>
           </w:p>
         </w:tc>
@@ -11016,7 +11958,7 @@
                 <w:sz w:val="20"/>
                 <w:szCs w:val="20"/>
               </w:rPr>
-              <w:t xml:space="preserve">Câu hỏi mở trả lời về hàng liên công ty</w:t>
+              <w:t xml:space="preserve">Bước 10 báo đã có đề xuất cho dòng này</w:t>
             </w:r>
           </w:p>
         </w:tc>
@@ -11049,7 +11991,7 @@
                 <w:sz w:val="20"/>
                 <w:szCs w:val="20"/>
               </w:rPr>
-              <w:t xml:space="preserve">Câu hỏi có chữ Marou kèm về hoặc xuất kho</w:t>
+              <w:t xml:space="preserve">Đã bấm bước 10 một lần trước đó</w:t>
             </w:r>
           </w:p>
         </w:tc>
@@ -11082,7 +12024,7 @@
                 <w:sz w:val="20"/>
                 <w:szCs w:val="20"/>
               </w:rPr>
-              <w:t xml:space="preserve">Dùng đúng câu trên nút; không thêm chữ Marou</w:t>
+              <w:t xml:space="preserve">Chuyển sang bước 12, thẻ đề xuất đã nằm trong hộp thư Hùng</w:t>
             </w:r>
           </w:p>
         </w:tc>
@@ -11121,7 +12063,7 @@
                 <w:sz w:val="20"/>
                 <w:szCs w:val="20"/>
               </w:rPr>
-              <w:t xml:space="preserve">Đoạn văn ghi mẫu có sẵn thay vì AI</w:t>
+              <w:t xml:space="preserve">Bước 7 trả lời chung chung về CTKM</w:t>
             </w:r>
           </w:p>
         </w:tc>
@@ -11154,7 +12096,7 @@
                 <w:sz w:val="20"/>
                 <w:szCs w:val="20"/>
               </w:rPr>
-              <w:t xml:space="preserve">Phép kiểm số đã chặn, hoặc AI đang tắt, hoặc hết trần</w:t>
+              <w:t xml:space="preserve">Bước 7 gửi ở đoạn chat khác với bước 6</w:t>
             </w:r>
           </w:p>
         </w:tc>
@@ -11187,7 +12129,7 @@
                 <w:sz w:val="20"/>
                 <w:szCs w:val="20"/>
               </w:rPr>
-              <w:t xml:space="preserve">Hành vi đúng. Mở tab Cài đặt AI xem trạng thái rồi giải thích</w:t>
+              <w:t xml:space="preserve">Bấm lại bước 6 rồi bước 7 liền nhau, không đổi đoạn chat</w:t>
             </w:r>
           </w:p>
         </w:tc>
@@ -11226,7 +12168,7 @@
                 <w:sz w:val="20"/>
                 <w:szCs w:val="20"/>
               </w:rPr>
-              <w:t xml:space="preserve">Màn hình chậm khoảng 20 giây</w:t>
+              <w:t xml:space="preserve">Đoạn văn ghi mẫu có sẵn thay vì AI</w:t>
             </w:r>
           </w:p>
         </w:tc>
@@ -11259,7 +12201,7 @@
                 <w:sz w:val="20"/>
                 <w:szCs w:val="20"/>
               </w:rPr>
-              <w:t xml:space="preserve">Đang đọc dữ liệu thật từ Business Central (brief, câu hỏi mở)</w:t>
+              <w:t xml:space="preserve">Phép kiểm số đã chặn, hoặc AI đang tắt, hoặc hết trần</w:t>
             </w:r>
           </w:p>
         </w:tc>
@@ -11292,7 +12234,7 @@
                 <w:sz w:val="20"/>
                 <w:szCs w:val="20"/>
               </w:rPr>
-              <w:t xml:space="preserve">Nói trước khi bấm. Đổi vai hay đổi company thì không còn chậm: cột phải lấy từ bản chụp, làm mới ở luồng nền</w:t>
+              <w:t xml:space="preserve">Hành vi đúng. Mở tab Cài đặt AI xem trạng thái rồi giải thích</w:t>
             </w:r>
           </w:p>
         </w:tc>
@@ -11436,7 +12378,7 @@
                 <w:sz w:val="20"/>
                 <w:szCs w:val="20"/>
               </w:rPr>
-              <w:t xml:space="preserve">Bước 12 không thấy thẻ HO106202</w:t>
+              <w:t xml:space="preserve">Bước 19 báo không còn đơn nào chờ xuất kho</w:t>
             </w:r>
           </w:p>
         </w:tc>
@@ -11469,7 +12411,7 @@
                 <w:sz w:val="20"/>
                 <w:szCs w:val="20"/>
               </w:rPr>
-              <w:t xml:space="preserve">Đơn đã được post nhận, hoặc đồng hồ ảo đã bị đẩy sang ngày khác</w:t>
+              <w:t xml:space="preserve">Chưa làm bước 12, và đơn HO106203 đã được post tay</w:t>
             </w:r>
           </w:p>
         </w:tc>
@@ -11502,7 +12444,7 @@
                 <w:sz w:val="20"/>
                 <w:szCs w:val="20"/>
               </w:rPr>
-              <w:t xml:space="preserve">Xem dòng Giờ hệ thống trong khay demo. Nếu đã +24 giờ thì HO106202 thành quá ngày, vẫn có thẻ đề xuất post, diễn tiếp bằng thẻ đó</w:t>
+              <w:t xml:space="preserve">Làm bước 12 trước. Hoặc bỏ bước 19, kể bằng thẻ của bước 16</w:t>
             </w:r>
           </w:p>
         </w:tc>
@@ -11652,7 +12594,7 @@
           <w:rFonts w:ascii="Aptos" w:cs="Aptos" w:eastAsia="Aptos" w:hAnsi="Aptos"/>
           <w:color w:val="27343A"/>
         </w:rPr>
-        <w:t xml:space="preserve">Phương án cuối cùng nếu mạng hỏng: đổi dải nguồn sang dữ liệu mô phỏng. Bộ mô phỏng neo ngày 18/09 và LS trong đó là công thức cũ, nên các bước 7, 9 (nhật ký tính LS) không có; các bước còn lại diễn được nhưng số khác. Nói rõ với khách là đang ở bộ mô phỏng.</w:t>
+        <w:t xml:space="preserve">Phương án cuối cùng nếu mạng hỏng: đổi dải nguồn sang dữ liệu mô phỏng. Bộ mô phỏng neo ngày 18/09 và LS trong đó là công thức cũ, nên các bước 11, 13 (nhật ký tính LS) và phần liên công ty không có; các bước UC2 diễn được nhưng số khác. Nói rõ với khách là đang ở bộ mô phỏng.</w:t>
       </w:r>
     </w:p>
     <w:sectPr>
@@ -11726,7 +12668,7 @@
         <w:sz w:val="18"/>
         <w:szCs w:val="18"/>
       </w:rPr>
-      <w:t xml:space="preserve">Demo script · Bản 2.4, 16/09/2026</w:t>
+      <w:t xml:space="preserve">Demo script · Bản 3.0, 17/09/2026</w:t>
     </w:r>
     <w:r>
       <w:rPr>

</xml_diff>

<commit_message>
Buoc 3-5 lo can date chuyen sang Dakao: console, QA, script 3.1, slide v6 va anh chup lai
</commit_message>
<xml_diff>
--- a/docs/13 Marou POC - Demo script (noi bo).docx
+++ b/docs/13 Marou POC - Demo script (noi bo).docx
@@ -482,7 +482,7 @@
                 <w:sz w:val="20"/>
                 <w:szCs w:val="20"/>
               </w:rPr>
-              <w:t xml:space="preserve">2 · Một lô cận date: AI phân tích, chọn phương án</w:t>
+              <w:t xml:space="preserve">2 · Một lô cận date ở cửa hàng: AI phân tích, chọn phương án</w:t>
             </w:r>
           </w:p>
         </w:tc>
@@ -1693,7 +1693,7 @@
                 <w:sz w:val="20"/>
                 <w:szCs w:val="20"/>
               </w:rPr>
-              <w:t xml:space="preserve">Inventory Health NWV-MAROU</w:t>
+              <w:t xml:space="preserve">Inventory Health NWV-DAKAO</w:t>
             </w:r>
           </w:p>
         </w:tc>
@@ -2691,7 +2691,7 @@
                 <w:sz w:val="20"/>
                 <w:szCs w:val="20"/>
               </w:rPr>
-              <w:t xml:space="preserve">Transfer Order HO1039 và đề xuất chuyển Choco pillar của lần QA</w:t>
+              <w:t xml:space="preserve">Transfer Order HO1039 và đề xuất chuyển Choco pillar của lần QA, ở cả hai company</w:t>
             </w:r>
           </w:p>
         </w:tc>
@@ -3569,7 +3569,7 @@
                 <w:sz w:val="20"/>
                 <w:szCs w:val="20"/>
               </w:rPr>
-              <w:t xml:space="preserve">Marou: chưa có đề xuất nào. Dakao: bốn dòng Executed (HO106200, HO106201, HO106202, phiếu nhận 107110)</w:t>
+              <w:t xml:space="preserve">Marou: chưa có đề xuất nào. Dakao: bốn dòng Executed (HO106200, HO106201, HO106202, phiếu nhận 107110), chưa có đề xuất chuyển hàng</w:t>
             </w:r>
           </w:p>
         </w:tc>
@@ -5255,7 +5255,7 @@
           <w:sz w:val="28"/>
           <w:szCs w:val="28"/>
         </w:rPr>
-        <w:t xml:space="preserve">Phần 2 · Một lô cận date: AI phân tích, chọn phương án</w:t>
+        <w:t xml:space="preserve">Phần 2 · Một lô cận date ở cửa hàng: AI phân tích, chọn phương án</w:t>
       </w:r>
     </w:p>
     <w:p>
@@ -5290,7 +5290,7 @@
           <w:rFonts w:ascii="Aptos" w:cs="Aptos" w:eastAsia="Aptos" w:hAnsi="Aptos"/>
           <w:color w:val="27343A"/>
         </w:rPr>
-        <w:t xml:space="preserve">Vai: trang.sc · Marou</w:t>
+        <w:t xml:space="preserve">Vai: trang.sc · Dakao</w:t>
       </w:r>
     </w:p>
     <w:tbl>
@@ -5550,7 +5550,7 @@
           <w:rFonts w:ascii="Aptos" w:cs="Aptos" w:eastAsia="Aptos" w:hAnsi="Aptos"/>
           <w:color w:val="27343A"/>
         </w:rPr>
-        <w:t xml:space="preserve">Vai: trang.sc · Marou</w:t>
+        <w:t xml:space="preserve">Vai: trang.sc · Dakao</w:t>
       </w:r>
     </w:p>
     <w:tbl>
@@ -5792,7 +5792,7 @@
           <w:rFonts w:ascii="Aptos" w:cs="Aptos" w:eastAsia="Aptos" w:hAnsi="Aptos"/>
           <w:color w:val="27343A"/>
         </w:rPr>
-        <w:t xml:space="preserve">Đây là UC2 nối sang UC5: hàng cận date đi về nơi bán nhanh, không phải huỷ.</w:t>
+        <w:t xml:space="preserve">Đây là UC2 nối sang UC5: hàng cận date đi về nơi bán nhanh, không phải huỷ. Bước này chạy ở Dakao vì cửa hàng thuộc Dakao; Marou là nhà sản xuất.</w:t>
       </w:r>
     </w:p>
     <w:p>
@@ -5844,7 +5844,7 @@
           <w:rFonts w:ascii="Aptos" w:cs="Aptos" w:eastAsia="Aptos" w:hAnsi="Aptos"/>
           <w:color w:val="27343A"/>
         </w:rPr>
-        <w:t xml:space="preserve">Vai: hung.dieuphoi · Marou</w:t>
+        <w:t xml:space="preserve">Vai: hung.dieuphoi · Dakao</w:t>
       </w:r>
     </w:p>
     <w:tbl>
@@ -12668,7 +12668,7 @@
         <w:sz w:val="18"/>
         <w:szCs w:val="18"/>
       </w:rPr>
-      <w:t xml:space="preserve">Demo script · Bản 3.0, 17/09/2026</w:t>
+      <w:t xml:space="preserve">Demo script · Bản 3.1, 17/09/2026</w:t>
     </w:r>
     <w:r>
       <w:rPr>

</xml_diff>